<commit_message>
add education and coaching
 some cleanup
</commit_message>
<xml_diff>
--- a/public/Hilliard-M-Scott-Resume-2025.docx
+++ b/public/Hilliard-M-Scott-Resume-2025.docx
@@ -187,300 +187,1118 @@
         <w:rPr>
           <w:i/>
         </w:rPr>
-        <w:t xml:space="preserve"> Inc</w:t>
-      </w:r>
-      <w:bookmarkStart w:id="2" w:name="_GoBack"/>
-      <w:bookmarkEnd w:id="2"/>
+        <w:t xml:space="preserve"> Inc.</w:t>
+      </w:r>
+      <w:r>
+        <w:t xml:space="preserve"> </w:t>
+      </w:r>
+      <w:r>
+        <w:t xml:space="preserve">I </w:t>
+      </w:r>
+      <w:r>
+        <w:t xml:space="preserve">Founded </w:t>
+      </w:r>
+      <w:proofErr w:type="spellStart"/>
+      <w:r>
+        <w:t>GoldTending</w:t>
+      </w:r>
+      <w:proofErr w:type="spellEnd"/>
+      <w:r>
+        <w:t xml:space="preserve"> to develop a revolutionary platform for aspiring young entrepreneurs. </w:t>
+      </w:r>
+    </w:p>
+    <w:p>
+      <w:pPr>
+        <w:spacing w:before="240" w:after="240"/>
+        <w:rPr>
+          <w:lang w:val="en-US"/>
+        </w:rPr>
+      </w:pPr>
+      <w:r>
+        <w:rPr>
+          <w:b/>
+          <w:lang w:val="en-US"/>
+        </w:rPr>
+        <w:t>Advisory Board for the Strategic Artificial</w:t>
+      </w:r>
+      <w:r>
+        <w:rPr>
+          <w:b/>
+          <w:lang w:val="en-US"/>
+        </w:rPr>
+        <w:t xml:space="preserve"> </w:t>
+      </w:r>
+      <w:r>
+        <w:rPr>
+          <w:b/>
+          <w:lang w:val="en-US"/>
+        </w:rPr>
+        <w:t>Intelligence Program at the University of Colorado</w:t>
+      </w:r>
+      <w:r>
+        <w:rPr>
+          <w:b/>
+          <w:lang w:val="en-US"/>
+        </w:rPr>
+        <w:t>,</w:t>
+      </w:r>
+      <w:r>
+        <w:rPr>
+          <w:b/>
+          <w:lang w:val="en-US"/>
+        </w:rPr>
+        <w:t xml:space="preserve"> Colorado Springs</w:t>
+      </w:r>
+      <w:r>
+        <w:rPr>
+          <w:b/>
+          <w:lang w:val="en-US"/>
+        </w:rPr>
+        <w:t xml:space="preserve"> </w:t>
+      </w:r>
       <w:r>
         <w:rPr>
           <w:i/>
         </w:rPr>
+        <w:t>UCCS</w:t>
+      </w:r>
+      <w:r>
+        <w:rPr>
+          <w:i/>
+        </w:rPr>
         <w:t>.</w:t>
       </w:r>
       <w:r>
         <w:t xml:space="preserve"> </w:t>
       </w:r>
       <w:r>
+        <w:rPr>
+          <w:lang w:val="en-US"/>
+        </w:rPr>
+        <w:t>Board members make a number of contributions to the program, including</w:t>
+      </w:r>
+      <w:r>
+        <w:rPr>
+          <w:lang w:val="en-US"/>
+        </w:rPr>
+        <w:t>:</w:t>
+      </w:r>
+    </w:p>
+    <w:p>
+      <w:pPr>
+        <w:rPr>
+          <w:lang w:val="en-US"/>
+        </w:rPr>
+      </w:pPr>
+      <w:r>
+        <w:rPr>
+          <w:lang w:val="en-US"/>
+        </w:rPr>
+        <w:t>Preserving and enhancing the reputation and quality of the program through strategic review of our credit and noncredit offerings to the community, as well as helping to build our value to the business community.</w:t>
+      </w:r>
+    </w:p>
+    <w:p>
+      <w:pPr>
+        <w:rPr>
+          <w:lang w:val="en-US"/>
+        </w:rPr>
+      </w:pPr>
+    </w:p>
+    <w:p>
+      <w:pPr>
+        <w:rPr>
+          <w:lang w:val="en-US"/>
+        </w:rPr>
+      </w:pPr>
+      <w:r>
+        <w:rPr>
+          <w:lang w:val="en-US"/>
+        </w:rPr>
+        <w:t>Offering expert guidance to our faculty and students through occasional classroom visits, forums and conferences, and input on our programs.</w:t>
+      </w:r>
+    </w:p>
+    <w:p>
+      <w:pPr>
+        <w:rPr>
+          <w:lang w:val="en-US"/>
+        </w:rPr>
+      </w:pPr>
+      <w:r>
+        <w:rPr>
+          <w:lang w:val="en-US"/>
+        </w:rPr>
+        <w:t xml:space="preserve">                </w:t>
+      </w:r>
+    </w:p>
+    <w:p>
+      <w:pPr>
+        <w:rPr>
+          <w:lang w:val="en-US"/>
+        </w:rPr>
+      </w:pPr>
+      <w:r>
+        <w:rPr>
+          <w:lang w:val="en-US"/>
+        </w:rPr>
+        <w:t>Promoting the program’s goal of linking industry with academia to help ensure that our work is relevant and benefits the business community.</w:t>
+      </w:r>
+    </w:p>
+    <w:p>
+      <w:pPr>
+        <w:rPr>
+          <w:lang w:val="en-US"/>
+        </w:rPr>
+      </w:pPr>
+    </w:p>
+    <w:p>
+      <w:pPr>
+        <w:ind w:left="720"/>
+        <w:rPr>
+          <w:lang w:val="en-US"/>
+        </w:rPr>
+      </w:pPr>
+      <w:r>
+        <w:rPr>
+          <w:b/>
+          <w:bCs/>
+          <w:lang w:val="en-US"/>
+        </w:rPr>
+        <w:t xml:space="preserve">Technologies: </w:t>
+      </w:r>
+      <w:proofErr w:type="spellStart"/>
+      <w:r>
+        <w:rPr>
+          <w:lang w:val="en-US"/>
+        </w:rPr>
+        <w:t>Javascript</w:t>
+      </w:r>
+      <w:proofErr w:type="spellEnd"/>
+      <w:r>
+        <w:rPr>
+          <w:lang w:val="en-US"/>
+        </w:rPr>
+        <w:t xml:space="preserve">, </w:t>
+      </w:r>
+      <w:proofErr w:type="spellStart"/>
+      <w:r>
+        <w:rPr>
+          <w:lang w:val="en-US"/>
+        </w:rPr>
+        <w:t>NextJS</w:t>
+      </w:r>
+      <w:proofErr w:type="spellEnd"/>
+      <w:r>
+        <w:rPr>
+          <w:lang w:val="en-US"/>
+        </w:rPr>
+        <w:t xml:space="preserve">, Firebase, </w:t>
+      </w:r>
+      <w:proofErr w:type="spellStart"/>
+      <w:r>
+        <w:rPr>
+          <w:lang w:val="en-US"/>
+        </w:rPr>
+        <w:t>Supabase</w:t>
+      </w:r>
+      <w:proofErr w:type="spellEnd"/>
+      <w:r>
+        <w:rPr>
+          <w:lang w:val="en-US"/>
+        </w:rPr>
+        <w:t xml:space="preserve">, </w:t>
+      </w:r>
+      <w:proofErr w:type="spellStart"/>
+      <w:r>
+        <w:rPr>
+          <w:lang w:val="en-US"/>
+        </w:rPr>
+        <w:t>O</w:t>
+      </w:r>
+      <w:r>
+        <w:rPr>
+          <w:lang w:val="en-US"/>
+        </w:rPr>
+        <w:t>penAI</w:t>
+      </w:r>
+      <w:proofErr w:type="spellEnd"/>
+      <w:r>
+        <w:rPr>
+          <w:lang w:val="en-US"/>
+        </w:rPr>
+        <w:t xml:space="preserve">, Node.js, React, </w:t>
+      </w:r>
+      <w:proofErr w:type="spellStart"/>
+      <w:r>
+        <w:rPr>
+          <w:lang w:val="en-US"/>
+        </w:rPr>
+        <w:t>TypeS</w:t>
+      </w:r>
+      <w:r>
+        <w:rPr>
+          <w:lang w:val="en-US"/>
+        </w:rPr>
+        <w:t>cript</w:t>
+      </w:r>
+      <w:proofErr w:type="spellEnd"/>
+      <w:r>
+        <w:rPr>
+          <w:lang w:val="en-US"/>
+        </w:rPr>
+        <w:t>, Vue</w:t>
+      </w:r>
+      <w:r>
+        <w:rPr>
+          <w:lang w:val="en-US"/>
+        </w:rPr>
+        <w:t>.js</w:t>
+      </w:r>
+    </w:p>
+    <w:p>
+      <w:pPr>
+        <w:ind w:left="720"/>
+        <w:rPr>
+          <w:lang w:val="en-US"/>
+        </w:rPr>
+      </w:pPr>
+      <w:r>
+        <w:rPr>
+          <w:b/>
+          <w:bCs/>
+          <w:lang w:val="en-US"/>
+        </w:rPr>
+        <w:t xml:space="preserve">Tools: </w:t>
+      </w:r>
+      <w:proofErr w:type="spellStart"/>
+      <w:r>
+        <w:rPr>
+          <w:lang w:val="en-US"/>
+        </w:rPr>
+        <w:t>ViTest</w:t>
+      </w:r>
+      <w:proofErr w:type="spellEnd"/>
+      <w:r>
+        <w:rPr>
+          <w:lang w:val="en-US"/>
+        </w:rPr>
+        <w:t xml:space="preserve">, Jasmin, Anthropic, </w:t>
+      </w:r>
+      <w:proofErr w:type="spellStart"/>
+      <w:r>
+        <w:rPr>
+          <w:lang w:val="en-US"/>
+        </w:rPr>
+        <w:t>Netlify</w:t>
+      </w:r>
+      <w:proofErr w:type="spellEnd"/>
+      <w:r>
+        <w:rPr>
+          <w:lang w:val="en-US"/>
+        </w:rPr>
+        <w:t xml:space="preserve">, </w:t>
+      </w:r>
+      <w:proofErr w:type="spellStart"/>
+      <w:r>
+        <w:rPr>
+          <w:lang w:val="en-US"/>
+        </w:rPr>
+        <w:t>Cloudflare</w:t>
+      </w:r>
+      <w:proofErr w:type="spellEnd"/>
+      <w:r>
+        <w:rPr>
+          <w:lang w:val="en-US"/>
+        </w:rPr>
+        <w:t>, Anthropic</w:t>
+      </w:r>
+      <w:r>
+        <w:rPr>
+          <w:lang w:val="en-US"/>
+        </w:rPr>
+        <w:t>, Tailwind CSS</w:t>
+      </w:r>
+    </w:p>
+    <w:p>
+      <w:pPr>
+        <w:rPr>
+          <w:lang w:val="en-US"/>
+        </w:rPr>
+      </w:pPr>
+    </w:p>
+    <w:p>
+      <w:pPr>
+        <w:spacing w:before="240" w:after="240"/>
+      </w:pPr>
+      <w:r>
+        <w:rPr>
+          <w:b/>
+        </w:rPr>
+        <w:t>Senior Quality Assurance Engineer</w:t>
+      </w:r>
+      <w:r>
+        <w:t xml:space="preserve"> </w:t>
+      </w:r>
+      <w:r>
+        <w:rPr>
+          <w:i/>
+        </w:rPr>
+        <w:t xml:space="preserve">Trimble / </w:t>
+      </w:r>
+      <w:proofErr w:type="spellStart"/>
+      <w:r>
+        <w:rPr>
+          <w:i/>
+        </w:rPr>
+        <w:t>SketchUp</w:t>
+      </w:r>
+      <w:proofErr w:type="spellEnd"/>
+      <w:r>
+        <w:rPr>
+          <w:i/>
+        </w:rPr>
+        <w:t>.</w:t>
+      </w:r>
+      <w:r>
+        <w:t xml:space="preserve"> </w:t>
+      </w:r>
+      <w:r>
         <w:t xml:space="preserve">I </w:t>
       </w:r>
       <w:r>
-        <w:t xml:space="preserve">Founded </w:t>
+        <w:t xml:space="preserve">Played a critical role in delivering high-quality software products for designers and architects worldwide. I was responsible for designing, developing, and executing comprehensive test plans, identifying defects, and collaborating with development teams. My expertise contributed to improving testing processes and ensuring the robustness of </w:t>
       </w:r>
       <w:proofErr w:type="spellStart"/>
       <w:r>
-        <w:t>GoldTending</w:t>
+        <w:t>SketchUp's</w:t>
       </w:r>
       <w:proofErr w:type="spellEnd"/>
       <w:r>
-        <w:t xml:space="preserve"> to develop a revolutionary platform for aspiring young entrepreneurs. </w:t>
-      </w:r>
-    </w:p>
-    <w:p>
-      <w:pPr>
-        <w:spacing w:before="240" w:after="240"/>
-        <w:rPr>
-          <w:lang w:val="en-US"/>
-        </w:rPr>
-      </w:pPr>
-      <w:r>
-        <w:rPr>
-          <w:b/>
-          <w:lang w:val="en-US"/>
-        </w:rPr>
-        <w:t>Advisory Board for the Strategic Artificial</w:t>
-      </w:r>
-      <w:r>
-        <w:rPr>
-          <w:b/>
-          <w:lang w:val="en-US"/>
-        </w:rPr>
+        <w:t xml:space="preserve"> 3D modeling API.</w:t>
+      </w:r>
+    </w:p>
+    <w:p>
+      <w:pPr>
+        <w:spacing w:before="240" w:after="240"/>
+        <w:ind w:left="720"/>
+        <w:rPr>
+          <w:lang w:val="en-US"/>
+        </w:rPr>
+      </w:pPr>
+      <w:r>
+        <w:rPr>
+          <w:b/>
+          <w:bCs/>
+          <w:lang w:val="en-US"/>
+        </w:rPr>
+        <w:t xml:space="preserve">Technologies: </w:t>
+      </w:r>
+      <w:r>
+        <w:rPr>
+          <w:lang w:val="en-US"/>
+        </w:rPr>
+        <w:t xml:space="preserve">Ruby, C++, </w:t>
+      </w:r>
+      <w:proofErr w:type="spellStart"/>
+      <w:r>
+        <w:rPr>
+          <w:lang w:val="en-US"/>
+        </w:rPr>
+        <w:t>Javascript</w:t>
+      </w:r>
+      <w:proofErr w:type="spellEnd"/>
+      <w:r>
+        <w:rPr>
+          <w:lang w:val="en-US"/>
+        </w:rPr>
+        <w:t>, Node.js</w:t>
+      </w:r>
+    </w:p>
+    <w:p>
+      <w:pPr>
+        <w:spacing w:before="240" w:after="240"/>
+        <w:ind w:left="720"/>
+        <w:rPr>
+          <w:lang w:val="en-US"/>
+        </w:rPr>
+      </w:pPr>
+      <w:r>
+        <w:rPr>
+          <w:b/>
+          <w:bCs/>
+          <w:lang w:val="en-US"/>
+        </w:rPr>
+        <w:t xml:space="preserve">Tools: </w:t>
+      </w:r>
+      <w:proofErr w:type="spellStart"/>
+      <w:r>
+        <w:rPr>
+          <w:lang w:val="en-US"/>
+        </w:rPr>
+        <w:t>Atlassian</w:t>
+      </w:r>
+      <w:proofErr w:type="spellEnd"/>
+      <w:r>
+        <w:rPr>
+          <w:lang w:val="en-US"/>
+        </w:rPr>
+        <w:t xml:space="preserve"> Suite, Visual Studio, </w:t>
+      </w:r>
+      <w:proofErr w:type="spellStart"/>
+      <w:r>
+        <w:rPr>
+          <w:lang w:val="en-US"/>
+        </w:rPr>
+        <w:t>RubyMine</w:t>
+      </w:r>
+      <w:proofErr w:type="spellEnd"/>
+      <w:r>
+        <w:rPr>
+          <w:lang w:val="en-US"/>
+        </w:rPr>
+        <w:t xml:space="preserve">, Cypress, Sauce Labs, Postman, </w:t>
+      </w:r>
+      <w:proofErr w:type="spellStart"/>
+      <w:r>
+        <w:rPr>
+          <w:lang w:val="en-US"/>
+        </w:rPr>
+        <w:t>Minitest</w:t>
+      </w:r>
+      <w:proofErr w:type="spellEnd"/>
+      <w:r>
+        <w:rPr>
+          <w:lang w:val="en-US"/>
+        </w:rPr>
+        <w:t xml:space="preserve">, </w:t>
+      </w:r>
+      <w:proofErr w:type="spellStart"/>
+      <w:r>
+        <w:rPr>
+          <w:lang w:val="en-US"/>
+        </w:rPr>
+        <w:t>Doxygen</w:t>
+      </w:r>
+      <w:proofErr w:type="spellEnd"/>
+    </w:p>
+    <w:p>
+      <w:pPr>
+        <w:spacing w:before="240" w:after="240"/>
+        <w:ind w:left="720"/>
+        <w:rPr>
+          <w:lang w:val="en-US"/>
+        </w:rPr>
+      </w:pPr>
+      <w:r>
+        <w:rPr>
+          <w:b/>
+          <w:bCs/>
+          <w:lang w:val="en-US"/>
+        </w:rPr>
+        <w:t>Additional Roles:</w:t>
+      </w:r>
+      <w:r>
+        <w:rPr>
+          <w:lang w:val="en-US"/>
+        </w:rPr>
+        <w:t xml:space="preserve"> Agile Scrum Master, Team Lead</w:t>
+      </w:r>
+    </w:p>
+    <w:p>
+      <w:pPr>
+        <w:spacing w:before="240" w:after="240"/>
+      </w:pPr>
+    </w:p>
+    <w:p>
+      <w:pPr>
+        <w:spacing w:before="240" w:after="240"/>
+      </w:pPr>
+      <w:r>
+        <w:rPr>
+          <w:b/>
+        </w:rPr>
+        <w:t xml:space="preserve">Senior </w:t>
+      </w:r>
+      <w:r>
+        <w:rPr>
+          <w:b/>
+        </w:rPr>
+        <w:t>Engineer</w:t>
+      </w:r>
+      <w:r>
         <w:t xml:space="preserve"> </w:t>
       </w:r>
-      <w:r>
-        <w:rPr>
-          <w:b/>
-          <w:lang w:val="en-US"/>
-        </w:rPr>
-        <w:t>Intelligence Program at the University of Colorado</w:t>
-      </w:r>
-      <w:r>
-        <w:rPr>
-          <w:b/>
-          <w:lang w:val="en-US"/>
-        </w:rPr>
-        <w:t>,</w:t>
-      </w:r>
-      <w:r>
-        <w:rPr>
-          <w:b/>
-          <w:lang w:val="en-US"/>
-        </w:rPr>
-        <w:t xml:space="preserve"> Colorado Springs</w:t>
-      </w:r>
-      <w:r>
-        <w:rPr>
-          <w:b/>
-          <w:lang w:val="en-US"/>
-        </w:rPr>
+      <w:proofErr w:type="spellStart"/>
+      <w:r>
+        <w:rPr>
+          <w:i/>
+        </w:rPr>
+        <w:t>ClickBank</w:t>
+      </w:r>
+      <w:proofErr w:type="spellEnd"/>
+      <w:r>
+        <w:rPr>
+          <w:i/>
+        </w:rPr>
+        <w:t>.</w:t>
+      </w:r>
+      <w:r>
+        <w:t xml:space="preserve"> As a key member of the</w:t>
+      </w:r>
+      <w:r>
+        <w:t xml:space="preserve"> team, I was instrumental in automating and streamlining the software development lifecycle. I designed and implemented CI/CD pipelines, managed cloud infrastructure, and ensured the reliability and scalability of our affiliate marketing platform, enabling rapid and dependable software delivery.</w:t>
+      </w:r>
+    </w:p>
+    <w:p>
+      <w:pPr>
+        <w:spacing w:before="240" w:after="240"/>
+        <w:ind w:left="720"/>
+        <w:rPr>
+          <w:lang w:val="en-US"/>
+        </w:rPr>
+      </w:pPr>
+      <w:r>
+        <w:rPr>
+          <w:b/>
+          <w:bCs/>
+          <w:lang w:val="en-US"/>
+        </w:rPr>
+        <w:t xml:space="preserve">Technologies: </w:t>
+      </w:r>
+      <w:r>
+        <w:rPr>
+          <w:lang w:val="en-US"/>
+        </w:rPr>
+        <w:t xml:space="preserve">Ruby, Cucumber, </w:t>
+      </w:r>
+      <w:proofErr w:type="spellStart"/>
+      <w:r>
+        <w:rPr>
+          <w:lang w:val="en-US"/>
+        </w:rPr>
+        <w:t>Nutch</w:t>
+      </w:r>
+      <w:proofErr w:type="spellEnd"/>
+      <w:r>
+        <w:rPr>
+          <w:lang w:val="en-US"/>
+        </w:rPr>
+        <w:t xml:space="preserve">, Apache Tomcat, AWS, </w:t>
+      </w:r>
+      <w:proofErr w:type="spellStart"/>
+      <w:r>
+        <w:rPr>
+          <w:lang w:val="en-US"/>
+        </w:rPr>
+        <w:t>Liquibase</w:t>
+      </w:r>
+      <w:proofErr w:type="spellEnd"/>
+      <w:r>
+        <w:rPr>
+          <w:lang w:val="en-US"/>
+        </w:rPr>
+        <w:t xml:space="preserve">, Docker, </w:t>
+      </w:r>
+      <w:proofErr w:type="spellStart"/>
+      <w:r>
+        <w:rPr>
+          <w:lang w:val="en-US"/>
+        </w:rPr>
+        <w:t>Doxygen</w:t>
+      </w:r>
+      <w:proofErr w:type="spellEnd"/>
+      <w:r>
+        <w:rPr>
+          <w:lang w:val="en-US"/>
+        </w:rPr>
+        <w:t>, Zeus/Azul</w:t>
+      </w:r>
+    </w:p>
+    <w:p>
+      <w:pPr>
+        <w:spacing w:before="240" w:after="240"/>
+        <w:ind w:left="720"/>
+        <w:rPr>
+          <w:lang w:val="en-US"/>
+        </w:rPr>
+      </w:pPr>
+      <w:r>
+        <w:rPr>
+          <w:b/>
+          <w:bCs/>
+          <w:lang w:val="en-US"/>
+        </w:rPr>
+        <w:t xml:space="preserve">Tools: </w:t>
+      </w:r>
+      <w:proofErr w:type="spellStart"/>
+      <w:r>
+        <w:rPr>
+          <w:lang w:val="en-US"/>
+        </w:rPr>
+        <w:t>Atlassian</w:t>
+      </w:r>
+      <w:proofErr w:type="spellEnd"/>
+      <w:r>
+        <w:rPr>
+          <w:lang w:val="en-US"/>
+        </w:rPr>
+        <w:t xml:space="preserve"> Suite, </w:t>
+      </w:r>
+      <w:proofErr w:type="spellStart"/>
+      <w:r>
+        <w:rPr>
+          <w:lang w:val="en-US"/>
+        </w:rPr>
+        <w:t>InjelliJ</w:t>
+      </w:r>
+      <w:proofErr w:type="spellEnd"/>
+      <w:r>
+        <w:rPr>
+          <w:lang w:val="en-US"/>
+        </w:rPr>
+        <w:t xml:space="preserve">, </w:t>
+      </w:r>
+      <w:proofErr w:type="spellStart"/>
+      <w:r>
+        <w:rPr>
+          <w:lang w:val="en-US"/>
+        </w:rPr>
+        <w:t>NetNeans</w:t>
+      </w:r>
+      <w:proofErr w:type="spellEnd"/>
+      <w:r>
+        <w:rPr>
+          <w:lang w:val="en-US"/>
+        </w:rPr>
+        <w:t xml:space="preserve">, Cypress, Sauce Labs, Swagger, Postman </w:t>
+      </w:r>
+    </w:p>
+    <w:p>
+      <w:pPr>
+        <w:spacing w:before="240" w:after="240"/>
+        <w:ind w:left="720"/>
+        <w:rPr>
+          <w:lang w:val="en-US"/>
+        </w:rPr>
+      </w:pPr>
+      <w:r>
+        <w:rPr>
+          <w:b/>
+          <w:bCs/>
+          <w:lang w:val="en-US"/>
+        </w:rPr>
+        <w:t>Additional Roles:</w:t>
+      </w:r>
+      <w:r>
+        <w:rPr>
+          <w:lang w:val="en-US"/>
+        </w:rPr>
+        <w:t xml:space="preserve"> Agile Scrum Master, Team Lead, </w:t>
+      </w:r>
+      <w:proofErr w:type="spellStart"/>
+      <w:r>
+        <w:rPr>
+          <w:lang w:val="en-US"/>
+        </w:rPr>
+        <w:t>Buildmeister</w:t>
+      </w:r>
+      <w:proofErr w:type="spellEnd"/>
+    </w:p>
+    <w:p>
+      <w:pPr>
+        <w:spacing w:before="240" w:after="240"/>
+      </w:pPr>
+    </w:p>
+    <w:p>
+      <w:pPr>
+        <w:spacing w:before="240" w:after="240"/>
+      </w:pPr>
+      <w:r>
+        <w:rPr>
+          <w:b/>
+        </w:rPr>
+        <w:t>Co-Founder &amp; Director of IT</w:t>
+      </w:r>
+      <w:r>
         <w:t xml:space="preserve"> </w:t>
       </w:r>
+      <w:proofErr w:type="spellStart"/>
       <w:r>
         <w:rPr>
           <w:i/>
         </w:rPr>
-        <w:t>UCCS</w:t>
-      </w:r>
+        <w:t>Rebit</w:t>
+      </w:r>
+      <w:proofErr w:type="spellEnd"/>
       <w:r>
         <w:rPr>
           <w:i/>
         </w:rPr>
+        <w:t xml:space="preserve"> Inc.</w:t>
+      </w:r>
+      <w:r>
+        <w:t xml:space="preserve"> </w:t>
+      </w:r>
+      <w:r>
+        <w:t xml:space="preserve">I </w:t>
+      </w:r>
+      <w:r>
+        <w:t xml:space="preserve">Co-founded </w:t>
+      </w:r>
+      <w:proofErr w:type="spellStart"/>
+      <w:r>
+        <w:t>Rebit</w:t>
+      </w:r>
+      <w:proofErr w:type="spellEnd"/>
+      <w:r>
+        <w:t xml:space="preserve"> and was part the engineering team that created a groundbreaking, simple, and automatic backup solution for consumers. We developed a "ridiculously simple" backup appliance that required no user intervention, fundamentally changing the landscape of personal data protection.</w:t>
+      </w:r>
+    </w:p>
+    <w:p>
+      <w:pPr>
+        <w:spacing w:before="240" w:after="240"/>
+        <w:ind w:left="720"/>
+        <w:rPr>
+          <w:lang w:val="en-US"/>
+        </w:rPr>
+      </w:pPr>
+      <w:r>
+        <w:rPr>
+          <w:b/>
+          <w:bCs/>
+          <w:lang w:val="en-US"/>
+        </w:rPr>
+        <w:t xml:space="preserve">Technologies: </w:t>
+      </w:r>
+      <w:r>
+        <w:rPr>
+          <w:lang w:val="en-US"/>
+        </w:rPr>
+        <w:t>Ruby, Cucumber, C++, Delphi, PostgreSQL, Access, Oracle, MSSQL, Oracle Business 1</w:t>
+      </w:r>
+    </w:p>
+    <w:p>
+      <w:pPr>
+        <w:spacing w:before="240" w:after="240"/>
+        <w:ind w:left="720"/>
+        <w:rPr>
+          <w:lang w:val="en-US"/>
+        </w:rPr>
+      </w:pPr>
+      <w:r>
+        <w:rPr>
+          <w:b/>
+          <w:bCs/>
+          <w:lang w:val="en-US"/>
+        </w:rPr>
+        <w:t xml:space="preserve">Tools: </w:t>
+      </w:r>
+      <w:proofErr w:type="spellStart"/>
+      <w:r>
+        <w:rPr>
+          <w:lang w:val="en-US"/>
+        </w:rPr>
+        <w:t>Atlassian</w:t>
+      </w:r>
+      <w:proofErr w:type="spellEnd"/>
+      <w:r>
+        <w:rPr>
+          <w:lang w:val="en-US"/>
+        </w:rPr>
+        <w:t xml:space="preserve"> Suite, Cypress, Sauce Labs, Postman, Agile Scrum Master, </w:t>
+      </w:r>
+      <w:proofErr w:type="spellStart"/>
+      <w:r>
+        <w:rPr>
+          <w:lang w:val="en-US"/>
+        </w:rPr>
+        <w:t>MercurialHG</w:t>
+      </w:r>
+      <w:proofErr w:type="spellEnd"/>
+      <w:r>
+        <w:rPr>
+          <w:lang w:val="en-US"/>
+        </w:rPr>
+        <w:t xml:space="preserve"> </w:t>
+      </w:r>
+    </w:p>
+    <w:p>
+      <w:pPr>
+        <w:spacing w:before="240" w:after="240"/>
+        <w:ind w:left="720"/>
+        <w:rPr>
+          <w:lang w:val="en-US"/>
+        </w:rPr>
+      </w:pPr>
+      <w:r>
+        <w:rPr>
+          <w:b/>
+          <w:bCs/>
+          <w:lang w:val="en-US"/>
+        </w:rPr>
+        <w:t>Additional Roles:</w:t>
+      </w:r>
+      <w:r>
+        <w:rPr>
+          <w:lang w:val="en-US"/>
+        </w:rPr>
+        <w:t xml:space="preserve"> Agile Scrum Master, Team Lead, Software Configuration Manager</w:t>
+      </w:r>
+    </w:p>
+    <w:p>
+      <w:pPr>
+        <w:spacing w:before="240" w:after="240"/>
+        <w:ind w:left="720"/>
+        <w:rPr>
+          <w:lang w:val="en-US"/>
+        </w:rPr>
+      </w:pPr>
+      <w:r>
+        <w:rPr>
+          <w:b/>
+          <w:bCs/>
+          <w:lang w:val="en-US"/>
+        </w:rPr>
+        <w:t xml:space="preserve">Exit: </w:t>
+      </w:r>
+      <w:proofErr w:type="spellStart"/>
+      <w:r>
+        <w:rPr>
+          <w:lang w:val="en-US"/>
+        </w:rPr>
+        <w:t>Rebit</w:t>
+      </w:r>
+      <w:proofErr w:type="spellEnd"/>
+      <w:r>
+        <w:rPr>
+          <w:lang w:val="en-US"/>
+        </w:rPr>
+        <w:t xml:space="preserve"> acquired </w:t>
+      </w:r>
+      <w:r>
+        <w:rPr>
+          <w:lang w:val="en-US"/>
+        </w:rPr>
+        <w:t xml:space="preserve">by </w:t>
+      </w:r>
+      <w:proofErr w:type="spellStart"/>
+      <w:r>
+        <w:rPr>
+          <w:lang w:val="en-US"/>
+        </w:rPr>
+        <w:t>Betsol</w:t>
+      </w:r>
+      <w:proofErr w:type="spellEnd"/>
+      <w:r>
+        <w:rPr>
+          <w:lang w:val="en-US"/>
+        </w:rPr>
+        <w:t>/S</w:t>
+      </w:r>
+      <w:r>
+        <w:rPr>
+          <w:lang w:val="en-US"/>
+        </w:rPr>
+        <w:t xml:space="preserve">ony </w:t>
+      </w:r>
+      <w:r>
+        <w:rPr>
+          <w:lang w:val="en-US"/>
+        </w:rPr>
+        <w:t xml:space="preserve">for </w:t>
+      </w:r>
+      <w:r>
+        <w:rPr>
+          <w:lang w:val="en-US"/>
+        </w:rPr>
+        <w:t>25 Million</w:t>
+      </w:r>
+    </w:p>
+    <w:p>
+      <w:pPr>
+        <w:spacing w:before="240" w:after="240"/>
+      </w:pPr>
+    </w:p>
+    <w:p>
+      <w:pPr>
+        <w:spacing w:before="240" w:after="240"/>
+      </w:pPr>
+      <w:r>
+        <w:rPr>
+          <w:b/>
+        </w:rPr>
+        <w:t>Co-Founder &amp; Director of Quality</w:t>
+      </w:r>
+      <w:r>
+        <w:t xml:space="preserve"> </w:t>
+      </w:r>
+      <w:r>
+        <w:rPr>
+          <w:i/>
+        </w:rPr>
+        <w:t>Benchmark Tape Systems</w:t>
+      </w:r>
+      <w:r>
+        <w:rPr>
+          <w:i/>
+        </w:rPr>
         <w:t>.</w:t>
       </w:r>
       <w:r>
         <w:t xml:space="preserve"> </w:t>
       </w:r>
       <w:r>
-        <w:rPr>
-          <w:lang w:val="en-US"/>
-        </w:rPr>
-        <w:t>Board members make a number of contributions to the program, including</w:t>
-      </w:r>
-      <w:r>
-        <w:rPr>
-          <w:lang w:val="en-US"/>
-        </w:rPr>
-        <w:t>:</w:t>
-      </w:r>
-    </w:p>
-    <w:p>
-      <w:pPr>
-        <w:rPr>
-          <w:lang w:val="en-US"/>
-        </w:rPr>
-      </w:pPr>
-      <w:r>
-        <w:rPr>
-          <w:lang w:val="en-US"/>
-        </w:rPr>
-        <w:t>Preserving and enhancing the reputation and quality of the program through strategic review of our credit and noncredit offerings to the community, as well as helping to build our value to the business community.</w:t>
-      </w:r>
-    </w:p>
-    <w:p>
-      <w:pPr>
-        <w:spacing w:before="240" w:after="240"/>
-      </w:pPr>
-      <w:r>
-        <w:rPr>
-          <w:b/>
-        </w:rPr>
-        <w:t>Senior Quality Assurance Engineer</w:t>
-      </w:r>
-      <w:r>
-        <w:t xml:space="preserve"> </w:t>
-      </w:r>
-      <w:r>
-        <w:rPr>
-          <w:i/>
-        </w:rPr>
-        <w:t xml:space="preserve">Trimble / </w:t>
+        <w:t xml:space="preserve">I </w:t>
+      </w:r>
+      <w:r>
+        <w:t>Co-founded the company and spearheaded the engineering efforts to develop</w:t>
+      </w:r>
+      <w:r>
+        <w:t xml:space="preserve"> and validate</w:t>
+      </w:r>
+      <w:r>
+        <w:t xml:space="preserve"> the DLT1 tape drive, a high-capacity data storage solution. My participation was crucial in taking the product from concept to market, establishing a new standard for reliable and efficient data backup for businesses.</w:t>
+      </w:r>
+    </w:p>
+    <w:p>
+      <w:pPr>
+        <w:spacing w:before="240" w:after="240"/>
+        <w:ind w:left="720"/>
+        <w:rPr>
+          <w:lang w:val="en-US"/>
+        </w:rPr>
+      </w:pPr>
+      <w:r>
+        <w:rPr>
+          <w:b/>
+          <w:bCs/>
+          <w:lang w:val="en-US"/>
+        </w:rPr>
+        <w:t xml:space="preserve">Technologies: </w:t>
+      </w:r>
+      <w:r>
+        <w:rPr>
+          <w:lang w:val="en-US"/>
+        </w:rPr>
+        <w:t xml:space="preserve">MS Server, MSSQL, PostgreSQL, OBDR, Unix, </w:t>
       </w:r>
       <w:proofErr w:type="spellStart"/>
       <w:r>
         <w:rPr>
-          <w:i/>
-        </w:rPr>
-        <w:t>SketchUp</w:t>
+          <w:lang w:val="en-US"/>
+        </w:rPr>
+        <w:t>Linux</w:t>
+      </w:r>
+      <w:proofErr w:type="gramStart"/>
+      <w:r>
+        <w:rPr>
+          <w:lang w:val="en-US"/>
+        </w:rPr>
+        <w:t>,C</w:t>
       </w:r>
       <w:proofErr w:type="spellEnd"/>
-      <w:r>
-        <w:rPr>
-          <w:i/>
-        </w:rPr>
-        <w:t>.</w:t>
-      </w:r>
-      <w:r>
-        <w:t xml:space="preserve"> </w:t>
-      </w:r>
-      <w:r>
-        <w:t xml:space="preserve">I </w:t>
-      </w:r>
-      <w:r>
-        <w:t xml:space="preserve">Played a critical role in delivering high-quality software products for designers and architects worldwide. I was responsible for designing, developing, and executing comprehensive test plans, identifying defects, and collaborating with development teams. My expertise contributed to improving testing processes and ensuring the robustness of </w:t>
+      <w:proofErr w:type="gramEnd"/>
+      <w:r>
+        <w:rPr>
+          <w:lang w:val="en-US"/>
+        </w:rPr>
+        <w:t>++, .Net</w:t>
+      </w:r>
+    </w:p>
+    <w:p>
+      <w:pPr>
+        <w:spacing w:before="240" w:after="240"/>
+        <w:ind w:left="720"/>
+        <w:rPr>
+          <w:lang w:val="en-US"/>
+        </w:rPr>
+      </w:pPr>
+      <w:r>
+        <w:rPr>
+          <w:b/>
+          <w:bCs/>
+          <w:lang w:val="en-US"/>
+        </w:rPr>
+        <w:t xml:space="preserve">Tools: </w:t>
       </w:r>
       <w:proofErr w:type="spellStart"/>
       <w:r>
-        <w:t>SketchUp's</w:t>
+        <w:rPr>
+          <w:lang w:val="en-US"/>
+        </w:rPr>
+        <w:t>TrackStar</w:t>
       </w:r>
       <w:proofErr w:type="spellEnd"/>
       <w:r>
-        <w:t xml:space="preserve"> 3D modeling API.</w:t>
-      </w:r>
-    </w:p>
-    <w:p>
-      <w:pPr>
-        <w:spacing w:before="240" w:after="240"/>
-      </w:pPr>
-      <w:r>
-        <w:rPr>
-          <w:b/>
-        </w:rPr>
-        <w:t xml:space="preserve">Senior </w:t>
-      </w:r>
-      <w:r>
-        <w:rPr>
-          <w:b/>
-        </w:rPr>
-        <w:t>Engineer</w:t>
-      </w:r>
-      <w:r>
-        <w:t xml:space="preserve"> </w:t>
+        <w:rPr>
+          <w:lang w:val="en-US"/>
+        </w:rPr>
+        <w:t xml:space="preserve">, Visual Studio, Windows Hardware Lab Kit (HLK), </w:t>
       </w:r>
       <w:proofErr w:type="spellStart"/>
       <w:r>
         <w:rPr>
-          <w:i/>
-        </w:rPr>
-        <w:t>ClickBank</w:t>
+          <w:lang w:val="en-US"/>
+        </w:rPr>
+        <w:t>SignTool</w:t>
       </w:r>
       <w:proofErr w:type="spellEnd"/>
       <w:r>
         <w:rPr>
-          <w:i/>
-        </w:rPr>
-        <w:t>.</w:t>
-      </w:r>
-      <w:r>
-        <w:t xml:space="preserve"> As a key member of the</w:t>
-      </w:r>
-      <w:r>
-        <w:t xml:space="preserve"> team, I was instrumental in automating and streamlining the software development lifecycle. I designed and implemented CI/CD pipelines, managed cloud infrastructure, and ensured the reliability and scalability of our affiliate marketing platform, enabling rapid and dependable software delivery.</w:t>
-      </w:r>
-    </w:p>
-    <w:p>
-      <w:pPr>
-        <w:spacing w:before="240" w:after="240"/>
-      </w:pPr>
-      <w:r>
-        <w:rPr>
-          <w:b/>
-        </w:rPr>
-        <w:t>Co-Founder &amp; Director of IT</w:t>
-      </w:r>
-      <w:r>
-        <w:t xml:space="preserve"> </w:t>
-      </w:r>
-      <w:proofErr w:type="spellStart"/>
-      <w:r>
-        <w:rPr>
-          <w:i/>
-        </w:rPr>
-        <w:t>Rebit</w:t>
-      </w:r>
-      <w:proofErr w:type="spellEnd"/>
-      <w:r>
-        <w:rPr>
-          <w:i/>
-        </w:rPr>
-        <w:t xml:space="preserve"> Inc.</w:t>
-      </w:r>
-      <w:r>
-        <w:t xml:space="preserve"> </w:t>
-      </w:r>
-      <w:r>
-        <w:t xml:space="preserve">I </w:t>
-      </w:r>
-      <w:r>
-        <w:t xml:space="preserve">Co-founded </w:t>
-      </w:r>
-      <w:proofErr w:type="spellStart"/>
-      <w:r>
-        <w:t>Rebit</w:t>
-      </w:r>
-      <w:proofErr w:type="spellEnd"/>
-      <w:r>
-        <w:t xml:space="preserve"> and was part the engineering team that created a groundbreaking, simple, and automatic backup solution for consumers. We developed a "ridiculously simple" backup appliance that required no user intervention, fundamentally changing the landscape of personal data protection.</w:t>
-      </w:r>
-    </w:p>
-    <w:p>
-      <w:pPr>
-        <w:spacing w:before="240" w:after="240"/>
-      </w:pPr>
-      <w:r>
-        <w:rPr>
-          <w:b/>
-        </w:rPr>
-        <w:t>Co-Founder &amp; Director of Quality</w:t>
-      </w:r>
-      <w:r>
-        <w:t xml:space="preserve"> </w:t>
-      </w:r>
-      <w:r>
-        <w:rPr>
-          <w:i/>
-        </w:rPr>
-        <w:t>Benchmark Tape Systems</w:t>
-      </w:r>
-      <w:r>
-        <w:rPr>
-          <w:i/>
-        </w:rPr>
-        <w:t>.</w:t>
-      </w:r>
-      <w:r>
-        <w:t xml:space="preserve"> </w:t>
-      </w:r>
-      <w:r>
-        <w:t xml:space="preserve">I </w:t>
-      </w:r>
-      <w:r>
-        <w:t>Co-founded the company and spearheaded the engineering efforts to develop</w:t>
-      </w:r>
-      <w:r>
-        <w:t xml:space="preserve"> and validate</w:t>
-      </w:r>
-      <w:r>
-        <w:t xml:space="preserve"> the DLT1 tape drive, a high-capacity data storage solution. My participation was crucial in taking the product from concept to market, establishing a new standard for reliable and efficient data backup for businesses.</w:t>
-      </w:r>
+          <w:lang w:val="en-US"/>
+        </w:rPr>
+        <w:t>, WHQL (Windows Hardware Quality Labs)</w:t>
+      </w:r>
+    </w:p>
+    <w:p>
+      <w:pPr>
+        <w:spacing w:before="240" w:after="240"/>
+        <w:ind w:left="720"/>
+        <w:rPr>
+          <w:lang w:val="en-US"/>
+        </w:rPr>
+      </w:pPr>
+      <w:r>
+        <w:rPr>
+          <w:b/>
+          <w:bCs/>
+          <w:lang w:val="en-US"/>
+        </w:rPr>
+        <w:t>Additional Roles:</w:t>
+      </w:r>
+      <w:r>
+        <w:rPr>
+          <w:lang w:val="en-US"/>
+        </w:rPr>
+        <w:t xml:space="preserve"> Agile Scrum Master, Director IT, Software Configuration Manager</w:t>
+      </w:r>
+    </w:p>
+    <w:p>
+      <w:pPr>
+        <w:spacing w:before="240" w:after="240"/>
+        <w:ind w:left="720"/>
+        <w:rPr>
+          <w:lang w:val="en-US"/>
+        </w:rPr>
+      </w:pPr>
+      <w:r>
+        <w:rPr>
+          <w:b/>
+          <w:bCs/>
+          <w:lang w:val="en-US"/>
+        </w:rPr>
+        <w:t xml:space="preserve">Exit: </w:t>
+      </w:r>
+      <w:r>
+        <w:rPr>
+          <w:lang w:val="en-US"/>
+        </w:rPr>
+        <w:t>Quantum acquired Benchmark in 2002 for $56 million.</w:t>
+      </w:r>
+    </w:p>
+    <w:p>
+      <w:pPr>
+        <w:spacing w:before="240" w:after="240"/>
+      </w:pPr>
     </w:p>
     <w:p>
       <w:pPr>
@@ -528,6 +1346,216 @@
     <w:p>
       <w:pPr>
         <w:spacing w:before="240" w:after="240"/>
+        <w:ind w:left="720"/>
+        <w:rPr>
+          <w:lang w:val="en-US"/>
+        </w:rPr>
+      </w:pPr>
+      <w:r>
+        <w:rPr>
+          <w:b/>
+          <w:bCs/>
+          <w:lang w:val="en-US"/>
+        </w:rPr>
+        <w:t>Technologies:</w:t>
+      </w:r>
+      <w:r>
+        <w:rPr>
+          <w:lang w:val="en-US"/>
+        </w:rPr>
+        <w:t xml:space="preserve"> MS Server, MSSQL, OBDR (One Button Disaster Recovery), </w:t>
+      </w:r>
+      <w:proofErr w:type="gramStart"/>
+      <w:r>
+        <w:rPr>
+          <w:lang w:val="en-US"/>
+        </w:rPr>
+        <w:t>Unix</w:t>
+      </w:r>
+      <w:proofErr w:type="gramEnd"/>
+      <w:r>
+        <w:rPr>
+          <w:lang w:val="en-US"/>
+        </w:rPr>
+        <w:t>, C++, .Net</w:t>
+      </w:r>
+    </w:p>
+    <w:p>
+      <w:pPr>
+        <w:spacing w:before="240" w:after="240"/>
+        <w:ind w:left="720"/>
+        <w:rPr>
+          <w:lang w:val="en-US"/>
+        </w:rPr>
+      </w:pPr>
+      <w:r>
+        <w:rPr>
+          <w:b/>
+          <w:bCs/>
+          <w:lang w:val="en-US"/>
+        </w:rPr>
+        <w:t>Tools:</w:t>
+      </w:r>
+      <w:r>
+        <w:rPr>
+          <w:lang w:val="en-US"/>
+        </w:rPr>
+        <w:t xml:space="preserve"> </w:t>
+      </w:r>
+      <w:proofErr w:type="spellStart"/>
+      <w:r>
+        <w:rPr>
+          <w:lang w:val="en-US"/>
+        </w:rPr>
+        <w:t>TrackStar</w:t>
+      </w:r>
+      <w:proofErr w:type="spellEnd"/>
+      <w:r>
+        <w:rPr>
+          <w:lang w:val="en-US"/>
+        </w:rPr>
+        <w:t xml:space="preserve">, Visual Studio, Windows Hardware Lab Kit (HLK), </w:t>
+      </w:r>
+      <w:proofErr w:type="spellStart"/>
+      <w:r>
+        <w:rPr>
+          <w:lang w:val="en-US"/>
+        </w:rPr>
+        <w:t>SignTool</w:t>
+      </w:r>
+      <w:proofErr w:type="spellEnd"/>
+      <w:r>
+        <w:rPr>
+          <w:lang w:val="en-US"/>
+        </w:rPr>
+        <w:t>, WHQL (Windows Hardware Quality Labs)</w:t>
+      </w:r>
+    </w:p>
+    <w:p>
+      <w:pPr>
+        <w:spacing w:before="240" w:after="240"/>
+        <w:ind w:left="720"/>
+        <w:rPr>
+          <w:lang w:val="en-US"/>
+        </w:rPr>
+      </w:pPr>
+      <w:r>
+        <w:rPr>
+          <w:b/>
+          <w:bCs/>
+          <w:lang w:val="en-US"/>
+        </w:rPr>
+        <w:t xml:space="preserve">Additional </w:t>
+      </w:r>
+      <w:proofErr w:type="spellStart"/>
+      <w:r>
+        <w:rPr>
+          <w:b/>
+          <w:bCs/>
+          <w:lang w:val="en-US"/>
+        </w:rPr>
+        <w:t>Roles</w:t>
+      </w:r>
+      <w:proofErr w:type="gramStart"/>
+      <w:r>
+        <w:rPr>
+          <w:b/>
+          <w:bCs/>
+          <w:lang w:val="en-US"/>
+        </w:rPr>
+        <w:t>:</w:t>
+      </w:r>
+      <w:r>
+        <w:rPr>
+          <w:lang w:val="en-US"/>
+        </w:rPr>
+        <w:t>Team</w:t>
+      </w:r>
+      <w:proofErr w:type="spellEnd"/>
+      <w:proofErr w:type="gramEnd"/>
+      <w:r>
+        <w:rPr>
+          <w:lang w:val="en-US"/>
+        </w:rPr>
+        <w:t xml:space="preserve"> Lead, Software Configuration Manager, </w:t>
+      </w:r>
+      <w:proofErr w:type="spellStart"/>
+      <w:r>
+        <w:rPr>
+          <w:lang w:val="en-US"/>
+        </w:rPr>
+        <w:t>Buildmeister</w:t>
+      </w:r>
+      <w:proofErr w:type="spellEnd"/>
+    </w:p>
+    <w:p>
+      <w:pPr>
+        <w:spacing w:before="240" w:after="240"/>
+        <w:ind w:left="720"/>
+        <w:rPr>
+          <w:lang w:val="en-US"/>
+        </w:rPr>
+      </w:pPr>
+      <w:r>
+        <w:rPr>
+          <w:b/>
+          <w:bCs/>
+          <w:lang w:val="en-US"/>
+        </w:rPr>
+        <w:t xml:space="preserve">Award: </w:t>
+      </w:r>
+      <w:r>
+        <w:rPr>
+          <w:lang w:val="en-US"/>
+        </w:rPr>
+        <w:t>Patent Number 5,960,460 for Non-Intrusive Replication of Hard Disk – a disaster recovery / data replication computer program</w:t>
+      </w:r>
+    </w:p>
+    <w:p>
+      <w:pPr>
+        <w:spacing w:before="240" w:after="240"/>
+        <w:ind w:left="720"/>
+        <w:rPr>
+          <w:lang w:val="en-US"/>
+        </w:rPr>
+      </w:pPr>
+      <w:r>
+        <w:rPr>
+          <w:b/>
+          <w:bCs/>
+          <w:lang w:val="en-US"/>
+        </w:rPr>
+        <w:t>Exit:</w:t>
+      </w:r>
+      <w:r>
+        <w:rPr>
+          <w:lang w:val="en-US"/>
+        </w:rPr>
+        <w:t xml:space="preserve"> </w:t>
+      </w:r>
+      <w:proofErr w:type="spellStart"/>
+      <w:r>
+        <w:rPr>
+          <w:lang w:val="en-US"/>
+        </w:rPr>
+        <w:t>Datasonix</w:t>
+      </w:r>
+      <w:proofErr w:type="spellEnd"/>
+      <w:r>
+        <w:rPr>
+          <w:lang w:val="en-US"/>
+        </w:rPr>
+        <w:t xml:space="preserve"> was acquired by Exabyte for $20 million.</w:t>
+      </w:r>
+    </w:p>
+    <w:p>
+      <w:pPr>
+        <w:spacing w:before="240" w:after="240"/>
+      </w:pPr>
+    </w:p>
+    <w:p>
+      <w:pPr>
+        <w:spacing w:before="240" w:after="240"/>
       </w:pPr>
       <w:r>
         <w:rPr>
@@ -577,6 +1605,209 @@
     <w:p>
       <w:pPr>
         <w:spacing w:before="240" w:after="240"/>
+        <w:ind w:left="720"/>
+        <w:rPr>
+          <w:lang w:val="en-US"/>
+        </w:rPr>
+      </w:pPr>
+      <w:r>
+        <w:rPr>
+          <w:b/>
+          <w:bCs/>
+          <w:lang w:val="en-US"/>
+        </w:rPr>
+        <w:t>Technologies:</w:t>
+      </w:r>
+      <w:r>
+        <w:rPr>
+          <w:lang w:val="en-US"/>
+        </w:rPr>
+        <w:t xml:space="preserve"> MS Server, MSSQL, LSTC2VM, </w:t>
+      </w:r>
+      <w:proofErr w:type="spellStart"/>
+      <w:r>
+        <w:rPr>
+          <w:lang w:val="en-US"/>
+        </w:rPr>
+        <w:t>HPu</w:t>
+      </w:r>
+      <w:proofErr w:type="spellEnd"/>
+      <w:r>
+        <w:rPr>
+          <w:lang w:val="en-US"/>
+        </w:rPr>
+        <w:t xml:space="preserve">, </w:t>
+      </w:r>
+      <w:proofErr w:type="gramStart"/>
+      <w:r>
+        <w:rPr>
+          <w:lang w:val="en-US"/>
+        </w:rPr>
+        <w:t>Unix</w:t>
+      </w:r>
+      <w:proofErr w:type="gramEnd"/>
+      <w:r>
+        <w:rPr>
+          <w:lang w:val="en-US"/>
+        </w:rPr>
+        <w:t xml:space="preserve">, Linux C++, .Net </w:t>
+      </w:r>
+    </w:p>
+    <w:p>
+      <w:pPr>
+        <w:spacing w:before="240" w:after="240"/>
+        <w:ind w:left="720"/>
+        <w:rPr>
+          <w:lang w:val="en-US"/>
+        </w:rPr>
+      </w:pPr>
+      <w:r>
+        <w:rPr>
+          <w:b/>
+          <w:bCs/>
+          <w:lang w:val="en-US"/>
+        </w:rPr>
+        <w:t xml:space="preserve">Tools: </w:t>
+      </w:r>
+      <w:proofErr w:type="spellStart"/>
+      <w:r>
+        <w:rPr>
+          <w:lang w:val="en-US"/>
+        </w:rPr>
+        <w:t>TrackStar</w:t>
+      </w:r>
+      <w:proofErr w:type="spellEnd"/>
+      <w:r>
+        <w:rPr>
+          <w:lang w:val="en-US"/>
+        </w:rPr>
+        <w:t xml:space="preserve">, Visual Studio, Windows Hardware Lab Kit (HLK), </w:t>
+      </w:r>
+      <w:proofErr w:type="spellStart"/>
+      <w:r>
+        <w:rPr>
+          <w:lang w:val="en-US"/>
+        </w:rPr>
+        <w:t>SignTool</w:t>
+      </w:r>
+      <w:proofErr w:type="spellEnd"/>
+      <w:r>
+        <w:rPr>
+          <w:lang w:val="en-US"/>
+        </w:rPr>
+        <w:t>, WHQL (Windows Hardware Quality Labs)</w:t>
+      </w:r>
+    </w:p>
+    <w:p>
+      <w:pPr>
+        <w:spacing w:before="240" w:after="240"/>
+        <w:ind w:left="720"/>
+        <w:rPr>
+          <w:lang w:val="en-US"/>
+        </w:rPr>
+      </w:pPr>
+      <w:r>
+        <w:rPr>
+          <w:b/>
+          <w:bCs/>
+          <w:lang w:val="en-US"/>
+        </w:rPr>
+        <w:t>Additional Roles:</w:t>
+      </w:r>
+      <w:r>
+        <w:rPr>
+          <w:lang w:val="en-US"/>
+        </w:rPr>
+        <w:t xml:space="preserve"> Agile Scrum Master, Team Lead</w:t>
+      </w:r>
+    </w:p>
+    <w:p>
+      <w:pPr>
+        <w:spacing w:before="240" w:after="240"/>
+        <w:ind w:left="720"/>
+        <w:rPr>
+          <w:lang w:val="en-US"/>
+        </w:rPr>
+      </w:pPr>
+      <w:r>
+        <w:rPr>
+          <w:b/>
+          <w:bCs/>
+          <w:lang w:val="en-US"/>
+        </w:rPr>
+        <w:t xml:space="preserve">Awards: </w:t>
+      </w:r>
+      <w:r>
+        <w:rPr>
+          <w:lang w:val="en-US"/>
+        </w:rPr>
+        <w:t xml:space="preserve">Technical Innovator of </w:t>
+      </w:r>
+      <w:proofErr w:type="gramStart"/>
+      <w:r>
+        <w:rPr>
+          <w:lang w:val="en-US"/>
+        </w:rPr>
+        <w:t>The</w:t>
+      </w:r>
+      <w:proofErr w:type="gramEnd"/>
+      <w:r>
+        <w:rPr>
+          <w:lang w:val="en-US"/>
+        </w:rPr>
+        <w:t xml:space="preserve"> Year. Malcom Baldridge Quality Award</w:t>
+      </w:r>
+    </w:p>
+    <w:p>
+      <w:pPr>
+        <w:spacing w:before="240" w:after="240"/>
+        <w:ind w:left="720"/>
+        <w:rPr>
+          <w:lang w:val="en-US"/>
+        </w:rPr>
+      </w:pPr>
+      <w:r>
+        <w:rPr>
+          <w:b/>
+          <w:bCs/>
+          <w:lang w:val="en-US"/>
+        </w:rPr>
+        <w:t xml:space="preserve">Exit: </w:t>
+      </w:r>
+      <w:r>
+        <w:rPr>
+          <w:lang w:val="en-US"/>
+        </w:rPr>
+        <w:t>Sun Microsystems acquired Storage Technology Corporation (</w:t>
+      </w:r>
+      <w:proofErr w:type="spellStart"/>
+      <w:r>
+        <w:rPr>
+          <w:lang w:val="en-US"/>
+        </w:rPr>
+        <w:t>StorageTek</w:t>
+      </w:r>
+      <w:proofErr w:type="spellEnd"/>
+      <w:r>
+        <w:rPr>
+          <w:lang w:val="en-US"/>
+        </w:rPr>
+        <w:t>) in August 2005 for US$4.1 billion.</w:t>
+      </w:r>
+    </w:p>
+    <w:p>
+      <w:pPr>
+        <w:spacing w:before="240" w:after="240"/>
+      </w:pPr>
+    </w:p>
+    <w:p>
+      <w:pPr>
+        <w:spacing w:before="240" w:after="240"/>
+      </w:pPr>
+    </w:p>
+    <w:p>
+      <w:pPr>
+        <w:spacing w:before="240" w:after="240"/>
       </w:pPr>
       <w:r>
         <w:rPr>
@@ -608,8 +1839,115 @@
         <w:t>I d</w:t>
       </w:r>
       <w:r>
-        <w:t>esigned and built mission-critical power supplies for the nation's most advanced defense and aerospace platforms. My projects included developing power systems for the Space Shuttle (NASA), nuclear submarines (U.S. Navy), and Black Ops helicopters (U.S. Air Force), all requiring the highest levels of precision and reliability.</w:t>
-      </w:r>
+        <w:t>esigned and built mission-critical power supplies for the nation's most advanced defense and aerospace platforms. My projects included developing power systems for the Space Shuttle (NASA), nuclear submarines (U.S. Navy), and Black Ops helicopters (U.S. Air</w:t>
+      </w:r>
+      <w:r>
+        <w:t>f</w:t>
+      </w:r>
+      <w:r>
+        <w:t>orce), all requiring the highest levels of precision and reliability.</w:t>
+      </w:r>
+    </w:p>
+    <w:p>
+      <w:pPr>
+        <w:spacing w:before="240" w:after="240"/>
+        <w:ind w:left="720"/>
+        <w:rPr>
+          <w:lang w:val="en-US"/>
+        </w:rPr>
+      </w:pPr>
+      <w:r>
+        <w:rPr>
+          <w:b/>
+          <w:bCs/>
+          <w:lang w:val="en-US"/>
+        </w:rPr>
+        <w:t xml:space="preserve">Technologies: </w:t>
+      </w:r>
+      <w:r>
+        <w:rPr>
+          <w:lang w:val="en-US"/>
+        </w:rPr>
+        <w:t xml:space="preserve">C, C++, i386 </w:t>
+      </w:r>
+      <w:proofErr w:type="spellStart"/>
+      <w:r>
+        <w:rPr>
+          <w:lang w:val="en-US"/>
+        </w:rPr>
+        <w:t>Assenbly</w:t>
+      </w:r>
+      <w:proofErr w:type="spellEnd"/>
+      <w:r>
+        <w:rPr>
+          <w:lang w:val="en-US"/>
+        </w:rPr>
+        <w:t>, MIL-STD-1495</w:t>
+      </w:r>
+    </w:p>
+    <w:p>
+      <w:pPr>
+        <w:spacing w:before="240" w:after="240"/>
+        <w:ind w:left="720"/>
+        <w:rPr>
+          <w:lang w:val="en-US"/>
+        </w:rPr>
+      </w:pPr>
+      <w:r>
+        <w:rPr>
+          <w:b/>
+          <w:bCs/>
+          <w:lang w:val="en-US"/>
+        </w:rPr>
+        <w:t xml:space="preserve">Tools: </w:t>
+      </w:r>
+      <w:proofErr w:type="spellStart"/>
+      <w:r>
+        <w:rPr>
+          <w:lang w:val="en-US"/>
+        </w:rPr>
+        <w:t>Aztek</w:t>
+      </w:r>
+      <w:proofErr w:type="spellEnd"/>
+      <w:r>
+        <w:rPr>
+          <w:lang w:val="en-US"/>
+        </w:rPr>
+        <w:t xml:space="preserve"> Compiler, AT&amp;T Compiler </w:t>
+      </w:r>
+    </w:p>
+    <w:p>
+      <w:pPr>
+        <w:spacing w:before="240" w:after="240"/>
+        <w:ind w:left="720"/>
+        <w:rPr>
+          <w:lang w:val="en-US"/>
+        </w:rPr>
+      </w:pPr>
+      <w:r>
+        <w:rPr>
+          <w:b/>
+          <w:bCs/>
+          <w:lang w:val="en-US"/>
+        </w:rPr>
+        <w:t>Additional Roles:</w:t>
+      </w:r>
+      <w:r>
+        <w:rPr>
+          <w:lang w:val="en-US"/>
+        </w:rPr>
+        <w:t xml:space="preserve"> NASA Qualified Assembler, Quality Control</w:t>
+      </w:r>
+    </w:p>
+    <w:p>
+      <w:pPr>
+        <w:spacing w:before="240" w:after="240"/>
+      </w:pPr>
+    </w:p>
+    <w:p>
+      <w:pPr>
+        <w:spacing w:before="240" w:after="240"/>
+      </w:pPr>
     </w:p>
     <w:p>
       <w:pPr>
@@ -709,6 +2047,33 @@
       <w:pPr>
         <w:spacing w:before="240" w:after="240"/>
         <w:rPr>
+          <w:lang w:val="en-US"/>
+        </w:rPr>
+      </w:pPr>
+      <w:r>
+        <w:rPr>
+          <w:b/>
+          <w:lang w:val="en-US"/>
+        </w:rPr>
+        <w:t>FCC License:</w:t>
+      </w:r>
+      <w:r>
+        <w:rPr>
+          <w:lang w:val="en-US"/>
+        </w:rPr>
+        <w:t xml:space="preserve"> </w:t>
+      </w:r>
+      <w:r>
+        <w:rPr>
+          <w:lang w:val="en-US"/>
+        </w:rPr>
+        <w:t xml:space="preserve">KA0JHK </w:t>
+      </w:r>
+    </w:p>
+    <w:p>
+      <w:pPr>
+        <w:spacing w:before="240" w:after="240"/>
+        <w:rPr>
           <w:b/>
           <w:lang w:val="en-US"/>
         </w:rPr>
@@ -732,7 +2097,7 @@
         <w:rPr>
           <w:lang w:val="en-US"/>
         </w:rPr>
-        <w:t xml:space="preserve">          </w:t>
+        <w:t>       </w:t>
       </w:r>
     </w:p>
     <w:p>
@@ -885,7 +2250,6 @@
         <w:rPr>
           <w:lang w:val="en-US"/>
         </w:rPr>
-        <w:lastRenderedPageBreak/>
         <w:t>Program Curation &amp; Scheduling: Develop, manage, and oversee the weekly on-air program schedule, ensuring a diverse and engaging mix of music, news, and public affairs programming.</w:t>
       </w:r>
     </w:p>
@@ -943,6 +2307,7 @@
         <w:rPr>
           <w:lang w:val="en-US"/>
         </w:rPr>
+        <w:lastRenderedPageBreak/>
         <w:t>Quality Control: Monitor on-air sound and programming to ensure a high standard of quality and professionalism.</w:t>
       </w:r>
     </w:p>
@@ -967,36 +2332,1282 @@
     </w:p>
     <w:p>
       <w:pPr>
-        <w:spacing w:before="240" w:after="240"/>
-        <w:rPr>
-          <w:lang w:val="en-US"/>
-        </w:rPr>
-      </w:pPr>
-      <w:r>
-        <w:rPr>
-          <w:b/>
-          <w:lang w:val="en-US"/>
-        </w:rPr>
-        <w:t>FCC License:</w:t>
-      </w:r>
-      <w:r>
-        <w:rPr>
-          <w:lang w:val="en-US"/>
-        </w:rPr>
-        <w:t xml:space="preserve"> </w:t>
-      </w:r>
-      <w:r>
-        <w:rPr>
-          <w:lang w:val="en-US"/>
-        </w:rPr>
-        <w:t xml:space="preserve">KA0JHK </w:t>
-      </w:r>
-    </w:p>
-    <w:p>
-      <w:pPr>
-        <w:spacing w:before="240" w:after="240"/>
-      </w:pPr>
-    </w:p>
+        <w:pStyle w:val="Heading3"/>
+        <w:keepNext w:val="0"/>
+        <w:keepLines w:val="0"/>
+        <w:spacing w:before="280"/>
+        <w:rPr>
+          <w:b/>
+          <w:color w:val="000000"/>
+          <w:sz w:val="26"/>
+          <w:szCs w:val="26"/>
+        </w:rPr>
+      </w:pPr>
+      <w:r>
+        <w:rPr>
+          <w:b/>
+          <w:color w:val="000000"/>
+          <w:sz w:val="26"/>
+          <w:szCs w:val="26"/>
+        </w:rPr>
+        <w:t>Education</w:t>
+      </w:r>
+    </w:p>
+    <w:tbl>
+      <w:tblPr>
+        <w:tblW w:w="0" w:type="auto"/>
+        <w:tblLayout w:type="fixed"/>
+        <w:tblLook w:val="0000" w:firstRow="0" w:lastRow="0" w:firstColumn="0" w:lastColumn="0" w:noHBand="0" w:noVBand="0"/>
+      </w:tblPr>
+      <w:tblGrid>
+        <w:gridCol w:w="648"/>
+        <w:gridCol w:w="8190"/>
+      </w:tblGrid>
+      <w:tr>
+        <w:tblPrEx>
+          <w:tblCellMar>
+            <w:top w:w="0" w:type="dxa"/>
+            <w:bottom w:w="0" w:type="dxa"/>
+          </w:tblCellMar>
+        </w:tblPrEx>
+        <w:tc>
+          <w:tcPr>
+            <w:tcW w:w="648" w:type="dxa"/>
+          </w:tcPr>
+          <w:p>
+            <w:pPr>
+              <w:pStyle w:val="NoTitle"/>
+            </w:pPr>
+          </w:p>
+        </w:tc>
+        <w:tc>
+          <w:tcPr>
+            <w:tcW w:w="8190" w:type="dxa"/>
+          </w:tcPr>
+          <w:p>
+            <w:pPr>
+              <w:pStyle w:val="Institution"/>
+              <w:rPr>
+                <w:rFonts w:ascii="Arial" w:hAnsi="Arial" w:cs="Arial"/>
+              </w:rPr>
+            </w:pPr>
+            <w:r>
+              <w:rPr>
+                <w:rFonts w:ascii="Arial" w:hAnsi="Arial" w:cs="Arial"/>
+                <w:b/>
+              </w:rPr>
+              <w:t xml:space="preserve">University of Colorado, </w:t>
+            </w:r>
+            <w:r>
+              <w:rPr>
+                <w:rFonts w:ascii="Arial" w:hAnsi="Arial" w:cs="Arial"/>
+                <w:b/>
+              </w:rPr>
+              <w:t>Colorado Springs</w:t>
+            </w:r>
+            <w:r>
+              <w:rPr>
+                <w:rFonts w:ascii="Arial" w:hAnsi="Arial" w:cs="Arial"/>
+              </w:rPr>
+              <w:tab/>
+            </w:r>
+            <w:r>
+              <w:rPr>
+                <w:rFonts w:ascii="Arial" w:hAnsi="Arial" w:cs="Arial"/>
+              </w:rPr>
+              <w:t xml:space="preserve"> </w:t>
+            </w:r>
+            <w:r>
+              <w:rPr>
+                <w:rFonts w:ascii="Arial" w:hAnsi="Arial" w:cs="Arial"/>
+              </w:rPr>
+              <w:t>Colorado Springs</w:t>
+            </w:r>
+            <w:r>
+              <w:rPr>
+                <w:rFonts w:ascii="Arial" w:hAnsi="Arial" w:cs="Arial"/>
+              </w:rPr>
+              <w:t xml:space="preserve">, CO </w:t>
+            </w:r>
+          </w:p>
+          <w:p>
+            <w:pPr>
+              <w:pStyle w:val="Achievement"/>
+              <w:rPr>
+                <w:rFonts w:ascii="Arial" w:hAnsi="Arial" w:cs="Arial"/>
+              </w:rPr>
+            </w:pPr>
+            <w:r>
+              <w:rPr>
+                <w:rFonts w:ascii="Arial" w:hAnsi="Arial" w:cs="Arial"/>
+                <w:lang w:val="en"/>
+              </w:rPr>
+              <w:t>Strategic Artificial Intelligence Program</w:t>
+            </w:r>
+            <w:r>
+              <w:rPr>
+                <w:rFonts w:ascii="Arial" w:hAnsi="Arial" w:cs="Arial"/>
+              </w:rPr>
+              <w:t>.</w:t>
+            </w:r>
+            <w:r>
+              <w:rPr>
+                <w:rFonts w:ascii="Arial" w:hAnsi="Arial" w:cs="Arial"/>
+              </w:rPr>
+              <w:t xml:space="preserve"> </w:t>
+            </w:r>
+          </w:p>
+          <w:p>
+            <w:pPr>
+              <w:pStyle w:val="Institution"/>
+              <w:rPr>
+                <w:rFonts w:ascii="Arial" w:hAnsi="Arial" w:cs="Arial"/>
+              </w:rPr>
+            </w:pPr>
+            <w:r>
+              <w:rPr>
+                <w:rFonts w:ascii="Arial" w:hAnsi="Arial" w:cs="Arial"/>
+              </w:rPr>
+              <w:t xml:space="preserve">                          </w:t>
+            </w:r>
+            <w:r>
+              <w:rPr>
+                <w:rFonts w:ascii="Arial" w:hAnsi="Arial" w:cs="Arial"/>
+                <w:b/>
+              </w:rPr>
+              <w:t>University of Denver</w:t>
+            </w:r>
+            <w:r>
+              <w:rPr>
+                <w:rFonts w:ascii="Arial" w:hAnsi="Arial" w:cs="Arial"/>
+              </w:rPr>
+              <w:tab/>
+              <w:t>Denver</w:t>
+            </w:r>
+            <w:r>
+              <w:rPr>
+                <w:rFonts w:ascii="Arial" w:hAnsi="Arial" w:cs="Arial"/>
+              </w:rPr>
+              <w:t xml:space="preserve">, CO </w:t>
+            </w:r>
+          </w:p>
+          <w:p>
+            <w:pPr>
+              <w:pStyle w:val="Achievement"/>
+              <w:rPr>
+                <w:rFonts w:ascii="Arial" w:hAnsi="Arial" w:cs="Arial"/>
+              </w:rPr>
+            </w:pPr>
+            <w:r>
+              <w:rPr>
+                <w:rFonts w:ascii="Arial" w:hAnsi="Arial" w:cs="Arial"/>
+                <w:lang w:val="en"/>
+              </w:rPr>
+              <w:t>Daniels Professional Development Program</w:t>
+            </w:r>
+            <w:r>
+              <w:rPr>
+                <w:rFonts w:ascii="Arial" w:hAnsi="Arial" w:cs="Arial"/>
+              </w:rPr>
+              <w:t>.</w:t>
+            </w:r>
+          </w:p>
+          <w:p>
+            <w:pPr>
+              <w:pStyle w:val="Institution"/>
+              <w:rPr>
+                <w:rFonts w:ascii="Arial" w:hAnsi="Arial" w:cs="Arial"/>
+              </w:rPr>
+            </w:pPr>
+            <w:r>
+              <w:rPr>
+                <w:rFonts w:ascii="Arial" w:hAnsi="Arial" w:cs="Arial"/>
+              </w:rPr>
+              <w:t xml:space="preserve">                          </w:t>
+            </w:r>
+            <w:proofErr w:type="spellStart"/>
+            <w:r>
+              <w:rPr>
+                <w:rFonts w:ascii="Arial" w:hAnsi="Arial" w:cs="Arial"/>
+                <w:b/>
+              </w:rPr>
+              <w:t>Berklee</w:t>
+            </w:r>
+            <w:proofErr w:type="spellEnd"/>
+            <w:r>
+              <w:rPr>
+                <w:rFonts w:ascii="Arial" w:hAnsi="Arial" w:cs="Arial"/>
+                <w:b/>
+              </w:rPr>
+              <w:t xml:space="preserve"> College of Music</w:t>
+            </w:r>
+            <w:r>
+              <w:rPr>
+                <w:rFonts w:ascii="Arial" w:hAnsi="Arial" w:cs="Arial"/>
+              </w:rPr>
+              <w:tab/>
+              <w:t>Boston, MA</w:t>
+            </w:r>
+          </w:p>
+          <w:p>
+            <w:pPr>
+              <w:pStyle w:val="Achievement"/>
+              <w:rPr>
+                <w:rFonts w:ascii="Arial" w:hAnsi="Arial" w:cs="Arial"/>
+              </w:rPr>
+            </w:pPr>
+            <w:r>
+              <w:rPr>
+                <w:rFonts w:ascii="Arial" w:hAnsi="Arial" w:cs="Arial"/>
+              </w:rPr>
+              <w:t>Music Production</w:t>
+            </w:r>
+            <w:r>
+              <w:rPr>
+                <w:rFonts w:ascii="Arial" w:hAnsi="Arial" w:cs="Arial"/>
+              </w:rPr>
+              <w:t>.</w:t>
+            </w:r>
+          </w:p>
+          <w:p>
+            <w:pPr>
+              <w:pStyle w:val="Institution"/>
+              <w:rPr>
+                <w:rFonts w:ascii="Arial" w:hAnsi="Arial" w:cs="Arial"/>
+              </w:rPr>
+            </w:pPr>
+            <w:r>
+              <w:rPr>
+                <w:rFonts w:ascii="Arial" w:hAnsi="Arial" w:cs="Arial"/>
+              </w:rPr>
+              <w:t xml:space="preserve">                          </w:t>
+            </w:r>
+            <w:r>
+              <w:rPr>
+                <w:rFonts w:ascii="Arial" w:hAnsi="Arial" w:cs="Arial"/>
+                <w:b/>
+              </w:rPr>
+              <w:t>University of Colorado</w:t>
+            </w:r>
+            <w:r>
+              <w:rPr>
+                <w:rFonts w:ascii="Arial" w:hAnsi="Arial" w:cs="Arial"/>
+              </w:rPr>
+              <w:tab/>
+            </w:r>
+            <w:r>
+              <w:rPr>
+                <w:rFonts w:ascii="Arial" w:hAnsi="Arial" w:cs="Arial"/>
+              </w:rPr>
+              <w:t xml:space="preserve">    </w:t>
+            </w:r>
+            <w:r>
+              <w:rPr>
+                <w:rFonts w:ascii="Arial" w:hAnsi="Arial" w:cs="Arial"/>
+              </w:rPr>
+              <w:t xml:space="preserve">Boulder, CO </w:t>
+            </w:r>
+          </w:p>
+          <w:p>
+            <w:pPr>
+              <w:pStyle w:val="Achievement"/>
+              <w:rPr>
+                <w:rFonts w:ascii="Arial" w:hAnsi="Arial" w:cs="Arial"/>
+              </w:rPr>
+            </w:pPr>
+            <w:r>
+              <w:rPr>
+                <w:rFonts w:ascii="Arial" w:hAnsi="Arial" w:cs="Arial"/>
+              </w:rPr>
+              <w:t>Leeds Schoo</w:t>
+            </w:r>
+            <w:r>
+              <w:rPr>
+                <w:rFonts w:ascii="Arial" w:hAnsi="Arial" w:cs="Arial"/>
+              </w:rPr>
+              <w:t>l of Business Management</w:t>
+            </w:r>
+            <w:r>
+              <w:rPr>
+                <w:rFonts w:ascii="Arial" w:hAnsi="Arial" w:cs="Arial"/>
+              </w:rPr>
+              <w:t>.</w:t>
+            </w:r>
+          </w:p>
+          <w:p>
+            <w:pPr>
+              <w:pStyle w:val="Institution"/>
+              <w:tabs>
+                <w:tab w:val="left" w:pos="-630"/>
+              </w:tabs>
+              <w:ind w:left="-108"/>
+              <w:rPr>
+                <w:rFonts w:ascii="Arial" w:hAnsi="Arial" w:cs="Arial"/>
+              </w:rPr>
+            </w:pPr>
+            <w:r>
+              <w:rPr>
+                <w:rFonts w:ascii="Arial" w:hAnsi="Arial" w:cs="Arial"/>
+              </w:rPr>
+              <w:t xml:space="preserve">                   </w:t>
+            </w:r>
+            <w:r>
+              <w:rPr>
+                <w:rFonts w:ascii="Arial" w:hAnsi="Arial" w:cs="Arial"/>
+              </w:rPr>
+              <w:t xml:space="preserve">         </w:t>
+            </w:r>
+            <w:r>
+              <w:rPr>
+                <w:rFonts w:ascii="Arial" w:hAnsi="Arial" w:cs="Arial"/>
+                <w:b/>
+              </w:rPr>
+              <w:t>Regis University</w:t>
+            </w:r>
+            <w:r>
+              <w:rPr>
+                <w:rFonts w:ascii="Arial" w:hAnsi="Arial" w:cs="Arial"/>
+              </w:rPr>
+              <w:t xml:space="preserve">                                Denver, CO</w:t>
+            </w:r>
+          </w:p>
+          <w:p>
+            <w:pPr>
+              <w:pStyle w:val="Achievement"/>
+              <w:rPr>
+                <w:rFonts w:ascii="Arial" w:hAnsi="Arial" w:cs="Arial"/>
+              </w:rPr>
+            </w:pPr>
+            <w:r>
+              <w:rPr>
+                <w:rFonts w:ascii="Arial" w:hAnsi="Arial" w:cs="Arial"/>
+              </w:rPr>
+              <w:t>Management Information Systems/Business Minor</w:t>
+            </w:r>
+            <w:r>
+              <w:rPr>
+                <w:rFonts w:ascii="Arial" w:hAnsi="Arial" w:cs="Arial"/>
+              </w:rPr>
+              <w:t>.</w:t>
+            </w:r>
+          </w:p>
+          <w:p>
+            <w:pPr>
+              <w:pStyle w:val="Institution"/>
+              <w:rPr>
+                <w:rFonts w:ascii="Arial" w:hAnsi="Arial" w:cs="Arial"/>
+              </w:rPr>
+            </w:pPr>
+            <w:r>
+              <w:rPr>
+                <w:rFonts w:ascii="Arial" w:hAnsi="Arial" w:cs="Arial"/>
+              </w:rPr>
+              <w:tab/>
+            </w:r>
+            <w:r>
+              <w:rPr>
+                <w:rFonts w:ascii="Arial" w:hAnsi="Arial" w:cs="Arial"/>
+              </w:rPr>
+              <w:t xml:space="preserve">   </w:t>
+            </w:r>
+            <w:r>
+              <w:rPr>
+                <w:rFonts w:ascii="Arial" w:hAnsi="Arial" w:cs="Arial"/>
+                <w:b/>
+              </w:rPr>
+              <w:t>University of Colorado</w:t>
+            </w:r>
+            <w:r>
+              <w:rPr>
+                <w:rFonts w:ascii="Arial" w:hAnsi="Arial" w:cs="Arial"/>
+              </w:rPr>
+              <w:tab/>
+            </w:r>
+            <w:r>
+              <w:rPr>
+                <w:rFonts w:ascii="Arial" w:hAnsi="Arial" w:cs="Arial"/>
+              </w:rPr>
+              <w:t xml:space="preserve"> </w:t>
+            </w:r>
+            <w:r>
+              <w:rPr>
+                <w:rFonts w:ascii="Arial" w:hAnsi="Arial" w:cs="Arial"/>
+              </w:rPr>
+              <w:t xml:space="preserve">Boulder, CO </w:t>
+            </w:r>
+          </w:p>
+          <w:p>
+            <w:pPr>
+              <w:pStyle w:val="Achievement"/>
+              <w:rPr>
+                <w:rFonts w:ascii="Arial" w:hAnsi="Arial" w:cs="Arial"/>
+              </w:rPr>
+            </w:pPr>
+            <w:r>
+              <w:rPr>
+                <w:rFonts w:ascii="Arial" w:hAnsi="Arial" w:cs="Arial"/>
+              </w:rPr>
+              <w:t>Electrical Engineering</w:t>
+            </w:r>
+            <w:r>
+              <w:rPr>
+                <w:rFonts w:ascii="Arial" w:hAnsi="Arial" w:cs="Arial"/>
+              </w:rPr>
+              <w:t xml:space="preserve"> Studies</w:t>
+            </w:r>
+            <w:r>
+              <w:rPr>
+                <w:rFonts w:ascii="Arial" w:hAnsi="Arial" w:cs="Arial"/>
+              </w:rPr>
+              <w:t>.</w:t>
+            </w:r>
+          </w:p>
+          <w:p>
+            <w:pPr>
+              <w:pStyle w:val="Achievement"/>
+              <w:rPr>
+                <w:rFonts w:ascii="Arial" w:hAnsi="Arial" w:cs="Arial"/>
+              </w:rPr>
+            </w:pPr>
+          </w:p>
+        </w:tc>
+      </w:tr>
+      <w:tr>
+        <w:tblPrEx>
+          <w:tblCellMar>
+            <w:top w:w="0" w:type="dxa"/>
+            <w:bottom w:w="0" w:type="dxa"/>
+          </w:tblCellMar>
+        </w:tblPrEx>
+        <w:tc>
+          <w:tcPr>
+            <w:tcW w:w="648" w:type="dxa"/>
+          </w:tcPr>
+          <w:p>
+            <w:pPr>
+              <w:pStyle w:val="NoTitle"/>
+            </w:pPr>
+          </w:p>
+        </w:tc>
+        <w:tc>
+          <w:tcPr>
+            <w:tcW w:w="8190" w:type="dxa"/>
+          </w:tcPr>
+          <w:p>
+            <w:pPr>
+              <w:pStyle w:val="Institution"/>
+              <w:rPr>
+                <w:rFonts w:ascii="Arial" w:hAnsi="Arial" w:cs="Arial"/>
+              </w:rPr>
+            </w:pPr>
+          </w:p>
+        </w:tc>
+      </w:tr>
+    </w:tbl>
+    <w:p/>
+    <w:p>
+      <w:pPr>
+        <w:pStyle w:val="Heading3"/>
+        <w:keepNext w:val="0"/>
+        <w:keepLines w:val="0"/>
+        <w:spacing w:before="280"/>
+        <w:rPr>
+          <w:b/>
+          <w:color w:val="000000"/>
+          <w:sz w:val="26"/>
+          <w:szCs w:val="26"/>
+        </w:rPr>
+      </w:pPr>
+      <w:r>
+        <w:rPr>
+          <w:b/>
+          <w:color w:val="000000"/>
+          <w:sz w:val="26"/>
+          <w:szCs w:val="26"/>
+        </w:rPr>
+        <w:t>Coaching Experience</w:t>
+      </w:r>
+    </w:p>
+    <w:tbl>
+      <w:tblPr>
+        <w:tblW w:w="0" w:type="auto"/>
+        <w:tblLayout w:type="fixed"/>
+        <w:tblLook w:val="0000" w:firstRow="0" w:lastRow="0" w:firstColumn="0" w:lastColumn="0" w:noHBand="0" w:noVBand="0"/>
+      </w:tblPr>
+      <w:tblGrid>
+        <w:gridCol w:w="648"/>
+        <w:gridCol w:w="8190"/>
+      </w:tblGrid>
+      <w:tr>
+        <w:tblPrEx>
+          <w:tblCellMar>
+            <w:top w:w="0" w:type="dxa"/>
+            <w:bottom w:w="0" w:type="dxa"/>
+          </w:tblCellMar>
+        </w:tblPrEx>
+        <w:tc>
+          <w:tcPr>
+            <w:tcW w:w="648" w:type="dxa"/>
+          </w:tcPr>
+          <w:p>
+            <w:pPr>
+              <w:pStyle w:val="NoTitle"/>
+            </w:pPr>
+          </w:p>
+        </w:tc>
+        <w:tc>
+          <w:tcPr>
+            <w:tcW w:w="8190" w:type="dxa"/>
+          </w:tcPr>
+          <w:p>
+            <w:pPr>
+              <w:pStyle w:val="Institution"/>
+              <w:rPr>
+                <w:rFonts w:ascii="Arial" w:hAnsi="Arial" w:cs="Arial"/>
+              </w:rPr>
+            </w:pPr>
+            <w:r>
+              <w:rPr>
+                <w:rFonts w:ascii="Arial" w:hAnsi="Arial" w:cs="Arial"/>
+              </w:rPr>
+              <w:t xml:space="preserve">                          </w:t>
+            </w:r>
+            <w:r>
+              <w:rPr>
+                <w:rFonts w:ascii="Arial" w:hAnsi="Arial" w:cs="Arial"/>
+                <w:b/>
+              </w:rPr>
+              <w:t>University of Colorado</w:t>
+            </w:r>
+            <w:r>
+              <w:rPr>
+                <w:rFonts w:ascii="Arial" w:hAnsi="Arial" w:cs="Arial"/>
+              </w:rPr>
+              <w:tab/>
+            </w:r>
+            <w:r>
+              <w:rPr>
+                <w:rFonts w:ascii="Arial" w:hAnsi="Arial" w:cs="Arial"/>
+              </w:rPr>
+              <w:t>Boulder</w:t>
+            </w:r>
+            <w:r>
+              <w:rPr>
+                <w:rFonts w:ascii="Arial" w:hAnsi="Arial" w:cs="Arial"/>
+              </w:rPr>
+              <w:t xml:space="preserve">, CO </w:t>
+            </w:r>
+          </w:p>
+          <w:p>
+            <w:pPr>
+              <w:pStyle w:val="Achievement"/>
+              <w:rPr>
+                <w:rFonts w:ascii="Arial" w:hAnsi="Arial" w:cs="Arial"/>
+                <w:lang w:val="en"/>
+              </w:rPr>
+            </w:pPr>
+            <w:r>
+              <w:rPr>
+                <w:rFonts w:ascii="Arial" w:hAnsi="Arial" w:cs="Arial"/>
+                <w:lang w:val="en"/>
+              </w:rPr>
+              <w:t>Assistant</w:t>
+            </w:r>
+            <w:r>
+              <w:rPr>
+                <w:rFonts w:ascii="Arial" w:hAnsi="Arial" w:cs="Arial"/>
+                <w:lang w:val="en"/>
+              </w:rPr>
+              <w:t>/Goalie</w:t>
+            </w:r>
+            <w:r>
+              <w:rPr>
+                <w:rFonts w:ascii="Arial" w:hAnsi="Arial" w:cs="Arial"/>
+                <w:lang w:val="en"/>
+              </w:rPr>
+              <w:t xml:space="preserve"> Coach CU Women’s Team</w:t>
+            </w:r>
+          </w:p>
+          <w:p>
+            <w:pPr>
+              <w:pStyle w:val="Achievement"/>
+              <w:rPr>
+                <w:rFonts w:ascii="Arial" w:hAnsi="Arial" w:cs="Arial"/>
+              </w:rPr>
+            </w:pPr>
+            <w:r>
+              <w:rPr>
+                <w:rFonts w:ascii="Arial" w:hAnsi="Arial" w:cs="Arial"/>
+                <w:lang w:val="en"/>
+              </w:rPr>
+              <w:t>NCAA-Nationals</w:t>
+            </w:r>
+          </w:p>
+          <w:p>
+            <w:pPr>
+              <w:pStyle w:val="Institution"/>
+              <w:rPr>
+                <w:rFonts w:ascii="Arial" w:hAnsi="Arial" w:cs="Arial"/>
+              </w:rPr>
+            </w:pPr>
+            <w:r>
+              <w:rPr>
+                <w:rFonts w:ascii="Arial" w:hAnsi="Arial" w:cs="Arial"/>
+              </w:rPr>
+              <w:t xml:space="preserve">                          </w:t>
+            </w:r>
+            <w:r>
+              <w:rPr>
+                <w:rFonts w:ascii="Arial" w:hAnsi="Arial" w:cs="Arial"/>
+                <w:b/>
+              </w:rPr>
+              <w:t>Golden High School</w:t>
+            </w:r>
+            <w:r>
+              <w:rPr>
+                <w:rFonts w:ascii="Arial" w:hAnsi="Arial" w:cs="Arial"/>
+              </w:rPr>
+              <w:tab/>
+              <w:t>Golden</w:t>
+            </w:r>
+            <w:r>
+              <w:rPr>
+                <w:rFonts w:ascii="Arial" w:hAnsi="Arial" w:cs="Arial"/>
+              </w:rPr>
+              <w:t xml:space="preserve">, CO </w:t>
+            </w:r>
+          </w:p>
+          <w:p>
+            <w:pPr>
+              <w:pStyle w:val="Achievement"/>
+              <w:rPr>
+                <w:rFonts w:ascii="Arial" w:hAnsi="Arial" w:cs="Arial"/>
+              </w:rPr>
+            </w:pPr>
+            <w:r>
+              <w:rPr>
+                <w:rFonts w:ascii="Arial" w:hAnsi="Arial" w:cs="Arial"/>
+                <w:lang w:val="en"/>
+              </w:rPr>
+              <w:t>Assistant</w:t>
+            </w:r>
+            <w:r>
+              <w:rPr>
+                <w:rFonts w:ascii="Arial" w:hAnsi="Arial" w:cs="Arial"/>
+                <w:lang w:val="en"/>
+              </w:rPr>
+              <w:t>/Goalie</w:t>
+            </w:r>
+            <w:r>
+              <w:rPr>
+                <w:rFonts w:ascii="Arial" w:hAnsi="Arial" w:cs="Arial"/>
+              </w:rPr>
+              <w:t xml:space="preserve"> Coach – Varsity</w:t>
+            </w:r>
+          </w:p>
+          <w:p>
+            <w:pPr>
+              <w:pStyle w:val="Achievement"/>
+              <w:rPr>
+                <w:rFonts w:ascii="Arial" w:hAnsi="Arial" w:cs="Arial"/>
+              </w:rPr>
+            </w:pPr>
+            <w:r>
+              <w:rPr>
+                <w:rFonts w:ascii="Arial" w:hAnsi="Arial" w:cs="Arial"/>
+              </w:rPr>
+              <w:t>State Champion</w:t>
+            </w:r>
+          </w:p>
+          <w:p>
+            <w:pPr>
+              <w:pStyle w:val="Institution"/>
+              <w:rPr>
+                <w:rFonts w:ascii="Arial" w:hAnsi="Arial" w:cs="Arial"/>
+              </w:rPr>
+            </w:pPr>
+            <w:r>
+              <w:rPr>
+                <w:rFonts w:ascii="Arial" w:hAnsi="Arial" w:cs="Arial"/>
+              </w:rPr>
+              <w:t xml:space="preserve">                          </w:t>
+            </w:r>
+            <w:r>
+              <w:rPr>
+                <w:rFonts w:ascii="Arial" w:hAnsi="Arial" w:cs="Arial"/>
+                <w:b/>
+              </w:rPr>
+              <w:t>Hyland Hills</w:t>
+            </w:r>
+            <w:r>
+              <w:rPr>
+                <w:rFonts w:ascii="Arial" w:hAnsi="Arial" w:cs="Arial"/>
+              </w:rPr>
+              <w:tab/>
+              <w:t>Westminster, CO</w:t>
+            </w:r>
+            <w:r>
+              <w:rPr>
+                <w:rFonts w:ascii="Arial" w:hAnsi="Arial" w:cs="Arial"/>
+              </w:rPr>
+              <w:t xml:space="preserve"> </w:t>
+            </w:r>
+          </w:p>
+          <w:p>
+            <w:pPr>
+              <w:pStyle w:val="Achievement"/>
+              <w:rPr>
+                <w:rFonts w:ascii="Arial" w:hAnsi="Arial" w:cs="Arial"/>
+              </w:rPr>
+            </w:pPr>
+            <w:r>
+              <w:rPr>
+                <w:rFonts w:ascii="Arial" w:hAnsi="Arial" w:cs="Arial"/>
+                <w:lang w:val="en"/>
+              </w:rPr>
+              <w:t>Assistant</w:t>
+            </w:r>
+            <w:r>
+              <w:rPr>
+                <w:rFonts w:ascii="Arial" w:hAnsi="Arial" w:cs="Arial"/>
+                <w:lang w:val="en"/>
+              </w:rPr>
+              <w:t>/Goalie</w:t>
+            </w:r>
+            <w:r>
+              <w:rPr>
+                <w:rFonts w:ascii="Arial" w:hAnsi="Arial" w:cs="Arial"/>
+              </w:rPr>
+              <w:t xml:space="preserve"> Coach –</w:t>
+            </w:r>
+            <w:r>
+              <w:rPr>
+                <w:rFonts w:ascii="Arial" w:hAnsi="Arial" w:cs="Arial"/>
+              </w:rPr>
+              <w:t xml:space="preserve"> Major A</w:t>
+            </w:r>
+          </w:p>
+          <w:p>
+            <w:pPr>
+              <w:pStyle w:val="Achievement"/>
+              <w:rPr>
+                <w:rFonts w:ascii="Arial" w:hAnsi="Arial" w:cs="Arial"/>
+              </w:rPr>
+            </w:pPr>
+            <w:r>
+              <w:rPr>
+                <w:rFonts w:ascii="Arial" w:hAnsi="Arial" w:cs="Arial"/>
+              </w:rPr>
+              <w:t>International Silver Stick Champion</w:t>
+            </w:r>
+          </w:p>
+          <w:p>
+            <w:pPr>
+              <w:pStyle w:val="Institution"/>
+              <w:rPr>
+                <w:rFonts w:ascii="Arial" w:hAnsi="Arial" w:cs="Arial"/>
+              </w:rPr>
+            </w:pPr>
+            <w:r>
+              <w:rPr>
+                <w:rFonts w:ascii="Arial" w:hAnsi="Arial" w:cs="Arial"/>
+              </w:rPr>
+              <w:t xml:space="preserve">                          </w:t>
+            </w:r>
+            <w:r>
+              <w:rPr>
+                <w:rFonts w:ascii="Arial" w:hAnsi="Arial" w:cs="Arial"/>
+                <w:b/>
+              </w:rPr>
+              <w:t>Hyland Hills</w:t>
+            </w:r>
+            <w:r>
+              <w:rPr>
+                <w:rFonts w:ascii="Arial" w:hAnsi="Arial" w:cs="Arial"/>
+              </w:rPr>
+              <w:tab/>
+              <w:t>Westminster</w:t>
+            </w:r>
+            <w:r>
+              <w:rPr>
+                <w:rFonts w:ascii="Arial" w:hAnsi="Arial" w:cs="Arial"/>
+              </w:rPr>
+              <w:t xml:space="preserve">, CO </w:t>
+            </w:r>
+          </w:p>
+          <w:p>
+            <w:pPr>
+              <w:pStyle w:val="Achievement"/>
+              <w:rPr>
+                <w:rFonts w:ascii="Arial" w:hAnsi="Arial" w:cs="Arial"/>
+              </w:rPr>
+            </w:pPr>
+            <w:r>
+              <w:rPr>
+                <w:rFonts w:ascii="Arial" w:hAnsi="Arial" w:cs="Arial"/>
+                <w:lang w:val="en"/>
+              </w:rPr>
+              <w:t>Assistant</w:t>
+            </w:r>
+            <w:r>
+              <w:rPr>
+                <w:rFonts w:ascii="Arial" w:hAnsi="Arial" w:cs="Arial"/>
+                <w:lang w:val="en"/>
+              </w:rPr>
+              <w:t>/Goalie</w:t>
+            </w:r>
+            <w:r>
+              <w:rPr>
+                <w:rFonts w:ascii="Arial" w:hAnsi="Arial" w:cs="Arial"/>
+              </w:rPr>
+              <w:t xml:space="preserve"> Coach –</w:t>
+            </w:r>
+            <w:r>
+              <w:rPr>
+                <w:rFonts w:ascii="Arial" w:hAnsi="Arial" w:cs="Arial"/>
+              </w:rPr>
+              <w:t xml:space="preserve"> Minor</w:t>
+            </w:r>
+            <w:r>
+              <w:rPr>
+                <w:rFonts w:ascii="Arial" w:hAnsi="Arial" w:cs="Arial"/>
+              </w:rPr>
+              <w:t xml:space="preserve"> A</w:t>
+            </w:r>
+          </w:p>
+          <w:p>
+            <w:pPr>
+              <w:pStyle w:val="Achievement"/>
+              <w:rPr>
+                <w:rFonts w:ascii="Arial" w:hAnsi="Arial" w:cs="Arial"/>
+              </w:rPr>
+            </w:pPr>
+            <w:r>
+              <w:rPr>
+                <w:rFonts w:ascii="Arial" w:hAnsi="Arial" w:cs="Arial"/>
+              </w:rPr>
+              <w:t>State Champion</w:t>
+            </w:r>
+          </w:p>
+          <w:p>
+            <w:pPr>
+              <w:pStyle w:val="Institution"/>
+              <w:rPr>
+                <w:rFonts w:ascii="Arial" w:hAnsi="Arial" w:cs="Arial"/>
+              </w:rPr>
+            </w:pPr>
+            <w:r>
+              <w:rPr>
+                <w:rFonts w:ascii="Arial" w:hAnsi="Arial" w:cs="Arial"/>
+              </w:rPr>
+              <w:t xml:space="preserve">                          </w:t>
+            </w:r>
+            <w:r>
+              <w:rPr>
+                <w:rFonts w:ascii="Arial" w:hAnsi="Arial" w:cs="Arial"/>
+                <w:b/>
+              </w:rPr>
+              <w:t>Hyland Hills</w:t>
+            </w:r>
+            <w:r>
+              <w:rPr>
+                <w:rFonts w:ascii="Arial" w:hAnsi="Arial" w:cs="Arial"/>
+              </w:rPr>
+              <w:tab/>
+            </w:r>
+            <w:r>
+              <w:rPr>
+                <w:rFonts w:ascii="Arial" w:hAnsi="Arial" w:cs="Arial"/>
+              </w:rPr>
+              <w:t xml:space="preserve">   </w:t>
+            </w:r>
+            <w:r>
+              <w:rPr>
+                <w:rFonts w:ascii="Arial" w:hAnsi="Arial" w:cs="Arial"/>
+              </w:rPr>
+              <w:t>Westminster</w:t>
+            </w:r>
+            <w:r>
+              <w:rPr>
+                <w:rFonts w:ascii="Arial" w:hAnsi="Arial" w:cs="Arial"/>
+              </w:rPr>
+              <w:t xml:space="preserve">, CO </w:t>
+            </w:r>
+          </w:p>
+          <w:p>
+            <w:pPr>
+              <w:pStyle w:val="Achievement"/>
+              <w:rPr>
+                <w:rFonts w:ascii="Arial" w:hAnsi="Arial" w:cs="Arial"/>
+              </w:rPr>
+            </w:pPr>
+            <w:r>
+              <w:rPr>
+                <w:rFonts w:ascii="Arial" w:hAnsi="Arial" w:cs="Arial"/>
+                <w:lang w:val="en"/>
+              </w:rPr>
+              <w:t>Assistant</w:t>
+            </w:r>
+            <w:r>
+              <w:rPr>
+                <w:rFonts w:ascii="Arial" w:hAnsi="Arial" w:cs="Arial"/>
+                <w:lang w:val="en"/>
+              </w:rPr>
+              <w:t>/Goalie</w:t>
+            </w:r>
+            <w:r>
+              <w:rPr>
+                <w:rFonts w:ascii="Arial" w:hAnsi="Arial" w:cs="Arial"/>
+              </w:rPr>
+              <w:t xml:space="preserve"> Coach</w:t>
+            </w:r>
+            <w:r>
+              <w:rPr>
+                <w:rFonts w:ascii="Arial" w:hAnsi="Arial" w:cs="Arial"/>
+              </w:rPr>
+              <w:t xml:space="preserve"> – Bantam B</w:t>
+            </w:r>
+          </w:p>
+          <w:p>
+            <w:pPr>
+              <w:pStyle w:val="Achievement"/>
+              <w:rPr>
+                <w:rFonts w:ascii="Arial" w:hAnsi="Arial" w:cs="Arial"/>
+              </w:rPr>
+            </w:pPr>
+            <w:r>
+              <w:rPr>
+                <w:rFonts w:ascii="Arial" w:hAnsi="Arial" w:cs="Arial"/>
+              </w:rPr>
+              <w:t>State Champion</w:t>
+            </w:r>
+          </w:p>
+          <w:p>
+            <w:pPr>
+              <w:pStyle w:val="Institution"/>
+              <w:tabs>
+                <w:tab w:val="left" w:pos="-630"/>
+              </w:tabs>
+              <w:ind w:left="-108"/>
+              <w:rPr>
+                <w:rFonts w:ascii="Arial" w:hAnsi="Arial" w:cs="Arial"/>
+              </w:rPr>
+            </w:pPr>
+            <w:r>
+              <w:rPr>
+                <w:rFonts w:ascii="Arial" w:hAnsi="Arial" w:cs="Arial"/>
+              </w:rPr>
+              <w:t xml:space="preserve">    </w:t>
+            </w:r>
+            <w:bookmarkStart w:id="2" w:name="_GoBack"/>
+            <w:bookmarkEnd w:id="2"/>
+            <w:r>
+              <w:rPr>
+                <w:rFonts w:ascii="Arial" w:hAnsi="Arial" w:cs="Arial"/>
+              </w:rPr>
+              <w:t xml:space="preserve">                        </w:t>
+            </w:r>
+            <w:r>
+              <w:rPr>
+                <w:rFonts w:ascii="Arial" w:hAnsi="Arial" w:cs="Arial"/>
+                <w:b/>
+              </w:rPr>
+              <w:t>Boulder Hockey Club</w:t>
+            </w:r>
+            <w:r>
+              <w:rPr>
+                <w:rFonts w:ascii="Arial" w:hAnsi="Arial" w:cs="Arial"/>
+              </w:rPr>
+              <w:t xml:space="preserve"> </w:t>
+            </w:r>
+            <w:r>
+              <w:rPr>
+                <w:rFonts w:ascii="Arial" w:hAnsi="Arial" w:cs="Arial"/>
+              </w:rPr>
+              <w:t xml:space="preserve">            </w:t>
+            </w:r>
+            <w:r>
+              <w:rPr>
+                <w:rFonts w:ascii="Arial" w:hAnsi="Arial" w:cs="Arial"/>
+              </w:rPr>
+              <w:t xml:space="preserve">     </w:t>
+            </w:r>
+            <w:r>
+              <w:rPr>
+                <w:rFonts w:ascii="Arial" w:hAnsi="Arial" w:cs="Arial"/>
+              </w:rPr>
+              <w:t xml:space="preserve">     </w:t>
+            </w:r>
+            <w:r>
+              <w:rPr>
+                <w:rFonts w:ascii="Arial" w:hAnsi="Arial" w:cs="Arial"/>
+              </w:rPr>
+              <w:t xml:space="preserve"> </w:t>
+            </w:r>
+            <w:r>
+              <w:rPr>
+                <w:rFonts w:ascii="Arial" w:hAnsi="Arial" w:cs="Arial"/>
+              </w:rPr>
+              <w:t>Boulder</w:t>
+            </w:r>
+            <w:r>
+              <w:rPr>
+                <w:rFonts w:ascii="Arial" w:hAnsi="Arial" w:cs="Arial"/>
+              </w:rPr>
+              <w:t>, CO</w:t>
+            </w:r>
+            <w:r>
+              <w:rPr>
+                <w:rFonts w:ascii="Arial" w:hAnsi="Arial" w:cs="Arial"/>
+              </w:rPr>
+              <w:t xml:space="preserve"> </w:t>
+            </w:r>
+          </w:p>
+          <w:p>
+            <w:pPr>
+              <w:pStyle w:val="Achievement"/>
+              <w:rPr>
+                <w:rFonts w:ascii="Arial" w:hAnsi="Arial" w:cs="Arial"/>
+              </w:rPr>
+            </w:pPr>
+            <w:r>
+              <w:rPr>
+                <w:rFonts w:ascii="Arial" w:hAnsi="Arial" w:cs="Arial"/>
+                <w:lang w:val="en"/>
+              </w:rPr>
+              <w:t xml:space="preserve">Head </w:t>
+            </w:r>
+            <w:r>
+              <w:rPr>
+                <w:rFonts w:ascii="Arial" w:hAnsi="Arial" w:cs="Arial"/>
+              </w:rPr>
+              <w:t>Coach –</w:t>
+            </w:r>
+            <w:r>
+              <w:rPr>
+                <w:rFonts w:ascii="Arial" w:hAnsi="Arial" w:cs="Arial"/>
+              </w:rPr>
+              <w:t xml:space="preserve"> Major A</w:t>
+            </w:r>
+          </w:p>
+          <w:p>
+            <w:pPr>
+              <w:pStyle w:val="Institution"/>
+              <w:rPr>
+                <w:rFonts w:ascii="Arial" w:hAnsi="Arial" w:cs="Arial"/>
+              </w:rPr>
+            </w:pPr>
+            <w:r>
+              <w:rPr>
+                <w:rFonts w:ascii="Arial" w:hAnsi="Arial" w:cs="Arial"/>
+              </w:rPr>
+              <w:tab/>
+            </w:r>
+            <w:r>
+              <w:rPr>
+                <w:rFonts w:ascii="Arial" w:hAnsi="Arial" w:cs="Arial"/>
+              </w:rPr>
+              <w:t xml:space="preserve">  </w:t>
+            </w:r>
+            <w:r>
+              <w:rPr>
+                <w:rFonts w:ascii="Arial" w:hAnsi="Arial" w:cs="Arial"/>
+                <w:b/>
+              </w:rPr>
+              <w:t>Fairview High School</w:t>
+            </w:r>
+            <w:r>
+              <w:rPr>
+                <w:rFonts w:ascii="Arial" w:hAnsi="Arial" w:cs="Arial"/>
+              </w:rPr>
+              <w:t xml:space="preserve">                        </w:t>
+            </w:r>
+            <w:r>
+              <w:rPr>
+                <w:rFonts w:ascii="Arial" w:hAnsi="Arial" w:cs="Arial"/>
+              </w:rPr>
+              <w:t xml:space="preserve">Boulder, CO </w:t>
+            </w:r>
+          </w:p>
+          <w:p>
+            <w:pPr>
+              <w:pStyle w:val="Achievement"/>
+              <w:rPr>
+                <w:rFonts w:ascii="Arial" w:hAnsi="Arial" w:cs="Arial"/>
+              </w:rPr>
+            </w:pPr>
+            <w:r>
+              <w:rPr>
+                <w:rFonts w:ascii="Arial" w:hAnsi="Arial" w:cs="Arial"/>
+              </w:rPr>
+              <w:t>Head Coach -  Varsity</w:t>
+            </w:r>
+          </w:p>
+          <w:p>
+            <w:pPr>
+              <w:pStyle w:val="Institution"/>
+              <w:rPr>
+                <w:rFonts w:ascii="Arial" w:hAnsi="Arial" w:cs="Arial"/>
+              </w:rPr>
+            </w:pPr>
+            <w:r>
+              <w:rPr>
+                <w:rFonts w:ascii="Arial" w:hAnsi="Arial" w:cs="Arial"/>
+              </w:rPr>
+              <w:t xml:space="preserve">   </w:t>
+            </w:r>
+            <w:r>
+              <w:rPr>
+                <w:rFonts w:ascii="Arial" w:hAnsi="Arial" w:cs="Arial"/>
+              </w:rPr>
+              <w:t xml:space="preserve">                      </w:t>
+            </w:r>
+            <w:proofErr w:type="spellStart"/>
+            <w:r>
+              <w:rPr>
+                <w:rFonts w:ascii="Arial" w:hAnsi="Arial" w:cs="Arial"/>
+                <w:b/>
+              </w:rPr>
+              <w:t>Thundercats</w:t>
+            </w:r>
+            <w:proofErr w:type="spellEnd"/>
+            <w:r>
+              <w:rPr>
+                <w:rFonts w:ascii="Arial" w:hAnsi="Arial" w:cs="Arial"/>
+                <w:b/>
+              </w:rPr>
+              <w:t xml:space="preserve"> Volleyball</w:t>
+            </w:r>
+            <w:r>
+              <w:rPr>
+                <w:rFonts w:ascii="Arial" w:hAnsi="Arial" w:cs="Arial"/>
+              </w:rPr>
+              <w:t xml:space="preserve">             </w:t>
+            </w:r>
+            <w:r>
+              <w:rPr>
+                <w:rFonts w:ascii="Arial" w:hAnsi="Arial" w:cs="Arial"/>
+              </w:rPr>
+              <w:t xml:space="preserve">        Thornton</w:t>
+            </w:r>
+            <w:r>
+              <w:rPr>
+                <w:rFonts w:ascii="Arial" w:hAnsi="Arial" w:cs="Arial"/>
+              </w:rPr>
+              <w:t xml:space="preserve">, CO </w:t>
+            </w:r>
+          </w:p>
+          <w:p>
+            <w:pPr>
+              <w:pStyle w:val="Achievement"/>
+              <w:rPr>
+                <w:rFonts w:ascii="Arial" w:hAnsi="Arial" w:cs="Arial"/>
+              </w:rPr>
+            </w:pPr>
+            <w:r>
+              <w:rPr>
+                <w:rFonts w:ascii="Arial" w:hAnsi="Arial" w:cs="Arial"/>
+              </w:rPr>
+              <w:t>Video</w:t>
+            </w:r>
+            <w:r>
+              <w:rPr>
+                <w:rFonts w:ascii="Arial" w:hAnsi="Arial" w:cs="Arial"/>
+              </w:rPr>
+              <w:t xml:space="preserve"> Coach </w:t>
+            </w:r>
+            <w:r>
+              <w:rPr>
+                <w:rFonts w:ascii="Arial" w:hAnsi="Arial" w:cs="Arial"/>
+              </w:rPr>
+              <w:t>– AAU – Ranked 7</w:t>
+            </w:r>
+            <w:r>
+              <w:rPr>
+                <w:rFonts w:ascii="Arial" w:hAnsi="Arial" w:cs="Arial"/>
+                <w:vertAlign w:val="superscript"/>
+              </w:rPr>
+              <w:t>th</w:t>
+            </w:r>
+            <w:r>
+              <w:rPr>
+                <w:rFonts w:ascii="Arial" w:hAnsi="Arial" w:cs="Arial"/>
+              </w:rPr>
+              <w:t xml:space="preserve"> in the Nation</w:t>
+            </w:r>
+            <w:r>
+              <w:rPr>
+                <w:rFonts w:ascii="Arial" w:hAnsi="Arial" w:cs="Arial"/>
+              </w:rPr>
+              <w:t xml:space="preserve"> </w:t>
+            </w:r>
+            <w:r>
+              <w:rPr>
+                <w:rFonts w:ascii="Arial" w:hAnsi="Arial" w:cs="Arial"/>
+              </w:rPr>
+              <w:t xml:space="preserve"> </w:t>
+            </w:r>
+          </w:p>
+          <w:p>
+            <w:pPr>
+              <w:pStyle w:val="Achievement"/>
+              <w:rPr>
+                <w:rFonts w:ascii="Arial" w:hAnsi="Arial" w:cs="Arial"/>
+              </w:rPr>
+            </w:pPr>
+          </w:p>
+          <w:p>
+            <w:pPr>
+              <w:pStyle w:val="Achievement"/>
+              <w:rPr>
+                <w:rFonts w:ascii="Arial" w:hAnsi="Arial" w:cs="Arial"/>
+              </w:rPr>
+            </w:pPr>
+          </w:p>
+        </w:tc>
+      </w:tr>
+      <w:tr>
+        <w:tblPrEx>
+          <w:tblCellMar>
+            <w:top w:w="0" w:type="dxa"/>
+            <w:bottom w:w="0" w:type="dxa"/>
+          </w:tblCellMar>
+        </w:tblPrEx>
+        <w:tc>
+          <w:tcPr>
+            <w:tcW w:w="648" w:type="dxa"/>
+          </w:tcPr>
+          <w:p>
+            <w:pPr>
+              <w:pStyle w:val="NoTitle"/>
+            </w:pPr>
+            <w:r>
+              <w:lastRenderedPageBreak/>
+              <w:t xml:space="preserve"> </w:t>
+            </w:r>
+          </w:p>
+        </w:tc>
+        <w:tc>
+          <w:tcPr>
+            <w:tcW w:w="8190" w:type="dxa"/>
+          </w:tcPr>
+          <w:p>
+            <w:pPr>
+              <w:pStyle w:val="Institution"/>
+              <w:rPr>
+                <w:rFonts w:ascii="Arial" w:hAnsi="Arial" w:cs="Arial"/>
+              </w:rPr>
+            </w:pPr>
+            <w:r>
+              <w:rPr>
+                <w:rFonts w:ascii="Arial" w:hAnsi="Arial" w:cs="Arial"/>
+              </w:rPr>
+              <w:t xml:space="preserve">  </w:t>
+            </w:r>
+          </w:p>
+        </w:tc>
+      </w:tr>
+    </w:tbl>
     <w:p/>
     <w:sectPr>
       <w:pgSz w:w="12240" w:h="15840"/>
@@ -1124,6 +3735,155 @@
     </w:lvl>
   </w:abstractNum>
   <w:abstractNum w:abstractNumId="1" w15:restartNumberingAfterBreak="0">
+    <w:nsid w:val="2235002E"/>
+    <w:multiLevelType w:val="multilevel"/>
+    <w:tmpl w:val="24E2772C"/>
+    <w:lvl w:ilvl="0">
+      <w:start w:val="1"/>
+      <w:numFmt w:val="bullet"/>
+      <w:lvlText w:val=""/>
+      <w:lvlJc w:val="left"/>
+      <w:pPr>
+        <w:tabs>
+          <w:tab w:val="num" w:pos="720"/>
+        </w:tabs>
+        <w:ind w:left="720" w:hanging="360"/>
+      </w:pPr>
+      <w:rPr>
+        <w:rFonts w:ascii="Symbol" w:hAnsi="Symbol" w:hint="default"/>
+        <w:sz w:val="20"/>
+      </w:rPr>
+    </w:lvl>
+    <w:lvl w:ilvl="1" w:tentative="1">
+      <w:start w:val="1"/>
+      <w:numFmt w:val="bullet"/>
+      <w:lvlText w:val="o"/>
+      <w:lvlJc w:val="left"/>
+      <w:pPr>
+        <w:tabs>
+          <w:tab w:val="num" w:pos="1440"/>
+        </w:tabs>
+        <w:ind w:left="1440" w:hanging="360"/>
+      </w:pPr>
+      <w:rPr>
+        <w:rFonts w:ascii="Courier New" w:hAnsi="Courier New" w:hint="default"/>
+        <w:sz w:val="20"/>
+      </w:rPr>
+    </w:lvl>
+    <w:lvl w:ilvl="2" w:tentative="1">
+      <w:start w:val="1"/>
+      <w:numFmt w:val="bullet"/>
+      <w:lvlText w:val=""/>
+      <w:lvlJc w:val="left"/>
+      <w:pPr>
+        <w:tabs>
+          <w:tab w:val="num" w:pos="2160"/>
+        </w:tabs>
+        <w:ind w:left="2160" w:hanging="360"/>
+      </w:pPr>
+      <w:rPr>
+        <w:rFonts w:ascii="Wingdings" w:hAnsi="Wingdings" w:hint="default"/>
+        <w:sz w:val="20"/>
+      </w:rPr>
+    </w:lvl>
+    <w:lvl w:ilvl="3" w:tentative="1">
+      <w:start w:val="1"/>
+      <w:numFmt w:val="bullet"/>
+      <w:lvlText w:val=""/>
+      <w:lvlJc w:val="left"/>
+      <w:pPr>
+        <w:tabs>
+          <w:tab w:val="num" w:pos="2880"/>
+        </w:tabs>
+        <w:ind w:left="2880" w:hanging="360"/>
+      </w:pPr>
+      <w:rPr>
+        <w:rFonts w:ascii="Wingdings" w:hAnsi="Wingdings" w:hint="default"/>
+        <w:sz w:val="20"/>
+      </w:rPr>
+    </w:lvl>
+    <w:lvl w:ilvl="4" w:tentative="1">
+      <w:start w:val="1"/>
+      <w:numFmt w:val="bullet"/>
+      <w:lvlText w:val=""/>
+      <w:lvlJc w:val="left"/>
+      <w:pPr>
+        <w:tabs>
+          <w:tab w:val="num" w:pos="3600"/>
+        </w:tabs>
+        <w:ind w:left="3600" w:hanging="360"/>
+      </w:pPr>
+      <w:rPr>
+        <w:rFonts w:ascii="Wingdings" w:hAnsi="Wingdings" w:hint="default"/>
+        <w:sz w:val="20"/>
+      </w:rPr>
+    </w:lvl>
+    <w:lvl w:ilvl="5" w:tentative="1">
+      <w:start w:val="1"/>
+      <w:numFmt w:val="bullet"/>
+      <w:lvlText w:val=""/>
+      <w:lvlJc w:val="left"/>
+      <w:pPr>
+        <w:tabs>
+          <w:tab w:val="num" w:pos="4320"/>
+        </w:tabs>
+        <w:ind w:left="4320" w:hanging="360"/>
+      </w:pPr>
+      <w:rPr>
+        <w:rFonts w:ascii="Wingdings" w:hAnsi="Wingdings" w:hint="default"/>
+        <w:sz w:val="20"/>
+      </w:rPr>
+    </w:lvl>
+    <w:lvl w:ilvl="6" w:tentative="1">
+      <w:start w:val="1"/>
+      <w:numFmt w:val="bullet"/>
+      <w:lvlText w:val=""/>
+      <w:lvlJc w:val="left"/>
+      <w:pPr>
+        <w:tabs>
+          <w:tab w:val="num" w:pos="5040"/>
+        </w:tabs>
+        <w:ind w:left="5040" w:hanging="360"/>
+      </w:pPr>
+      <w:rPr>
+        <w:rFonts w:ascii="Wingdings" w:hAnsi="Wingdings" w:hint="default"/>
+        <w:sz w:val="20"/>
+      </w:rPr>
+    </w:lvl>
+    <w:lvl w:ilvl="7" w:tentative="1">
+      <w:start w:val="1"/>
+      <w:numFmt w:val="bullet"/>
+      <w:lvlText w:val=""/>
+      <w:lvlJc w:val="left"/>
+      <w:pPr>
+        <w:tabs>
+          <w:tab w:val="num" w:pos="5760"/>
+        </w:tabs>
+        <w:ind w:left="5760" w:hanging="360"/>
+      </w:pPr>
+      <w:rPr>
+        <w:rFonts w:ascii="Wingdings" w:hAnsi="Wingdings" w:hint="default"/>
+        <w:sz w:val="20"/>
+      </w:rPr>
+    </w:lvl>
+    <w:lvl w:ilvl="8" w:tentative="1">
+      <w:start w:val="1"/>
+      <w:numFmt w:val="bullet"/>
+      <w:lvlText w:val=""/>
+      <w:lvlJc w:val="left"/>
+      <w:pPr>
+        <w:tabs>
+          <w:tab w:val="num" w:pos="6480"/>
+        </w:tabs>
+        <w:ind w:left="6480" w:hanging="360"/>
+      </w:pPr>
+      <w:rPr>
+        <w:rFonts w:ascii="Wingdings" w:hAnsi="Wingdings" w:hint="default"/>
+        <w:sz w:val="20"/>
+      </w:rPr>
+    </w:lvl>
+  </w:abstractNum>
+  <w:abstractNum w:abstractNumId="2" w15:restartNumberingAfterBreak="0">
     <w:nsid w:val="51B42BD2"/>
     <w:multiLevelType w:val="hybridMultilevel"/>
     <w:tmpl w:val="C318E95E"/>
@@ -1236,7 +3996,7 @@
       </w:rPr>
     </w:lvl>
   </w:abstractNum>
-  <w:abstractNum w:abstractNumId="2" w15:restartNumberingAfterBreak="0">
+  <w:abstractNum w:abstractNumId="3" w15:restartNumberingAfterBreak="0">
     <w:nsid w:val="59D872A4"/>
     <w:multiLevelType w:val="hybridMultilevel"/>
     <w:tmpl w:val="86C6CC48"/>
@@ -1350,13 +4110,16 @@
     </w:lvl>
   </w:abstractNum>
   <w:num w:numId="1">
-    <w:abstractNumId w:val="2"/>
+    <w:abstractNumId w:val="3"/>
   </w:num>
   <w:num w:numId="2">
-    <w:abstractNumId w:val="1"/>
+    <w:abstractNumId w:val="2"/>
   </w:num>
   <w:num w:numId="3">
     <w:abstractNumId w:val="0"/>
+  </w:num>
+  <w:num w:numId="4">
+    <w:abstractNumId w:val="1"/>
   </w:num>
 </w:numbering>
 </file>
@@ -1753,6 +4516,7 @@
   </w:latentStyles>
   <w:style w:type="paragraph" w:default="1" w:styleId="Normal">
     <w:name w:val="Normal"/>
+    <w:rsid w:val="00B62D88"/>
   </w:style>
   <w:style w:type="paragraph" w:styleId="Heading1">
     <w:name w:val="heading 1"/>
@@ -1849,7 +4613,6 @@
   <w:style w:type="character" w:default="1" w:styleId="DefaultParagraphFont">
     <w:name w:val="Default Paragraph Font"/>
     <w:uiPriority w:val="1"/>
-    <w:semiHidden/>
     <w:unhideWhenUsed/>
   </w:style>
   <w:style w:type="table" w:default="1" w:styleId="TableNormal">
@@ -1945,6 +4708,75 @@
       <w:sz w:val="28"/>
       <w:szCs w:val="28"/>
     </w:rPr>
+  </w:style>
+  <w:style w:type="paragraph" w:customStyle="1" w:styleId="Achievement">
+    <w:name w:val="Achievement"/>
+    <w:basedOn w:val="BodyText"/>
+    <w:rsid w:val="00C10C8E"/>
+    <w:pPr>
+      <w:spacing w:after="60" w:line="240" w:lineRule="atLeast"/>
+      <w:ind w:left="240" w:hanging="240"/>
+      <w:jc w:val="both"/>
+    </w:pPr>
+    <w:rPr>
+      <w:rFonts w:ascii="Garamond" w:eastAsia="Times New Roman" w:hAnsi="Garamond" w:cs="Times New Roman"/>
+      <w:szCs w:val="20"/>
+      <w:lang w:val="en-US"/>
+    </w:rPr>
+  </w:style>
+  <w:style w:type="paragraph" w:customStyle="1" w:styleId="Institution">
+    <w:name w:val="Institution"/>
+    <w:basedOn w:val="Normal"/>
+    <w:next w:val="Achievement"/>
+    <w:rsid w:val="00C10C8E"/>
+    <w:pPr>
+      <w:tabs>
+        <w:tab w:val="left" w:pos="1440"/>
+        <w:tab w:val="right" w:pos="6480"/>
+      </w:tabs>
+      <w:spacing w:before="60" w:line="220" w:lineRule="atLeast"/>
+    </w:pPr>
+    <w:rPr>
+      <w:rFonts w:ascii="Garamond" w:eastAsia="Times New Roman" w:hAnsi="Garamond" w:cs="Times New Roman"/>
+      <w:szCs w:val="20"/>
+      <w:lang w:val="en-US"/>
+    </w:rPr>
+  </w:style>
+  <w:style w:type="paragraph" w:customStyle="1" w:styleId="NoTitle">
+    <w:name w:val="No Title"/>
+    <w:basedOn w:val="Normal"/>
+    <w:rsid w:val="00C10C8E"/>
+    <w:pPr>
+      <w:spacing w:before="220" w:line="220" w:lineRule="atLeast"/>
+    </w:pPr>
+    <w:rPr>
+      <w:rFonts w:ascii="Garamond" w:eastAsia="Times New Roman" w:hAnsi="Garamond" w:cs="Times New Roman"/>
+      <w:caps/>
+      <w:spacing w:val="15"/>
+      <w:sz w:val="20"/>
+      <w:szCs w:val="20"/>
+      <w:lang w:val="en-US"/>
+    </w:rPr>
+  </w:style>
+  <w:style w:type="paragraph" w:styleId="BodyText">
+    <w:name w:val="Body Text"/>
+    <w:basedOn w:val="Normal"/>
+    <w:link w:val="BodyTextChar"/>
+    <w:uiPriority w:val="99"/>
+    <w:semiHidden/>
+    <w:unhideWhenUsed/>
+    <w:rsid w:val="00C10C8E"/>
+    <w:pPr>
+      <w:spacing w:after="120"/>
+    </w:pPr>
+  </w:style>
+  <w:style w:type="character" w:customStyle="1" w:styleId="BodyTextChar">
+    <w:name w:val="Body Text Char"/>
+    <w:basedOn w:val="DefaultParagraphFont"/>
+    <w:link w:val="BodyText"/>
+    <w:uiPriority w:val="99"/>
+    <w:semiHidden/>
+    <w:rsid w:val="00C10C8E"/>
   </w:style>
 </w:styles>
 </file>

</xml_diff>

<commit_message>
add resume to contact
update form
</commit_message>
<xml_diff>
--- a/public/Hilliard-M-Scott-Resume-2025.docx
+++ b/public/Hilliard-M-Scott-Resume-2025.docx
@@ -37,7 +37,7 @@
       <w:r>
         <w:t xml:space="preserve"> </w:t>
       </w:r>
-      <w:hyperlink r:id="rId5" w:history="1">
+      <w:hyperlink r:id="rId7" w:history="1">
         <w:r>
           <w:rPr>
             <w:rStyle w:val="Hyperlink"/>
@@ -63,12 +63,18 @@
         <w:spacing w:before="240" w:after="240"/>
         <w:jc w:val="center"/>
         <w:rPr>
-          <w:b/>
-        </w:rPr>
-      </w:pPr>
-      <w:r>
-        <w:rPr>
-          <w:b/>
+          <w:rStyle w:val="BookTitle"/>
+          <w:i w:val="0"/>
+          <w:sz w:val="28"/>
+          <w:szCs w:val="28"/>
+        </w:rPr>
+      </w:pPr>
+      <w:r>
+        <w:rPr>
+          <w:rStyle w:val="BookTitle"/>
+          <w:i w:val="0"/>
+          <w:sz w:val="28"/>
+          <w:szCs w:val="28"/>
         </w:rPr>
         <w:t>Seni</w:t>
       </w:r>
@@ -76,7 +82,10 @@
       <w:bookmarkEnd w:id="0"/>
       <w:r>
         <w:rPr>
-          <w:b/>
+          <w:rStyle w:val="BookTitle"/>
+          <w:i w:val="0"/>
+          <w:sz w:val="28"/>
+          <w:szCs w:val="28"/>
         </w:rPr>
         <w:t>or Engineer &amp; Entrepreneur</w:t>
       </w:r>
@@ -110,7 +119,7 @@
                     <pic:cNvPicPr/>
                   </pic:nvPicPr>
                   <pic:blipFill>
-                    <a:blip r:embed="rId6">
+                    <a:blip r:embed="rId8">
                       <a:extLst>
                         <a:ext uri="{28A0092B-C50C-407E-A947-70E740481C1C}">
                           <a14:useLocalDpi xmlns:a14="http://schemas.microsoft.com/office/drawing/2010/main" val="0"/>
@@ -204,7 +213,10 @@
       </w:r>
       <w:proofErr w:type="spellEnd"/>
       <w:r>
-        <w:t xml:space="preserve"> to develop a revolutionary platform for aspiring young entrepreneurs. </w:t>
+        <w:t xml:space="preserve"> to develop a</w:t>
+      </w:r>
+      <w:r>
+        <w:t xml:space="preserve"> platform for aspiring young entrepreneurs. </w:t>
       </w:r>
     </w:p>
     <w:p>
@@ -323,12 +335,6 @@
           <w:lang w:val="en-US"/>
         </w:rPr>
       </w:pPr>
-      <w:r>
-        <w:rPr>
-          <w:lang w:val="en-US"/>
-        </w:rPr>
-        <w:t xml:space="preserve">                </w:t>
-      </w:r>
     </w:p>
     <w:p>
       <w:pPr>
@@ -432,7 +438,13 @@
         <w:rPr>
           <w:lang w:val="en-US"/>
         </w:rPr>
-        <w:t>TypeS</w:t>
+        <w:t>T</w:t>
+      </w:r>
+      <w:r>
+        <w:rPr>
+          <w:lang w:val="en-US"/>
+        </w:rPr>
+        <w:t>ypeS</w:t>
       </w:r>
       <w:r>
         <w:rPr>
@@ -461,6 +473,14 @@
           <w:lang w:val="en-US"/>
         </w:rPr>
       </w:pPr>
+    </w:p>
+    <w:p>
+      <w:pPr>
+        <w:ind w:left="720"/>
+        <w:rPr>
+          <w:lang w:val="en-US"/>
+        </w:rPr>
+      </w:pPr>
       <w:r>
         <w:rPr>
           <w:b/>
@@ -627,6 +647,7 @@
           <w:bCs/>
           <w:lang w:val="en-US"/>
         </w:rPr>
+        <w:lastRenderedPageBreak/>
         <w:t xml:space="preserve">Tools: </w:t>
       </w:r>
       <w:proofErr w:type="spellStart"/>
@@ -1286,6 +1307,7 @@
           <w:bCs/>
           <w:lang w:val="en-US"/>
         </w:rPr>
+        <w:lastRenderedPageBreak/>
         <w:t xml:space="preserve">Exit: </w:t>
       </w:r>
       <w:r>
@@ -1336,11 +1358,7 @@
       </w:r>
       <w:proofErr w:type="spellEnd"/>
       <w:r>
-        <w:t xml:space="preserve">, the world's smallest and lightest tape drive. This portable data </w:t>
-      </w:r>
-      <w:r>
-        <w:lastRenderedPageBreak/>
-        <w:t>storage device was a technological marvel, offering unprecedented data mobility and backup capabilities for the time.</w:t>
+        <w:t>, the world's smallest and lightest tape drive. This portable data storage device was a technological marvel, offering unprecedented data mobility and backup capabilities for the time.</w:t>
       </w:r>
     </w:p>
     <w:p>
@@ -1629,14 +1647,20 @@
         <w:rPr>
           <w:lang w:val="en-US"/>
         </w:rPr>
-        <w:t>HPu</w:t>
+        <w:t>HPux</w:t>
       </w:r>
       <w:proofErr w:type="spellEnd"/>
       <w:r>
         <w:rPr>
           <w:lang w:val="en-US"/>
         </w:rPr>
-        <w:t xml:space="preserve">, </w:t>
+        <w:t>,</w:t>
+      </w:r>
+      <w:r>
+        <w:rPr>
+          <w:lang w:val="en-US"/>
+        </w:rPr>
+        <w:t xml:space="preserve"> </w:t>
       </w:r>
       <w:proofErr w:type="gramStart"/>
       <w:r>
@@ -1792,7 +1816,19 @@
         <w:rPr>
           <w:lang w:val="en-US"/>
         </w:rPr>
-        <w:t>) in August 2005 for US$4.1 billion.</w:t>
+        <w:t>) in August 2005 for US</w:t>
+      </w:r>
+      <w:r>
+        <w:rPr>
+          <w:lang w:val="en-US"/>
+        </w:rPr>
+        <w:t xml:space="preserve"> </w:t>
+      </w:r>
+      <w:r>
+        <w:rPr>
+          <w:lang w:val="en-US"/>
+        </w:rPr>
+        <w:t>$4.1 billion.</w:t>
       </w:r>
     </w:p>
     <w:p>
@@ -1839,7 +1875,11 @@
         <w:t>I d</w:t>
       </w:r>
       <w:r>
-        <w:t>esigned and built mission-critical power supplies for the nation's most advanced defense and aerospace platforms. My projects included developing power systems for the Space Shuttle (NASA), nuclear submarines (U.S. Navy), and Black Ops helicopters (U.S. Air</w:t>
+        <w:t xml:space="preserve">esigned and built mission-critical power supplies for the nation's most advanced defense and aerospace platforms. My projects included developing </w:t>
+      </w:r>
+      <w:r>
+        <w:lastRenderedPageBreak/>
+        <w:t>power systems for the Space Shuttle (NASA), nuclear submarines (U.S. Navy), and Black Ops helicopters (U.S. Air</w:t>
       </w:r>
       <w:r>
         <w:t>f</w:t>
@@ -1938,16 +1978,6 @@
         </w:rPr>
         <w:t xml:space="preserve"> NASA Qualified Assembler, Quality Control</w:t>
       </w:r>
-    </w:p>
-    <w:p>
-      <w:pPr>
-        <w:spacing w:before="240" w:after="240"/>
-      </w:pPr>
-    </w:p>
-    <w:p>
-      <w:pPr>
-        <w:spacing w:before="240" w:after="240"/>
-      </w:pPr>
     </w:p>
     <w:p>
       <w:pPr>
@@ -2097,7 +2127,7 @@
         <w:rPr>
           <w:lang w:val="en-US"/>
         </w:rPr>
-        <w:t>       </w:t>
+        <w:t>Maintain Broadcast Systems: Oversee the maintenance, repair, and installation of all broadcast equipment, including studio consoles, microphones, transmitters, antennas, and remote broadcast gear.</w:t>
       </w:r>
     </w:p>
     <w:p>
@@ -2116,7 +2146,7 @@
         <w:rPr>
           <w:lang w:val="en-US"/>
         </w:rPr>
-        <w:t>Maintain Broadcast Systems: Oversee the maintenance, repair, and installation of all broadcast equipment, including studio consoles, microphones, transmitters, antennas, and remote broadcast gear.</w:t>
+        <w:t>Ensure FCC Compliance: Serve as the station's Chief Operator, ensuring full compliance with all FCC technical regulations, maintaining station logs, and performing required EAS tests.</w:t>
       </w:r>
     </w:p>
     <w:p>
@@ -2135,7 +2165,7 @@
         <w:rPr>
           <w:lang w:val="en-US"/>
         </w:rPr>
-        <w:t>Ensure FCC Compliance: Serve as the station's Chief Operator, ensuring full compliance with all FCC technical regulations, maintaining station logs, and performing required EAS tests.</w:t>
+        <w:t>Manage IT Infrastructure: Supervise the health and performance of station computers, servers, networking equipment, and the audio automation system.</w:t>
       </w:r>
     </w:p>
     <w:p>
@@ -2154,7 +2184,7 @@
         <w:rPr>
           <w:lang w:val="en-US"/>
         </w:rPr>
-        <w:t>Manage IT Infrastructure: Supervise the health and performance of station computers, servers, networking equipment, and the audio automation system.</w:t>
+        <w:t>Troubleshoot &amp; Repair: Provide timely and effective troubleshooting for any technical issues that arise, minimizing off-air time and resolving equipment failures.</w:t>
       </w:r>
     </w:p>
     <w:p>
@@ -2173,49 +2203,14 @@
         <w:rPr>
           <w:lang w:val="en-US"/>
         </w:rPr>
-        <w:t>Troubleshoot &amp; Repair: Provide timely and effective troubleshooting for any technical issues that arise, minimizing off-air time and resolving equipment failures.</w:t>
-      </w:r>
-    </w:p>
-    <w:p>
-      <w:pPr>
-        <w:pStyle w:val="ListParagraph"/>
-        <w:numPr>
-          <w:ilvl w:val="1"/>
-          <w:numId w:val="1"/>
-        </w:numPr>
-        <w:spacing w:before="240" w:after="240"/>
-        <w:rPr>
-          <w:lang w:val="en-US"/>
-        </w:rPr>
-      </w:pPr>
-      <w:r>
-        <w:rPr>
-          <w:lang w:val="en-US"/>
-        </w:rPr>
         <w:t>Strategic Technical Planning: Research, propose, and implement technology upgrades to improve broadcast quality and station capabilities.</w:t>
       </w:r>
-    </w:p>
-    <w:p>
-      <w:pPr>
-        <w:spacing w:before="240" w:after="240"/>
-        <w:rPr>
-          <w:lang w:val="en-US"/>
-        </w:rPr>
-      </w:pPr>
-      <w:r>
-        <w:rPr>
-          <w:lang w:val="en-US"/>
-        </w:rPr>
-        <w:t xml:space="preserve">            </w:t>
-      </w:r>
-    </w:p>
-    <w:p>
-      <w:pPr>
-        <w:spacing w:before="240" w:after="240"/>
-        <w:rPr>
-          <w:lang w:val="en-US"/>
-        </w:rPr>
-      </w:pPr>
+      <w:r>
+        <w:rPr>
+          <w:lang w:val="en-US"/>
+        </w:rPr>
+        <w:t xml:space="preserve"> </w:t>
+      </w:r>
     </w:p>
     <w:p>
       <w:pPr>
@@ -2288,6 +2283,7 @@
         <w:rPr>
           <w:lang w:val="en-US"/>
         </w:rPr>
+        <w:lastRenderedPageBreak/>
         <w:t>Content &amp; Mission Alignment: Ensure all on-air content reflects KGNU’s core mission of diversity, inclusiveness, and providing a platform for overlooked perspectives.</w:t>
       </w:r>
     </w:p>
@@ -2307,7 +2303,6 @@
         <w:rPr>
           <w:lang w:val="en-US"/>
         </w:rPr>
-        <w:lastRenderedPageBreak/>
         <w:t>Quality Control: Monitor on-air sound and programming to ensure a high standard of quality and professionalism.</w:t>
       </w:r>
     </w:p>
@@ -2332,27 +2327,13 @@
     </w:p>
     <w:p>
       <w:pPr>
-        <w:pStyle w:val="Heading3"/>
-        <w:keepNext w:val="0"/>
-        <w:keepLines w:val="0"/>
-        <w:spacing w:before="280"/>
-        <w:rPr>
-          <w:b/>
-          <w:color w:val="000000"/>
-          <w:sz w:val="26"/>
-          <w:szCs w:val="26"/>
-        </w:rPr>
-      </w:pPr>
-      <w:r>
-        <w:rPr>
-          <w:b/>
-          <w:color w:val="000000"/>
-          <w:sz w:val="26"/>
-          <w:szCs w:val="26"/>
-        </w:rPr>
-        <w:t>Education</w:t>
-      </w:r>
-    </w:p>
+        <w:spacing w:before="240" w:after="240"/>
+        <w:rPr>
+          <w:lang w:val="en-US"/>
+        </w:rPr>
+      </w:pPr>
+    </w:p>
+    <w:p/>
     <w:tbl>
       <w:tblPr>
         <w:tblW w:w="0" w:type="auto"/>
@@ -2386,389 +2367,46 @@
           </w:tcPr>
           <w:p>
             <w:pPr>
-              <w:pStyle w:val="Institution"/>
-              <w:rPr>
-                <w:rFonts w:ascii="Arial" w:hAnsi="Arial" w:cs="Arial"/>
-              </w:rPr>
+              <w:pStyle w:val="Achievement"/>
+              <w:ind w:left="0" w:firstLine="0"/>
             </w:pPr>
-            <w:r>
-              <w:rPr>
-                <w:rFonts w:ascii="Arial" w:hAnsi="Arial" w:cs="Arial"/>
-                <w:b/>
-              </w:rPr>
-              <w:t xml:space="preserve">University of Colorado, </w:t>
-            </w:r>
-            <w:r>
-              <w:rPr>
-                <w:rFonts w:ascii="Arial" w:hAnsi="Arial" w:cs="Arial"/>
-                <w:b/>
-              </w:rPr>
-              <w:t>Colorado Springs</w:t>
-            </w:r>
-            <w:r>
-              <w:rPr>
-                <w:rFonts w:ascii="Arial" w:hAnsi="Arial" w:cs="Arial"/>
-              </w:rPr>
-              <w:tab/>
-            </w:r>
-            <w:r>
-              <w:rPr>
-                <w:rFonts w:ascii="Arial" w:hAnsi="Arial" w:cs="Arial"/>
-              </w:rPr>
-              <w:t xml:space="preserve"> </w:t>
-            </w:r>
-            <w:r>
-              <w:rPr>
-                <w:rFonts w:ascii="Arial" w:hAnsi="Arial" w:cs="Arial"/>
-              </w:rPr>
-              <w:t>Colorado Springs</w:t>
-            </w:r>
-            <w:r>
-              <w:rPr>
-                <w:rFonts w:ascii="Arial" w:hAnsi="Arial" w:cs="Arial"/>
-              </w:rPr>
-              <w:t xml:space="preserve">, CO </w:t>
-            </w:r>
           </w:p>
+        </w:tc>
+      </w:tr>
+      <w:tr>
+        <w:tblPrEx>
+          <w:tblCellMar>
+            <w:top w:w="0" w:type="dxa"/>
+            <w:bottom w:w="0" w:type="dxa"/>
+          </w:tblCellMar>
+        </w:tblPrEx>
+        <w:trPr>
+          <w:cantSplit/>
+        </w:trPr>
+        <w:tc>
+          <w:tcPr>
+            <w:tcW w:w="8838" w:type="dxa"/>
+            <w:gridSpan w:val="2"/>
+          </w:tcPr>
           <w:p>
             <w:pPr>
-              <w:pStyle w:val="Achievement"/>
-              <w:rPr>
-                <w:rFonts w:ascii="Arial" w:hAnsi="Arial" w:cs="Arial"/>
+              <w:pStyle w:val="SectionTitle"/>
+              <w:rPr>
+                <w:rFonts w:ascii="Arial" w:hAnsi="Arial" w:cs="Arial"/>
+                <w:b/>
+                <w:sz w:val="24"/>
+                <w:szCs w:val="24"/>
               </w:rPr>
             </w:pPr>
             <w:r>
               <w:rPr>
                 <w:rFonts w:ascii="Arial" w:hAnsi="Arial" w:cs="Arial"/>
-                <w:lang w:val="en"/>
-              </w:rPr>
-              <w:t>Strategic Artificial Intelligence Program</w:t>
-            </w:r>
-            <w:r>
-              <w:rPr>
-                <w:rFonts w:ascii="Arial" w:hAnsi="Arial" w:cs="Arial"/>
-              </w:rPr>
-              <w:t>.</w:t>
-            </w:r>
-            <w:r>
-              <w:rPr>
-                <w:rFonts w:ascii="Arial" w:hAnsi="Arial" w:cs="Arial"/>
-              </w:rPr>
-              <w:t xml:space="preserve"> </w:t>
-            </w:r>
-          </w:p>
-          <w:p>
-            <w:pPr>
-              <w:pStyle w:val="Institution"/>
-              <w:rPr>
-                <w:rFonts w:ascii="Arial" w:hAnsi="Arial" w:cs="Arial"/>
-              </w:rPr>
-            </w:pPr>
-            <w:r>
-              <w:rPr>
-                <w:rFonts w:ascii="Arial" w:hAnsi="Arial" w:cs="Arial"/>
-              </w:rPr>
-              <w:t xml:space="preserve">                          </w:t>
-            </w:r>
-            <w:r>
-              <w:rPr>
-                <w:rFonts w:ascii="Arial" w:hAnsi="Arial" w:cs="Arial"/>
                 <w:b/>
-              </w:rPr>
-              <w:t>University of Denver</w:t>
-            </w:r>
-            <w:r>
-              <w:rPr>
-                <w:rFonts w:ascii="Arial" w:hAnsi="Arial" w:cs="Arial"/>
-              </w:rPr>
-              <w:tab/>
-              <w:t>Denver</w:t>
-            </w:r>
-            <w:r>
-              <w:rPr>
-                <w:rFonts w:ascii="Arial" w:hAnsi="Arial" w:cs="Arial"/>
-              </w:rPr>
-              <w:t xml:space="preserve">, CO </w:t>
-            </w:r>
-          </w:p>
-          <w:p>
-            <w:pPr>
-              <w:pStyle w:val="Achievement"/>
-              <w:rPr>
-                <w:rFonts w:ascii="Arial" w:hAnsi="Arial" w:cs="Arial"/>
-              </w:rPr>
-            </w:pPr>
-            <w:r>
-              <w:rPr>
-                <w:rFonts w:ascii="Arial" w:hAnsi="Arial" w:cs="Arial"/>
-                <w:lang w:val="en"/>
-              </w:rPr>
-              <w:t>Daniels Professional Development Program</w:t>
-            </w:r>
-            <w:r>
-              <w:rPr>
-                <w:rFonts w:ascii="Arial" w:hAnsi="Arial" w:cs="Arial"/>
-              </w:rPr>
-              <w:t>.</w:t>
-            </w:r>
-          </w:p>
-          <w:p>
-            <w:pPr>
-              <w:pStyle w:val="Institution"/>
-              <w:rPr>
-                <w:rFonts w:ascii="Arial" w:hAnsi="Arial" w:cs="Arial"/>
-              </w:rPr>
-            </w:pPr>
-            <w:r>
-              <w:rPr>
-                <w:rFonts w:ascii="Arial" w:hAnsi="Arial" w:cs="Arial"/>
-              </w:rPr>
-              <w:t xml:space="preserve">                          </w:t>
-            </w:r>
-            <w:proofErr w:type="spellStart"/>
-            <w:r>
-              <w:rPr>
-                <w:rFonts w:ascii="Arial" w:hAnsi="Arial" w:cs="Arial"/>
-                <w:b/>
-              </w:rPr>
-              <w:t>Berklee</w:t>
-            </w:r>
-            <w:proofErr w:type="spellEnd"/>
-            <w:r>
-              <w:rPr>
-                <w:rFonts w:ascii="Arial" w:hAnsi="Arial" w:cs="Arial"/>
-                <w:b/>
-              </w:rPr>
-              <w:t xml:space="preserve"> College of Music</w:t>
-            </w:r>
-            <w:r>
-              <w:rPr>
-                <w:rFonts w:ascii="Arial" w:hAnsi="Arial" w:cs="Arial"/>
-              </w:rPr>
-              <w:tab/>
-              <w:t>Boston, MA</w:t>
-            </w:r>
-          </w:p>
-          <w:p>
-            <w:pPr>
-              <w:pStyle w:val="Achievement"/>
-              <w:rPr>
-                <w:rFonts w:ascii="Arial" w:hAnsi="Arial" w:cs="Arial"/>
-              </w:rPr>
-            </w:pPr>
-            <w:r>
-              <w:rPr>
-                <w:rFonts w:ascii="Arial" w:hAnsi="Arial" w:cs="Arial"/>
-              </w:rPr>
-              <w:t>Music Production</w:t>
-            </w:r>
-            <w:r>
-              <w:rPr>
-                <w:rFonts w:ascii="Arial" w:hAnsi="Arial" w:cs="Arial"/>
-              </w:rPr>
-              <w:t>.</w:t>
-            </w:r>
-          </w:p>
-          <w:p>
-            <w:pPr>
-              <w:pStyle w:val="Institution"/>
-              <w:rPr>
-                <w:rFonts w:ascii="Arial" w:hAnsi="Arial" w:cs="Arial"/>
-              </w:rPr>
-            </w:pPr>
-            <w:r>
-              <w:rPr>
-                <w:rFonts w:ascii="Arial" w:hAnsi="Arial" w:cs="Arial"/>
-              </w:rPr>
-              <w:t xml:space="preserve">                          </w:t>
-            </w:r>
-            <w:r>
-              <w:rPr>
-                <w:rFonts w:ascii="Arial" w:hAnsi="Arial" w:cs="Arial"/>
-                <w:b/>
-              </w:rPr>
-              <w:t>University of Colorado</w:t>
-            </w:r>
-            <w:r>
-              <w:rPr>
-                <w:rFonts w:ascii="Arial" w:hAnsi="Arial" w:cs="Arial"/>
-              </w:rPr>
-              <w:tab/>
-            </w:r>
-            <w:r>
-              <w:rPr>
-                <w:rFonts w:ascii="Arial" w:hAnsi="Arial" w:cs="Arial"/>
-              </w:rPr>
-              <w:t xml:space="preserve">    </w:t>
-            </w:r>
-            <w:r>
-              <w:rPr>
-                <w:rFonts w:ascii="Arial" w:hAnsi="Arial" w:cs="Arial"/>
-              </w:rPr>
-              <w:t xml:space="preserve">Boulder, CO </w:t>
-            </w:r>
-          </w:p>
-          <w:p>
-            <w:pPr>
-              <w:pStyle w:val="Achievement"/>
-              <w:rPr>
-                <w:rFonts w:ascii="Arial" w:hAnsi="Arial" w:cs="Arial"/>
-              </w:rPr>
-            </w:pPr>
-            <w:r>
-              <w:rPr>
-                <w:rFonts w:ascii="Arial" w:hAnsi="Arial" w:cs="Arial"/>
-              </w:rPr>
-              <w:t>Leeds Schoo</w:t>
-            </w:r>
-            <w:r>
-              <w:rPr>
-                <w:rFonts w:ascii="Arial" w:hAnsi="Arial" w:cs="Arial"/>
-              </w:rPr>
-              <w:t>l of Business Management</w:t>
-            </w:r>
-            <w:r>
-              <w:rPr>
-                <w:rFonts w:ascii="Arial" w:hAnsi="Arial" w:cs="Arial"/>
-              </w:rPr>
-              <w:t>.</w:t>
-            </w:r>
-          </w:p>
-          <w:p>
-            <w:pPr>
-              <w:pStyle w:val="Institution"/>
-              <w:tabs>
-                <w:tab w:val="left" w:pos="-630"/>
-              </w:tabs>
-              <w:ind w:left="-108"/>
-              <w:rPr>
-                <w:rFonts w:ascii="Arial" w:hAnsi="Arial" w:cs="Arial"/>
-              </w:rPr>
-            </w:pPr>
-            <w:r>
-              <w:rPr>
-                <w:rFonts w:ascii="Arial" w:hAnsi="Arial" w:cs="Arial"/>
-              </w:rPr>
-              <w:t xml:space="preserve">                   </w:t>
-            </w:r>
-            <w:r>
-              <w:rPr>
-                <w:rFonts w:ascii="Arial" w:hAnsi="Arial" w:cs="Arial"/>
-              </w:rPr>
-              <w:t xml:space="preserve">         </w:t>
-            </w:r>
-            <w:r>
-              <w:rPr>
-                <w:rFonts w:ascii="Arial" w:hAnsi="Arial" w:cs="Arial"/>
-                <w:b/>
-              </w:rPr>
-              <w:t>Regis University</w:t>
-            </w:r>
-            <w:r>
-              <w:rPr>
-                <w:rFonts w:ascii="Arial" w:hAnsi="Arial" w:cs="Arial"/>
-              </w:rPr>
-              <w:t xml:space="preserve">                                Denver, CO</w:t>
-            </w:r>
-          </w:p>
-          <w:p>
-            <w:pPr>
-              <w:pStyle w:val="Achievement"/>
-              <w:rPr>
-                <w:rFonts w:ascii="Arial" w:hAnsi="Arial" w:cs="Arial"/>
-              </w:rPr>
-            </w:pPr>
-            <w:r>
-              <w:rPr>
-                <w:rFonts w:ascii="Arial" w:hAnsi="Arial" w:cs="Arial"/>
-              </w:rPr>
-              <w:t>Management Information Systems/Business Minor</w:t>
-            </w:r>
-            <w:r>
-              <w:rPr>
-                <w:rFonts w:ascii="Arial" w:hAnsi="Arial" w:cs="Arial"/>
-              </w:rPr>
-              <w:t>.</w:t>
-            </w:r>
-          </w:p>
-          <w:p>
-            <w:pPr>
-              <w:pStyle w:val="Institution"/>
-              <w:rPr>
-                <w:rFonts w:ascii="Arial" w:hAnsi="Arial" w:cs="Arial"/>
-              </w:rPr>
-            </w:pPr>
-            <w:r>
-              <w:rPr>
-                <w:rFonts w:ascii="Arial" w:hAnsi="Arial" w:cs="Arial"/>
-              </w:rPr>
-              <w:tab/>
-            </w:r>
-            <w:r>
-              <w:rPr>
-                <w:rFonts w:ascii="Arial" w:hAnsi="Arial" w:cs="Arial"/>
-              </w:rPr>
-              <w:t xml:space="preserve">   </w:t>
-            </w:r>
-            <w:r>
-              <w:rPr>
-                <w:rFonts w:ascii="Arial" w:hAnsi="Arial" w:cs="Arial"/>
-                <w:b/>
-              </w:rPr>
-              <w:t>University of Colorado</w:t>
-            </w:r>
-            <w:r>
-              <w:rPr>
-                <w:rFonts w:ascii="Arial" w:hAnsi="Arial" w:cs="Arial"/>
-              </w:rPr>
-              <w:tab/>
-            </w:r>
-            <w:r>
-              <w:rPr>
-                <w:rFonts w:ascii="Arial" w:hAnsi="Arial" w:cs="Arial"/>
-              </w:rPr>
-              <w:t xml:space="preserve"> </w:t>
-            </w:r>
-            <w:r>
-              <w:rPr>
-                <w:rFonts w:ascii="Arial" w:hAnsi="Arial" w:cs="Arial"/>
-              </w:rPr>
-              <w:t xml:space="preserve">Boulder, CO </w:t>
-            </w:r>
-          </w:p>
-          <w:p>
-            <w:pPr>
-              <w:pStyle w:val="Achievement"/>
-              <w:rPr>
-                <w:rFonts w:ascii="Arial" w:hAnsi="Arial" w:cs="Arial"/>
-              </w:rPr>
-            </w:pPr>
-            <w:r>
-              <w:rPr>
-                <w:rFonts w:ascii="Arial" w:hAnsi="Arial" w:cs="Arial"/>
-              </w:rPr>
-              <w:t>Electrical Engineering</w:t>
-            </w:r>
-            <w:r>
-              <w:rPr>
-                <w:rFonts w:ascii="Arial" w:hAnsi="Arial" w:cs="Arial"/>
-              </w:rPr>
-              <w:t xml:space="preserve"> Studies</w:t>
-            </w:r>
-            <w:r>
-              <w:rPr>
-                <w:rFonts w:ascii="Arial" w:hAnsi="Arial" w:cs="Arial"/>
-              </w:rPr>
-              <w:t>.</w:t>
-            </w:r>
-          </w:p>
-          <w:p>
-            <w:pPr>
-              <w:pStyle w:val="Achievement"/>
-              <w:rPr>
-                <w:rFonts w:ascii="Arial" w:hAnsi="Arial" w:cs="Arial"/>
-              </w:rPr>
-            </w:pPr>
+                <w:sz w:val="24"/>
+                <w:szCs w:val="24"/>
+              </w:rPr>
+              <w:t>Education</w:t>
+            </w:r>
           </w:p>
         </w:tc>
       </w:tr>
@@ -2798,36 +2436,522 @@
               <w:pStyle w:val="Institution"/>
               <w:rPr>
                 <w:rFonts w:ascii="Arial" w:hAnsi="Arial" w:cs="Arial"/>
-              </w:rPr>
+                <w:szCs w:val="22"/>
+              </w:rPr>
+            </w:pPr>
+            <w:r>
+              <w:rPr>
+                <w:rFonts w:ascii="Arial" w:hAnsi="Arial" w:cs="Arial"/>
+                <w:szCs w:val="22"/>
+              </w:rPr>
+              <w:tab/>
+            </w:r>
+            <w:r>
+              <w:rPr>
+                <w:rFonts w:ascii="Arial" w:hAnsi="Arial" w:cs="Arial"/>
+                <w:b/>
+                <w:szCs w:val="22"/>
+              </w:rPr>
+              <w:t>UCCS</w:t>
+            </w:r>
+            <w:r>
+              <w:rPr>
+                <w:rFonts w:ascii="Arial" w:hAnsi="Arial" w:cs="Arial"/>
+                <w:b/>
+                <w:szCs w:val="22"/>
+              </w:rPr>
+              <w:t xml:space="preserve">                                     </w:t>
+            </w:r>
+            <w:r>
+              <w:rPr>
+                <w:rFonts w:ascii="Arial" w:hAnsi="Arial" w:cs="Arial"/>
+                <w:szCs w:val="22"/>
+              </w:rPr>
+              <w:t>Colorado Springs</w:t>
+            </w:r>
+            <w:r>
+              <w:rPr>
+                <w:rFonts w:ascii="Arial" w:hAnsi="Arial" w:cs="Arial"/>
+                <w:szCs w:val="22"/>
+              </w:rPr>
+              <w:t xml:space="preserve">, CO </w:t>
+            </w:r>
+          </w:p>
+          <w:p>
+            <w:pPr>
+              <w:pStyle w:val="Achievement"/>
+              <w:rPr>
+                <w:rFonts w:ascii="Arial" w:hAnsi="Arial" w:cs="Arial"/>
+                <w:szCs w:val="22"/>
+              </w:rPr>
+            </w:pPr>
+            <w:r>
+              <w:rPr>
+                <w:rFonts w:ascii="Arial" w:hAnsi="Arial" w:cs="Arial"/>
+                <w:szCs w:val="22"/>
+              </w:rPr>
+              <w:t>Strategic Artificial Intelligence Program</w:t>
+            </w:r>
+          </w:p>
+          <w:p>
+            <w:pPr>
+              <w:pStyle w:val="Institution"/>
+              <w:rPr>
+                <w:rFonts w:ascii="Arial" w:hAnsi="Arial" w:cs="Arial"/>
+                <w:szCs w:val="22"/>
+              </w:rPr>
+            </w:pPr>
+            <w:r>
+              <w:rPr>
+                <w:rFonts w:ascii="Arial" w:hAnsi="Arial" w:cs="Arial"/>
+                <w:szCs w:val="22"/>
+              </w:rPr>
+              <w:tab/>
+            </w:r>
+            <w:r>
+              <w:rPr>
+                <w:rFonts w:ascii="Arial" w:hAnsi="Arial" w:cs="Arial"/>
+                <w:b/>
+                <w:szCs w:val="22"/>
+              </w:rPr>
+              <w:t>University of Denver</w:t>
+            </w:r>
+            <w:r>
+              <w:rPr>
+                <w:rFonts w:ascii="Arial" w:hAnsi="Arial" w:cs="Arial"/>
+                <w:szCs w:val="22"/>
+              </w:rPr>
+              <w:tab/>
+            </w:r>
+            <w:proofErr w:type="spellStart"/>
+            <w:r>
+              <w:rPr>
+                <w:rFonts w:ascii="Arial" w:hAnsi="Arial" w:cs="Arial"/>
+                <w:szCs w:val="22"/>
+              </w:rPr>
+              <w:t>Denver</w:t>
+            </w:r>
+            <w:proofErr w:type="spellEnd"/>
+            <w:r>
+              <w:rPr>
+                <w:rFonts w:ascii="Arial" w:hAnsi="Arial" w:cs="Arial"/>
+                <w:szCs w:val="22"/>
+              </w:rPr>
+              <w:t xml:space="preserve">, CO </w:t>
+            </w:r>
+          </w:p>
+          <w:p>
+            <w:pPr>
+              <w:pStyle w:val="Achievement"/>
+              <w:rPr>
+                <w:rFonts w:ascii="Arial" w:hAnsi="Arial" w:cs="Arial"/>
+                <w:szCs w:val="22"/>
+              </w:rPr>
+            </w:pPr>
+            <w:r>
+              <w:rPr>
+                <w:rFonts w:ascii="Arial" w:hAnsi="Arial" w:cs="Arial"/>
+                <w:szCs w:val="22"/>
+              </w:rPr>
+              <w:t>Daniels Professional Development</w:t>
+            </w:r>
+            <w:r>
+              <w:rPr>
+                <w:rFonts w:ascii="Arial" w:hAnsi="Arial" w:cs="Arial"/>
+                <w:szCs w:val="22"/>
+              </w:rPr>
+              <w:t xml:space="preserve"> Program.</w:t>
+            </w:r>
+            <w:r>
+              <w:rPr>
+                <w:rFonts w:ascii="Arial" w:hAnsi="Arial" w:cs="Arial"/>
+                <w:szCs w:val="22"/>
+              </w:rPr>
+              <w:t xml:space="preserve"> </w:t>
+            </w:r>
+          </w:p>
+          <w:p>
+            <w:pPr>
+              <w:pStyle w:val="Achievement"/>
+              <w:rPr>
+                <w:rFonts w:ascii="Arial" w:hAnsi="Arial" w:cs="Arial"/>
+                <w:szCs w:val="22"/>
+              </w:rPr>
+            </w:pPr>
+            <w:r>
+              <w:rPr>
+                <w:rFonts w:ascii="Arial" w:hAnsi="Arial" w:cs="Arial"/>
+                <w:b/>
+                <w:szCs w:val="22"/>
+              </w:rPr>
+              <w:t xml:space="preserve">                       </w:t>
+            </w:r>
+            <w:r>
+              <w:rPr>
+                <w:rFonts w:ascii="Arial" w:hAnsi="Arial" w:cs="Arial"/>
+                <w:b/>
+                <w:szCs w:val="22"/>
+              </w:rPr>
+              <w:t>University</w:t>
+            </w:r>
+            <w:r>
+              <w:rPr>
+                <w:rFonts w:ascii="Arial" w:hAnsi="Arial" w:cs="Arial"/>
+                <w:b/>
+                <w:szCs w:val="22"/>
+              </w:rPr>
+              <w:t xml:space="preserve"> of Colorado</w:t>
+            </w:r>
+            <w:r>
+              <w:rPr>
+                <w:rFonts w:ascii="Arial" w:hAnsi="Arial" w:cs="Arial"/>
+                <w:szCs w:val="22"/>
+              </w:rPr>
+              <w:t xml:space="preserve"> </w:t>
+            </w:r>
+            <w:r>
+              <w:rPr>
+                <w:rFonts w:ascii="Arial" w:hAnsi="Arial" w:cs="Arial"/>
+                <w:szCs w:val="22"/>
+              </w:rPr>
+              <w:t xml:space="preserve">                 </w:t>
+            </w:r>
+            <w:r>
+              <w:rPr>
+                <w:rFonts w:ascii="Arial" w:hAnsi="Arial" w:cs="Arial"/>
+                <w:szCs w:val="22"/>
+              </w:rPr>
+              <w:t xml:space="preserve">      </w:t>
+            </w:r>
+            <w:r>
+              <w:rPr>
+                <w:rFonts w:ascii="Arial" w:hAnsi="Arial" w:cs="Arial"/>
+                <w:szCs w:val="22"/>
+              </w:rPr>
+              <w:t xml:space="preserve"> </w:t>
+            </w:r>
+            <w:r>
+              <w:rPr>
+                <w:rFonts w:ascii="Arial" w:hAnsi="Arial" w:cs="Arial"/>
+                <w:szCs w:val="22"/>
+              </w:rPr>
+              <w:t>Boulder</w:t>
+            </w:r>
+            <w:r>
+              <w:rPr>
+                <w:rFonts w:ascii="Arial" w:hAnsi="Arial" w:cs="Arial"/>
+                <w:szCs w:val="22"/>
+              </w:rPr>
+              <w:t>, CO</w:t>
+            </w:r>
+          </w:p>
+          <w:p>
+            <w:pPr>
+              <w:pStyle w:val="Achievement"/>
+              <w:rPr>
+                <w:rFonts w:ascii="Arial" w:hAnsi="Arial" w:cs="Arial"/>
+                <w:szCs w:val="22"/>
+              </w:rPr>
+            </w:pPr>
+            <w:r>
+              <w:rPr>
+                <w:rFonts w:ascii="Arial" w:hAnsi="Arial" w:cs="Arial"/>
+                <w:szCs w:val="22"/>
+              </w:rPr>
+              <w:t>Leeds School of Business Management</w:t>
+            </w:r>
+          </w:p>
+          <w:p>
+            <w:pPr>
+              <w:pStyle w:val="Institution"/>
+              <w:rPr>
+                <w:rFonts w:ascii="Arial" w:hAnsi="Arial" w:cs="Arial"/>
+                <w:szCs w:val="22"/>
+              </w:rPr>
+            </w:pPr>
+            <w:r>
+              <w:rPr>
+                <w:rFonts w:ascii="Arial" w:hAnsi="Arial" w:cs="Arial"/>
+                <w:szCs w:val="22"/>
+              </w:rPr>
+              <w:tab/>
+            </w:r>
+            <w:proofErr w:type="spellStart"/>
+            <w:r>
+              <w:rPr>
+                <w:rFonts w:ascii="Arial" w:hAnsi="Arial" w:cs="Arial"/>
+                <w:b/>
+                <w:szCs w:val="22"/>
+              </w:rPr>
+              <w:t>Berklee</w:t>
+            </w:r>
+            <w:proofErr w:type="spellEnd"/>
+            <w:r>
+              <w:rPr>
+                <w:rFonts w:ascii="Arial" w:hAnsi="Arial" w:cs="Arial"/>
+                <w:b/>
+                <w:szCs w:val="22"/>
+              </w:rPr>
+              <w:t xml:space="preserve"> Music College</w:t>
+            </w:r>
+            <w:r>
+              <w:rPr>
+                <w:rFonts w:ascii="Arial" w:hAnsi="Arial" w:cs="Arial"/>
+                <w:szCs w:val="22"/>
+              </w:rPr>
+              <w:tab/>
+            </w:r>
+            <w:r>
+              <w:rPr>
+                <w:rFonts w:ascii="Arial" w:hAnsi="Arial" w:cs="Arial"/>
+                <w:szCs w:val="22"/>
+              </w:rPr>
+              <w:t>Boston, MA</w:t>
+            </w:r>
+            <w:r>
+              <w:rPr>
+                <w:rFonts w:ascii="Arial" w:hAnsi="Arial" w:cs="Arial"/>
+                <w:szCs w:val="22"/>
+              </w:rPr>
+              <w:t xml:space="preserve"> </w:t>
+            </w:r>
+          </w:p>
+          <w:p>
+            <w:pPr>
+              <w:pStyle w:val="Achievement"/>
+              <w:rPr>
+                <w:rFonts w:ascii="Arial" w:hAnsi="Arial" w:cs="Arial"/>
+                <w:szCs w:val="22"/>
+              </w:rPr>
+            </w:pPr>
+            <w:r>
+              <w:rPr>
+                <w:rFonts w:ascii="Arial" w:hAnsi="Arial" w:cs="Arial"/>
+                <w:szCs w:val="22"/>
+              </w:rPr>
+              <w:t>Music Production</w:t>
+            </w:r>
+            <w:r>
+              <w:rPr>
+                <w:rFonts w:ascii="Arial" w:hAnsi="Arial" w:cs="Arial"/>
+                <w:szCs w:val="22"/>
+              </w:rPr>
+              <w:t xml:space="preserve"> Program</w:t>
+            </w:r>
+          </w:p>
+          <w:p>
+            <w:pPr>
+              <w:pStyle w:val="Institution"/>
+              <w:tabs>
+                <w:tab w:val="left" w:pos="-630"/>
+              </w:tabs>
+              <w:ind w:left="-108"/>
+              <w:rPr>
+                <w:rFonts w:ascii="Arial" w:hAnsi="Arial" w:cs="Arial"/>
+                <w:szCs w:val="22"/>
+              </w:rPr>
+            </w:pPr>
+            <w:r>
+              <w:rPr>
+                <w:rFonts w:ascii="Arial" w:hAnsi="Arial" w:cs="Arial"/>
+                <w:szCs w:val="22"/>
+              </w:rPr>
+              <w:t xml:space="preserve">                   </w:t>
+            </w:r>
+            <w:r>
+              <w:rPr>
+                <w:rFonts w:ascii="Arial" w:hAnsi="Arial" w:cs="Arial"/>
+                <w:szCs w:val="22"/>
+              </w:rPr>
+              <w:t xml:space="preserve">     </w:t>
+            </w:r>
+            <w:r>
+              <w:rPr>
+                <w:rFonts w:ascii="Arial" w:hAnsi="Arial" w:cs="Arial"/>
+                <w:szCs w:val="22"/>
+              </w:rPr>
+              <w:t xml:space="preserve"> </w:t>
+            </w:r>
+            <w:r>
+              <w:rPr>
+                <w:rFonts w:ascii="Arial" w:hAnsi="Arial" w:cs="Arial"/>
+                <w:b/>
+                <w:szCs w:val="22"/>
+              </w:rPr>
+              <w:t>Regis University</w:t>
+            </w:r>
+            <w:r>
+              <w:rPr>
+                <w:rFonts w:ascii="Arial" w:hAnsi="Arial" w:cs="Arial"/>
+                <w:b/>
+                <w:szCs w:val="22"/>
+              </w:rPr>
+              <w:t xml:space="preserve">                                   </w:t>
+            </w:r>
+            <w:r>
+              <w:rPr>
+                <w:rFonts w:ascii="Arial" w:hAnsi="Arial" w:cs="Arial"/>
+                <w:szCs w:val="22"/>
+              </w:rPr>
+              <w:t>D</w:t>
+            </w:r>
+            <w:r>
+              <w:rPr>
+                <w:rFonts w:ascii="Arial" w:hAnsi="Arial" w:cs="Arial"/>
+                <w:szCs w:val="22"/>
+              </w:rPr>
+              <w:t>enver, CO</w:t>
+            </w:r>
+          </w:p>
+          <w:p>
+            <w:pPr>
+              <w:pStyle w:val="Achievement"/>
+              <w:rPr>
+                <w:rFonts w:ascii="Arial" w:hAnsi="Arial" w:cs="Arial"/>
+                <w:szCs w:val="22"/>
+              </w:rPr>
+            </w:pPr>
+            <w:r>
+              <w:rPr>
+                <w:rFonts w:ascii="Arial" w:hAnsi="Arial" w:cs="Arial"/>
+                <w:szCs w:val="22"/>
+              </w:rPr>
+              <w:t>Management Information Systems/Business Minor</w:t>
+            </w:r>
+          </w:p>
+          <w:p>
+            <w:pPr>
+              <w:pStyle w:val="Institution"/>
+              <w:rPr>
+                <w:rFonts w:ascii="Arial" w:hAnsi="Arial" w:cs="Arial"/>
+                <w:szCs w:val="22"/>
+              </w:rPr>
+            </w:pPr>
+            <w:r>
+              <w:rPr>
+                <w:rFonts w:ascii="Arial" w:hAnsi="Arial" w:cs="Arial"/>
+                <w:szCs w:val="22"/>
+              </w:rPr>
+              <w:tab/>
+            </w:r>
+            <w:r>
+              <w:rPr>
+                <w:rFonts w:ascii="Arial" w:hAnsi="Arial" w:cs="Arial"/>
+                <w:b/>
+                <w:szCs w:val="22"/>
+              </w:rPr>
+              <w:t>University of Colorado</w:t>
+            </w:r>
+            <w:r>
+              <w:rPr>
+                <w:rFonts w:ascii="Arial" w:hAnsi="Arial" w:cs="Arial"/>
+                <w:b/>
+                <w:szCs w:val="22"/>
+              </w:rPr>
+              <w:t xml:space="preserve">                       </w:t>
+            </w:r>
+            <w:r>
+              <w:rPr>
+                <w:rFonts w:ascii="Arial" w:hAnsi="Arial" w:cs="Arial"/>
+                <w:szCs w:val="22"/>
+              </w:rPr>
+              <w:t xml:space="preserve">Boulder, CO </w:t>
+            </w:r>
+          </w:p>
+          <w:p>
+            <w:pPr>
+              <w:pStyle w:val="Achievement"/>
+              <w:rPr>
+                <w:rFonts w:ascii="Arial" w:hAnsi="Arial" w:cs="Arial"/>
+                <w:szCs w:val="22"/>
+              </w:rPr>
+            </w:pPr>
+            <w:r>
+              <w:rPr>
+                <w:rFonts w:ascii="Arial" w:hAnsi="Arial" w:cs="Arial"/>
+                <w:szCs w:val="22"/>
+              </w:rPr>
+              <w:t>Electrical Engineering Studies.</w:t>
+            </w:r>
+          </w:p>
+          <w:p>
+            <w:pPr>
+              <w:pStyle w:val="Achievement"/>
+              <w:rPr>
+                <w:rFonts w:ascii="Arial" w:hAnsi="Arial" w:cs="Arial"/>
+                <w:szCs w:val="22"/>
+              </w:rPr>
+            </w:pPr>
+          </w:p>
+          <w:p>
+            <w:pPr>
+              <w:pStyle w:val="Achievement"/>
+              <w:rPr>
+                <w:rFonts w:ascii="Arial" w:hAnsi="Arial" w:cs="Arial"/>
+                <w:szCs w:val="22"/>
+              </w:rPr>
+            </w:pPr>
+          </w:p>
+          <w:p>
+            <w:pPr>
+              <w:pStyle w:val="Achievement"/>
+              <w:rPr>
+                <w:rFonts w:ascii="Arial" w:hAnsi="Arial" w:cs="Arial"/>
+                <w:sz w:val="18"/>
+                <w:szCs w:val="18"/>
+              </w:rPr>
+            </w:pPr>
+          </w:p>
+          <w:p>
+            <w:pPr>
+              <w:pStyle w:val="Achievement"/>
+              <w:rPr>
+                <w:rFonts w:ascii="Arial" w:hAnsi="Arial" w:cs="Arial"/>
+                <w:sz w:val="18"/>
+                <w:szCs w:val="18"/>
+              </w:rPr>
+            </w:pPr>
+          </w:p>
+          <w:p>
+            <w:pPr>
+              <w:pStyle w:val="Achievement"/>
             </w:pPr>
           </w:p>
         </w:tc>
       </w:tr>
     </w:tbl>
+    <w:p>
+      <w:pPr>
+        <w:spacing w:before="240" w:after="240"/>
+        <w:rPr>
+          <w:lang w:val="en-US"/>
+        </w:rPr>
+      </w:pPr>
+    </w:p>
+    <w:p>
+      <w:pPr>
+        <w:rPr>
+          <w:lang w:val="en-US"/>
+        </w:rPr>
+      </w:pPr>
+      <w:r>
+        <w:rPr>
+          <w:lang w:val="en-US"/>
+        </w:rPr>
+        <w:br w:type="page"/>
+      </w:r>
+      <w:bookmarkStart w:id="2" w:name="_GoBack"/>
+      <w:bookmarkEnd w:id="2"/>
+    </w:p>
+    <w:p>
+      <w:pPr>
+        <w:spacing w:before="240" w:after="240"/>
+        <w:rPr>
+          <w:lang w:val="en-US"/>
+        </w:rPr>
+      </w:pPr>
+    </w:p>
     <w:p/>
-    <w:p>
-      <w:pPr>
-        <w:pStyle w:val="Heading3"/>
-        <w:keepNext w:val="0"/>
-        <w:keepLines w:val="0"/>
-        <w:spacing w:before="280"/>
-        <w:rPr>
-          <w:b/>
-          <w:color w:val="000000"/>
-          <w:sz w:val="26"/>
-          <w:szCs w:val="26"/>
-        </w:rPr>
-      </w:pPr>
-      <w:r>
-        <w:rPr>
-          <w:b/>
-          <w:color w:val="000000"/>
-          <w:sz w:val="26"/>
-          <w:szCs w:val="26"/>
-        </w:rPr>
-        <w:t>Coaching Experience</w:t>
-      </w:r>
-    </w:p>
     <w:tbl>
       <w:tblPr>
         <w:tblW w:w="0" w:type="auto"/>
@@ -2861,39 +2985,112 @@
           </w:tcPr>
           <w:p>
             <w:pPr>
+              <w:pStyle w:val="Achievement"/>
+              <w:ind w:left="0" w:firstLine="0"/>
+            </w:pPr>
+          </w:p>
+        </w:tc>
+      </w:tr>
+      <w:tr>
+        <w:tblPrEx>
+          <w:tblCellMar>
+            <w:top w:w="0" w:type="dxa"/>
+            <w:bottom w:w="0" w:type="dxa"/>
+          </w:tblCellMar>
+        </w:tblPrEx>
+        <w:trPr>
+          <w:cantSplit/>
+        </w:trPr>
+        <w:tc>
+          <w:tcPr>
+            <w:tcW w:w="8838" w:type="dxa"/>
+            <w:gridSpan w:val="2"/>
+          </w:tcPr>
+          <w:p>
+            <w:pPr>
+              <w:pStyle w:val="SectionTitle"/>
+              <w:rPr>
+                <w:rFonts w:ascii="Arial" w:hAnsi="Arial" w:cs="Arial"/>
+                <w:b/>
+                <w:sz w:val="24"/>
+                <w:szCs w:val="24"/>
+              </w:rPr>
+            </w:pPr>
+            <w:r>
+              <w:rPr>
+                <w:rFonts w:ascii="Arial" w:hAnsi="Arial" w:cs="Arial"/>
+                <w:b/>
+                <w:sz w:val="24"/>
+                <w:szCs w:val="24"/>
+              </w:rPr>
+              <w:t>COACHING</w:t>
+            </w:r>
+          </w:p>
+        </w:tc>
+      </w:tr>
+      <w:tr>
+        <w:tblPrEx>
+          <w:tblCellMar>
+            <w:top w:w="0" w:type="dxa"/>
+            <w:bottom w:w="0" w:type="dxa"/>
+          </w:tblCellMar>
+        </w:tblPrEx>
+        <w:tc>
+          <w:tcPr>
+            <w:tcW w:w="648" w:type="dxa"/>
+          </w:tcPr>
+          <w:p>
+            <w:pPr>
+              <w:pStyle w:val="NoTitle"/>
+            </w:pPr>
+          </w:p>
+        </w:tc>
+        <w:tc>
+          <w:tcPr>
+            <w:tcW w:w="8190" w:type="dxa"/>
+          </w:tcPr>
+          <w:p>
+            <w:pPr>
               <w:pStyle w:val="Institution"/>
               <w:rPr>
                 <w:rFonts w:ascii="Arial" w:hAnsi="Arial" w:cs="Arial"/>
+                <w:szCs w:val="22"/>
               </w:rPr>
             </w:pPr>
             <w:r>
               <w:rPr>
                 <w:rFonts w:ascii="Arial" w:hAnsi="Arial" w:cs="Arial"/>
-              </w:rPr>
-              <w:t xml:space="preserve">                          </w:t>
+                <w:szCs w:val="22"/>
+              </w:rPr>
+              <w:tab/>
             </w:r>
             <w:r>
               <w:rPr>
                 <w:rFonts w:ascii="Arial" w:hAnsi="Arial" w:cs="Arial"/>
                 <w:b/>
+                <w:szCs w:val="22"/>
               </w:rPr>
               <w:t>University of Colorado</w:t>
             </w:r>
             <w:r>
               <w:rPr>
                 <w:rFonts w:ascii="Arial" w:hAnsi="Arial" w:cs="Arial"/>
+                <w:szCs w:val="22"/>
               </w:rPr>
               <w:tab/>
-            </w:r>
-            <w:r>
-              <w:rPr>
-                <w:rFonts w:ascii="Arial" w:hAnsi="Arial" w:cs="Arial"/>
+              <w:t xml:space="preserve"> </w:t>
+            </w:r>
+            <w:r>
+              <w:rPr>
+                <w:rFonts w:ascii="Arial" w:hAnsi="Arial" w:cs="Arial"/>
+                <w:szCs w:val="22"/>
               </w:rPr>
               <w:t>Boulder</w:t>
             </w:r>
             <w:r>
               <w:rPr>
                 <w:rFonts w:ascii="Arial" w:hAnsi="Arial" w:cs="Arial"/>
+                <w:szCs w:val="22"/>
               </w:rPr>
               <w:t xml:space="preserve">, CO </w:t>
             </w:r>
@@ -2903,29 +3100,36 @@
               <w:pStyle w:val="Achievement"/>
               <w:rPr>
                 <w:rFonts w:ascii="Arial" w:hAnsi="Arial" w:cs="Arial"/>
-                <w:lang w:val="en"/>
+                <w:szCs w:val="22"/>
               </w:rPr>
             </w:pPr>
             <w:r>
               <w:rPr>
                 <w:rFonts w:ascii="Arial" w:hAnsi="Arial" w:cs="Arial"/>
-                <w:lang w:val="en"/>
-              </w:rPr>
-              <w:t>Assistant</w:t>
-            </w:r>
-            <w:r>
-              <w:rPr>
-                <w:rFonts w:ascii="Arial" w:hAnsi="Arial" w:cs="Arial"/>
-                <w:lang w:val="en"/>
-              </w:rPr>
-              <w:t>/Goalie</w:t>
-            </w:r>
-            <w:r>
-              <w:rPr>
-                <w:rFonts w:ascii="Arial" w:hAnsi="Arial" w:cs="Arial"/>
-                <w:lang w:val="en"/>
-              </w:rPr>
-              <w:t xml:space="preserve"> Coach CU Women’s Team</w:t>
+                <w:szCs w:val="22"/>
+              </w:rPr>
+              <w:t>Assistant/Goalie Coach</w:t>
+            </w:r>
+            <w:r>
+              <w:rPr>
+                <w:rFonts w:ascii="Arial" w:hAnsi="Arial" w:cs="Arial"/>
+                <w:szCs w:val="22"/>
+              </w:rPr>
+              <w:t>.</w:t>
+            </w:r>
+            <w:r>
+              <w:rPr>
+                <w:rFonts w:ascii="Arial" w:hAnsi="Arial" w:cs="Arial"/>
+                <w:szCs w:val="22"/>
+              </w:rPr>
+              <w:t xml:space="preserve"> CU Wo</w:t>
+            </w:r>
+            <w:r>
+              <w:rPr>
+                <w:rFonts w:ascii="Arial" w:hAnsi="Arial" w:cs="Arial"/>
+                <w:szCs w:val="22"/>
+              </w:rPr>
+              <w:t>men’s Team</w:t>
             </w:r>
           </w:p>
           <w:p>
@@ -2933,14 +3137,15 @@
               <w:pStyle w:val="Achievement"/>
               <w:rPr>
                 <w:rFonts w:ascii="Arial" w:hAnsi="Arial" w:cs="Arial"/>
+                <w:szCs w:val="22"/>
               </w:rPr>
             </w:pPr>
             <w:r>
               <w:rPr>
                 <w:rFonts w:ascii="Arial" w:hAnsi="Arial" w:cs="Arial"/>
-                <w:lang w:val="en"/>
-              </w:rPr>
-              <w:t>NCAA-Nationals</w:t>
+                <w:szCs w:val="22"/>
+              </w:rPr>
+              <w:t>NCAA - Nationals</w:t>
             </w:r>
           </w:p>
           <w:p>
@@ -2948,31 +3153,42 @@
               <w:pStyle w:val="Institution"/>
               <w:rPr>
                 <w:rFonts w:ascii="Arial" w:hAnsi="Arial" w:cs="Arial"/>
+                <w:szCs w:val="22"/>
               </w:rPr>
             </w:pPr>
             <w:r>
               <w:rPr>
                 <w:rFonts w:ascii="Arial" w:hAnsi="Arial" w:cs="Arial"/>
-              </w:rPr>
-              <w:t xml:space="preserve">                          </w:t>
+                <w:szCs w:val="22"/>
+              </w:rPr>
+              <w:tab/>
             </w:r>
             <w:r>
               <w:rPr>
                 <w:rFonts w:ascii="Arial" w:hAnsi="Arial" w:cs="Arial"/>
                 <w:b/>
+                <w:szCs w:val="22"/>
               </w:rPr>
               <w:t>Golden High School</w:t>
             </w:r>
             <w:r>
               <w:rPr>
                 <w:rFonts w:ascii="Arial" w:hAnsi="Arial" w:cs="Arial"/>
+                <w:szCs w:val="22"/>
               </w:rPr>
               <w:tab/>
+            </w:r>
+            <w:r>
+              <w:rPr>
+                <w:rFonts w:ascii="Arial" w:hAnsi="Arial" w:cs="Arial"/>
+                <w:szCs w:val="22"/>
+              </w:rPr>
               <w:t>Golden</w:t>
             </w:r>
             <w:r>
               <w:rPr>
                 <w:rFonts w:ascii="Arial" w:hAnsi="Arial" w:cs="Arial"/>
+                <w:szCs w:val="22"/>
               </w:rPr>
               <w:t xml:space="preserve">, CO </w:t>
             </w:r>
@@ -2982,27 +3198,15 @@
               <w:pStyle w:val="Achievement"/>
               <w:rPr>
                 <w:rFonts w:ascii="Arial" w:hAnsi="Arial" w:cs="Arial"/>
+                <w:szCs w:val="22"/>
               </w:rPr>
             </w:pPr>
             <w:r>
               <w:rPr>
                 <w:rFonts w:ascii="Arial" w:hAnsi="Arial" w:cs="Arial"/>
-                <w:lang w:val="en"/>
-              </w:rPr>
-              <w:t>Assistant</w:t>
-            </w:r>
-            <w:r>
-              <w:rPr>
-                <w:rFonts w:ascii="Arial" w:hAnsi="Arial" w:cs="Arial"/>
-                <w:lang w:val="en"/>
-              </w:rPr>
-              <w:t>/Goalie</w:t>
-            </w:r>
-            <w:r>
-              <w:rPr>
-                <w:rFonts w:ascii="Arial" w:hAnsi="Arial" w:cs="Arial"/>
-              </w:rPr>
-              <w:t xml:space="preserve"> Coach – Varsity</w:t>
+                <w:szCs w:val="22"/>
+              </w:rPr>
+              <w:t>Assistant/Goalie Coach – Varsity</w:t>
             </w:r>
           </w:p>
           <w:p>
@@ -3010,13 +3214,135 @@
               <w:pStyle w:val="Achievement"/>
               <w:rPr>
                 <w:rFonts w:ascii="Arial" w:hAnsi="Arial" w:cs="Arial"/>
+                <w:szCs w:val="22"/>
               </w:rPr>
             </w:pPr>
             <w:r>
               <w:rPr>
                 <w:rFonts w:ascii="Arial" w:hAnsi="Arial" w:cs="Arial"/>
+                <w:szCs w:val="22"/>
               </w:rPr>
               <w:t>State Champion</w:t>
+            </w:r>
+            <w:r>
+              <w:rPr>
+                <w:rFonts w:ascii="Arial" w:hAnsi="Arial" w:cs="Arial"/>
+                <w:szCs w:val="22"/>
+              </w:rPr>
+              <w:t xml:space="preserve"> </w:t>
+            </w:r>
+          </w:p>
+          <w:p>
+            <w:pPr>
+              <w:pStyle w:val="Achievement"/>
+              <w:rPr>
+                <w:rFonts w:ascii="Arial" w:hAnsi="Arial" w:cs="Arial"/>
+                <w:szCs w:val="22"/>
+              </w:rPr>
+            </w:pPr>
+            <w:r>
+              <w:rPr>
+                <w:rFonts w:ascii="Arial" w:hAnsi="Arial" w:cs="Arial"/>
+                <w:b/>
+                <w:szCs w:val="22"/>
+              </w:rPr>
+              <w:t xml:space="preserve">                         </w:t>
+            </w:r>
+            <w:r>
+              <w:rPr>
+                <w:rFonts w:ascii="Arial" w:hAnsi="Arial" w:cs="Arial"/>
+                <w:b/>
+                <w:szCs w:val="22"/>
+              </w:rPr>
+              <w:t xml:space="preserve">Hyland Hills                   </w:t>
+            </w:r>
+            <w:r>
+              <w:rPr>
+                <w:rFonts w:ascii="Arial" w:hAnsi="Arial" w:cs="Arial"/>
+                <w:szCs w:val="22"/>
+              </w:rPr>
+              <w:t xml:space="preserve">       </w:t>
+            </w:r>
+            <w:r>
+              <w:rPr>
+                <w:rFonts w:ascii="Arial" w:hAnsi="Arial" w:cs="Arial"/>
+                <w:szCs w:val="22"/>
+              </w:rPr>
+              <w:t xml:space="preserve"> </w:t>
+            </w:r>
+            <w:r>
+              <w:rPr>
+                <w:rFonts w:ascii="Arial" w:hAnsi="Arial" w:cs="Arial"/>
+                <w:szCs w:val="22"/>
+              </w:rPr>
+              <w:t xml:space="preserve">     </w:t>
+            </w:r>
+            <w:r>
+              <w:rPr>
+                <w:rFonts w:ascii="Arial" w:hAnsi="Arial" w:cs="Arial"/>
+                <w:szCs w:val="22"/>
+              </w:rPr>
+              <w:t xml:space="preserve">     </w:t>
+            </w:r>
+            <w:r>
+              <w:rPr>
+                <w:rFonts w:ascii="Arial" w:hAnsi="Arial" w:cs="Arial"/>
+                <w:szCs w:val="22"/>
+              </w:rPr>
+              <w:t xml:space="preserve">    Boulder, CO</w:t>
+            </w:r>
+          </w:p>
+          <w:p>
+            <w:pPr>
+              <w:pStyle w:val="Achievement"/>
+              <w:rPr>
+                <w:rFonts w:ascii="Arial" w:hAnsi="Arial" w:cs="Arial"/>
+                <w:szCs w:val="22"/>
+              </w:rPr>
+            </w:pPr>
+            <w:r>
+              <w:rPr>
+                <w:rFonts w:ascii="Arial" w:hAnsi="Arial" w:cs="Arial"/>
+                <w:szCs w:val="22"/>
+              </w:rPr>
+              <w:t>Assistant/Goalie</w:t>
+            </w:r>
+            <w:r>
+              <w:rPr>
+                <w:rFonts w:ascii="Arial" w:hAnsi="Arial" w:cs="Arial"/>
+                <w:szCs w:val="22"/>
+              </w:rPr>
+              <w:t xml:space="preserve"> </w:t>
+            </w:r>
+            <w:r>
+              <w:rPr>
+                <w:rFonts w:ascii="Arial" w:hAnsi="Arial" w:cs="Arial"/>
+                <w:szCs w:val="22"/>
+              </w:rPr>
+              <w:t>Coach Major A</w:t>
+            </w:r>
+          </w:p>
+          <w:p>
+            <w:pPr>
+              <w:pStyle w:val="Achievement"/>
+              <w:rPr>
+                <w:rFonts w:ascii="Arial" w:hAnsi="Arial" w:cs="Arial"/>
+                <w:szCs w:val="22"/>
+              </w:rPr>
+            </w:pPr>
+            <w:r>
+              <w:rPr>
+                <w:rFonts w:ascii="Arial" w:hAnsi="Arial" w:cs="Arial"/>
+                <w:szCs w:val="22"/>
+              </w:rPr>
+              <w:t>International Silver Stick Champion</w:t>
+            </w:r>
+            <w:r>
+              <w:rPr>
+                <w:rFonts w:ascii="Arial" w:hAnsi="Arial" w:cs="Arial"/>
+                <w:szCs w:val="22"/>
+              </w:rPr>
+              <w:t xml:space="preserve"> </w:t>
             </w:r>
           </w:p>
           <w:p>
@@ -3024,31 +3350,49 @@
               <w:pStyle w:val="Institution"/>
               <w:rPr>
                 <w:rFonts w:ascii="Arial" w:hAnsi="Arial" w:cs="Arial"/>
+                <w:szCs w:val="22"/>
               </w:rPr>
             </w:pPr>
             <w:r>
               <w:rPr>
                 <w:rFonts w:ascii="Arial" w:hAnsi="Arial" w:cs="Arial"/>
-              </w:rPr>
-              <w:t xml:space="preserve">                          </w:t>
+                <w:szCs w:val="22"/>
+              </w:rPr>
+              <w:tab/>
             </w:r>
             <w:r>
               <w:rPr>
                 <w:rFonts w:ascii="Arial" w:hAnsi="Arial" w:cs="Arial"/>
                 <w:b/>
+                <w:szCs w:val="22"/>
               </w:rPr>
               <w:t>Hyland Hills</w:t>
             </w:r>
             <w:r>
               <w:rPr>
                 <w:rFonts w:ascii="Arial" w:hAnsi="Arial" w:cs="Arial"/>
+                <w:szCs w:val="22"/>
               </w:rPr>
               <w:tab/>
-              <w:t>Westminster, CO</w:t>
-            </w:r>
-            <w:r>
-              <w:rPr>
-                <w:rFonts w:ascii="Arial" w:hAnsi="Arial" w:cs="Arial"/>
+            </w:r>
+            <w:r>
+              <w:rPr>
+                <w:rFonts w:ascii="Arial" w:hAnsi="Arial" w:cs="Arial"/>
+                <w:szCs w:val="22"/>
+              </w:rPr>
+              <w:t>W</w:t>
+            </w:r>
+            <w:r>
+              <w:rPr>
+                <w:rFonts w:ascii="Arial" w:hAnsi="Arial" w:cs="Arial"/>
+                <w:szCs w:val="22"/>
+              </w:rPr>
+              <w:t>estminster, CO</w:t>
+            </w:r>
+            <w:r>
+              <w:rPr>
+                <w:rFonts w:ascii="Arial" w:hAnsi="Arial" w:cs="Arial"/>
+                <w:szCs w:val="22"/>
               </w:rPr>
               <w:t xml:space="preserve"> </w:t>
             </w:r>
@@ -3058,33 +3402,15 @@
               <w:pStyle w:val="Achievement"/>
               <w:rPr>
                 <w:rFonts w:ascii="Arial" w:hAnsi="Arial" w:cs="Arial"/>
+                <w:szCs w:val="22"/>
               </w:rPr>
             </w:pPr>
             <w:r>
               <w:rPr>
                 <w:rFonts w:ascii="Arial" w:hAnsi="Arial" w:cs="Arial"/>
-                <w:lang w:val="en"/>
-              </w:rPr>
-              <w:t>Assistant</w:t>
-            </w:r>
-            <w:r>
-              <w:rPr>
-                <w:rFonts w:ascii="Arial" w:hAnsi="Arial" w:cs="Arial"/>
-                <w:lang w:val="en"/>
-              </w:rPr>
-              <w:t>/Goalie</w:t>
-            </w:r>
-            <w:r>
-              <w:rPr>
-                <w:rFonts w:ascii="Arial" w:hAnsi="Arial" w:cs="Arial"/>
-              </w:rPr>
-              <w:t xml:space="preserve"> Coach –</w:t>
-            </w:r>
-            <w:r>
-              <w:rPr>
-                <w:rFonts w:ascii="Arial" w:hAnsi="Arial" w:cs="Arial"/>
-              </w:rPr>
-              <w:t xml:space="preserve"> Major A</w:t>
+                <w:szCs w:val="22"/>
+              </w:rPr>
+              <w:t>Assistant/Goalie Coach Minor A</w:t>
             </w:r>
           </w:p>
           <w:p>
@@ -3092,13 +3418,99 @@
               <w:pStyle w:val="Achievement"/>
               <w:rPr>
                 <w:rFonts w:ascii="Arial" w:hAnsi="Arial" w:cs="Arial"/>
+                <w:szCs w:val="22"/>
               </w:rPr>
             </w:pPr>
             <w:r>
               <w:rPr>
                 <w:rFonts w:ascii="Arial" w:hAnsi="Arial" w:cs="Arial"/>
-              </w:rPr>
-              <w:t>International Silver Stick Champion</w:t>
+                <w:szCs w:val="22"/>
+              </w:rPr>
+              <w:t>State Champion</w:t>
+            </w:r>
+          </w:p>
+          <w:p>
+            <w:pPr>
+              <w:pStyle w:val="Achievement"/>
+              <w:rPr>
+                <w:rFonts w:ascii="Arial" w:hAnsi="Arial" w:cs="Arial"/>
+                <w:szCs w:val="22"/>
+              </w:rPr>
+            </w:pPr>
+            <w:r>
+              <w:rPr>
+                <w:rFonts w:ascii="Arial" w:hAnsi="Arial" w:cs="Arial"/>
+                <w:szCs w:val="22"/>
+              </w:rPr>
+              <w:t xml:space="preserve">                       </w:t>
+            </w:r>
+            <w:r>
+              <w:rPr>
+                <w:rFonts w:ascii="Arial" w:hAnsi="Arial" w:cs="Arial"/>
+                <w:szCs w:val="22"/>
+              </w:rPr>
+              <w:t xml:space="preserve"> </w:t>
+            </w:r>
+            <w:r>
+              <w:rPr>
+                <w:rFonts w:ascii="Arial" w:hAnsi="Arial" w:cs="Arial"/>
+                <w:b/>
+                <w:szCs w:val="22"/>
+              </w:rPr>
+              <w:t xml:space="preserve">Hyland Hills         </w:t>
+            </w:r>
+            <w:r>
+              <w:rPr>
+                <w:rFonts w:ascii="Arial" w:hAnsi="Arial" w:cs="Arial"/>
+                <w:szCs w:val="22"/>
+              </w:rPr>
+              <w:t xml:space="preserve">                          </w:t>
+            </w:r>
+            <w:r>
+              <w:rPr>
+                <w:rFonts w:ascii="Arial" w:hAnsi="Arial" w:cs="Arial"/>
+                <w:szCs w:val="22"/>
+              </w:rPr>
+              <w:t xml:space="preserve">      </w:t>
+            </w:r>
+            <w:r>
+              <w:rPr>
+                <w:rFonts w:ascii="Arial" w:hAnsi="Arial" w:cs="Arial"/>
+                <w:szCs w:val="22"/>
+              </w:rPr>
+              <w:t xml:space="preserve"> Denver, CO</w:t>
+            </w:r>
+          </w:p>
+          <w:p>
+            <w:pPr>
+              <w:pStyle w:val="Achievement"/>
+              <w:rPr>
+                <w:rFonts w:ascii="Arial" w:hAnsi="Arial" w:cs="Arial"/>
+                <w:szCs w:val="22"/>
+              </w:rPr>
+            </w:pPr>
+            <w:r>
+              <w:rPr>
+                <w:rFonts w:ascii="Arial" w:hAnsi="Arial" w:cs="Arial"/>
+                <w:szCs w:val="22"/>
+              </w:rPr>
+              <w:t>Assistant/Goalie Coach Bantam B</w:t>
+            </w:r>
+          </w:p>
+          <w:p>
+            <w:pPr>
+              <w:pStyle w:val="Achievement"/>
+              <w:rPr>
+                <w:rFonts w:ascii="Arial" w:hAnsi="Arial" w:cs="Arial"/>
+                <w:szCs w:val="22"/>
+              </w:rPr>
+            </w:pPr>
+            <w:r>
+              <w:rPr>
+                <w:rFonts w:ascii="Arial" w:hAnsi="Arial" w:cs="Arial"/>
+                <w:szCs w:val="22"/>
+              </w:rPr>
+              <w:t>State Champion</w:t>
             </w:r>
           </w:p>
           <w:p>
@@ -3106,33 +3518,31 @@
               <w:pStyle w:val="Institution"/>
               <w:rPr>
                 <w:rFonts w:ascii="Arial" w:hAnsi="Arial" w:cs="Arial"/>
+                <w:szCs w:val="22"/>
               </w:rPr>
             </w:pPr>
             <w:r>
               <w:rPr>
                 <w:rFonts w:ascii="Arial" w:hAnsi="Arial" w:cs="Arial"/>
-              </w:rPr>
-              <w:t xml:space="preserve">                          </w:t>
+                <w:szCs w:val="22"/>
+              </w:rPr>
+              <w:tab/>
             </w:r>
             <w:r>
               <w:rPr>
                 <w:rFonts w:ascii="Arial" w:hAnsi="Arial" w:cs="Arial"/>
                 <w:b/>
-              </w:rPr>
-              <w:t>Hyland Hills</w:t>
-            </w:r>
-            <w:r>
-              <w:rPr>
-                <w:rFonts w:ascii="Arial" w:hAnsi="Arial" w:cs="Arial"/>
+                <w:szCs w:val="22"/>
+              </w:rPr>
+              <w:t>Boulder Hockey Club</w:t>
+            </w:r>
+            <w:r>
+              <w:rPr>
+                <w:rFonts w:ascii="Arial" w:hAnsi="Arial" w:cs="Arial"/>
+                <w:szCs w:val="22"/>
               </w:rPr>
               <w:tab/>
-              <w:t>Westminster</w:t>
-            </w:r>
-            <w:r>
-              <w:rPr>
-                <w:rFonts w:ascii="Arial" w:hAnsi="Arial" w:cs="Arial"/>
-              </w:rPr>
-              <w:t xml:space="preserve">, CO </w:t>
+              <w:t xml:space="preserve">Boulder, CO </w:t>
             </w:r>
           </w:p>
           <w:p>
@@ -3140,39 +3550,56 @@
               <w:pStyle w:val="Achievement"/>
               <w:rPr>
                 <w:rFonts w:ascii="Arial" w:hAnsi="Arial" w:cs="Arial"/>
+                <w:szCs w:val="22"/>
               </w:rPr>
             </w:pPr>
             <w:r>
               <w:rPr>
                 <w:rFonts w:ascii="Arial" w:hAnsi="Arial" w:cs="Arial"/>
-                <w:lang w:val="en"/>
-              </w:rPr>
-              <w:t>Assistant</w:t>
-            </w:r>
-            <w:r>
-              <w:rPr>
-                <w:rFonts w:ascii="Arial" w:hAnsi="Arial" w:cs="Arial"/>
-                <w:lang w:val="en"/>
-              </w:rPr>
-              <w:t>/Goalie</w:t>
-            </w:r>
-            <w:r>
-              <w:rPr>
-                <w:rFonts w:ascii="Arial" w:hAnsi="Arial" w:cs="Arial"/>
-              </w:rPr>
-              <w:t xml:space="preserve"> Coach –</w:t>
-            </w:r>
-            <w:r>
-              <w:rPr>
-                <w:rFonts w:ascii="Arial" w:hAnsi="Arial" w:cs="Arial"/>
-              </w:rPr>
-              <w:t xml:space="preserve"> Minor</w:t>
-            </w:r>
-            <w:r>
-              <w:rPr>
-                <w:rFonts w:ascii="Arial" w:hAnsi="Arial" w:cs="Arial"/>
-              </w:rPr>
-              <w:t xml:space="preserve"> A</w:t>
+                <w:szCs w:val="22"/>
+              </w:rPr>
+              <w:t>Head Coach – Major A</w:t>
+            </w:r>
+          </w:p>
+          <w:p>
+            <w:pPr>
+              <w:pStyle w:val="Institution"/>
+              <w:rPr>
+                <w:rFonts w:ascii="Arial" w:hAnsi="Arial" w:cs="Arial"/>
+                <w:szCs w:val="22"/>
+              </w:rPr>
+            </w:pPr>
+            <w:r>
+              <w:rPr>
+                <w:rFonts w:ascii="Arial" w:hAnsi="Arial" w:cs="Arial"/>
+                <w:b/>
+                <w:szCs w:val="22"/>
+              </w:rPr>
+              <w:t xml:space="preserve">                      </w:t>
+            </w:r>
+            <w:r>
+              <w:rPr>
+                <w:rFonts w:ascii="Arial" w:hAnsi="Arial" w:cs="Arial"/>
+                <w:b/>
+                <w:szCs w:val="22"/>
+              </w:rPr>
+              <w:t xml:space="preserve"> </w:t>
+            </w:r>
+            <w:r>
+              <w:rPr>
+                <w:rFonts w:ascii="Arial" w:hAnsi="Arial" w:cs="Arial"/>
+                <w:b/>
+                <w:szCs w:val="22"/>
+              </w:rPr>
+              <w:t>Fairview High School</w:t>
+            </w:r>
+            <w:r>
+              <w:rPr>
+                <w:rFonts w:ascii="Arial" w:hAnsi="Arial" w:cs="Arial"/>
+                <w:szCs w:val="22"/>
+              </w:rPr>
+              <w:tab/>
+              <w:t xml:space="preserve">Boulder, CO </w:t>
             </w:r>
           </w:p>
           <w:p>
@@ -3180,13 +3607,15 @@
               <w:pStyle w:val="Achievement"/>
               <w:rPr>
                 <w:rFonts w:ascii="Arial" w:hAnsi="Arial" w:cs="Arial"/>
+                <w:szCs w:val="22"/>
               </w:rPr>
             </w:pPr>
             <w:r>
               <w:rPr>
                 <w:rFonts w:ascii="Arial" w:hAnsi="Arial" w:cs="Arial"/>
-              </w:rPr>
-              <w:t>State Champion</w:t>
+                <w:szCs w:val="22"/>
+              </w:rPr>
+              <w:t>Head Coach – Varsity</w:t>
             </w:r>
           </w:p>
           <w:p>
@@ -3194,42 +3623,47 @@
               <w:pStyle w:val="Institution"/>
               <w:rPr>
                 <w:rFonts w:ascii="Arial" w:hAnsi="Arial" w:cs="Arial"/>
+                <w:szCs w:val="22"/>
               </w:rPr>
             </w:pPr>
             <w:r>
               <w:rPr>
                 <w:rFonts w:ascii="Arial" w:hAnsi="Arial" w:cs="Arial"/>
-              </w:rPr>
-              <w:t xml:space="preserve">                          </w:t>
-            </w:r>
-            <w:r>
-              <w:rPr>
-                <w:rFonts w:ascii="Arial" w:hAnsi="Arial" w:cs="Arial"/>
                 <w:b/>
-              </w:rPr>
-              <w:t>Hyland Hills</w:t>
-            </w:r>
-            <w:r>
-              <w:rPr>
-                <w:rFonts w:ascii="Arial" w:hAnsi="Arial" w:cs="Arial"/>
+                <w:szCs w:val="22"/>
+              </w:rPr>
+              <w:t xml:space="preserve">                       </w:t>
+            </w:r>
+            <w:proofErr w:type="spellStart"/>
+            <w:r>
+              <w:rPr>
+                <w:rFonts w:ascii="Arial" w:hAnsi="Arial" w:cs="Arial"/>
+                <w:b/>
+                <w:szCs w:val="22"/>
+              </w:rPr>
+              <w:t>Thundercats</w:t>
+            </w:r>
+            <w:proofErr w:type="spellEnd"/>
+            <w:r>
+              <w:rPr>
+                <w:rFonts w:ascii="Arial" w:hAnsi="Arial" w:cs="Arial"/>
+                <w:b/>
+                <w:szCs w:val="22"/>
+              </w:rPr>
+              <w:t xml:space="preserve"> Volleyball</w:t>
+            </w:r>
+            <w:r>
+              <w:rPr>
+                <w:rFonts w:ascii="Arial" w:hAnsi="Arial" w:cs="Arial"/>
+                <w:szCs w:val="22"/>
               </w:rPr>
               <w:tab/>
-            </w:r>
-            <w:r>
-              <w:rPr>
-                <w:rFonts w:ascii="Arial" w:hAnsi="Arial" w:cs="Arial"/>
-              </w:rPr>
-              <w:t xml:space="preserve">   </w:t>
-            </w:r>
-            <w:r>
-              <w:rPr>
-                <w:rFonts w:ascii="Arial" w:hAnsi="Arial" w:cs="Arial"/>
-              </w:rPr>
-              <w:t>Westminster</w:t>
-            </w:r>
-            <w:r>
-              <w:rPr>
-                <w:rFonts w:ascii="Arial" w:hAnsi="Arial" w:cs="Arial"/>
+              <w:t>Thornton</w:t>
+            </w:r>
+            <w:r>
+              <w:rPr>
+                <w:rFonts w:ascii="Arial" w:hAnsi="Arial" w:cs="Arial"/>
+                <w:szCs w:val="22"/>
               </w:rPr>
               <w:t xml:space="preserve">, CO </w:t>
             </w:r>
@@ -3239,33 +3673,15 @@
               <w:pStyle w:val="Achievement"/>
               <w:rPr>
                 <w:rFonts w:ascii="Arial" w:hAnsi="Arial" w:cs="Arial"/>
+                <w:szCs w:val="22"/>
               </w:rPr>
             </w:pPr>
             <w:r>
               <w:rPr>
                 <w:rFonts w:ascii="Arial" w:hAnsi="Arial" w:cs="Arial"/>
-                <w:lang w:val="en"/>
-              </w:rPr>
-              <w:t>Assistant</w:t>
-            </w:r>
-            <w:r>
-              <w:rPr>
-                <w:rFonts w:ascii="Arial" w:hAnsi="Arial" w:cs="Arial"/>
-                <w:lang w:val="en"/>
-              </w:rPr>
-              <w:t>/Goalie</w:t>
-            </w:r>
-            <w:r>
-              <w:rPr>
-                <w:rFonts w:ascii="Arial" w:hAnsi="Arial" w:cs="Arial"/>
-              </w:rPr>
-              <w:t xml:space="preserve"> Coach</w:t>
-            </w:r>
-            <w:r>
-              <w:rPr>
-                <w:rFonts w:ascii="Arial" w:hAnsi="Arial" w:cs="Arial"/>
-              </w:rPr>
-              <w:t xml:space="preserve"> – Bantam B</w:t>
+                <w:szCs w:val="22"/>
+              </w:rPr>
+              <w:t xml:space="preserve">Video Coach </w:t>
             </w:r>
           </w:p>
           <w:p>
@@ -3273,286 +3689,39 @@
               <w:pStyle w:val="Achievement"/>
               <w:rPr>
                 <w:rFonts w:ascii="Arial" w:hAnsi="Arial" w:cs="Arial"/>
+                <w:szCs w:val="22"/>
               </w:rPr>
             </w:pPr>
             <w:r>
               <w:rPr>
                 <w:rFonts w:ascii="Arial" w:hAnsi="Arial" w:cs="Arial"/>
-              </w:rPr>
-              <w:t>State Champion</w:t>
-            </w:r>
-          </w:p>
-          <w:p>
-            <w:pPr>
-              <w:pStyle w:val="Institution"/>
-              <w:tabs>
-                <w:tab w:val="left" w:pos="-630"/>
-              </w:tabs>
-              <w:ind w:left="-108"/>
-              <w:rPr>
-                <w:rFonts w:ascii="Arial" w:hAnsi="Arial" w:cs="Arial"/>
-              </w:rPr>
-            </w:pPr>
-            <w:r>
-              <w:rPr>
-                <w:rFonts w:ascii="Arial" w:hAnsi="Arial" w:cs="Arial"/>
-              </w:rPr>
-              <w:t xml:space="preserve">    </w:t>
-            </w:r>
-            <w:bookmarkStart w:id="2" w:name="_GoBack"/>
-            <w:bookmarkEnd w:id="2"/>
-            <w:r>
-              <w:rPr>
-                <w:rFonts w:ascii="Arial" w:hAnsi="Arial" w:cs="Arial"/>
-              </w:rPr>
-              <w:t xml:space="preserve">                        </w:t>
-            </w:r>
-            <w:r>
-              <w:rPr>
-                <w:rFonts w:ascii="Arial" w:hAnsi="Arial" w:cs="Arial"/>
-                <w:b/>
-              </w:rPr>
-              <w:t>Boulder Hockey Club</w:t>
-            </w:r>
-            <w:r>
-              <w:rPr>
-                <w:rFonts w:ascii="Arial" w:hAnsi="Arial" w:cs="Arial"/>
-              </w:rPr>
-              <w:t xml:space="preserve"> </w:t>
-            </w:r>
-            <w:r>
-              <w:rPr>
-                <w:rFonts w:ascii="Arial" w:hAnsi="Arial" w:cs="Arial"/>
-              </w:rPr>
-              <w:t xml:space="preserve">            </w:t>
-            </w:r>
-            <w:r>
-              <w:rPr>
-                <w:rFonts w:ascii="Arial" w:hAnsi="Arial" w:cs="Arial"/>
-              </w:rPr>
-              <w:t xml:space="preserve">     </w:t>
-            </w:r>
-            <w:r>
-              <w:rPr>
-                <w:rFonts w:ascii="Arial" w:hAnsi="Arial" w:cs="Arial"/>
-              </w:rPr>
-              <w:t xml:space="preserve">     </w:t>
-            </w:r>
-            <w:r>
-              <w:rPr>
-                <w:rFonts w:ascii="Arial" w:hAnsi="Arial" w:cs="Arial"/>
-              </w:rPr>
-              <w:t xml:space="preserve"> </w:t>
-            </w:r>
-            <w:r>
-              <w:rPr>
-                <w:rFonts w:ascii="Arial" w:hAnsi="Arial" w:cs="Arial"/>
-              </w:rPr>
-              <w:t>Boulder</w:t>
-            </w:r>
-            <w:r>
-              <w:rPr>
-                <w:rFonts w:ascii="Arial" w:hAnsi="Arial" w:cs="Arial"/>
-              </w:rPr>
-              <w:t>, CO</w:t>
-            </w:r>
-            <w:r>
-              <w:rPr>
-                <w:rFonts w:ascii="Arial" w:hAnsi="Arial" w:cs="Arial"/>
-              </w:rPr>
-              <w:t xml:space="preserve"> </w:t>
+                <w:szCs w:val="22"/>
+              </w:rPr>
+              <w:t>AAU – Ranked 7</w:t>
+            </w:r>
+            <w:r>
+              <w:rPr>
+                <w:rFonts w:ascii="Arial" w:hAnsi="Arial" w:cs="Arial"/>
+                <w:szCs w:val="22"/>
+                <w:vertAlign w:val="superscript"/>
+              </w:rPr>
+              <w:t>th</w:t>
+            </w:r>
+            <w:r>
+              <w:rPr>
+                <w:rFonts w:ascii="Arial" w:hAnsi="Arial" w:cs="Arial"/>
+                <w:szCs w:val="22"/>
+              </w:rPr>
+              <w:t xml:space="preserve"> in the Nation </w:t>
             </w:r>
           </w:p>
           <w:p>
             <w:pPr>
               <w:pStyle w:val="Achievement"/>
-              <w:rPr>
-                <w:rFonts w:ascii="Arial" w:hAnsi="Arial" w:cs="Arial"/>
-              </w:rPr>
-            </w:pPr>
-            <w:r>
-              <w:rPr>
-                <w:rFonts w:ascii="Arial" w:hAnsi="Arial" w:cs="Arial"/>
-                <w:lang w:val="en"/>
-              </w:rPr>
-              <w:t xml:space="preserve">Head </w:t>
-            </w:r>
-            <w:r>
-              <w:rPr>
-                <w:rFonts w:ascii="Arial" w:hAnsi="Arial" w:cs="Arial"/>
-              </w:rPr>
-              <w:t>Coach –</w:t>
-            </w:r>
-            <w:r>
-              <w:rPr>
-                <w:rFonts w:ascii="Arial" w:hAnsi="Arial" w:cs="Arial"/>
-              </w:rPr>
-              <w:t xml:space="preserve"> Major A</w:t>
-            </w:r>
-          </w:p>
-          <w:p>
-            <w:pPr>
-              <w:pStyle w:val="Institution"/>
-              <w:rPr>
-                <w:rFonts w:ascii="Arial" w:hAnsi="Arial" w:cs="Arial"/>
-              </w:rPr>
-            </w:pPr>
-            <w:r>
-              <w:rPr>
-                <w:rFonts w:ascii="Arial" w:hAnsi="Arial" w:cs="Arial"/>
-              </w:rPr>
-              <w:tab/>
-            </w:r>
-            <w:r>
-              <w:rPr>
-                <w:rFonts w:ascii="Arial" w:hAnsi="Arial" w:cs="Arial"/>
-              </w:rPr>
-              <w:t xml:space="preserve">  </w:t>
-            </w:r>
-            <w:r>
-              <w:rPr>
-                <w:rFonts w:ascii="Arial" w:hAnsi="Arial" w:cs="Arial"/>
-                <w:b/>
-              </w:rPr>
-              <w:t>Fairview High School</w:t>
-            </w:r>
-            <w:r>
-              <w:rPr>
-                <w:rFonts w:ascii="Arial" w:hAnsi="Arial" w:cs="Arial"/>
-              </w:rPr>
-              <w:t xml:space="preserve">                        </w:t>
-            </w:r>
-            <w:r>
-              <w:rPr>
-                <w:rFonts w:ascii="Arial" w:hAnsi="Arial" w:cs="Arial"/>
-              </w:rPr>
-              <w:t xml:space="preserve">Boulder, CO </w:t>
-            </w:r>
-          </w:p>
-          <w:p>
-            <w:pPr>
-              <w:pStyle w:val="Achievement"/>
-              <w:rPr>
-                <w:rFonts w:ascii="Arial" w:hAnsi="Arial" w:cs="Arial"/>
-              </w:rPr>
-            </w:pPr>
-            <w:r>
-              <w:rPr>
-                <w:rFonts w:ascii="Arial" w:hAnsi="Arial" w:cs="Arial"/>
-              </w:rPr>
-              <w:t>Head Coach -  Varsity</w:t>
-            </w:r>
-          </w:p>
-          <w:p>
-            <w:pPr>
-              <w:pStyle w:val="Institution"/>
-              <w:rPr>
-                <w:rFonts w:ascii="Arial" w:hAnsi="Arial" w:cs="Arial"/>
-              </w:rPr>
-            </w:pPr>
-            <w:r>
-              <w:rPr>
-                <w:rFonts w:ascii="Arial" w:hAnsi="Arial" w:cs="Arial"/>
-              </w:rPr>
-              <w:t xml:space="preserve">   </w:t>
-            </w:r>
-            <w:r>
-              <w:rPr>
-                <w:rFonts w:ascii="Arial" w:hAnsi="Arial" w:cs="Arial"/>
-              </w:rPr>
-              <w:t xml:space="preserve">                      </w:t>
-            </w:r>
-            <w:proofErr w:type="spellStart"/>
-            <w:r>
-              <w:rPr>
-                <w:rFonts w:ascii="Arial" w:hAnsi="Arial" w:cs="Arial"/>
-                <w:b/>
-              </w:rPr>
-              <w:t>Thundercats</w:t>
-            </w:r>
-            <w:proofErr w:type="spellEnd"/>
-            <w:r>
-              <w:rPr>
-                <w:rFonts w:ascii="Arial" w:hAnsi="Arial" w:cs="Arial"/>
-                <w:b/>
-              </w:rPr>
-              <w:t xml:space="preserve"> Volleyball</w:t>
-            </w:r>
-            <w:r>
-              <w:rPr>
-                <w:rFonts w:ascii="Arial" w:hAnsi="Arial" w:cs="Arial"/>
-              </w:rPr>
-              <w:t xml:space="preserve">             </w:t>
-            </w:r>
-            <w:r>
-              <w:rPr>
-                <w:rFonts w:ascii="Arial" w:hAnsi="Arial" w:cs="Arial"/>
-              </w:rPr>
-              <w:t xml:space="preserve">        Thornton</w:t>
-            </w:r>
-            <w:r>
-              <w:rPr>
-                <w:rFonts w:ascii="Arial" w:hAnsi="Arial" w:cs="Arial"/>
-              </w:rPr>
-              <w:t xml:space="preserve">, CO </w:t>
-            </w:r>
-          </w:p>
-          <w:p>
-            <w:pPr>
-              <w:pStyle w:val="Achievement"/>
-              <w:rPr>
-                <w:rFonts w:ascii="Arial" w:hAnsi="Arial" w:cs="Arial"/>
-              </w:rPr>
-            </w:pPr>
-            <w:r>
-              <w:rPr>
-                <w:rFonts w:ascii="Arial" w:hAnsi="Arial" w:cs="Arial"/>
-              </w:rPr>
-              <w:t>Video</w:t>
-            </w:r>
-            <w:r>
-              <w:rPr>
-                <w:rFonts w:ascii="Arial" w:hAnsi="Arial" w:cs="Arial"/>
-              </w:rPr>
-              <w:t xml:space="preserve"> Coach </w:t>
-            </w:r>
-            <w:r>
-              <w:rPr>
-                <w:rFonts w:ascii="Arial" w:hAnsi="Arial" w:cs="Arial"/>
-              </w:rPr>
-              <w:t>– AAU – Ranked 7</w:t>
-            </w:r>
-            <w:r>
-              <w:rPr>
-                <w:rFonts w:ascii="Arial" w:hAnsi="Arial" w:cs="Arial"/>
-                <w:vertAlign w:val="superscript"/>
-              </w:rPr>
-              <w:t>th</w:t>
-            </w:r>
-            <w:r>
-              <w:rPr>
-                <w:rFonts w:ascii="Arial" w:hAnsi="Arial" w:cs="Arial"/>
-              </w:rPr>
-              <w:t xml:space="preserve"> in the Nation</w:t>
-            </w:r>
-            <w:r>
-              <w:rPr>
-                <w:rFonts w:ascii="Arial" w:hAnsi="Arial" w:cs="Arial"/>
-              </w:rPr>
-              <w:t xml:space="preserve"> </w:t>
-            </w:r>
-            <w:r>
-              <w:rPr>
-                <w:rFonts w:ascii="Arial" w:hAnsi="Arial" w:cs="Arial"/>
-              </w:rPr>
-              <w:t xml:space="preserve"> </w:t>
-            </w:r>
-          </w:p>
-          <w:p>
-            <w:pPr>
-              <w:pStyle w:val="Achievement"/>
-              <w:rPr>
-                <w:rFonts w:ascii="Arial" w:hAnsi="Arial" w:cs="Arial"/>
+              <w:ind w:left="0" w:firstLine="0"/>
+              <w:rPr>
+                <w:rFonts w:ascii="Arial" w:hAnsi="Arial" w:cs="Arial"/>
+                <w:szCs w:val="22"/>
               </w:rPr>
             </w:pPr>
           </w:p>
@@ -3561,7 +3730,23 @@
               <w:pStyle w:val="Achievement"/>
               <w:rPr>
                 <w:rFonts w:ascii="Arial" w:hAnsi="Arial" w:cs="Arial"/>
-              </w:rPr>
+                <w:szCs w:val="22"/>
+              </w:rPr>
+            </w:pPr>
+          </w:p>
+          <w:p>
+            <w:pPr>
+              <w:pStyle w:val="Achievement"/>
+              <w:rPr>
+                <w:rFonts w:ascii="Arial" w:hAnsi="Arial" w:cs="Arial"/>
+                <w:sz w:val="18"/>
+                <w:szCs w:val="18"/>
+              </w:rPr>
+            </w:pPr>
+          </w:p>
+          <w:p>
+            <w:pPr>
+              <w:pStyle w:val="Achievement"/>
             </w:pPr>
           </w:p>
         </w:tc>
@@ -3581,10 +3766,6 @@
             <w:pPr>
               <w:pStyle w:val="NoTitle"/>
             </w:pPr>
-            <w:r>
-              <w:lastRenderedPageBreak/>
-              <w:t xml:space="preserve"> </w:t>
-            </w:r>
           </w:p>
         </w:tc>
         <w:tc>
@@ -3596,20 +3777,51 @@
               <w:pStyle w:val="Institution"/>
               <w:rPr>
                 <w:rFonts w:ascii="Arial" w:hAnsi="Arial" w:cs="Arial"/>
+                <w:sz w:val="18"/>
+                <w:szCs w:val="18"/>
               </w:rPr>
             </w:pPr>
-            <w:r>
-              <w:rPr>
-                <w:rFonts w:ascii="Arial" w:hAnsi="Arial" w:cs="Arial"/>
-              </w:rPr>
-              <w:t xml:space="preserve">  </w:t>
-            </w:r>
           </w:p>
         </w:tc>
       </w:tr>
     </w:tbl>
-    <w:p/>
+    <w:p>
+      <w:pPr>
+        <w:spacing w:before="240" w:after="240"/>
+        <w:rPr>
+          <w:lang w:val="en-US"/>
+        </w:rPr>
+      </w:pPr>
+    </w:p>
+    <w:p>
+      <w:pPr>
+        <w:spacing w:before="240" w:after="240"/>
+        <w:rPr>
+          <w:lang w:val="en-US"/>
+        </w:rPr>
+      </w:pPr>
+    </w:p>
+    <w:p>
+      <w:pPr>
+        <w:pStyle w:val="Heading3"/>
+        <w:keepNext w:val="0"/>
+        <w:keepLines w:val="0"/>
+        <w:spacing w:before="280"/>
+        <w:rPr>
+          <w:b/>
+          <w:color w:val="000000"/>
+          <w:sz w:val="26"/>
+          <w:szCs w:val="26"/>
+        </w:rPr>
+      </w:pPr>
+    </w:p>
     <w:sectPr>
+      <w:headerReference w:type="even" r:id="rId9"/>
+      <w:headerReference w:type="default" r:id="rId10"/>
+      <w:footerReference w:type="even" r:id="rId11"/>
+      <w:footerReference w:type="default" r:id="rId12"/>
+      <w:headerReference w:type="first" r:id="rId13"/>
+      <w:footerReference w:type="first" r:id="rId14"/>
       <w:pgSz w:w="12240" w:h="15840"/>
       <w:pgMar w:top="360" w:right="1440" w:bottom="1440" w:left="1440" w:header="720" w:footer="720" w:gutter="0"/>
       <w:pgNumType w:start="1"/>
@@ -3617,6 +3829,116 @@
     </w:sectPr>
   </w:body>
 </w:document>
+</file>
+
+<file path=word/endnotes.xml><?xml version="1.0" encoding="utf-8"?>
+<w:endnotes xmlns:wpc="http://schemas.microsoft.com/office/word/2010/wordprocessingCanvas" xmlns:mc="http://schemas.openxmlformats.org/markup-compatibility/2006" xmlns:o="urn:schemas-microsoft-com:office:office" xmlns:r="http://schemas.openxmlformats.org/officeDocument/2006/relationships" xmlns:m="http://schemas.openxmlformats.org/officeDocument/2006/math" xmlns:v="urn:schemas-microsoft-com:vml" xmlns:wp14="http://schemas.microsoft.com/office/word/2010/wordprocessingDrawing" xmlns:wp="http://schemas.openxmlformats.org/drawingml/2006/wordprocessingDrawing" xmlns:w10="urn:schemas-microsoft-com:office:word" xmlns:w="http://schemas.openxmlformats.org/wordprocessingml/2006/main" xmlns:w14="http://schemas.microsoft.com/office/word/2010/wordml" xmlns:w15="http://schemas.microsoft.com/office/word/2012/wordml" xmlns:wpg="http://schemas.microsoft.com/office/word/2010/wordprocessingGroup" xmlns:wpi="http://schemas.microsoft.com/office/word/2010/wordprocessingInk" xmlns:wne="http://schemas.microsoft.com/office/word/2006/wordml" xmlns:wps="http://schemas.microsoft.com/office/word/2010/wordprocessingShape" mc:Ignorable="w14 w15 wp14">
+  <w:endnote w:type="separator" w:id="-1">
+    <w:p>
+      <w:pPr>
+        <w:spacing w:line="240" w:lineRule="auto"/>
+      </w:pPr>
+      <w:r>
+        <w:separator/>
+      </w:r>
+    </w:p>
+  </w:endnote>
+  <w:endnote w:type="continuationSeparator" w:id="0">
+    <w:p>
+      <w:pPr>
+        <w:spacing w:line="240" w:lineRule="auto"/>
+      </w:pPr>
+      <w:r>
+        <w:continuationSeparator/>
+      </w:r>
+    </w:p>
+  </w:endnote>
+</w:endnotes>
+</file>
+
+<file path=word/footer1.xml><?xml version="1.0" encoding="utf-8"?>
+<w:ftr xmlns:wpc="http://schemas.microsoft.com/office/word/2010/wordprocessingCanvas" xmlns:mc="http://schemas.openxmlformats.org/markup-compatibility/2006" xmlns:o="urn:schemas-microsoft-com:office:office" xmlns:r="http://schemas.openxmlformats.org/officeDocument/2006/relationships" xmlns:m="http://schemas.openxmlformats.org/officeDocument/2006/math" xmlns:v="urn:schemas-microsoft-com:vml" xmlns:wp14="http://schemas.microsoft.com/office/word/2010/wordprocessingDrawing" xmlns:wp="http://schemas.openxmlformats.org/drawingml/2006/wordprocessingDrawing" xmlns:w10="urn:schemas-microsoft-com:office:word" xmlns:w="http://schemas.openxmlformats.org/wordprocessingml/2006/main" xmlns:w14="http://schemas.microsoft.com/office/word/2010/wordml" xmlns:w15="http://schemas.microsoft.com/office/word/2012/wordml" xmlns:wpg="http://schemas.microsoft.com/office/word/2010/wordprocessingGroup" xmlns:wpi="http://schemas.microsoft.com/office/word/2010/wordprocessingInk" xmlns:wne="http://schemas.microsoft.com/office/word/2006/wordml" xmlns:wps="http://schemas.microsoft.com/office/word/2010/wordprocessingShape" mc:Ignorable="w14 w15 wp14">
+  <w:p>
+    <w:pPr>
+      <w:pStyle w:val="Footer"/>
+    </w:pPr>
+  </w:p>
+</w:ftr>
+</file>
+
+<file path=word/footer2.xml><?xml version="1.0" encoding="utf-8"?>
+<w:ftr xmlns:wpc="http://schemas.microsoft.com/office/word/2010/wordprocessingCanvas" xmlns:mc="http://schemas.openxmlformats.org/markup-compatibility/2006" xmlns:o="urn:schemas-microsoft-com:office:office" xmlns:r="http://schemas.openxmlformats.org/officeDocument/2006/relationships" xmlns:m="http://schemas.openxmlformats.org/officeDocument/2006/math" xmlns:v="urn:schemas-microsoft-com:vml" xmlns:wp14="http://schemas.microsoft.com/office/word/2010/wordprocessingDrawing" xmlns:wp="http://schemas.openxmlformats.org/drawingml/2006/wordprocessingDrawing" xmlns:w10="urn:schemas-microsoft-com:office:word" xmlns:w="http://schemas.openxmlformats.org/wordprocessingml/2006/main" xmlns:w14="http://schemas.microsoft.com/office/word/2010/wordml" xmlns:w15="http://schemas.microsoft.com/office/word/2012/wordml" xmlns:wpg="http://schemas.microsoft.com/office/word/2010/wordprocessingGroup" xmlns:wpi="http://schemas.microsoft.com/office/word/2010/wordprocessingInk" xmlns:wne="http://schemas.microsoft.com/office/word/2006/wordml" xmlns:wps="http://schemas.microsoft.com/office/word/2010/wordprocessingShape" mc:Ignorable="w14 w15 wp14">
+  <w:p>
+    <w:pPr>
+      <w:pStyle w:val="Footer"/>
+    </w:pPr>
+  </w:p>
+</w:ftr>
+</file>
+
+<file path=word/footer3.xml><?xml version="1.0" encoding="utf-8"?>
+<w:ftr xmlns:wpc="http://schemas.microsoft.com/office/word/2010/wordprocessingCanvas" xmlns:mc="http://schemas.openxmlformats.org/markup-compatibility/2006" xmlns:o="urn:schemas-microsoft-com:office:office" xmlns:r="http://schemas.openxmlformats.org/officeDocument/2006/relationships" xmlns:m="http://schemas.openxmlformats.org/officeDocument/2006/math" xmlns:v="urn:schemas-microsoft-com:vml" xmlns:wp14="http://schemas.microsoft.com/office/word/2010/wordprocessingDrawing" xmlns:wp="http://schemas.openxmlformats.org/drawingml/2006/wordprocessingDrawing" xmlns:w10="urn:schemas-microsoft-com:office:word" xmlns:w="http://schemas.openxmlformats.org/wordprocessingml/2006/main" xmlns:w14="http://schemas.microsoft.com/office/word/2010/wordml" xmlns:w15="http://schemas.microsoft.com/office/word/2012/wordml" xmlns:wpg="http://schemas.microsoft.com/office/word/2010/wordprocessingGroup" xmlns:wpi="http://schemas.microsoft.com/office/word/2010/wordprocessingInk" xmlns:wne="http://schemas.microsoft.com/office/word/2006/wordml" xmlns:wps="http://schemas.microsoft.com/office/word/2010/wordprocessingShape" mc:Ignorable="w14 w15 wp14">
+  <w:p>
+    <w:pPr>
+      <w:pStyle w:val="Footer"/>
+    </w:pPr>
+  </w:p>
+</w:ftr>
+</file>
+
+<file path=word/footnotes.xml><?xml version="1.0" encoding="utf-8"?>
+<w:footnotes xmlns:wpc="http://schemas.microsoft.com/office/word/2010/wordprocessingCanvas" xmlns:mc="http://schemas.openxmlformats.org/markup-compatibility/2006" xmlns:o="urn:schemas-microsoft-com:office:office" xmlns:r="http://schemas.openxmlformats.org/officeDocument/2006/relationships" xmlns:m="http://schemas.openxmlformats.org/officeDocument/2006/math" xmlns:v="urn:schemas-microsoft-com:vml" xmlns:wp14="http://schemas.microsoft.com/office/word/2010/wordprocessingDrawing" xmlns:wp="http://schemas.openxmlformats.org/drawingml/2006/wordprocessingDrawing" xmlns:w10="urn:schemas-microsoft-com:office:word" xmlns:w="http://schemas.openxmlformats.org/wordprocessingml/2006/main" xmlns:w14="http://schemas.microsoft.com/office/word/2010/wordml" xmlns:w15="http://schemas.microsoft.com/office/word/2012/wordml" xmlns:wpg="http://schemas.microsoft.com/office/word/2010/wordprocessingGroup" xmlns:wpi="http://schemas.microsoft.com/office/word/2010/wordprocessingInk" xmlns:wne="http://schemas.microsoft.com/office/word/2006/wordml" xmlns:wps="http://schemas.microsoft.com/office/word/2010/wordprocessingShape" mc:Ignorable="w14 w15 wp14">
+  <w:footnote w:type="separator" w:id="-1">
+    <w:p>
+      <w:pPr>
+        <w:spacing w:line="240" w:lineRule="auto"/>
+      </w:pPr>
+      <w:r>
+        <w:separator/>
+      </w:r>
+    </w:p>
+  </w:footnote>
+  <w:footnote w:type="continuationSeparator" w:id="0">
+    <w:p>
+      <w:pPr>
+        <w:spacing w:line="240" w:lineRule="auto"/>
+      </w:pPr>
+      <w:r>
+        <w:continuationSeparator/>
+      </w:r>
+    </w:p>
+  </w:footnote>
+</w:footnotes>
+</file>
+
+<file path=word/header1.xml><?xml version="1.0" encoding="utf-8"?>
+<w:hdr xmlns:wpc="http://schemas.microsoft.com/office/word/2010/wordprocessingCanvas" xmlns:mc="http://schemas.openxmlformats.org/markup-compatibility/2006" xmlns:o="urn:schemas-microsoft-com:office:office" xmlns:r="http://schemas.openxmlformats.org/officeDocument/2006/relationships" xmlns:m="http://schemas.openxmlformats.org/officeDocument/2006/math" xmlns:v="urn:schemas-microsoft-com:vml" xmlns:wp14="http://schemas.microsoft.com/office/word/2010/wordprocessingDrawing" xmlns:wp="http://schemas.openxmlformats.org/drawingml/2006/wordprocessingDrawing" xmlns:w10="urn:schemas-microsoft-com:office:word" xmlns:w="http://schemas.openxmlformats.org/wordprocessingml/2006/main" xmlns:w14="http://schemas.microsoft.com/office/word/2010/wordml" xmlns:w15="http://schemas.microsoft.com/office/word/2012/wordml" xmlns:wpg="http://schemas.microsoft.com/office/word/2010/wordprocessingGroup" xmlns:wpi="http://schemas.microsoft.com/office/word/2010/wordprocessingInk" xmlns:wne="http://schemas.microsoft.com/office/word/2006/wordml" xmlns:wps="http://schemas.microsoft.com/office/word/2010/wordprocessingShape" mc:Ignorable="w14 w15 wp14">
+  <w:p>
+    <w:pPr>
+      <w:pStyle w:val="Header"/>
+    </w:pPr>
+  </w:p>
+</w:hdr>
+</file>
+
+<file path=word/header2.xml><?xml version="1.0" encoding="utf-8"?>
+<w:hdr xmlns:wpc="http://schemas.microsoft.com/office/word/2010/wordprocessingCanvas" xmlns:mc="http://schemas.openxmlformats.org/markup-compatibility/2006" xmlns:o="urn:schemas-microsoft-com:office:office" xmlns:r="http://schemas.openxmlformats.org/officeDocument/2006/relationships" xmlns:m="http://schemas.openxmlformats.org/officeDocument/2006/math" xmlns:v="urn:schemas-microsoft-com:vml" xmlns:wp14="http://schemas.microsoft.com/office/word/2010/wordprocessingDrawing" xmlns:wp="http://schemas.openxmlformats.org/drawingml/2006/wordprocessingDrawing" xmlns:w10="urn:schemas-microsoft-com:office:word" xmlns:w="http://schemas.openxmlformats.org/wordprocessingml/2006/main" xmlns:w14="http://schemas.microsoft.com/office/word/2010/wordml" xmlns:w15="http://schemas.microsoft.com/office/word/2012/wordml" xmlns:wpg="http://schemas.microsoft.com/office/word/2010/wordprocessingGroup" xmlns:wpi="http://schemas.microsoft.com/office/word/2010/wordprocessingInk" xmlns:wne="http://schemas.microsoft.com/office/word/2006/wordml" xmlns:wps="http://schemas.microsoft.com/office/word/2010/wordprocessingShape" mc:Ignorable="w14 w15 wp14">
+  <w:p>
+    <w:pPr>
+      <w:pStyle w:val="Header"/>
+    </w:pPr>
+  </w:p>
+</w:hdr>
+</file>
+
+<file path=word/header3.xml><?xml version="1.0" encoding="utf-8"?>
+<w:hdr xmlns:wpc="http://schemas.microsoft.com/office/word/2010/wordprocessingCanvas" xmlns:mc="http://schemas.openxmlformats.org/markup-compatibility/2006" xmlns:o="urn:schemas-microsoft-com:office:office" xmlns:r="http://schemas.openxmlformats.org/officeDocument/2006/relationships" xmlns:m="http://schemas.openxmlformats.org/officeDocument/2006/math" xmlns:v="urn:schemas-microsoft-com:vml" xmlns:wp14="http://schemas.microsoft.com/office/word/2010/wordprocessingDrawing" xmlns:wp="http://schemas.openxmlformats.org/drawingml/2006/wordprocessingDrawing" xmlns:w10="urn:schemas-microsoft-com:office:word" xmlns:w="http://schemas.openxmlformats.org/wordprocessingml/2006/main" xmlns:w14="http://schemas.microsoft.com/office/word/2010/wordml" xmlns:w15="http://schemas.microsoft.com/office/word/2012/wordml" xmlns:wpg="http://schemas.microsoft.com/office/word/2010/wordprocessingGroup" xmlns:wpi="http://schemas.microsoft.com/office/word/2010/wordprocessingInk" xmlns:wne="http://schemas.microsoft.com/office/word/2006/wordml" xmlns:wps="http://schemas.microsoft.com/office/word/2010/wordprocessingShape" mc:Ignorable="w14 w15 wp14">
+  <w:p>
+    <w:pPr>
+      <w:pStyle w:val="Header"/>
+    </w:pPr>
+  </w:p>
+</w:hdr>
 </file>
 
 <file path=word/numbering.xml><?xml version="1.0" encoding="utf-8"?>
@@ -4516,7 +4838,7 @@
   </w:latentStyles>
   <w:style w:type="paragraph" w:default="1" w:styleId="Normal">
     <w:name w:val="Normal"/>
-    <w:rsid w:val="00B62D88"/>
+    <w:rsid w:val="004658E7"/>
   </w:style>
   <w:style w:type="paragraph" w:styleId="Heading1">
     <w:name w:val="heading 1"/>
@@ -4777,6 +5099,84 @@
     <w:uiPriority w:val="99"/>
     <w:semiHidden/>
     <w:rsid w:val="00C10C8E"/>
+  </w:style>
+  <w:style w:type="paragraph" w:styleId="Header">
+    <w:name w:val="header"/>
+    <w:basedOn w:val="Normal"/>
+    <w:link w:val="HeaderChar"/>
+    <w:uiPriority w:val="99"/>
+    <w:unhideWhenUsed/>
+    <w:rsid w:val="00D44BC6"/>
+    <w:pPr>
+      <w:tabs>
+        <w:tab w:val="center" w:pos="4680"/>
+        <w:tab w:val="right" w:pos="9360"/>
+      </w:tabs>
+      <w:spacing w:line="240" w:lineRule="auto"/>
+    </w:pPr>
+  </w:style>
+  <w:style w:type="character" w:customStyle="1" w:styleId="HeaderChar">
+    <w:name w:val="Header Char"/>
+    <w:basedOn w:val="DefaultParagraphFont"/>
+    <w:link w:val="Header"/>
+    <w:uiPriority w:val="99"/>
+    <w:rsid w:val="00D44BC6"/>
+  </w:style>
+  <w:style w:type="paragraph" w:styleId="Footer">
+    <w:name w:val="footer"/>
+    <w:basedOn w:val="Normal"/>
+    <w:link w:val="FooterChar"/>
+    <w:uiPriority w:val="99"/>
+    <w:unhideWhenUsed/>
+    <w:rsid w:val="00D44BC6"/>
+    <w:pPr>
+      <w:tabs>
+        <w:tab w:val="center" w:pos="4680"/>
+        <w:tab w:val="right" w:pos="9360"/>
+      </w:tabs>
+      <w:spacing w:line="240" w:lineRule="auto"/>
+    </w:pPr>
+  </w:style>
+  <w:style w:type="character" w:customStyle="1" w:styleId="FooterChar">
+    <w:name w:val="Footer Char"/>
+    <w:basedOn w:val="DefaultParagraphFont"/>
+    <w:link w:val="Footer"/>
+    <w:uiPriority w:val="99"/>
+    <w:rsid w:val="00D44BC6"/>
+  </w:style>
+  <w:style w:type="character" w:styleId="BookTitle">
+    <w:name w:val="Book Title"/>
+    <w:basedOn w:val="DefaultParagraphFont"/>
+    <w:uiPriority w:val="33"/>
+    <w:qFormat/>
+    <w:rsid w:val="00D44BC6"/>
+    <w:rPr>
+      <w:b/>
+      <w:bCs/>
+      <w:i/>
+      <w:iCs/>
+      <w:spacing w:val="5"/>
+    </w:rPr>
+  </w:style>
+  <w:style w:type="paragraph" w:customStyle="1" w:styleId="SectionTitle">
+    <w:name w:val="Section Title"/>
+    <w:basedOn w:val="Normal"/>
+    <w:next w:val="Normal"/>
+    <w:rsid w:val="00A04B52"/>
+    <w:pPr>
+      <w:pBdr>
+        <w:bottom w:val="single" w:sz="6" w:space="1" w:color="808080"/>
+      </w:pBdr>
+      <w:spacing w:before="220" w:line="220" w:lineRule="atLeast"/>
+    </w:pPr>
+    <w:rPr>
+      <w:rFonts w:ascii="Garamond" w:eastAsia="Times New Roman" w:hAnsi="Garamond" w:cs="Times New Roman"/>
+      <w:caps/>
+      <w:spacing w:val="15"/>
+      <w:sz w:val="20"/>
+      <w:szCs w:val="20"/>
+      <w:lang w:val="en-US"/>
+    </w:rPr>
   </w:style>
 </w:styles>
 </file>

</xml_diff>

<commit_message>
update technetics and STK
added details
</commit_message>
<xml_diff>
--- a/public/Hilliard-M-Scott-Resume-2025.docx
+++ b/public/Hilliard-M-Scott-Resume-2025.docx
@@ -907,57 +907,984 @@
           <w:bCs/>
           <w:lang w:val="en-US"/>
         </w:rPr>
-        <w:t xml:space="preserve">Additional </w:t>
+        <w:t>Additional Roles:</w:t>
+      </w:r>
+      <w:r>
+        <w:rPr>
+          <w:lang w:val="en-US"/>
+        </w:rPr>
+        <w:t xml:space="preserve"> Agile Scrum Master, Team Lead, </w:t>
+      </w:r>
+      <w:proofErr w:type="spellStart"/>
+      <w:r>
+        <w:rPr>
+          <w:lang w:val="en-US"/>
+        </w:rPr>
+        <w:t>Buildmeister</w:t>
+      </w:r>
+      <w:proofErr w:type="spellEnd"/>
+    </w:p>
+    <w:p>
+      <w:pPr>
+        <w:spacing w:before="240" w:after="240"/>
+      </w:pPr>
+    </w:p>
+    <w:p>
+      <w:pPr>
+        <w:spacing w:before="240" w:after="240"/>
+      </w:pPr>
+      <w:r>
+        <w:rPr>
+          <w:b/>
+        </w:rPr>
+        <w:t>Co-Founder &amp; Director of IT</w:t>
+      </w:r>
+      <w:r>
+        <w:t xml:space="preserve"> </w:t>
+      </w:r>
+      <w:proofErr w:type="spellStart"/>
+      <w:r>
+        <w:rPr>
+          <w:i/>
+        </w:rPr>
+        <w:t>Rebit</w:t>
+      </w:r>
+      <w:proofErr w:type="spellEnd"/>
+      <w:r>
+        <w:rPr>
+          <w:i/>
+        </w:rPr>
+        <w:t xml:space="preserve"> Inc.</w:t>
+      </w:r>
+      <w:r>
+        <w:t xml:space="preserve"> </w:t>
+      </w:r>
+      <w:r>
+        <w:t xml:space="preserve">I </w:t>
+      </w:r>
+      <w:r>
+        <w:t xml:space="preserve">Co-founded </w:t>
+      </w:r>
+      <w:proofErr w:type="spellStart"/>
+      <w:r>
+        <w:t>Rebit</w:t>
+      </w:r>
+      <w:proofErr w:type="spellEnd"/>
+      <w:r>
+        <w:t xml:space="preserve"> and was part the engineering team that created a groundbreaking, simple, and automatic backup solution for consumers. We developed a "ridiculously simple" backup appliance that required no user intervention, fundamentally changing the landscape of personal data protection.</w:t>
+      </w:r>
+    </w:p>
+    <w:p>
+      <w:pPr>
+        <w:spacing w:before="240" w:after="240"/>
+        <w:ind w:left="720"/>
+        <w:rPr>
+          <w:lang w:val="en-US"/>
+        </w:rPr>
+      </w:pPr>
+      <w:r>
+        <w:rPr>
+          <w:b/>
+          <w:bCs/>
+          <w:lang w:val="en-US"/>
+        </w:rPr>
+        <w:t xml:space="preserve">Technologies: </w:t>
+      </w:r>
+      <w:r>
+        <w:rPr>
+          <w:lang w:val="en-US"/>
+        </w:rPr>
+        <w:t>Ruby, Cucumber, C++, Delphi, PostgreSQL, Access, Oracle, MSSQL, Oracle Business 1</w:t>
+      </w:r>
+    </w:p>
+    <w:p>
+      <w:pPr>
+        <w:spacing w:before="240" w:after="240"/>
+        <w:ind w:left="720"/>
+        <w:rPr>
+          <w:lang w:val="en-US"/>
+        </w:rPr>
+      </w:pPr>
+      <w:r>
+        <w:rPr>
+          <w:b/>
+          <w:bCs/>
+          <w:lang w:val="en-US"/>
+        </w:rPr>
+        <w:t xml:space="preserve">Tools: </w:t>
+      </w:r>
+      <w:proofErr w:type="spellStart"/>
+      <w:r>
+        <w:rPr>
+          <w:lang w:val="en-US"/>
+        </w:rPr>
+        <w:t>Atlassian</w:t>
+      </w:r>
+      <w:proofErr w:type="spellEnd"/>
+      <w:r>
+        <w:rPr>
+          <w:lang w:val="en-US"/>
+        </w:rPr>
+        <w:t xml:space="preserve"> Suite, Cypress, Sauce Labs, Postman, Agile Scrum Master, </w:t>
+      </w:r>
+      <w:proofErr w:type="spellStart"/>
+      <w:r>
+        <w:rPr>
+          <w:lang w:val="en-US"/>
+        </w:rPr>
+        <w:t>MercurialHG</w:t>
+      </w:r>
+      <w:proofErr w:type="spellEnd"/>
+      <w:r>
+        <w:rPr>
+          <w:lang w:val="en-US"/>
+        </w:rPr>
+        <w:t xml:space="preserve"> </w:t>
+      </w:r>
+    </w:p>
+    <w:p>
+      <w:pPr>
+        <w:spacing w:before="240" w:after="240"/>
+        <w:ind w:left="720"/>
+        <w:rPr>
+          <w:lang w:val="en-US"/>
+        </w:rPr>
+      </w:pPr>
+      <w:r>
+        <w:rPr>
+          <w:b/>
+          <w:bCs/>
+          <w:lang w:val="en-US"/>
+        </w:rPr>
+        <w:t>Additional Roles:</w:t>
+      </w:r>
+      <w:r>
+        <w:rPr>
+          <w:lang w:val="en-US"/>
+        </w:rPr>
+        <w:t xml:space="preserve"> Agile Scrum Master, Team Lead, Software Configuration Manager</w:t>
+      </w:r>
+    </w:p>
+    <w:p>
+      <w:pPr>
+        <w:spacing w:before="240" w:after="240"/>
+        <w:ind w:left="720"/>
+        <w:rPr>
+          <w:lang w:val="en-US"/>
+        </w:rPr>
+      </w:pPr>
+      <w:r>
+        <w:rPr>
+          <w:b/>
+          <w:bCs/>
+          <w:lang w:val="en-US"/>
+        </w:rPr>
+        <w:t xml:space="preserve">Exit: </w:t>
+      </w:r>
+      <w:proofErr w:type="spellStart"/>
+      <w:r>
+        <w:rPr>
+          <w:lang w:val="en-US"/>
+        </w:rPr>
+        <w:t>Rebit</w:t>
+      </w:r>
+      <w:proofErr w:type="spellEnd"/>
+      <w:r>
+        <w:rPr>
+          <w:lang w:val="en-US"/>
+        </w:rPr>
+        <w:t xml:space="preserve"> acquired </w:t>
+      </w:r>
+      <w:r>
+        <w:rPr>
+          <w:lang w:val="en-US"/>
+        </w:rPr>
+        <w:t xml:space="preserve">by </w:t>
+      </w:r>
+      <w:proofErr w:type="spellStart"/>
+      <w:r>
+        <w:rPr>
+          <w:lang w:val="en-US"/>
+        </w:rPr>
+        <w:t>Betsol</w:t>
+      </w:r>
+      <w:proofErr w:type="spellEnd"/>
+      <w:r>
+        <w:rPr>
+          <w:lang w:val="en-US"/>
+        </w:rPr>
+        <w:t xml:space="preserve"> Carbonite</w:t>
+      </w:r>
+      <w:r>
+        <w:rPr>
+          <w:lang w:val="en-US"/>
+        </w:rPr>
+        <w:t xml:space="preserve"> </w:t>
+      </w:r>
+      <w:r>
+        <w:rPr>
+          <w:lang w:val="en-US"/>
+        </w:rPr>
+        <w:t xml:space="preserve">for </w:t>
+      </w:r>
+      <w:r>
+        <w:rPr>
+          <w:lang w:val="en-US"/>
+        </w:rPr>
+        <w:t>25 Million</w:t>
+      </w:r>
+    </w:p>
+    <w:p>
+      <w:pPr>
+        <w:spacing w:before="240" w:after="240"/>
+      </w:pPr>
+    </w:p>
+    <w:p>
+      <w:pPr>
+        <w:spacing w:before="240" w:after="240"/>
+      </w:pPr>
+      <w:r>
+        <w:rPr>
+          <w:b/>
+        </w:rPr>
+        <w:t>Co-Founder &amp; Director of Quality</w:t>
+      </w:r>
+      <w:r>
+        <w:t xml:space="preserve"> </w:t>
+      </w:r>
+      <w:r>
+        <w:rPr>
+          <w:i/>
+        </w:rPr>
+        <w:t>Benchmark Tape Systems</w:t>
+      </w:r>
+      <w:r>
+        <w:rPr>
+          <w:i/>
+        </w:rPr>
+        <w:t>.</w:t>
+      </w:r>
+      <w:r>
+        <w:t xml:space="preserve"> </w:t>
+      </w:r>
+      <w:r>
+        <w:t xml:space="preserve">I </w:t>
+      </w:r>
+      <w:r>
+        <w:t>Co-founded the company and spearheaded the engineering efforts to develop</w:t>
+      </w:r>
+      <w:r>
+        <w:t xml:space="preserve"> and validate</w:t>
+      </w:r>
+      <w:r>
+        <w:t xml:space="preserve"> the DLT1 tape drive, a high-capacity data storage solution. My participation was crucial in taking the product from concept to market, establishing a new standard for reliable and efficient data backup for businesses.</w:t>
+      </w:r>
+    </w:p>
+    <w:p>
+      <w:pPr>
+        <w:spacing w:before="240" w:after="240"/>
+        <w:ind w:left="720"/>
+        <w:rPr>
+          <w:lang w:val="en-US"/>
+        </w:rPr>
+      </w:pPr>
+      <w:r>
+        <w:rPr>
+          <w:b/>
+          <w:bCs/>
+          <w:lang w:val="en-US"/>
+        </w:rPr>
+        <w:t xml:space="preserve">Technologies: </w:t>
+      </w:r>
+      <w:r>
+        <w:rPr>
+          <w:lang w:val="en-US"/>
+        </w:rPr>
+        <w:t xml:space="preserve">MS Server, MSSQL, PostgreSQL, OBDR, Unix, </w:t>
+      </w:r>
+      <w:proofErr w:type="spellStart"/>
+      <w:r>
+        <w:rPr>
+          <w:lang w:val="en-US"/>
+        </w:rPr>
+        <w:t>Linux</w:t>
+      </w:r>
+      <w:proofErr w:type="gramStart"/>
+      <w:r>
+        <w:rPr>
+          <w:lang w:val="en-US"/>
+        </w:rPr>
+        <w:t>,C</w:t>
+      </w:r>
+      <w:proofErr w:type="spellEnd"/>
+      <w:proofErr w:type="gramEnd"/>
+      <w:r>
+        <w:rPr>
+          <w:lang w:val="en-US"/>
+        </w:rPr>
+        <w:t>++, .Net</w:t>
+      </w:r>
+    </w:p>
+    <w:p>
+      <w:pPr>
+        <w:spacing w:before="240" w:after="240"/>
+        <w:ind w:left="720"/>
+        <w:rPr>
+          <w:lang w:val="en-US"/>
+        </w:rPr>
+      </w:pPr>
+      <w:r>
+        <w:rPr>
+          <w:b/>
+          <w:bCs/>
+          <w:lang w:val="en-US"/>
+        </w:rPr>
+        <w:t xml:space="preserve">Tools: </w:t>
+      </w:r>
+      <w:proofErr w:type="spellStart"/>
+      <w:r>
+        <w:rPr>
+          <w:lang w:val="en-US"/>
+        </w:rPr>
+        <w:t>TrackStar</w:t>
+      </w:r>
+      <w:proofErr w:type="spellEnd"/>
+      <w:r>
+        <w:rPr>
+          <w:lang w:val="en-US"/>
+        </w:rPr>
+        <w:t xml:space="preserve">, Visual Studio, Windows Hardware Lab Kit (HLK), </w:t>
+      </w:r>
+      <w:proofErr w:type="spellStart"/>
+      <w:r>
+        <w:rPr>
+          <w:lang w:val="en-US"/>
+        </w:rPr>
+        <w:t>SignTool</w:t>
+      </w:r>
+      <w:proofErr w:type="spellEnd"/>
+      <w:r>
+        <w:rPr>
+          <w:lang w:val="en-US"/>
+        </w:rPr>
+        <w:t>, WHQL (Windows Hardware Quality Labs)</w:t>
+      </w:r>
+    </w:p>
+    <w:p>
+      <w:pPr>
+        <w:spacing w:before="240" w:after="240"/>
+        <w:ind w:left="720"/>
+        <w:rPr>
+          <w:lang w:val="en-US"/>
+        </w:rPr>
+      </w:pPr>
+      <w:r>
+        <w:rPr>
+          <w:b/>
+          <w:bCs/>
+          <w:lang w:val="en-US"/>
+        </w:rPr>
+        <w:t>Additional Roles:</w:t>
+      </w:r>
+      <w:r>
+        <w:rPr>
+          <w:lang w:val="en-US"/>
+        </w:rPr>
+        <w:t xml:space="preserve"> Agile Scrum Master, Director IT, Software Configuration Manager</w:t>
+      </w:r>
+    </w:p>
+    <w:p>
+      <w:pPr>
+        <w:spacing w:before="240" w:after="240"/>
+        <w:ind w:left="720"/>
+        <w:rPr>
+          <w:lang w:val="en-US"/>
+        </w:rPr>
+      </w:pPr>
+      <w:r>
+        <w:rPr>
+          <w:b/>
+          <w:bCs/>
+          <w:lang w:val="en-US"/>
+        </w:rPr>
+        <w:lastRenderedPageBreak/>
+        <w:t xml:space="preserve">Exit: </w:t>
+      </w:r>
+      <w:r>
+        <w:rPr>
+          <w:lang w:val="en-US"/>
+        </w:rPr>
+        <w:t>Quantum acquired Benchmark in 2002 for $56 million.</w:t>
+      </w:r>
+    </w:p>
+    <w:p>
+      <w:pPr>
+        <w:spacing w:before="240" w:after="240"/>
+      </w:pPr>
+    </w:p>
+    <w:p>
+      <w:pPr>
+        <w:spacing w:before="240" w:after="240"/>
+      </w:pPr>
+      <w:r>
+        <w:rPr>
+          <w:b/>
+        </w:rPr>
+        <w:t>Co-Founder &amp; Director of IT</w:t>
+      </w:r>
+      <w:r>
+        <w:t xml:space="preserve"> </w:t>
+      </w:r>
+      <w:proofErr w:type="spellStart"/>
+      <w:r>
+        <w:rPr>
+          <w:i/>
+        </w:rPr>
+        <w:t>Datasonix</w:t>
+      </w:r>
+      <w:proofErr w:type="spellEnd"/>
+      <w:r>
+        <w:rPr>
+          <w:i/>
+        </w:rPr>
+        <w:t xml:space="preserve"> Inc.</w:t>
+      </w:r>
+      <w:r>
+        <w:t xml:space="preserve"> As a co-founder, I was part of the engineering team that created </w:t>
+      </w:r>
+      <w:proofErr w:type="spellStart"/>
+      <w:r>
+        <w:t>Pereos</w:t>
+      </w:r>
+      <w:proofErr w:type="spellEnd"/>
+      <w:r>
+        <w:t>, the world's smallest and lightest tape drive. This portable data storage device was a technological marvel, offering unprecedented data mobility and backup capabilities for the time.</w:t>
+      </w:r>
+    </w:p>
+    <w:p>
+      <w:pPr>
+        <w:spacing w:before="240" w:after="240"/>
+        <w:ind w:left="720"/>
+        <w:rPr>
+          <w:lang w:val="en-US"/>
+        </w:rPr>
+      </w:pPr>
+      <w:r>
+        <w:rPr>
+          <w:b/>
+          <w:bCs/>
+          <w:lang w:val="en-US"/>
+        </w:rPr>
+        <w:t>Technologies:</w:t>
+      </w:r>
+      <w:r>
+        <w:rPr>
+          <w:lang w:val="en-US"/>
+        </w:rPr>
+        <w:t xml:space="preserve"> MS Server, MSSQL, OBDR (One Button Disaster Recovery), </w:t>
+      </w:r>
+      <w:proofErr w:type="gramStart"/>
+      <w:r>
+        <w:rPr>
+          <w:lang w:val="en-US"/>
+        </w:rPr>
+        <w:t>Unix</w:t>
+      </w:r>
+      <w:proofErr w:type="gramEnd"/>
+      <w:r>
+        <w:rPr>
+          <w:lang w:val="en-US"/>
+        </w:rPr>
+        <w:t>, C++, .Net</w:t>
+      </w:r>
+    </w:p>
+    <w:p>
+      <w:pPr>
+        <w:spacing w:before="240" w:after="240"/>
+        <w:ind w:left="720"/>
+        <w:rPr>
+          <w:lang w:val="en-US"/>
+        </w:rPr>
+      </w:pPr>
+      <w:r>
+        <w:rPr>
+          <w:b/>
+          <w:bCs/>
+          <w:lang w:val="en-US"/>
+        </w:rPr>
+        <w:t>Tools:</w:t>
+      </w:r>
+      <w:r>
+        <w:rPr>
+          <w:lang w:val="en-US"/>
+        </w:rPr>
+        <w:t xml:space="preserve"> </w:t>
+      </w:r>
+      <w:proofErr w:type="spellStart"/>
+      <w:r>
+        <w:rPr>
+          <w:lang w:val="en-US"/>
+        </w:rPr>
+        <w:t>TrackStar</w:t>
+      </w:r>
+      <w:proofErr w:type="spellEnd"/>
+      <w:r>
+        <w:rPr>
+          <w:lang w:val="en-US"/>
+        </w:rPr>
+        <w:t xml:space="preserve">, Visual Studio, Windows Hardware Lab Kit (HLK), </w:t>
+      </w:r>
+      <w:proofErr w:type="spellStart"/>
+      <w:r>
+        <w:rPr>
+          <w:lang w:val="en-US"/>
+        </w:rPr>
+        <w:t>SignTool</w:t>
+      </w:r>
+      <w:proofErr w:type="spellEnd"/>
+      <w:r>
+        <w:rPr>
+          <w:lang w:val="en-US"/>
+        </w:rPr>
+        <w:t>, WHQL (Windows Hardware Quality Labs)</w:t>
+      </w:r>
+    </w:p>
+    <w:p>
+      <w:pPr>
+        <w:spacing w:before="240" w:after="240"/>
+        <w:ind w:left="720"/>
+        <w:rPr>
+          <w:lang w:val="en-US"/>
+        </w:rPr>
+      </w:pPr>
+      <w:r>
+        <w:rPr>
+          <w:b/>
+          <w:bCs/>
+          <w:lang w:val="en-US"/>
+        </w:rPr>
+        <w:t>Additional Roles:</w:t>
+      </w:r>
+      <w:r>
+        <w:rPr>
+          <w:b/>
+          <w:bCs/>
+          <w:lang w:val="en-US"/>
+        </w:rPr>
+        <w:t xml:space="preserve"> </w:t>
+      </w:r>
+      <w:r>
+        <w:rPr>
+          <w:lang w:val="en-US"/>
+        </w:rPr>
+        <w:t xml:space="preserve">Team Lead, Software Configuration Manager, </w:t>
+      </w:r>
+      <w:proofErr w:type="spellStart"/>
+      <w:r>
+        <w:rPr>
+          <w:lang w:val="en-US"/>
+        </w:rPr>
+        <w:t>Buildmeister</w:t>
+      </w:r>
+      <w:proofErr w:type="spellEnd"/>
+    </w:p>
+    <w:p>
+      <w:pPr>
+        <w:spacing w:before="240" w:after="240"/>
+        <w:ind w:left="720"/>
+        <w:rPr>
+          <w:lang w:val="en-US"/>
+        </w:rPr>
+      </w:pPr>
+      <w:r>
+        <w:rPr>
+          <w:b/>
+          <w:bCs/>
+          <w:lang w:val="en-US"/>
+        </w:rPr>
+        <w:t xml:space="preserve">Award: </w:t>
+      </w:r>
+      <w:r>
+        <w:rPr>
+          <w:lang w:val="en-US"/>
+        </w:rPr>
+        <w:t>Patent Number 5,960,460 for Non-Intrusive Replication of Hard Disk – a disaster recovery / data replication computer program</w:t>
+      </w:r>
+    </w:p>
+    <w:p>
+      <w:pPr>
+        <w:spacing w:before="240" w:after="240"/>
+        <w:ind w:left="720"/>
+        <w:rPr>
+          <w:lang w:val="en-US"/>
+        </w:rPr>
+      </w:pPr>
+      <w:r>
+        <w:rPr>
+          <w:b/>
+          <w:bCs/>
+          <w:lang w:val="en-US"/>
+        </w:rPr>
+        <w:t>Exit:</w:t>
+      </w:r>
+      <w:r>
+        <w:rPr>
+          <w:lang w:val="en-US"/>
+        </w:rPr>
+        <w:t xml:space="preserve"> </w:t>
+      </w:r>
+      <w:proofErr w:type="spellStart"/>
+      <w:r>
+        <w:rPr>
+          <w:lang w:val="en-US"/>
+        </w:rPr>
+        <w:t>Datasonix</w:t>
+      </w:r>
+      <w:proofErr w:type="spellEnd"/>
+      <w:r>
+        <w:rPr>
+          <w:lang w:val="en-US"/>
+        </w:rPr>
+        <w:t xml:space="preserve"> was acquired by Exabyte for $20 million.</w:t>
+      </w:r>
+    </w:p>
+    <w:p>
+      <w:pPr>
+        <w:spacing w:before="240" w:after="240"/>
+      </w:pPr>
+    </w:p>
+    <w:p>
+      <w:pPr>
+        <w:spacing w:before="240" w:after="240"/>
+      </w:pPr>
+      <w:r>
+        <w:rPr>
+          <w:b/>
+        </w:rPr>
+        <w:t>Senior Software/Firmware Engineer/IT</w:t>
+      </w:r>
+      <w:r>
+        <w:t xml:space="preserve"> </w:t>
+      </w:r>
+      <w:proofErr w:type="spellStart"/>
+      <w:r>
+        <w:rPr>
+          <w:i/>
+        </w:rPr>
+        <w:t>StorageTek</w:t>
+      </w:r>
+      <w:proofErr w:type="spellEnd"/>
+      <w:r>
+        <w:rPr>
+          <w:i/>
+        </w:rPr>
+        <w:t>.</w:t>
+      </w:r>
+      <w:r>
+        <w:t xml:space="preserve"> </w:t>
+      </w:r>
+      <w:r>
+        <w:t xml:space="preserve">I </w:t>
+      </w:r>
+      <w:r>
+        <w:t>Contributed to the development of cutti</w:t>
+      </w:r>
+      <w:r>
+        <w:t>ng-edge automated storage systems</w:t>
+      </w:r>
+      <w:r>
+        <w:t xml:space="preserve">, including the innovative Iceberg </w:t>
+      </w:r>
+      <w:r>
+        <w:t xml:space="preserve">a </w:t>
+      </w:r>
+      <w:r>
+        <w:t>totally redundant, fault tolerant disk system. My work in tools and software engineering was vital to the functionality and reliability of these large-scale data storage solutions, which were used by major corporations worldwide.</w:t>
+      </w:r>
+    </w:p>
+    <w:p>
+      <w:pPr>
+        <w:spacing w:before="240" w:after="240"/>
+        <w:ind w:left="720"/>
+        <w:rPr>
+          <w:lang w:val="en-US"/>
+        </w:rPr>
+      </w:pPr>
+      <w:r>
+        <w:rPr>
+          <w:b/>
+          <w:bCs/>
+          <w:lang w:val="en-US"/>
+        </w:rPr>
+        <w:t>Technologies:</w:t>
+      </w:r>
+      <w:r>
+        <w:rPr>
+          <w:lang w:val="en-US"/>
+        </w:rPr>
+        <w:t xml:space="preserve"> MS Server, MSSQL, LSTC2VM, </w:t>
+      </w:r>
+      <w:proofErr w:type="spellStart"/>
+      <w:r>
+        <w:rPr>
+          <w:lang w:val="en-US"/>
+        </w:rPr>
+        <w:t>HPu</w:t>
+      </w:r>
+      <w:r>
+        <w:rPr>
+          <w:lang w:val="en-US"/>
+        </w:rPr>
+        <w:t>X</w:t>
+      </w:r>
+      <w:proofErr w:type="spellEnd"/>
+      <w:r>
+        <w:rPr>
+          <w:lang w:val="en-US"/>
+        </w:rPr>
+        <w:t>,</w:t>
+      </w:r>
+      <w:r>
+        <w:rPr>
+          <w:lang w:val="en-US"/>
+        </w:rPr>
+        <w:t xml:space="preserve"> Linux</w:t>
+      </w:r>
+      <w:r>
+        <w:rPr>
+          <w:lang w:val="en-US"/>
+        </w:rPr>
+        <w:t>,</w:t>
+      </w:r>
+      <w:r>
+        <w:rPr>
+          <w:lang w:val="en-US"/>
+        </w:rPr>
+        <w:t xml:space="preserve"> C++, .Net</w:t>
+      </w:r>
+      <w:r>
+        <w:rPr>
+          <w:lang w:val="en-US"/>
+        </w:rPr>
+        <w:t>,</w:t>
+      </w:r>
+      <w:r>
+        <w:rPr>
+          <w:lang w:val="en-US"/>
+        </w:rPr>
+        <w:t xml:space="preserve"> ASP, AS</w:t>
+      </w:r>
+      <w:r>
+        <w:rPr>
+          <w:lang w:val="en-US"/>
+        </w:rPr>
+        <w:t>P.NET, PHP, C#, Perl and VBScript</w:t>
+      </w:r>
+      <w:r>
+        <w:rPr>
+          <w:lang w:val="en-US"/>
+        </w:rPr>
+        <w:t>   </w:t>
       </w:r>
       <w:bookmarkStart w:id="2" w:name="_GoBack"/>
       <w:bookmarkEnd w:id="2"/>
       <w:r>
         <w:rPr>
+          <w:lang w:val="en-US"/>
+        </w:rPr>
+        <w:t xml:space="preserve">             </w:t>
+      </w:r>
+    </w:p>
+    <w:p>
+      <w:pPr>
+        <w:spacing w:before="240" w:after="240"/>
+        <w:ind w:left="720"/>
+        <w:rPr>
+          <w:lang w:val="en-US"/>
+        </w:rPr>
+      </w:pPr>
+      <w:r>
+        <w:rPr>
           <w:b/>
           <w:bCs/>
           <w:lang w:val="en-US"/>
         </w:rPr>
-        <w:t>Roles:</w:t>
-      </w:r>
-      <w:r>
-        <w:rPr>
-          <w:lang w:val="en-US"/>
-        </w:rPr>
-        <w:t xml:space="preserve"> Agile Scrum Master, Team Lead, </w:t>
+        <w:t xml:space="preserve">Tools: </w:t>
       </w:r>
       <w:proofErr w:type="spellStart"/>
       <w:r>
         <w:rPr>
           <w:lang w:val="en-US"/>
         </w:rPr>
-        <w:t>Buildmeister</w:t>
+        <w:t>TrackStar</w:t>
       </w:r>
       <w:proofErr w:type="spellEnd"/>
-    </w:p>
-    <w:p>
-      <w:pPr>
-        <w:spacing w:before="240" w:after="240"/>
-      </w:pPr>
-    </w:p>
-    <w:p>
-      <w:pPr>
-        <w:spacing w:before="240" w:after="240"/>
-      </w:pPr>
-      <w:r>
-        <w:rPr>
-          <w:b/>
-        </w:rPr>
-        <w:t>Co-Founder &amp; Director of IT</w:t>
-      </w:r>
-      <w:r>
+      <w:r>
+        <w:rPr>
+          <w:lang w:val="en-US"/>
+        </w:rPr>
+        <w:t xml:space="preserve">, Visual Studio, Windows Hardware Lab Kit (HLK), </w:t>
+      </w:r>
+      <w:proofErr w:type="spellStart"/>
+      <w:r>
+        <w:rPr>
+          <w:lang w:val="en-US"/>
+        </w:rPr>
+        <w:t>SignTool</w:t>
+      </w:r>
+      <w:proofErr w:type="spellEnd"/>
+      <w:r>
+        <w:rPr>
+          <w:lang w:val="en-US"/>
+        </w:rPr>
+        <w:t>, WHQL (Windows Hardware Quality Labs)</w:t>
+      </w:r>
+    </w:p>
+    <w:p>
+      <w:pPr>
+        <w:spacing w:before="240" w:after="240"/>
+        <w:ind w:left="720"/>
+        <w:rPr>
+          <w:lang w:val="en-US"/>
+        </w:rPr>
+      </w:pPr>
+      <w:r>
+        <w:rPr>
+          <w:b/>
+          <w:bCs/>
+          <w:lang w:val="en-US"/>
+        </w:rPr>
+        <w:t>Additional Roles:</w:t>
+      </w:r>
+      <w:r>
+        <w:rPr>
+          <w:lang w:val="en-US"/>
+        </w:rPr>
+        <w:t xml:space="preserve"> Agile Scrum Master, Team Lead</w:t>
+      </w:r>
+    </w:p>
+    <w:p>
+      <w:pPr>
+        <w:spacing w:before="240" w:after="240"/>
+        <w:ind w:left="720"/>
+        <w:rPr>
+          <w:lang w:val="en-US"/>
+        </w:rPr>
+      </w:pPr>
+      <w:r>
+        <w:rPr>
+          <w:b/>
+          <w:bCs/>
+          <w:lang w:val="en-US"/>
+        </w:rPr>
+        <w:t xml:space="preserve">Awards: </w:t>
+      </w:r>
+      <w:r>
+        <w:rPr>
+          <w:lang w:val="en-US"/>
+        </w:rPr>
+        <w:t xml:space="preserve">Technical Innovator </w:t>
+      </w:r>
+      <w:proofErr w:type="gramStart"/>
+      <w:r>
+        <w:rPr>
+          <w:lang w:val="en-US"/>
+        </w:rPr>
+        <w:t>O</w:t>
+      </w:r>
+      <w:r>
+        <w:rPr>
+          <w:lang w:val="en-US"/>
+        </w:rPr>
+        <w:t>f</w:t>
+      </w:r>
+      <w:proofErr w:type="gramEnd"/>
+      <w:r>
+        <w:rPr>
+          <w:lang w:val="en-US"/>
+        </w:rPr>
+        <w:t xml:space="preserve"> The Year. Malcom Baldridge Quality Award</w:t>
+      </w:r>
+    </w:p>
+    <w:p>
+      <w:pPr>
+        <w:spacing w:before="240" w:after="240"/>
+        <w:ind w:left="720"/>
+        <w:rPr>
+          <w:lang w:val="en-US"/>
+        </w:rPr>
+      </w:pPr>
+      <w:r>
+        <w:rPr>
+          <w:b/>
+          <w:bCs/>
+          <w:lang w:val="en-US"/>
+        </w:rPr>
+        <w:t xml:space="preserve">Exit: </w:t>
+      </w:r>
+      <w:r>
+        <w:rPr>
+          <w:lang w:val="en-US"/>
+        </w:rPr>
+        <w:t>Sun Microsystems acquired Storage Technology Corporation (</w:t>
+      </w:r>
+      <w:proofErr w:type="spellStart"/>
+      <w:r>
+        <w:rPr>
+          <w:lang w:val="en-US"/>
+        </w:rPr>
+        <w:t>StorageTek</w:t>
+      </w:r>
+      <w:proofErr w:type="spellEnd"/>
+      <w:r>
+        <w:rPr>
+          <w:lang w:val="en-US"/>
+        </w:rPr>
+        <w:t>) in August 2005 for US</w:t>
+      </w:r>
+      <w:r>
+        <w:rPr>
+          <w:lang w:val="en-US"/>
+        </w:rPr>
         <w:t xml:space="preserve"> </w:t>
       </w:r>
+      <w:r>
+        <w:rPr>
+          <w:lang w:val="en-US"/>
+        </w:rPr>
+        <w:t>$4.1 billion.</w:t>
+      </w:r>
+    </w:p>
+    <w:p>
+      <w:pPr>
+        <w:spacing w:before="240" w:after="240"/>
+      </w:pPr>
+    </w:p>
+    <w:p>
+      <w:pPr>
+        <w:spacing w:before="240" w:after="240"/>
+      </w:pPr>
+      <w:r>
+        <w:rPr>
+          <w:b/>
+        </w:rPr>
+        <w:t xml:space="preserve">Aerospace Power Design </w:t>
+      </w:r>
+      <w:r>
+        <w:rPr>
+          <w:b/>
+        </w:rPr>
+        <w:t>Engineer</w:t>
+      </w:r>
+      <w:r>
+        <w:t xml:space="preserve"> </w:t>
+      </w:r>
       <w:proofErr w:type="spellStart"/>
       <w:r>
         <w:rPr>
           <w:i/>
         </w:rPr>
-        <w:t>Rebit</w:t>
+        <w:t>Technetics</w:t>
       </w:r>
       <w:proofErr w:type="spellEnd"/>
       <w:r>
@@ -970,18 +1897,16 @@
         <w:t xml:space="preserve"> </w:t>
       </w:r>
       <w:r>
-        <w:t xml:space="preserve">I </w:t>
-      </w:r>
-      <w:r>
-        <w:t xml:space="preserve">Co-founded </w:t>
-      </w:r>
-      <w:proofErr w:type="spellStart"/>
-      <w:r>
-        <w:t>Rebit</w:t>
-      </w:r>
-      <w:proofErr w:type="spellEnd"/>
-      <w:r>
-        <w:t xml:space="preserve"> and was part the engineering team that created a groundbreaking, simple, and automatic backup solution for consumers. We developed a "ridiculously simple" backup appliance that required no user intervention, fundamentally changing the landscape of personal data protection.</w:t>
+        <w:t>I d</w:t>
+      </w:r>
+      <w:r>
+        <w:t>esigned and built mission-critical power supplies for the nation's most advanced defense and aerospace platforms. My projects included developing power systems for the Space Shuttle (NASA), nuclear submarines (U.S. Navy), and Black Ops helicopters (U.S. Air</w:t>
+      </w:r>
+      <w:r>
+        <w:t>f</w:t>
+      </w:r>
+      <w:r>
+        <w:t>orce), all requiring the highest levels of precision and reliability.</w:t>
       </w:r>
     </w:p>
     <w:p>
@@ -998,902 +1923,7 @@
           <w:bCs/>
           <w:lang w:val="en-US"/>
         </w:rPr>
-        <w:t xml:space="preserve">Technologies: </w:t>
-      </w:r>
-      <w:r>
-        <w:rPr>
-          <w:lang w:val="en-US"/>
-        </w:rPr>
-        <w:t>Ruby, Cucumber, C++, Delphi, PostgreSQL, Access, Oracle, MSSQL, Oracle Business 1</w:t>
-      </w:r>
-    </w:p>
-    <w:p>
-      <w:pPr>
-        <w:spacing w:before="240" w:after="240"/>
-        <w:ind w:left="720"/>
-        <w:rPr>
-          <w:lang w:val="en-US"/>
-        </w:rPr>
-      </w:pPr>
-      <w:r>
-        <w:rPr>
-          <w:b/>
-          <w:bCs/>
-          <w:lang w:val="en-US"/>
-        </w:rPr>
-        <w:t xml:space="preserve">Tools: </w:t>
-      </w:r>
-      <w:proofErr w:type="spellStart"/>
-      <w:r>
-        <w:rPr>
-          <w:lang w:val="en-US"/>
-        </w:rPr>
-        <w:t>Atlassian</w:t>
-      </w:r>
-      <w:proofErr w:type="spellEnd"/>
-      <w:r>
-        <w:rPr>
-          <w:lang w:val="en-US"/>
-        </w:rPr>
-        <w:t xml:space="preserve"> Suite, Cypress, Sauce Labs, Postman, Agile Scrum Master, </w:t>
-      </w:r>
-      <w:proofErr w:type="spellStart"/>
-      <w:r>
-        <w:rPr>
-          <w:lang w:val="en-US"/>
-        </w:rPr>
-        <w:t>MercurialHG</w:t>
-      </w:r>
-      <w:proofErr w:type="spellEnd"/>
-      <w:r>
-        <w:rPr>
-          <w:lang w:val="en-US"/>
-        </w:rPr>
-        <w:t xml:space="preserve"> </w:t>
-      </w:r>
-    </w:p>
-    <w:p>
-      <w:pPr>
-        <w:spacing w:before="240" w:after="240"/>
-        <w:ind w:left="720"/>
-        <w:rPr>
-          <w:lang w:val="en-US"/>
-        </w:rPr>
-      </w:pPr>
-      <w:r>
-        <w:rPr>
-          <w:b/>
-          <w:bCs/>
-          <w:lang w:val="en-US"/>
-        </w:rPr>
-        <w:t>Additional Roles:</w:t>
-      </w:r>
-      <w:r>
-        <w:rPr>
-          <w:lang w:val="en-US"/>
-        </w:rPr>
-        <w:t xml:space="preserve"> Agile Scrum Master, Team Lead, Software Configuration Manager</w:t>
-      </w:r>
-    </w:p>
-    <w:p>
-      <w:pPr>
-        <w:spacing w:before="240" w:after="240"/>
-        <w:ind w:left="720"/>
-        <w:rPr>
-          <w:lang w:val="en-US"/>
-        </w:rPr>
-      </w:pPr>
-      <w:r>
-        <w:rPr>
-          <w:b/>
-          <w:bCs/>
-          <w:lang w:val="en-US"/>
-        </w:rPr>
-        <w:t xml:space="preserve">Exit: </w:t>
-      </w:r>
-      <w:proofErr w:type="spellStart"/>
-      <w:r>
-        <w:rPr>
-          <w:lang w:val="en-US"/>
-        </w:rPr>
-        <w:t>Rebit</w:t>
-      </w:r>
-      <w:proofErr w:type="spellEnd"/>
-      <w:r>
-        <w:rPr>
-          <w:lang w:val="en-US"/>
-        </w:rPr>
-        <w:t xml:space="preserve"> acquired </w:t>
-      </w:r>
-      <w:r>
-        <w:rPr>
-          <w:lang w:val="en-US"/>
-        </w:rPr>
-        <w:t xml:space="preserve">by </w:t>
-      </w:r>
-      <w:proofErr w:type="spellStart"/>
-      <w:r>
-        <w:rPr>
-          <w:lang w:val="en-US"/>
-        </w:rPr>
-        <w:t>Betsol</w:t>
-      </w:r>
-      <w:proofErr w:type="spellEnd"/>
-      <w:r>
-        <w:rPr>
-          <w:lang w:val="en-US"/>
-        </w:rPr>
-        <w:t xml:space="preserve"> Carbonite</w:t>
-      </w:r>
-      <w:r>
-        <w:rPr>
-          <w:lang w:val="en-US"/>
-        </w:rPr>
-        <w:t xml:space="preserve"> </w:t>
-      </w:r>
-      <w:r>
-        <w:rPr>
-          <w:lang w:val="en-US"/>
-        </w:rPr>
-        <w:t xml:space="preserve">for </w:t>
-      </w:r>
-      <w:r>
-        <w:rPr>
-          <w:lang w:val="en-US"/>
-        </w:rPr>
-        <w:t>25 Million</w:t>
-      </w:r>
-    </w:p>
-    <w:p>
-      <w:pPr>
-        <w:spacing w:before="240" w:after="240"/>
-      </w:pPr>
-    </w:p>
-    <w:p>
-      <w:pPr>
-        <w:spacing w:before="240" w:after="240"/>
-      </w:pPr>
-      <w:r>
-        <w:rPr>
-          <w:b/>
-        </w:rPr>
-        <w:t>Co-Founder &amp; Director of Quality</w:t>
-      </w:r>
-      <w:r>
-        <w:t xml:space="preserve"> </w:t>
-      </w:r>
-      <w:r>
-        <w:rPr>
-          <w:i/>
-        </w:rPr>
-        <w:t>Benchmark Tape Systems</w:t>
-      </w:r>
-      <w:r>
-        <w:rPr>
-          <w:i/>
-        </w:rPr>
-        <w:t>.</w:t>
-      </w:r>
-      <w:r>
-        <w:t xml:space="preserve"> </w:t>
-      </w:r>
-      <w:r>
-        <w:t xml:space="preserve">I </w:t>
-      </w:r>
-      <w:r>
-        <w:t>Co-founded the company and spearheaded the engineering efforts to develop</w:t>
-      </w:r>
-      <w:r>
-        <w:t xml:space="preserve"> and validate</w:t>
-      </w:r>
-      <w:r>
-        <w:t xml:space="preserve"> the DLT1 tape drive, a high-capacity data storage solution. My participation was crucial in taking the product from concept to market, establishing a new standard for reliable and efficient data backup for businesses.</w:t>
-      </w:r>
-    </w:p>
-    <w:p>
-      <w:pPr>
-        <w:spacing w:before="240" w:after="240"/>
-        <w:ind w:left="720"/>
-        <w:rPr>
-          <w:lang w:val="en-US"/>
-        </w:rPr>
-      </w:pPr>
-      <w:r>
-        <w:rPr>
-          <w:b/>
-          <w:bCs/>
-          <w:lang w:val="en-US"/>
-        </w:rPr>
-        <w:t xml:space="preserve">Technologies: </w:t>
-      </w:r>
-      <w:r>
-        <w:rPr>
-          <w:lang w:val="en-US"/>
-        </w:rPr>
-        <w:t xml:space="preserve">MS Server, MSSQL, PostgreSQL, OBDR, Unix, </w:t>
-      </w:r>
-      <w:proofErr w:type="spellStart"/>
-      <w:r>
-        <w:rPr>
-          <w:lang w:val="en-US"/>
-        </w:rPr>
-        <w:t>Linux</w:t>
-      </w:r>
-      <w:proofErr w:type="gramStart"/>
-      <w:r>
-        <w:rPr>
-          <w:lang w:val="en-US"/>
-        </w:rPr>
-        <w:t>,C</w:t>
-      </w:r>
-      <w:proofErr w:type="spellEnd"/>
-      <w:proofErr w:type="gramEnd"/>
-      <w:r>
-        <w:rPr>
-          <w:lang w:val="en-US"/>
-        </w:rPr>
-        <w:t>++, .Net</w:t>
-      </w:r>
-    </w:p>
-    <w:p>
-      <w:pPr>
-        <w:spacing w:before="240" w:after="240"/>
-        <w:ind w:left="720"/>
-        <w:rPr>
-          <w:lang w:val="en-US"/>
-        </w:rPr>
-      </w:pPr>
-      <w:r>
-        <w:rPr>
-          <w:b/>
-          <w:bCs/>
-          <w:lang w:val="en-US"/>
-        </w:rPr>
-        <w:t xml:space="preserve">Tools: </w:t>
-      </w:r>
-      <w:proofErr w:type="spellStart"/>
-      <w:r>
-        <w:rPr>
-          <w:lang w:val="en-US"/>
-        </w:rPr>
-        <w:t>TrackStar</w:t>
-      </w:r>
-      <w:proofErr w:type="spellEnd"/>
-      <w:r>
-        <w:rPr>
-          <w:lang w:val="en-US"/>
-        </w:rPr>
-        <w:t xml:space="preserve">, Visual Studio, Windows Hardware Lab Kit (HLK), </w:t>
-      </w:r>
-      <w:proofErr w:type="spellStart"/>
-      <w:r>
-        <w:rPr>
-          <w:lang w:val="en-US"/>
-        </w:rPr>
-        <w:t>SignTool</w:t>
-      </w:r>
-      <w:proofErr w:type="spellEnd"/>
-      <w:r>
-        <w:rPr>
-          <w:lang w:val="en-US"/>
-        </w:rPr>
-        <w:t>, WHQL (Windows Hardware Quality Labs)</w:t>
-      </w:r>
-    </w:p>
-    <w:p>
-      <w:pPr>
-        <w:spacing w:before="240" w:after="240"/>
-        <w:ind w:left="720"/>
-        <w:rPr>
-          <w:lang w:val="en-US"/>
-        </w:rPr>
-      </w:pPr>
-      <w:r>
-        <w:rPr>
-          <w:b/>
-          <w:bCs/>
-          <w:lang w:val="en-US"/>
-        </w:rPr>
-        <w:t>Additional Roles:</w:t>
-      </w:r>
-      <w:r>
-        <w:rPr>
-          <w:lang w:val="en-US"/>
-        </w:rPr>
-        <w:t xml:space="preserve"> Agile Scrum Master, Director IT, Software Configuration Manager</w:t>
-      </w:r>
-    </w:p>
-    <w:p>
-      <w:pPr>
-        <w:spacing w:before="240" w:after="240"/>
-        <w:ind w:left="720"/>
-        <w:rPr>
-          <w:lang w:val="en-US"/>
-        </w:rPr>
-      </w:pPr>
-      <w:r>
-        <w:rPr>
-          <w:b/>
-          <w:bCs/>
-          <w:lang w:val="en-US"/>
-        </w:rPr>
         <w:lastRenderedPageBreak/>
-        <w:t xml:space="preserve">Exit: </w:t>
-      </w:r>
-      <w:r>
-        <w:rPr>
-          <w:lang w:val="en-US"/>
-        </w:rPr>
-        <w:t>Quantum acquired Benchmark in 2002 for $56 million.</w:t>
-      </w:r>
-    </w:p>
-    <w:p>
-      <w:pPr>
-        <w:spacing w:before="240" w:after="240"/>
-      </w:pPr>
-    </w:p>
-    <w:p>
-      <w:pPr>
-        <w:spacing w:before="240" w:after="240"/>
-      </w:pPr>
-      <w:r>
-        <w:rPr>
-          <w:b/>
-        </w:rPr>
-        <w:t>Co-Founder &amp; Director of IT</w:t>
-      </w:r>
-      <w:r>
-        <w:t xml:space="preserve"> </w:t>
-      </w:r>
-      <w:proofErr w:type="spellStart"/>
-      <w:r>
-        <w:rPr>
-          <w:i/>
-        </w:rPr>
-        <w:t>Datasonix</w:t>
-      </w:r>
-      <w:proofErr w:type="spellEnd"/>
-      <w:r>
-        <w:rPr>
-          <w:i/>
-        </w:rPr>
-        <w:t xml:space="preserve"> Inc.</w:t>
-      </w:r>
-      <w:r>
-        <w:t xml:space="preserve"> As a co-founder, I was part of the engineering team that created </w:t>
-      </w:r>
-      <w:proofErr w:type="spellStart"/>
-      <w:r>
-        <w:t>Pereos</w:t>
-      </w:r>
-      <w:proofErr w:type="spellEnd"/>
-      <w:r>
-        <w:t>, the world's smallest and lightest tape drive. This portable data storage device was a technological marvel, offering unprecedented data mobility and backup capabilities for the time.</w:t>
-      </w:r>
-    </w:p>
-    <w:p>
-      <w:pPr>
-        <w:spacing w:before="240" w:after="240"/>
-        <w:ind w:left="720"/>
-        <w:rPr>
-          <w:lang w:val="en-US"/>
-        </w:rPr>
-      </w:pPr>
-      <w:r>
-        <w:rPr>
-          <w:b/>
-          <w:bCs/>
-          <w:lang w:val="en-US"/>
-        </w:rPr>
-        <w:t>Technologies:</w:t>
-      </w:r>
-      <w:r>
-        <w:rPr>
-          <w:lang w:val="en-US"/>
-        </w:rPr>
-        <w:t xml:space="preserve"> MS Server, MSSQL, OBDR (One Button Disaster Recovery), </w:t>
-      </w:r>
-      <w:proofErr w:type="gramStart"/>
-      <w:r>
-        <w:rPr>
-          <w:lang w:val="en-US"/>
-        </w:rPr>
-        <w:t>Unix</w:t>
-      </w:r>
-      <w:proofErr w:type="gramEnd"/>
-      <w:r>
-        <w:rPr>
-          <w:lang w:val="en-US"/>
-        </w:rPr>
-        <w:t>, C++, .Net</w:t>
-      </w:r>
-    </w:p>
-    <w:p>
-      <w:pPr>
-        <w:spacing w:before="240" w:after="240"/>
-        <w:ind w:left="720"/>
-        <w:rPr>
-          <w:lang w:val="en-US"/>
-        </w:rPr>
-      </w:pPr>
-      <w:r>
-        <w:rPr>
-          <w:b/>
-          <w:bCs/>
-          <w:lang w:val="en-US"/>
-        </w:rPr>
-        <w:t>Tools:</w:t>
-      </w:r>
-      <w:r>
-        <w:rPr>
-          <w:lang w:val="en-US"/>
-        </w:rPr>
-        <w:t xml:space="preserve"> </w:t>
-      </w:r>
-      <w:proofErr w:type="spellStart"/>
-      <w:r>
-        <w:rPr>
-          <w:lang w:val="en-US"/>
-        </w:rPr>
-        <w:t>TrackStar</w:t>
-      </w:r>
-      <w:proofErr w:type="spellEnd"/>
-      <w:r>
-        <w:rPr>
-          <w:lang w:val="en-US"/>
-        </w:rPr>
-        <w:t xml:space="preserve">, Visual Studio, Windows Hardware Lab Kit (HLK), </w:t>
-      </w:r>
-      <w:proofErr w:type="spellStart"/>
-      <w:r>
-        <w:rPr>
-          <w:lang w:val="en-US"/>
-        </w:rPr>
-        <w:t>SignTool</w:t>
-      </w:r>
-      <w:proofErr w:type="spellEnd"/>
-      <w:r>
-        <w:rPr>
-          <w:lang w:val="en-US"/>
-        </w:rPr>
-        <w:t>, WHQL (Windows Hardware Quality Labs)</w:t>
-      </w:r>
-    </w:p>
-    <w:p>
-      <w:pPr>
-        <w:spacing w:before="240" w:after="240"/>
-        <w:ind w:left="720"/>
-        <w:rPr>
-          <w:lang w:val="en-US"/>
-        </w:rPr>
-      </w:pPr>
-      <w:r>
-        <w:rPr>
-          <w:b/>
-          <w:bCs/>
-          <w:lang w:val="en-US"/>
-        </w:rPr>
-        <w:t>Additional Roles:</w:t>
-      </w:r>
-      <w:r>
-        <w:rPr>
-          <w:b/>
-          <w:bCs/>
-          <w:lang w:val="en-US"/>
-        </w:rPr>
-        <w:t xml:space="preserve"> </w:t>
-      </w:r>
-      <w:r>
-        <w:rPr>
-          <w:lang w:val="en-US"/>
-        </w:rPr>
-        <w:t xml:space="preserve">Team Lead, Software Configuration Manager, </w:t>
-      </w:r>
-      <w:proofErr w:type="spellStart"/>
-      <w:r>
-        <w:rPr>
-          <w:lang w:val="en-US"/>
-        </w:rPr>
-        <w:t>Buildmeister</w:t>
-      </w:r>
-      <w:proofErr w:type="spellEnd"/>
-    </w:p>
-    <w:p>
-      <w:pPr>
-        <w:spacing w:before="240" w:after="240"/>
-        <w:ind w:left="720"/>
-        <w:rPr>
-          <w:lang w:val="en-US"/>
-        </w:rPr>
-      </w:pPr>
-      <w:r>
-        <w:rPr>
-          <w:b/>
-          <w:bCs/>
-          <w:lang w:val="en-US"/>
-        </w:rPr>
-        <w:t xml:space="preserve">Award: </w:t>
-      </w:r>
-      <w:r>
-        <w:rPr>
-          <w:lang w:val="en-US"/>
-        </w:rPr>
-        <w:t>Patent Number 5,960,460 for Non-Intrusive Replication of Hard Disk – a disaster recovery / data replication computer program</w:t>
-      </w:r>
-    </w:p>
-    <w:p>
-      <w:pPr>
-        <w:spacing w:before="240" w:after="240"/>
-        <w:ind w:left="720"/>
-        <w:rPr>
-          <w:lang w:val="en-US"/>
-        </w:rPr>
-      </w:pPr>
-      <w:r>
-        <w:rPr>
-          <w:b/>
-          <w:bCs/>
-          <w:lang w:val="en-US"/>
-        </w:rPr>
-        <w:t>Exit:</w:t>
-      </w:r>
-      <w:r>
-        <w:rPr>
-          <w:lang w:val="en-US"/>
-        </w:rPr>
-        <w:t xml:space="preserve"> </w:t>
-      </w:r>
-      <w:proofErr w:type="spellStart"/>
-      <w:r>
-        <w:rPr>
-          <w:lang w:val="en-US"/>
-        </w:rPr>
-        <w:t>Datasonix</w:t>
-      </w:r>
-      <w:proofErr w:type="spellEnd"/>
-      <w:r>
-        <w:rPr>
-          <w:lang w:val="en-US"/>
-        </w:rPr>
-        <w:t xml:space="preserve"> was acquired by Exabyte for $20 million.</w:t>
-      </w:r>
-    </w:p>
-    <w:p>
-      <w:pPr>
-        <w:spacing w:before="240" w:after="240"/>
-      </w:pPr>
-    </w:p>
-    <w:p>
-      <w:pPr>
-        <w:spacing w:before="240" w:after="240"/>
-      </w:pPr>
-      <w:r>
-        <w:rPr>
-          <w:b/>
-        </w:rPr>
-        <w:t>Senior Software/Firmware Engineer/IT</w:t>
-      </w:r>
-      <w:r>
-        <w:t xml:space="preserve"> </w:t>
-      </w:r>
-      <w:proofErr w:type="spellStart"/>
-      <w:r>
-        <w:rPr>
-          <w:i/>
-        </w:rPr>
-        <w:t>StorageTek</w:t>
-      </w:r>
-      <w:proofErr w:type="spellEnd"/>
-      <w:r>
-        <w:rPr>
-          <w:i/>
-        </w:rPr>
-        <w:t>.</w:t>
-      </w:r>
-      <w:r>
-        <w:t xml:space="preserve"> </w:t>
-      </w:r>
-      <w:r>
-        <w:t xml:space="preserve">I </w:t>
-      </w:r>
-      <w:r>
-        <w:t>Contributed to the development of cutti</w:t>
-      </w:r>
-      <w:r>
-        <w:t>ng-edge automated storage systems</w:t>
-      </w:r>
-      <w:r>
-        <w:t xml:space="preserve">, including the innovative Iceberg </w:t>
-      </w:r>
-      <w:r>
-        <w:t xml:space="preserve">a </w:t>
-      </w:r>
-      <w:r>
-        <w:t>totally redundant, fault tolerant disk system. My work in tools and software engineering was vital to the functionality and reliability of these large-scale data storage solutions, which were used by major corporations worldwide.</w:t>
-      </w:r>
-    </w:p>
-    <w:p>
-      <w:pPr>
-        <w:spacing w:before="240" w:after="240"/>
-        <w:ind w:left="720"/>
-        <w:rPr>
-          <w:lang w:val="en-US"/>
-        </w:rPr>
-      </w:pPr>
-      <w:r>
-        <w:rPr>
-          <w:b/>
-          <w:bCs/>
-          <w:lang w:val="en-US"/>
-        </w:rPr>
-        <w:t>Technologies:</w:t>
-      </w:r>
-      <w:r>
-        <w:rPr>
-          <w:lang w:val="en-US"/>
-        </w:rPr>
-        <w:t xml:space="preserve"> MS Server, MSSQL, LSTC2VM, </w:t>
-      </w:r>
-      <w:proofErr w:type="spellStart"/>
-      <w:r>
-        <w:rPr>
-          <w:lang w:val="en-US"/>
-        </w:rPr>
-        <w:t>HPux</w:t>
-      </w:r>
-      <w:proofErr w:type="spellEnd"/>
-      <w:r>
-        <w:rPr>
-          <w:lang w:val="en-US"/>
-        </w:rPr>
-        <w:t>,</w:t>
-      </w:r>
-      <w:r>
-        <w:rPr>
-          <w:lang w:val="en-US"/>
-        </w:rPr>
-        <w:t xml:space="preserve"> </w:t>
-      </w:r>
-      <w:proofErr w:type="gramStart"/>
-      <w:r>
-        <w:rPr>
-          <w:lang w:val="en-US"/>
-        </w:rPr>
-        <w:t>Unix</w:t>
-      </w:r>
-      <w:proofErr w:type="gramEnd"/>
-      <w:r>
-        <w:rPr>
-          <w:lang w:val="en-US"/>
-        </w:rPr>
-        <w:t xml:space="preserve">, Linux C++, .Net </w:t>
-      </w:r>
-    </w:p>
-    <w:p>
-      <w:pPr>
-        <w:spacing w:before="240" w:after="240"/>
-        <w:ind w:left="720"/>
-        <w:rPr>
-          <w:lang w:val="en-US"/>
-        </w:rPr>
-      </w:pPr>
-      <w:r>
-        <w:rPr>
-          <w:b/>
-          <w:bCs/>
-          <w:lang w:val="en-US"/>
-        </w:rPr>
-        <w:t xml:space="preserve">Tools: </w:t>
-      </w:r>
-      <w:proofErr w:type="spellStart"/>
-      <w:r>
-        <w:rPr>
-          <w:lang w:val="en-US"/>
-        </w:rPr>
-        <w:t>TrackStar</w:t>
-      </w:r>
-      <w:proofErr w:type="spellEnd"/>
-      <w:r>
-        <w:rPr>
-          <w:lang w:val="en-US"/>
-        </w:rPr>
-        <w:t xml:space="preserve">, Visual Studio, Windows Hardware Lab Kit (HLK), </w:t>
-      </w:r>
-      <w:proofErr w:type="spellStart"/>
-      <w:r>
-        <w:rPr>
-          <w:lang w:val="en-US"/>
-        </w:rPr>
-        <w:t>SignTool</w:t>
-      </w:r>
-      <w:proofErr w:type="spellEnd"/>
-      <w:r>
-        <w:rPr>
-          <w:lang w:val="en-US"/>
-        </w:rPr>
-        <w:t>, WHQL (Windows Hardware Quality Labs)</w:t>
-      </w:r>
-    </w:p>
-    <w:p>
-      <w:pPr>
-        <w:spacing w:before="240" w:after="240"/>
-        <w:ind w:left="720"/>
-        <w:rPr>
-          <w:lang w:val="en-US"/>
-        </w:rPr>
-      </w:pPr>
-      <w:r>
-        <w:rPr>
-          <w:b/>
-          <w:bCs/>
-          <w:lang w:val="en-US"/>
-        </w:rPr>
-        <w:t>Additional Roles:</w:t>
-      </w:r>
-      <w:r>
-        <w:rPr>
-          <w:lang w:val="en-US"/>
-        </w:rPr>
-        <w:t xml:space="preserve"> Agile Scrum Master, Team Lead</w:t>
-      </w:r>
-    </w:p>
-    <w:p>
-      <w:pPr>
-        <w:spacing w:before="240" w:after="240"/>
-        <w:ind w:left="720"/>
-        <w:rPr>
-          <w:lang w:val="en-US"/>
-        </w:rPr>
-      </w:pPr>
-      <w:r>
-        <w:rPr>
-          <w:b/>
-          <w:bCs/>
-          <w:lang w:val="en-US"/>
-        </w:rPr>
-        <w:t xml:space="preserve">Awards: </w:t>
-      </w:r>
-      <w:r>
-        <w:rPr>
-          <w:lang w:val="en-US"/>
-        </w:rPr>
-        <w:t xml:space="preserve">Technical Innovator of </w:t>
-      </w:r>
-      <w:proofErr w:type="gramStart"/>
-      <w:r>
-        <w:rPr>
-          <w:lang w:val="en-US"/>
-        </w:rPr>
-        <w:t>The</w:t>
-      </w:r>
-      <w:proofErr w:type="gramEnd"/>
-      <w:r>
-        <w:rPr>
-          <w:lang w:val="en-US"/>
-        </w:rPr>
-        <w:t xml:space="preserve"> Year. Malcom Baldridge Quality Award</w:t>
-      </w:r>
-    </w:p>
-    <w:p>
-      <w:pPr>
-        <w:spacing w:before="240" w:after="240"/>
-        <w:ind w:left="720"/>
-        <w:rPr>
-          <w:lang w:val="en-US"/>
-        </w:rPr>
-      </w:pPr>
-      <w:r>
-        <w:rPr>
-          <w:b/>
-          <w:bCs/>
-          <w:lang w:val="en-US"/>
-        </w:rPr>
-        <w:t xml:space="preserve">Exit: </w:t>
-      </w:r>
-      <w:r>
-        <w:rPr>
-          <w:lang w:val="en-US"/>
-        </w:rPr>
-        <w:t>Sun Microsystems acquired Storage Technology Corporation (</w:t>
-      </w:r>
-      <w:proofErr w:type="spellStart"/>
-      <w:r>
-        <w:rPr>
-          <w:lang w:val="en-US"/>
-        </w:rPr>
-        <w:t>StorageTek</w:t>
-      </w:r>
-      <w:proofErr w:type="spellEnd"/>
-      <w:r>
-        <w:rPr>
-          <w:lang w:val="en-US"/>
-        </w:rPr>
-        <w:t>) in August 2005 for US</w:t>
-      </w:r>
-      <w:r>
-        <w:rPr>
-          <w:lang w:val="en-US"/>
-        </w:rPr>
-        <w:t xml:space="preserve"> </w:t>
-      </w:r>
-      <w:r>
-        <w:rPr>
-          <w:lang w:val="en-US"/>
-        </w:rPr>
-        <w:t>$4.1 billion.</w:t>
-      </w:r>
-    </w:p>
-    <w:p>
-      <w:pPr>
-        <w:spacing w:before="240" w:after="240"/>
-      </w:pPr>
-    </w:p>
-    <w:p>
-      <w:pPr>
-        <w:spacing w:before="240" w:after="240"/>
-      </w:pPr>
-    </w:p>
-    <w:p>
-      <w:pPr>
-        <w:spacing w:before="240" w:after="240"/>
-      </w:pPr>
-      <w:r>
-        <w:rPr>
-          <w:b/>
-        </w:rPr>
-        <w:t>Electrical Engineer</w:t>
-      </w:r>
-      <w:r>
-        <w:t xml:space="preserve"> </w:t>
-      </w:r>
-      <w:proofErr w:type="spellStart"/>
-      <w:r>
-        <w:rPr>
-          <w:i/>
-        </w:rPr>
-        <w:t>Technetics</w:t>
-      </w:r>
-      <w:proofErr w:type="spellEnd"/>
-      <w:r>
-        <w:rPr>
-          <w:i/>
-        </w:rPr>
-        <w:t xml:space="preserve"> Inc.</w:t>
-      </w:r>
-      <w:r>
-        <w:t xml:space="preserve"> </w:t>
-      </w:r>
-      <w:r>
-        <w:t>I d</w:t>
-      </w:r>
-      <w:r>
-        <w:t xml:space="preserve">esigned and built mission-critical power supplies for the nation's most advanced defense and aerospace platforms. My projects included developing </w:t>
-      </w:r>
-      <w:r>
-        <w:lastRenderedPageBreak/>
-        <w:t>power systems for the Space Shuttle (NASA), nuclear submarines (U.S. Navy), and Black Ops helicopters (U.S. Air</w:t>
-      </w:r>
-      <w:r>
-        <w:t>f</w:t>
-      </w:r>
-      <w:r>
-        <w:t>orce), all requiring the highest levels of precision and reliability.</w:t>
-      </w:r>
-    </w:p>
-    <w:p>
-      <w:pPr>
-        <w:spacing w:before="240" w:after="240"/>
-        <w:ind w:left="720"/>
-        <w:rPr>
-          <w:lang w:val="en-US"/>
-        </w:rPr>
-      </w:pPr>
-      <w:r>
-        <w:rPr>
-          <w:b/>
-          <w:bCs/>
-          <w:lang w:val="en-US"/>
-        </w:rPr>
         <w:t xml:space="preserve">Technologies: </w:t>
       </w:r>
       <w:r>
@@ -2275,7 +2305,6 @@
         <w:rPr>
           <w:lang w:val="en-US"/>
         </w:rPr>
-        <w:lastRenderedPageBreak/>
         <w:t>Content &amp; Mission Alignment: Ensure all on-air content reflects KGNU’s core mission of diversity, inclusiveness, and providing a platform for overlooked perspectives.</w:t>
       </w:r>
     </w:p>
@@ -2295,6 +2324,7 @@
         <w:rPr>
           <w:lang w:val="en-US"/>
         </w:rPr>
+        <w:lastRenderedPageBreak/>
         <w:t>Quality Control: Monitor on-air sound and programming to ensure a high standard of quality and professionalism.</w:t>
       </w:r>
     </w:p>
@@ -2552,14 +2582,7 @@
                 <w:rFonts w:ascii="Arial" w:hAnsi="Arial" w:cs="Arial"/>
                 <w:szCs w:val="22"/>
               </w:rPr>
-              <w:t xml:space="preserve"> Program.</w:t>
-            </w:r>
-            <w:r>
-              <w:rPr>
-                <w:rFonts w:ascii="Arial" w:hAnsi="Arial" w:cs="Arial"/>
-                <w:szCs w:val="22"/>
-              </w:rPr>
-              <w:t xml:space="preserve"> </w:t>
+              <w:t xml:space="preserve"> Program</w:t>
             </w:r>
           </w:p>
           <w:p>
@@ -2652,6 +2675,13 @@
               </w:rPr>
               <w:t>Leeds School of Business Management</w:t>
             </w:r>
+            <w:r>
+              <w:rPr>
+                <w:rFonts w:ascii="Arial" w:hAnsi="Arial" w:cs="Arial"/>
+                <w:szCs w:val="22"/>
+              </w:rPr>
+              <w:t xml:space="preserve"> </w:t>
+            </w:r>
           </w:p>
           <w:p>
             <w:pPr>
@@ -2692,6 +2722,13 @@
                 <w:szCs w:val="22"/>
               </w:rPr>
               <w:tab/>
+            </w:r>
+            <w:r>
+              <w:rPr>
+                <w:rFonts w:ascii="Arial" w:hAnsi="Arial" w:cs="Arial"/>
+                <w:szCs w:val="22"/>
+              </w:rPr>
+              <w:t xml:space="preserve"> </w:t>
             </w:r>
             <w:r>
               <w:rPr>
@@ -2778,7 +2815,23 @@
                 <w:b/>
                 <w:szCs w:val="22"/>
               </w:rPr>
-              <w:t xml:space="preserve">                                   </w:t>
+              <w:t xml:space="preserve">                                  </w:t>
+            </w:r>
+            <w:r>
+              <w:rPr>
+                <w:rFonts w:ascii="Arial" w:hAnsi="Arial" w:cs="Arial"/>
+                <w:b/>
+                <w:szCs w:val="22"/>
+              </w:rPr>
+              <w:t xml:space="preserve"> </w:t>
+            </w:r>
+            <w:r>
+              <w:rPr>
+                <w:rFonts w:ascii="Arial" w:hAnsi="Arial" w:cs="Arial"/>
+                <w:b/>
+                <w:szCs w:val="22"/>
+              </w:rPr>
+              <w:t xml:space="preserve"> </w:t>
             </w:r>
             <w:r>
               <w:rPr>
@@ -2841,6 +2894,14 @@
                 <w:szCs w:val="22"/>
               </w:rPr>
               <w:t xml:space="preserve">                       </w:t>
+            </w:r>
+            <w:r>
+              <w:rPr>
+                <w:rFonts w:ascii="Arial" w:hAnsi="Arial" w:cs="Arial"/>
+                <w:b/>
+                <w:szCs w:val="22"/>
+              </w:rPr>
+              <w:t xml:space="preserve"> </w:t>
             </w:r>
             <w:r>
               <w:rPr>

</xml_diff>

<commit_message>
added other jobs templates
</commit_message>
<xml_diff>
--- a/public/Hilliard-M-Scott-Resume-2025.docx
+++ b/public/Hilliard-M-Scott-Resume-2025.docx
@@ -1490,6 +1490,39 @@
     </w:p>
     <w:p>
       <w:pPr>
+        <w:pStyle w:val="ListParagraph"/>
+        <w:numPr>
+          <w:ilvl w:val="0"/>
+          <w:numId w:val="5"/>
+        </w:numPr>
+        <w:spacing w:before="240" w:after="240"/>
+        <w:rPr>
+          <w:lang w:val="en-US"/>
+        </w:rPr>
+      </w:pPr>
+      <w:r>
+        <w:rPr>
+          <w:b/>
+          <w:bCs/>
+          <w:lang w:val="en-US"/>
+        </w:rPr>
+        <w:t xml:space="preserve">Award: </w:t>
+      </w:r>
+      <w:r>
+        <w:rPr>
+          <w:lang w:val="en-US"/>
+        </w:rPr>
+        <w:t xml:space="preserve">Patent Number 5,960,460 for Non-Intrusive Replication of Hard Disk – </w:t>
+      </w:r>
+      <w:r>
+        <w:rPr>
+          <w:lang w:val="en-US"/>
+        </w:rPr>
+        <w:t>a disaster recovery / data replication computer program ultimately implemented by the Federal Bureau of Investigations as a checking mechanism to confirm the integrity of replicated data. Also used as a means of disaster recovery of an entire computer system.</w:t>
+      </w:r>
+    </w:p>
+    <w:p>
+      <w:pPr>
         <w:spacing w:before="240" w:after="240"/>
         <w:ind w:left="720"/>
         <w:rPr>
@@ -1502,39 +1535,81 @@
           <w:bCs/>
           <w:lang w:val="en-US"/>
         </w:rPr>
-        <w:t xml:space="preserve">Award: </w:t>
-      </w:r>
-      <w:r>
-        <w:rPr>
-          <w:lang w:val="en-US"/>
-        </w:rPr>
-        <w:t xml:space="preserve">Patent Number 5,960,460 for Non-Intrusive Replication of Hard Disk – </w:t>
-      </w:r>
-      <w:r>
-        <w:rPr>
-          <w:lang w:val="en-US"/>
-        </w:rPr>
-        <w:t>a disaster recovery / data replication computer program ultimately implemented by the Federal Bureau of Investigations as a checking mechanism to confirm the integrity of replicated data. Also used a</w:t>
-      </w:r>
-      <w:bookmarkStart w:id="2" w:name="_GoBack"/>
-      <w:bookmarkEnd w:id="2"/>
-      <w:r>
-        <w:rPr>
-          <w:lang w:val="en-US"/>
-        </w:rPr>
-        <w:t>s a means of disaster</w:t>
-      </w:r>
-      <w:r>
-        <w:rPr>
-          <w:lang w:val="en-US"/>
-        </w:rPr>
-        <w:t xml:space="preserve"> recovery of an entire computer </w:t>
-      </w:r>
-      <w:r>
-        <w:rPr>
-          <w:lang w:val="en-US"/>
-        </w:rPr>
-        <w:t>system.</w:t>
+        <w:t>Exit:</w:t>
+      </w:r>
+      <w:r>
+        <w:rPr>
+          <w:lang w:val="en-US"/>
+        </w:rPr>
+        <w:t xml:space="preserve"> </w:t>
+      </w:r>
+      <w:proofErr w:type="spellStart"/>
+      <w:r>
+        <w:rPr>
+          <w:lang w:val="en-US"/>
+        </w:rPr>
+        <w:t>Datasonix</w:t>
+      </w:r>
+      <w:proofErr w:type="spellEnd"/>
+      <w:r>
+        <w:rPr>
+          <w:lang w:val="en-US"/>
+        </w:rPr>
+        <w:t xml:space="preserve"> was acquired by Exabyte for $20 million.</w:t>
+      </w:r>
+    </w:p>
+    <w:p>
+      <w:pPr>
+        <w:spacing w:before="240" w:after="240"/>
+      </w:pPr>
+    </w:p>
+    <w:p>
+      <w:pPr>
+        <w:spacing w:before="240" w:after="240"/>
+      </w:pPr>
+      <w:r>
+        <w:rPr>
+          <w:b/>
+        </w:rPr>
+        <w:t>Senior Software/Firmware Engineer/IT</w:t>
+      </w:r>
+      <w:r>
+        <w:t xml:space="preserve"> </w:t>
+      </w:r>
+      <w:proofErr w:type="spellStart"/>
+      <w:r>
+        <w:rPr>
+          <w:i/>
+        </w:rPr>
+        <w:t>StorageTek</w:t>
+      </w:r>
+      <w:proofErr w:type="spellEnd"/>
+      <w:r>
+        <w:rPr>
+          <w:i/>
+        </w:rPr>
+        <w:t>.</w:t>
+      </w:r>
+      <w:r>
+        <w:t xml:space="preserve"> </w:t>
+      </w:r>
+      <w:r>
+        <w:t xml:space="preserve">I </w:t>
+      </w:r>
+      <w:r>
+        <w:t>Contributed to the development of cutti</w:t>
+      </w:r>
+      <w:r>
+        <w:t>ng-edge automated storage systems</w:t>
+      </w:r>
+      <w:r>
+        <w:t xml:space="preserve">, including the innovative Iceberg </w:t>
+      </w:r>
+      <w:r>
+        <w:t xml:space="preserve">a </w:t>
+      </w:r>
+      <w:r>
+        <w:t>totally redundant, fault tolerant disk system. My work in tools and software engineering was vital to the functionality and reliability of these large-scale data storage solutions, which were used by major corporations worldwide.</w:t>
       </w:r>
     </w:p>
     <w:p>
@@ -1551,81 +1626,75 @@
           <w:bCs/>
           <w:lang w:val="en-US"/>
         </w:rPr>
-        <w:t>Exit:</w:t>
-      </w:r>
-      <w:r>
-        <w:rPr>
-          <w:lang w:val="en-US"/>
-        </w:rPr>
-        <w:t xml:space="preserve"> </w:t>
+        <w:t>Technologies:</w:t>
+      </w:r>
+      <w:r>
+        <w:rPr>
+          <w:lang w:val="en-US"/>
+        </w:rPr>
+        <w:t xml:space="preserve"> MS Server, MSSQL, LSTC2VM, </w:t>
       </w:r>
       <w:proofErr w:type="spellStart"/>
       <w:r>
         <w:rPr>
           <w:lang w:val="en-US"/>
         </w:rPr>
-        <w:t>Datasonix</w:t>
+        <w:t>HPu</w:t>
+      </w:r>
+      <w:r>
+        <w:rPr>
+          <w:lang w:val="en-US"/>
+        </w:rPr>
+        <w:t>X</w:t>
       </w:r>
       <w:proofErr w:type="spellEnd"/>
       <w:r>
         <w:rPr>
           <w:lang w:val="en-US"/>
         </w:rPr>
-        <w:t xml:space="preserve"> was acquired by Exabyte for $20 million.</w:t>
-      </w:r>
-    </w:p>
-    <w:p>
-      <w:pPr>
-        <w:spacing w:before="240" w:after="240"/>
-      </w:pPr>
-    </w:p>
-    <w:p>
-      <w:pPr>
-        <w:spacing w:before="240" w:after="240"/>
-      </w:pPr>
-      <w:r>
-        <w:rPr>
-          <w:b/>
-        </w:rPr>
-        <w:t>Senior Software/Firmware Engineer/IT</w:t>
-      </w:r>
-      <w:r>
-        <w:t xml:space="preserve"> </w:t>
-      </w:r>
-      <w:proofErr w:type="spellStart"/>
-      <w:r>
-        <w:rPr>
-          <w:i/>
-        </w:rPr>
-        <w:t>StorageTek</w:t>
-      </w:r>
-      <w:proofErr w:type="spellEnd"/>
-      <w:r>
-        <w:rPr>
-          <w:i/>
-        </w:rPr>
-        <w:t>.</w:t>
-      </w:r>
-      <w:r>
-        <w:t xml:space="preserve"> </w:t>
-      </w:r>
-      <w:r>
-        <w:t xml:space="preserve">I </w:t>
-      </w:r>
-      <w:r>
-        <w:t>Contributed to the development of cutti</w:t>
-      </w:r>
-      <w:r>
-        <w:t>ng-edge automated storage systems</w:t>
-      </w:r>
-      <w:r>
-        <w:t xml:space="preserve">, including the innovative Iceberg </w:t>
-      </w:r>
-      <w:r>
-        <w:t xml:space="preserve">a </w:t>
-      </w:r>
-      <w:r>
-        <w:t>totally redundant, fault tolerant disk system. My work in tools and software engineering was vital to the functionality and reliability of these large-scale data storage solutions, which were used by major corporations worldwide.</w:t>
+        <w:t>,</w:t>
+      </w:r>
+      <w:r>
+        <w:rPr>
+          <w:lang w:val="en-US"/>
+        </w:rPr>
+        <w:t xml:space="preserve"> Linux</w:t>
+      </w:r>
+      <w:r>
+        <w:rPr>
+          <w:lang w:val="en-US"/>
+        </w:rPr>
+        <w:t>,</w:t>
+      </w:r>
+      <w:r>
+        <w:rPr>
+          <w:lang w:val="en-US"/>
+        </w:rPr>
+        <w:t xml:space="preserve"> C++, .Net</w:t>
+      </w:r>
+      <w:r>
+        <w:rPr>
+          <w:lang w:val="en-US"/>
+        </w:rPr>
+        <w:t>,</w:t>
+      </w:r>
+      <w:r>
+        <w:rPr>
+          <w:lang w:val="en-US"/>
+        </w:rPr>
+        <w:t xml:space="preserve"> ASP, AS</w:t>
+      </w:r>
+      <w:r>
+        <w:rPr>
+          <w:lang w:val="en-US"/>
+        </w:rPr>
+        <w:t>P.NET, PHP, C#, Perl and VBScript</w:t>
+      </w:r>
+      <w:r>
+        <w:rPr>
+          <w:lang w:val="en-US"/>
+        </w:rPr>
+        <w:t xml:space="preserve">                </w:t>
       </w:r>
     </w:p>
     <w:p>
@@ -1642,75 +1711,35 @@
           <w:bCs/>
           <w:lang w:val="en-US"/>
         </w:rPr>
-        <w:t>Technologies:</w:t>
-      </w:r>
-      <w:r>
-        <w:rPr>
-          <w:lang w:val="en-US"/>
-        </w:rPr>
-        <w:t xml:space="preserve"> MS Server, MSSQL, LSTC2VM, </w:t>
+        <w:t xml:space="preserve">Tools: </w:t>
       </w:r>
       <w:proofErr w:type="spellStart"/>
       <w:r>
         <w:rPr>
           <w:lang w:val="en-US"/>
         </w:rPr>
-        <w:t>HPu</w:t>
-      </w:r>
-      <w:r>
-        <w:rPr>
-          <w:lang w:val="en-US"/>
-        </w:rPr>
-        <w:t>X</w:t>
+        <w:t>TrackStar</w:t>
       </w:r>
       <w:proofErr w:type="spellEnd"/>
       <w:r>
         <w:rPr>
           <w:lang w:val="en-US"/>
         </w:rPr>
-        <w:t>,</w:t>
-      </w:r>
-      <w:r>
-        <w:rPr>
-          <w:lang w:val="en-US"/>
-        </w:rPr>
-        <w:t xml:space="preserve"> Linux</w:t>
-      </w:r>
-      <w:r>
-        <w:rPr>
-          <w:lang w:val="en-US"/>
-        </w:rPr>
-        <w:t>,</w:t>
-      </w:r>
-      <w:r>
-        <w:rPr>
-          <w:lang w:val="en-US"/>
-        </w:rPr>
-        <w:t xml:space="preserve"> C++, .Net</w:t>
-      </w:r>
-      <w:r>
-        <w:rPr>
-          <w:lang w:val="en-US"/>
-        </w:rPr>
-        <w:t>,</w:t>
-      </w:r>
-      <w:r>
-        <w:rPr>
-          <w:lang w:val="en-US"/>
-        </w:rPr>
-        <w:t xml:space="preserve"> ASP, AS</w:t>
-      </w:r>
-      <w:r>
-        <w:rPr>
-          <w:lang w:val="en-US"/>
-        </w:rPr>
-        <w:t>P.NET, PHP, C#, Perl and VBScript</w:t>
-      </w:r>
-      <w:r>
-        <w:rPr>
-          <w:lang w:val="en-US"/>
-        </w:rPr>
-        <w:t xml:space="preserve">                </w:t>
+        <w:t xml:space="preserve">, Visual Studio, Windows Hardware Lab Kit (HLK), </w:t>
+      </w:r>
+      <w:proofErr w:type="spellStart"/>
+      <w:r>
+        <w:rPr>
+          <w:lang w:val="en-US"/>
+        </w:rPr>
+        <w:t>SignTool</w:t>
+      </w:r>
+      <w:proofErr w:type="spellEnd"/>
+      <w:r>
+        <w:rPr>
+          <w:lang w:val="en-US"/>
+        </w:rPr>
+        <w:t>, WHQL (Windows Hardware Quality Labs)</w:t>
       </w:r>
     </w:p>
     <w:p>
@@ -1727,35 +1756,13 @@
           <w:bCs/>
           <w:lang w:val="en-US"/>
         </w:rPr>
-        <w:t xml:space="preserve">Tools: </w:t>
-      </w:r>
-      <w:proofErr w:type="spellStart"/>
-      <w:r>
-        <w:rPr>
-          <w:lang w:val="en-US"/>
-        </w:rPr>
-        <w:t>TrackStar</w:t>
-      </w:r>
-      <w:proofErr w:type="spellEnd"/>
-      <w:r>
-        <w:rPr>
-          <w:lang w:val="en-US"/>
-        </w:rPr>
-        <w:t xml:space="preserve">, Visual Studio, Windows Hardware Lab Kit (HLK), </w:t>
-      </w:r>
-      <w:proofErr w:type="spellStart"/>
-      <w:r>
-        <w:rPr>
-          <w:lang w:val="en-US"/>
-        </w:rPr>
-        <w:t>SignTool</w:t>
-      </w:r>
-      <w:proofErr w:type="spellEnd"/>
-      <w:r>
-        <w:rPr>
-          <w:lang w:val="en-US"/>
-        </w:rPr>
-        <w:t>, WHQL (Windows Hardware Quality Labs)</w:t>
+        <w:t>Additional Roles:</w:t>
+      </w:r>
+      <w:r>
+        <w:rPr>
+          <w:lang w:val="en-US"/>
+        </w:rPr>
+        <w:t xml:space="preserve"> Agile Scrum Master, Team Lead</w:t>
       </w:r>
     </w:p>
     <w:p>
@@ -1772,13 +1779,33 @@
           <w:bCs/>
           <w:lang w:val="en-US"/>
         </w:rPr>
-        <w:t>Additional Roles:</w:t>
-      </w:r>
-      <w:r>
-        <w:rPr>
-          <w:lang w:val="en-US"/>
-        </w:rPr>
-        <w:t xml:space="preserve"> Agile Scrum Master, Team Lead</w:t>
+        <w:t xml:space="preserve">Awards: </w:t>
+      </w:r>
+      <w:r>
+        <w:rPr>
+          <w:lang w:val="en-US"/>
+        </w:rPr>
+        <w:t xml:space="preserve">Technical Innovator </w:t>
+      </w:r>
+      <w:proofErr w:type="gramStart"/>
+      <w:r>
+        <w:rPr>
+          <w:lang w:val="en-US"/>
+        </w:rPr>
+        <w:t>O</w:t>
+      </w:r>
+      <w:r>
+        <w:rPr>
+          <w:lang w:val="en-US"/>
+        </w:rPr>
+        <w:t>f</w:t>
+      </w:r>
+      <w:proofErr w:type="gramEnd"/>
+      <w:r>
+        <w:rPr>
+          <w:lang w:val="en-US"/>
+        </w:rPr>
+        <w:t xml:space="preserve"> The Year. Malcom Baldridge Quality Award</w:t>
       </w:r>
     </w:p>
     <w:p>
@@ -1795,134 +1822,88 @@
           <w:bCs/>
           <w:lang w:val="en-US"/>
         </w:rPr>
-        <w:t xml:space="preserve">Awards: </w:t>
-      </w:r>
-      <w:r>
-        <w:rPr>
-          <w:lang w:val="en-US"/>
-        </w:rPr>
-        <w:t xml:space="preserve">Technical Innovator </w:t>
-      </w:r>
-      <w:proofErr w:type="gramStart"/>
-      <w:r>
-        <w:rPr>
-          <w:lang w:val="en-US"/>
-        </w:rPr>
-        <w:t>O</w:t>
-      </w:r>
-      <w:r>
-        <w:rPr>
-          <w:lang w:val="en-US"/>
-        </w:rPr>
-        <w:t>f</w:t>
-      </w:r>
-      <w:proofErr w:type="gramEnd"/>
-      <w:r>
-        <w:rPr>
-          <w:lang w:val="en-US"/>
-        </w:rPr>
-        <w:t xml:space="preserve"> The Year. Malcom Baldridge Quality Award</w:t>
+        <w:t xml:space="preserve">Exit: </w:t>
+      </w:r>
+      <w:r>
+        <w:rPr>
+          <w:lang w:val="en-US"/>
+        </w:rPr>
+        <w:t>Sun Microsystems acquired Storage Technology Corporation (</w:t>
+      </w:r>
+      <w:proofErr w:type="spellStart"/>
+      <w:r>
+        <w:rPr>
+          <w:lang w:val="en-US"/>
+        </w:rPr>
+        <w:t>StorageTek</w:t>
+      </w:r>
+      <w:proofErr w:type="spellEnd"/>
+      <w:r>
+        <w:rPr>
+          <w:lang w:val="en-US"/>
+        </w:rPr>
+        <w:t>) in August 2005 for US</w:t>
+      </w:r>
+      <w:r>
+        <w:rPr>
+          <w:lang w:val="en-US"/>
+        </w:rPr>
+        <w:t xml:space="preserve"> </w:t>
+      </w:r>
+      <w:r>
+        <w:rPr>
+          <w:lang w:val="en-US"/>
+        </w:rPr>
+        <w:t>$4.1 billion.</w:t>
       </w:r>
     </w:p>
     <w:p>
       <w:pPr>
         <w:spacing w:before="240" w:after="240"/>
-        <w:ind w:left="720"/>
-        <w:rPr>
-          <w:lang w:val="en-US"/>
-        </w:rPr>
-      </w:pPr>
-      <w:r>
-        <w:rPr>
-          <w:b/>
-          <w:bCs/>
-          <w:lang w:val="en-US"/>
-        </w:rPr>
-        <w:t xml:space="preserve">Exit: </w:t>
-      </w:r>
-      <w:r>
-        <w:rPr>
-          <w:lang w:val="en-US"/>
-        </w:rPr>
-        <w:t>Sun Microsystems acquired Storage Technology Corporation (</w:t>
+      </w:pPr>
+    </w:p>
+    <w:p>
+      <w:pPr>
+        <w:spacing w:before="240" w:after="240"/>
+      </w:pPr>
+      <w:r>
+        <w:rPr>
+          <w:b/>
+        </w:rPr>
+        <w:lastRenderedPageBreak/>
+        <w:t xml:space="preserve">Aerospace Power Design </w:t>
+      </w:r>
+      <w:r>
+        <w:rPr>
+          <w:b/>
+        </w:rPr>
+        <w:t>Engineer</w:t>
+      </w:r>
+      <w:r>
+        <w:t xml:space="preserve"> </w:t>
       </w:r>
       <w:proofErr w:type="spellStart"/>
       <w:r>
         <w:rPr>
-          <w:lang w:val="en-US"/>
-        </w:rPr>
-        <w:t>StorageTek</w:t>
+          <w:i/>
+        </w:rPr>
+        <w:t>Technetics</w:t>
       </w:r>
       <w:proofErr w:type="spellEnd"/>
       <w:r>
         <w:rPr>
-          <w:lang w:val="en-US"/>
-        </w:rPr>
-        <w:t>) in August 2005 for US</w:t>
-      </w:r>
-      <w:r>
-        <w:rPr>
-          <w:lang w:val="en-US"/>
-        </w:rPr>
+          <w:i/>
+        </w:rPr>
+        <w:t xml:space="preserve"> Inc.</w:t>
+      </w:r>
+      <w:r>
         <w:t xml:space="preserve"> </w:t>
       </w:r>
       <w:r>
-        <w:rPr>
-          <w:lang w:val="en-US"/>
-        </w:rPr>
-        <w:t>$4.1 billion.</w:t>
-      </w:r>
-    </w:p>
-    <w:p>
-      <w:pPr>
-        <w:spacing w:before="240" w:after="240"/>
-      </w:pPr>
-    </w:p>
-    <w:p>
-      <w:pPr>
-        <w:spacing w:before="240" w:after="240"/>
-      </w:pPr>
-      <w:r>
-        <w:rPr>
-          <w:b/>
-        </w:rPr>
-        <w:t xml:space="preserve">Aerospace Power Design </w:t>
-      </w:r>
-      <w:r>
-        <w:rPr>
-          <w:b/>
-        </w:rPr>
-        <w:t>Engineer</w:t>
-      </w:r>
-      <w:r>
-        <w:t xml:space="preserve"> </w:t>
-      </w:r>
-      <w:proofErr w:type="spellStart"/>
-      <w:r>
-        <w:rPr>
-          <w:i/>
-        </w:rPr>
-        <w:t>Technetics</w:t>
-      </w:r>
-      <w:proofErr w:type="spellEnd"/>
-      <w:r>
-        <w:rPr>
-          <w:i/>
-        </w:rPr>
-        <w:t xml:space="preserve"> Inc.</w:t>
-      </w:r>
-      <w:r>
-        <w:t xml:space="preserve"> </w:t>
-      </w:r>
-      <w:r>
         <w:t>I d</w:t>
       </w:r>
       <w:r>
-        <w:t xml:space="preserve">esigned and built mission-critical power supplies for the nation's most advanced defense and aerospace platforms. My projects included </w:t>
-      </w:r>
-      <w:r>
-        <w:lastRenderedPageBreak/>
-        <w:t>developing power systems for the Space Shuttle (NASA), nuclear submarines (U.S. Navy), and Black Ops helicopters (U.S. Air</w:t>
+        <w:t>esigned and built mission-critical power supplies for the nation's most advanced defense and aerospace platforms. My projects included developing power systems for the Space Shuttle (NASA), nuclear submarines (U.S. Navy), and Black Ops helicopters (U.S. Air</w:t>
       </w:r>
       <w:r>
         <w:t>f</w:t>
@@ -2168,107 +2149,16 @@
       </w:pPr>
       <w:r>
         <w:rPr>
-          <w:lang w:val="en-US"/>
-        </w:rPr>
-        <w:t>Maintain Broadcast Systems: Oversee the maintenance, repair, and installation of all broadcast equipment, including studio consoles, microphones, transmitters, antennas, and remote broadcast gear.</w:t>
-      </w:r>
-    </w:p>
-    <w:p>
-      <w:pPr>
-        <w:pStyle w:val="ListParagraph"/>
-        <w:numPr>
-          <w:ilvl w:val="1"/>
-          <w:numId w:val="1"/>
-        </w:numPr>
-        <w:spacing w:before="240" w:after="240"/>
-        <w:rPr>
-          <w:lang w:val="en-US"/>
-        </w:rPr>
-      </w:pPr>
-      <w:r>
-        <w:rPr>
-          <w:lang w:val="en-US"/>
-        </w:rPr>
-        <w:t>Ensure FCC Compliance: Serve as the station's Chief Operator, ensuring full compliance with all FCC technical regulations, maintaining station logs, and performing required EAS tests.</w:t>
-      </w:r>
-    </w:p>
-    <w:p>
-      <w:pPr>
-        <w:pStyle w:val="ListParagraph"/>
-        <w:numPr>
-          <w:ilvl w:val="1"/>
-          <w:numId w:val="1"/>
-        </w:numPr>
-        <w:spacing w:before="240" w:after="240"/>
-        <w:rPr>
-          <w:lang w:val="en-US"/>
-        </w:rPr>
-      </w:pPr>
-      <w:r>
-        <w:rPr>
-          <w:lang w:val="en-US"/>
-        </w:rPr>
-        <w:t>Manage IT Infrastructure: Supervise the health and performance of station computers, servers, networking equipment, and the audio automation system.</w:t>
-      </w:r>
-    </w:p>
-    <w:p>
-      <w:pPr>
-        <w:pStyle w:val="ListParagraph"/>
-        <w:numPr>
-          <w:ilvl w:val="1"/>
-          <w:numId w:val="1"/>
-        </w:numPr>
-        <w:spacing w:before="240" w:after="240"/>
-        <w:rPr>
-          <w:lang w:val="en-US"/>
-        </w:rPr>
-      </w:pPr>
-      <w:r>
-        <w:rPr>
-          <w:lang w:val="en-US"/>
-        </w:rPr>
-        <w:t>Troubleshoot &amp; Repair: Provide timely and effective troubleshooting for any technical issues that arise, minimizing off-air time and resolving equipment failures.</w:t>
-      </w:r>
-    </w:p>
-    <w:p>
-      <w:pPr>
-        <w:pStyle w:val="ListParagraph"/>
-        <w:numPr>
-          <w:ilvl w:val="1"/>
-          <w:numId w:val="1"/>
-        </w:numPr>
-        <w:spacing w:before="240" w:after="240"/>
-        <w:rPr>
-          <w:lang w:val="en-US"/>
-        </w:rPr>
-      </w:pPr>
-      <w:r>
-        <w:rPr>
-          <w:lang w:val="en-US"/>
-        </w:rPr>
-        <w:t>Strategic Technical Planning: Research, propose, and implement technology upgrades to improve broadcast quality and station capabilities.</w:t>
-      </w:r>
-      <w:r>
-        <w:rPr>
-          <w:lang w:val="en-US"/>
-        </w:rPr>
-        <w:t xml:space="preserve"> </w:t>
-      </w:r>
-    </w:p>
-    <w:p>
-      <w:pPr>
-        <w:spacing w:before="240" w:after="240"/>
-        <w:rPr>
-          <w:b/>
-          <w:lang w:val="en-US"/>
-        </w:rPr>
-      </w:pPr>
-      <w:r>
-        <w:rPr>
-          <w:b/>
-          <w:lang w:val="en-US"/>
-        </w:rPr>
-        <w:t>Programming Responsibilities:</w:t>
+          <w:b/>
+          <w:lang w:val="en-US"/>
+        </w:rPr>
+        <w:t>Maintain Broadcast Systems:</w:t>
+      </w:r>
+      <w:r>
+        <w:rPr>
+          <w:lang w:val="en-US"/>
+        </w:rPr>
+        <w:t xml:space="preserve"> Oversee the maintenance, repair, and installation of all broadcast equipment, including studio consoles, microphones, transmitters, antennas, and remote broadcast gear.</w:t>
       </w:r>
     </w:p>
     <w:p>
@@ -2276,7 +2166,133 @@
         <w:pStyle w:val="ListParagraph"/>
         <w:numPr>
           <w:ilvl w:val="0"/>
-          <w:numId w:val="3"/>
+          <w:numId w:val="6"/>
+        </w:numPr>
+        <w:spacing w:before="240" w:after="240"/>
+        <w:rPr>
+          <w:lang w:val="en-US"/>
+        </w:rPr>
+      </w:pPr>
+      <w:r>
+        <w:rPr>
+          <w:b/>
+          <w:lang w:val="en-US"/>
+        </w:rPr>
+        <w:t>Ensure FCC Compliance:</w:t>
+      </w:r>
+      <w:r>
+        <w:rPr>
+          <w:lang w:val="en-US"/>
+        </w:rPr>
+        <w:t xml:space="preserve"> Serve as the station's Chief Operator, ensuring full compliance with all FCC technical regulations, maintaining station logs, and performing required EAS tests.</w:t>
+      </w:r>
+    </w:p>
+    <w:p>
+      <w:pPr>
+        <w:pStyle w:val="ListParagraph"/>
+        <w:numPr>
+          <w:ilvl w:val="0"/>
+          <w:numId w:val="6"/>
+        </w:numPr>
+        <w:spacing w:before="240" w:after="240"/>
+        <w:rPr>
+          <w:lang w:val="en-US"/>
+        </w:rPr>
+      </w:pPr>
+      <w:r>
+        <w:rPr>
+          <w:b/>
+          <w:lang w:val="en-US"/>
+        </w:rPr>
+        <w:t>Manage IT Infrastructure:</w:t>
+      </w:r>
+      <w:r>
+        <w:rPr>
+          <w:lang w:val="en-US"/>
+        </w:rPr>
+        <w:t xml:space="preserve"> Supervise the health and performance of station computers, servers, networking equipment, and the audio automation system.</w:t>
+      </w:r>
+    </w:p>
+    <w:p>
+      <w:pPr>
+        <w:pStyle w:val="ListParagraph"/>
+        <w:numPr>
+          <w:ilvl w:val="0"/>
+          <w:numId w:val="6"/>
+        </w:numPr>
+        <w:spacing w:before="240" w:after="240"/>
+        <w:rPr>
+          <w:lang w:val="en-US"/>
+        </w:rPr>
+      </w:pPr>
+      <w:r>
+        <w:rPr>
+          <w:b/>
+          <w:lang w:val="en-US"/>
+        </w:rPr>
+        <w:t>Troubleshoot &amp; Repair:</w:t>
+      </w:r>
+      <w:r>
+        <w:rPr>
+          <w:lang w:val="en-US"/>
+        </w:rPr>
+        <w:t xml:space="preserve"> Provide timely and effective troubleshooting for any technical issues that arise, minimizing off-air time and resolving equipment failures.</w:t>
+      </w:r>
+    </w:p>
+    <w:p>
+      <w:pPr>
+        <w:pStyle w:val="ListParagraph"/>
+        <w:numPr>
+          <w:ilvl w:val="0"/>
+          <w:numId w:val="6"/>
+        </w:numPr>
+        <w:spacing w:before="240" w:after="240"/>
+        <w:rPr>
+          <w:lang w:val="en-US"/>
+        </w:rPr>
+      </w:pPr>
+      <w:r>
+        <w:rPr>
+          <w:b/>
+          <w:lang w:val="en-US"/>
+        </w:rPr>
+        <w:t>Strategic Technical Planning:</w:t>
+      </w:r>
+      <w:r>
+        <w:rPr>
+          <w:lang w:val="en-US"/>
+        </w:rPr>
+        <w:t xml:space="preserve"> Research, propose, and implement technology upgrades to improve broadcast quality and station capabilities.</w:t>
+      </w:r>
+      <w:r>
+        <w:rPr>
+          <w:lang w:val="en-US"/>
+        </w:rPr>
+        <w:t xml:space="preserve"> </w:t>
+      </w:r>
+    </w:p>
+    <w:p>
+      <w:pPr>
+        <w:spacing w:before="240" w:after="240"/>
+        <w:rPr>
+          <w:b/>
+          <w:lang w:val="en-US"/>
+        </w:rPr>
+      </w:pPr>
+      <w:r>
+        <w:rPr>
+          <w:b/>
+          <w:lang w:val="en-US"/>
+        </w:rPr>
+        <w:t>Programming Responsibilities:</w:t>
+      </w:r>
+    </w:p>
+    <w:p>
+      <w:pPr>
+        <w:pStyle w:val="ListParagraph"/>
+        <w:numPr>
+          <w:ilvl w:val="0"/>
+          <w:numId w:val="8"/>
         </w:numPr>
         <w:spacing w:before="240" w:after="240"/>
         <w:jc w:val="both"/>
@@ -2286,86 +2302,133 @@
       </w:pPr>
       <w:r>
         <w:rPr>
-          <w:lang w:val="en-US"/>
-        </w:rPr>
-        <w:t>Program Curation &amp; Scheduling: Develop, manage, and oversee the weekly on-air program schedule, ensuring a diverse and engaging mix of music, news, and public affairs programming.</w:t>
+          <w:b/>
+          <w:lang w:val="en-US"/>
+        </w:rPr>
+        <w:t>Program Curation &amp; Scheduling:</w:t>
+      </w:r>
+      <w:r>
+        <w:rPr>
+          <w:lang w:val="en-US"/>
+        </w:rPr>
+        <w:t xml:space="preserve"> Develop, manage, and oversee the weekly on-air program schedule, ensuring a diverse and engaging mix of music, news, and public affairs programming.</w:t>
       </w:r>
     </w:p>
     <w:p>
       <w:pPr>
         <w:pStyle w:val="ListParagraph"/>
         <w:numPr>
-          <w:ilvl w:val="1"/>
-          <w:numId w:val="2"/>
+          <w:ilvl w:val="0"/>
+          <w:numId w:val="9"/>
         </w:numPr>
         <w:spacing w:before="240" w:after="240"/>
-        <w:rPr>
-          <w:lang w:val="en-US"/>
-        </w:rPr>
-      </w:pPr>
-      <w:r>
-        <w:rPr>
-          <w:lang w:val="en-US"/>
-        </w:rPr>
-        <w:t>Volunteer Management: Recruit, train, and provide ongoing support and mentorship to KGNU’s large and diverse team of volunteer programmers.</w:t>
+        <w:jc w:val="both"/>
+        <w:rPr>
+          <w:lang w:val="en-US"/>
+        </w:rPr>
+      </w:pPr>
+      <w:r>
+        <w:rPr>
+          <w:b/>
+          <w:lang w:val="en-US"/>
+        </w:rPr>
+        <w:lastRenderedPageBreak/>
+        <w:t>Volunteer Management:</w:t>
+      </w:r>
+      <w:r>
+        <w:rPr>
+          <w:lang w:val="en-US"/>
+        </w:rPr>
+        <w:t xml:space="preserve"> Recruit, train, and provide ongoing support and mentorship to KGNU’s large and diverse team of volunteer programmers.</w:t>
       </w:r>
     </w:p>
     <w:p>
       <w:pPr>
         <w:pStyle w:val="ListParagraph"/>
         <w:numPr>
-          <w:ilvl w:val="1"/>
-          <w:numId w:val="2"/>
+          <w:ilvl w:val="0"/>
+          <w:numId w:val="9"/>
         </w:numPr>
         <w:spacing w:before="240" w:after="240"/>
-        <w:rPr>
-          <w:lang w:val="en-US"/>
-        </w:rPr>
-      </w:pPr>
-      <w:r>
-        <w:rPr>
-          <w:lang w:val="en-US"/>
-        </w:rPr>
-        <w:lastRenderedPageBreak/>
-        <w:t>Content &amp; Mission Alignment: Ensure all on-air content reflects KGNU’s core mission of diversity, inclusiveness, and providing a platform for overlooked perspectives.</w:t>
+        <w:jc w:val="both"/>
+        <w:rPr>
+          <w:lang w:val="en-US"/>
+        </w:rPr>
+      </w:pPr>
+      <w:r>
+        <w:rPr>
+          <w:b/>
+          <w:lang w:val="en-US"/>
+        </w:rPr>
+        <w:t>Content &amp; Mission Alignment:</w:t>
+      </w:r>
+      <w:r>
+        <w:rPr>
+          <w:lang w:val="en-US"/>
+        </w:rPr>
+        <w:t xml:space="preserve"> Ensure all on-air content reflects KGNU’s core mission of diversity, inclusiveness, and providing a platform for overlooked perspectives.</w:t>
       </w:r>
     </w:p>
     <w:p>
       <w:pPr>
         <w:pStyle w:val="ListParagraph"/>
         <w:numPr>
-          <w:ilvl w:val="1"/>
-          <w:numId w:val="2"/>
+          <w:ilvl w:val="0"/>
+          <w:numId w:val="9"/>
         </w:numPr>
         <w:spacing w:before="240" w:after="240"/>
-        <w:rPr>
-          <w:lang w:val="en-US"/>
-        </w:rPr>
-      </w:pPr>
-      <w:r>
-        <w:rPr>
-          <w:lang w:val="en-US"/>
-        </w:rPr>
-        <w:t>Quality Control: Monitor on-air sound and programming to ensure a high standard of quality and professionalism.</w:t>
+        <w:jc w:val="both"/>
+        <w:rPr>
+          <w:lang w:val="en-US"/>
+        </w:rPr>
+      </w:pPr>
+      <w:r>
+        <w:rPr>
+          <w:b/>
+          <w:lang w:val="en-US"/>
+        </w:rPr>
+        <w:t>Quality Control:</w:t>
+      </w:r>
+      <w:r>
+        <w:rPr>
+          <w:lang w:val="en-US"/>
+        </w:rPr>
+        <w:t xml:space="preserve"> Monitor on-air sound and programming to ensure a high standard of quality and professionalism.</w:t>
       </w:r>
     </w:p>
     <w:p>
       <w:pPr>
         <w:pStyle w:val="ListParagraph"/>
         <w:numPr>
-          <w:ilvl w:val="1"/>
-          <w:numId w:val="2"/>
+          <w:ilvl w:val="0"/>
+          <w:numId w:val="9"/>
         </w:numPr>
         <w:spacing w:before="240" w:after="240"/>
-        <w:rPr>
-          <w:lang w:val="en-US"/>
-        </w:rPr>
-      </w:pPr>
-      <w:r>
-        <w:rPr>
-          <w:lang w:val="en-US"/>
-        </w:rPr>
-        <w:t>Community Engagement: Act as a liaison between the station and the community, actively seeking out new programming ideas and talent that reflect the diversity of our listenership.</w:t>
+        <w:jc w:val="both"/>
+        <w:rPr>
+          <w:lang w:val="en-US"/>
+        </w:rPr>
+      </w:pPr>
+      <w:bookmarkStart w:id="2" w:name="_GoBack"/>
+      <w:r>
+        <w:rPr>
+          <w:b/>
+          <w:lang w:val="en-US"/>
+        </w:rPr>
+        <w:t>Community Engagement:</w:t>
+      </w:r>
+      <w:r>
+        <w:rPr>
+          <w:lang w:val="en-US"/>
+        </w:rPr>
+        <w:t xml:space="preserve"> </w:t>
+      </w:r>
+      <w:bookmarkEnd w:id="2"/>
+      <w:r>
+        <w:rPr>
+          <w:lang w:val="en-US"/>
+        </w:rPr>
+        <w:t>Act as a liaison between the station and the community, actively seeking out new programming ideas and talent that reflect the diversity of our listenership.</w:t>
       </w:r>
     </w:p>
     <w:p>
@@ -4177,6 +4240,119 @@
     </w:lvl>
   </w:abstractNum>
   <w:abstractNum w:abstractNumId="1" w15:restartNumberingAfterBreak="0">
+    <w:nsid w:val="1CFF067D"/>
+    <w:multiLevelType w:val="hybridMultilevel"/>
+    <w:tmpl w:val="3A30B9C0"/>
+    <w:lvl w:ilvl="0" w:tplc="04090001">
+      <w:start w:val="1"/>
+      <w:numFmt w:val="bullet"/>
+      <w:lvlText w:val=""/>
+      <w:lvlJc w:val="left"/>
+      <w:pPr>
+        <w:ind w:left="1440" w:hanging="360"/>
+      </w:pPr>
+      <w:rPr>
+        <w:rFonts w:ascii="Symbol" w:hAnsi="Symbol" w:hint="default"/>
+      </w:rPr>
+    </w:lvl>
+    <w:lvl w:ilvl="1" w:tplc="04090003" w:tentative="1">
+      <w:start w:val="1"/>
+      <w:numFmt w:val="bullet"/>
+      <w:lvlText w:val="o"/>
+      <w:lvlJc w:val="left"/>
+      <w:pPr>
+        <w:ind w:left="2160" w:hanging="360"/>
+      </w:pPr>
+      <w:rPr>
+        <w:rFonts w:ascii="Courier New" w:hAnsi="Courier New" w:cs="Courier New" w:hint="default"/>
+      </w:rPr>
+    </w:lvl>
+    <w:lvl w:ilvl="2" w:tplc="04090005" w:tentative="1">
+      <w:start w:val="1"/>
+      <w:numFmt w:val="bullet"/>
+      <w:lvlText w:val=""/>
+      <w:lvlJc w:val="left"/>
+      <w:pPr>
+        <w:ind w:left="2880" w:hanging="360"/>
+      </w:pPr>
+      <w:rPr>
+        <w:rFonts w:ascii="Wingdings" w:hAnsi="Wingdings" w:hint="default"/>
+      </w:rPr>
+    </w:lvl>
+    <w:lvl w:ilvl="3" w:tplc="04090001" w:tentative="1">
+      <w:start w:val="1"/>
+      <w:numFmt w:val="bullet"/>
+      <w:lvlText w:val=""/>
+      <w:lvlJc w:val="left"/>
+      <w:pPr>
+        <w:ind w:left="3600" w:hanging="360"/>
+      </w:pPr>
+      <w:rPr>
+        <w:rFonts w:ascii="Symbol" w:hAnsi="Symbol" w:hint="default"/>
+      </w:rPr>
+    </w:lvl>
+    <w:lvl w:ilvl="4" w:tplc="04090003" w:tentative="1">
+      <w:start w:val="1"/>
+      <w:numFmt w:val="bullet"/>
+      <w:lvlText w:val="o"/>
+      <w:lvlJc w:val="left"/>
+      <w:pPr>
+        <w:ind w:left="4320" w:hanging="360"/>
+      </w:pPr>
+      <w:rPr>
+        <w:rFonts w:ascii="Courier New" w:hAnsi="Courier New" w:cs="Courier New" w:hint="default"/>
+      </w:rPr>
+    </w:lvl>
+    <w:lvl w:ilvl="5" w:tplc="04090005" w:tentative="1">
+      <w:start w:val="1"/>
+      <w:numFmt w:val="bullet"/>
+      <w:lvlText w:val=""/>
+      <w:lvlJc w:val="left"/>
+      <w:pPr>
+        <w:ind w:left="5040" w:hanging="360"/>
+      </w:pPr>
+      <w:rPr>
+        <w:rFonts w:ascii="Wingdings" w:hAnsi="Wingdings" w:hint="default"/>
+      </w:rPr>
+    </w:lvl>
+    <w:lvl w:ilvl="6" w:tplc="04090001" w:tentative="1">
+      <w:start w:val="1"/>
+      <w:numFmt w:val="bullet"/>
+      <w:lvlText w:val=""/>
+      <w:lvlJc w:val="left"/>
+      <w:pPr>
+        <w:ind w:left="5760" w:hanging="360"/>
+      </w:pPr>
+      <w:rPr>
+        <w:rFonts w:ascii="Symbol" w:hAnsi="Symbol" w:hint="default"/>
+      </w:rPr>
+    </w:lvl>
+    <w:lvl w:ilvl="7" w:tplc="04090003" w:tentative="1">
+      <w:start w:val="1"/>
+      <w:numFmt w:val="bullet"/>
+      <w:lvlText w:val="o"/>
+      <w:lvlJc w:val="left"/>
+      <w:pPr>
+        <w:ind w:left="6480" w:hanging="360"/>
+      </w:pPr>
+      <w:rPr>
+        <w:rFonts w:ascii="Courier New" w:hAnsi="Courier New" w:cs="Courier New" w:hint="default"/>
+      </w:rPr>
+    </w:lvl>
+    <w:lvl w:ilvl="8" w:tplc="04090005" w:tentative="1">
+      <w:start w:val="1"/>
+      <w:numFmt w:val="bullet"/>
+      <w:lvlText w:val=""/>
+      <w:lvlJc w:val="left"/>
+      <w:pPr>
+        <w:ind w:left="7200" w:hanging="360"/>
+      </w:pPr>
+      <w:rPr>
+        <w:rFonts w:ascii="Wingdings" w:hAnsi="Wingdings" w:hint="default"/>
+      </w:rPr>
+    </w:lvl>
+  </w:abstractNum>
+  <w:abstractNum w:abstractNumId="2" w15:restartNumberingAfterBreak="0">
     <w:nsid w:val="2235002E"/>
     <w:multiLevelType w:val="multilevel"/>
     <w:tmpl w:val="24E2772C"/>
@@ -4325,7 +4501,346 @@
       </w:rPr>
     </w:lvl>
   </w:abstractNum>
-  <w:abstractNum w:abstractNumId="2" w15:restartNumberingAfterBreak="0">
+  <w:abstractNum w:abstractNumId="3" w15:restartNumberingAfterBreak="0">
+    <w:nsid w:val="29777C15"/>
+    <w:multiLevelType w:val="hybridMultilevel"/>
+    <w:tmpl w:val="EC564368"/>
+    <w:lvl w:ilvl="0" w:tplc="04090001">
+      <w:start w:val="1"/>
+      <w:numFmt w:val="bullet"/>
+      <w:lvlText w:val=""/>
+      <w:lvlJc w:val="left"/>
+      <w:pPr>
+        <w:ind w:left="1800" w:hanging="360"/>
+      </w:pPr>
+      <w:rPr>
+        <w:rFonts w:ascii="Symbol" w:hAnsi="Symbol" w:hint="default"/>
+      </w:rPr>
+    </w:lvl>
+    <w:lvl w:ilvl="1" w:tplc="04090003">
+      <w:start w:val="1"/>
+      <w:numFmt w:val="bullet"/>
+      <w:lvlText w:val="o"/>
+      <w:lvlJc w:val="left"/>
+      <w:pPr>
+        <w:ind w:left="2520" w:hanging="360"/>
+      </w:pPr>
+      <w:rPr>
+        <w:rFonts w:ascii="Courier New" w:hAnsi="Courier New" w:cs="Courier New" w:hint="default"/>
+      </w:rPr>
+    </w:lvl>
+    <w:lvl w:ilvl="2" w:tplc="04090005" w:tentative="1">
+      <w:start w:val="1"/>
+      <w:numFmt w:val="bullet"/>
+      <w:lvlText w:val=""/>
+      <w:lvlJc w:val="left"/>
+      <w:pPr>
+        <w:ind w:left="3240" w:hanging="360"/>
+      </w:pPr>
+      <w:rPr>
+        <w:rFonts w:ascii="Wingdings" w:hAnsi="Wingdings" w:hint="default"/>
+      </w:rPr>
+    </w:lvl>
+    <w:lvl w:ilvl="3" w:tplc="04090001" w:tentative="1">
+      <w:start w:val="1"/>
+      <w:numFmt w:val="bullet"/>
+      <w:lvlText w:val=""/>
+      <w:lvlJc w:val="left"/>
+      <w:pPr>
+        <w:ind w:left="3960" w:hanging="360"/>
+      </w:pPr>
+      <w:rPr>
+        <w:rFonts w:ascii="Symbol" w:hAnsi="Symbol" w:hint="default"/>
+      </w:rPr>
+    </w:lvl>
+    <w:lvl w:ilvl="4" w:tplc="04090003" w:tentative="1">
+      <w:start w:val="1"/>
+      <w:numFmt w:val="bullet"/>
+      <w:lvlText w:val="o"/>
+      <w:lvlJc w:val="left"/>
+      <w:pPr>
+        <w:ind w:left="4680" w:hanging="360"/>
+      </w:pPr>
+      <w:rPr>
+        <w:rFonts w:ascii="Courier New" w:hAnsi="Courier New" w:cs="Courier New" w:hint="default"/>
+      </w:rPr>
+    </w:lvl>
+    <w:lvl w:ilvl="5" w:tplc="04090005" w:tentative="1">
+      <w:start w:val="1"/>
+      <w:numFmt w:val="bullet"/>
+      <w:lvlText w:val=""/>
+      <w:lvlJc w:val="left"/>
+      <w:pPr>
+        <w:ind w:left="5400" w:hanging="360"/>
+      </w:pPr>
+      <w:rPr>
+        <w:rFonts w:ascii="Wingdings" w:hAnsi="Wingdings" w:hint="default"/>
+      </w:rPr>
+    </w:lvl>
+    <w:lvl w:ilvl="6" w:tplc="04090001" w:tentative="1">
+      <w:start w:val="1"/>
+      <w:numFmt w:val="bullet"/>
+      <w:lvlText w:val=""/>
+      <w:lvlJc w:val="left"/>
+      <w:pPr>
+        <w:ind w:left="6120" w:hanging="360"/>
+      </w:pPr>
+      <w:rPr>
+        <w:rFonts w:ascii="Symbol" w:hAnsi="Symbol" w:hint="default"/>
+      </w:rPr>
+    </w:lvl>
+    <w:lvl w:ilvl="7" w:tplc="04090003" w:tentative="1">
+      <w:start w:val="1"/>
+      <w:numFmt w:val="bullet"/>
+      <w:lvlText w:val="o"/>
+      <w:lvlJc w:val="left"/>
+      <w:pPr>
+        <w:ind w:left="6840" w:hanging="360"/>
+      </w:pPr>
+      <w:rPr>
+        <w:rFonts w:ascii="Courier New" w:hAnsi="Courier New" w:cs="Courier New" w:hint="default"/>
+      </w:rPr>
+    </w:lvl>
+    <w:lvl w:ilvl="8" w:tplc="04090005" w:tentative="1">
+      <w:start w:val="1"/>
+      <w:numFmt w:val="bullet"/>
+      <w:lvlText w:val=""/>
+      <w:lvlJc w:val="left"/>
+      <w:pPr>
+        <w:ind w:left="7560" w:hanging="360"/>
+      </w:pPr>
+      <w:rPr>
+        <w:rFonts w:ascii="Wingdings" w:hAnsi="Wingdings" w:hint="default"/>
+      </w:rPr>
+    </w:lvl>
+  </w:abstractNum>
+  <w:abstractNum w:abstractNumId="4" w15:restartNumberingAfterBreak="0">
+    <w:nsid w:val="29BD7E71"/>
+    <w:multiLevelType w:val="hybridMultilevel"/>
+    <w:tmpl w:val="F95C0B3E"/>
+    <w:lvl w:ilvl="0" w:tplc="04090001">
+      <w:start w:val="1"/>
+      <w:numFmt w:val="bullet"/>
+      <w:lvlText w:val=""/>
+      <w:lvlJc w:val="left"/>
+      <w:pPr>
+        <w:ind w:left="1800" w:hanging="360"/>
+      </w:pPr>
+      <w:rPr>
+        <w:rFonts w:ascii="Symbol" w:hAnsi="Symbol" w:hint="default"/>
+      </w:rPr>
+    </w:lvl>
+    <w:lvl w:ilvl="1" w:tplc="04090001">
+      <w:start w:val="1"/>
+      <w:numFmt w:val="bullet"/>
+      <w:lvlText w:val=""/>
+      <w:lvlJc w:val="left"/>
+      <w:pPr>
+        <w:ind w:left="2520" w:hanging="360"/>
+      </w:pPr>
+      <w:rPr>
+        <w:rFonts w:ascii="Symbol" w:hAnsi="Symbol" w:hint="default"/>
+      </w:rPr>
+    </w:lvl>
+    <w:lvl w:ilvl="2" w:tplc="04090005" w:tentative="1">
+      <w:start w:val="1"/>
+      <w:numFmt w:val="bullet"/>
+      <w:lvlText w:val=""/>
+      <w:lvlJc w:val="left"/>
+      <w:pPr>
+        <w:ind w:left="3240" w:hanging="360"/>
+      </w:pPr>
+      <w:rPr>
+        <w:rFonts w:ascii="Wingdings" w:hAnsi="Wingdings" w:hint="default"/>
+      </w:rPr>
+    </w:lvl>
+    <w:lvl w:ilvl="3" w:tplc="04090001" w:tentative="1">
+      <w:start w:val="1"/>
+      <w:numFmt w:val="bullet"/>
+      <w:lvlText w:val=""/>
+      <w:lvlJc w:val="left"/>
+      <w:pPr>
+        <w:ind w:left="3960" w:hanging="360"/>
+      </w:pPr>
+      <w:rPr>
+        <w:rFonts w:ascii="Symbol" w:hAnsi="Symbol" w:hint="default"/>
+      </w:rPr>
+    </w:lvl>
+    <w:lvl w:ilvl="4" w:tplc="04090003" w:tentative="1">
+      <w:start w:val="1"/>
+      <w:numFmt w:val="bullet"/>
+      <w:lvlText w:val="o"/>
+      <w:lvlJc w:val="left"/>
+      <w:pPr>
+        <w:ind w:left="4680" w:hanging="360"/>
+      </w:pPr>
+      <w:rPr>
+        <w:rFonts w:ascii="Courier New" w:hAnsi="Courier New" w:cs="Courier New" w:hint="default"/>
+      </w:rPr>
+    </w:lvl>
+    <w:lvl w:ilvl="5" w:tplc="04090005" w:tentative="1">
+      <w:start w:val="1"/>
+      <w:numFmt w:val="bullet"/>
+      <w:lvlText w:val=""/>
+      <w:lvlJc w:val="left"/>
+      <w:pPr>
+        <w:ind w:left="5400" w:hanging="360"/>
+      </w:pPr>
+      <w:rPr>
+        <w:rFonts w:ascii="Wingdings" w:hAnsi="Wingdings" w:hint="default"/>
+      </w:rPr>
+    </w:lvl>
+    <w:lvl w:ilvl="6" w:tplc="04090001" w:tentative="1">
+      <w:start w:val="1"/>
+      <w:numFmt w:val="bullet"/>
+      <w:lvlText w:val=""/>
+      <w:lvlJc w:val="left"/>
+      <w:pPr>
+        <w:ind w:left="6120" w:hanging="360"/>
+      </w:pPr>
+      <w:rPr>
+        <w:rFonts w:ascii="Symbol" w:hAnsi="Symbol" w:hint="default"/>
+      </w:rPr>
+    </w:lvl>
+    <w:lvl w:ilvl="7" w:tplc="04090003" w:tentative="1">
+      <w:start w:val="1"/>
+      <w:numFmt w:val="bullet"/>
+      <w:lvlText w:val="o"/>
+      <w:lvlJc w:val="left"/>
+      <w:pPr>
+        <w:ind w:left="6840" w:hanging="360"/>
+      </w:pPr>
+      <w:rPr>
+        <w:rFonts w:ascii="Courier New" w:hAnsi="Courier New" w:cs="Courier New" w:hint="default"/>
+      </w:rPr>
+    </w:lvl>
+    <w:lvl w:ilvl="8" w:tplc="04090005" w:tentative="1">
+      <w:start w:val="1"/>
+      <w:numFmt w:val="bullet"/>
+      <w:lvlText w:val=""/>
+      <w:lvlJc w:val="left"/>
+      <w:pPr>
+        <w:ind w:left="7560" w:hanging="360"/>
+      </w:pPr>
+      <w:rPr>
+        <w:rFonts w:ascii="Wingdings" w:hAnsi="Wingdings" w:hint="default"/>
+      </w:rPr>
+    </w:lvl>
+  </w:abstractNum>
+  <w:abstractNum w:abstractNumId="5" w15:restartNumberingAfterBreak="0">
+    <w:nsid w:val="4B6B18E7"/>
+    <w:multiLevelType w:val="hybridMultilevel"/>
+    <w:tmpl w:val="132CC66C"/>
+    <w:lvl w:ilvl="0" w:tplc="04090001">
+      <w:start w:val="1"/>
+      <w:numFmt w:val="bullet"/>
+      <w:lvlText w:val=""/>
+      <w:lvlJc w:val="left"/>
+      <w:pPr>
+        <w:ind w:left="1800" w:hanging="360"/>
+      </w:pPr>
+      <w:rPr>
+        <w:rFonts w:ascii="Symbol" w:hAnsi="Symbol" w:hint="default"/>
+      </w:rPr>
+    </w:lvl>
+    <w:lvl w:ilvl="1" w:tplc="04090003" w:tentative="1">
+      <w:start w:val="1"/>
+      <w:numFmt w:val="bullet"/>
+      <w:lvlText w:val="o"/>
+      <w:lvlJc w:val="left"/>
+      <w:pPr>
+        <w:ind w:left="2520" w:hanging="360"/>
+      </w:pPr>
+      <w:rPr>
+        <w:rFonts w:ascii="Courier New" w:hAnsi="Courier New" w:cs="Courier New" w:hint="default"/>
+      </w:rPr>
+    </w:lvl>
+    <w:lvl w:ilvl="2" w:tplc="04090005" w:tentative="1">
+      <w:start w:val="1"/>
+      <w:numFmt w:val="bullet"/>
+      <w:lvlText w:val=""/>
+      <w:lvlJc w:val="left"/>
+      <w:pPr>
+        <w:ind w:left="3240" w:hanging="360"/>
+      </w:pPr>
+      <w:rPr>
+        <w:rFonts w:ascii="Wingdings" w:hAnsi="Wingdings" w:hint="default"/>
+      </w:rPr>
+    </w:lvl>
+    <w:lvl w:ilvl="3" w:tplc="04090001" w:tentative="1">
+      <w:start w:val="1"/>
+      <w:numFmt w:val="bullet"/>
+      <w:lvlText w:val=""/>
+      <w:lvlJc w:val="left"/>
+      <w:pPr>
+        <w:ind w:left="3960" w:hanging="360"/>
+      </w:pPr>
+      <w:rPr>
+        <w:rFonts w:ascii="Symbol" w:hAnsi="Symbol" w:hint="default"/>
+      </w:rPr>
+    </w:lvl>
+    <w:lvl w:ilvl="4" w:tplc="04090003" w:tentative="1">
+      <w:start w:val="1"/>
+      <w:numFmt w:val="bullet"/>
+      <w:lvlText w:val="o"/>
+      <w:lvlJc w:val="left"/>
+      <w:pPr>
+        <w:ind w:left="4680" w:hanging="360"/>
+      </w:pPr>
+      <w:rPr>
+        <w:rFonts w:ascii="Courier New" w:hAnsi="Courier New" w:cs="Courier New" w:hint="default"/>
+      </w:rPr>
+    </w:lvl>
+    <w:lvl w:ilvl="5" w:tplc="04090005" w:tentative="1">
+      <w:start w:val="1"/>
+      <w:numFmt w:val="bullet"/>
+      <w:lvlText w:val=""/>
+      <w:lvlJc w:val="left"/>
+      <w:pPr>
+        <w:ind w:left="5400" w:hanging="360"/>
+      </w:pPr>
+      <w:rPr>
+        <w:rFonts w:ascii="Wingdings" w:hAnsi="Wingdings" w:hint="default"/>
+      </w:rPr>
+    </w:lvl>
+    <w:lvl w:ilvl="6" w:tplc="04090001" w:tentative="1">
+      <w:start w:val="1"/>
+      <w:numFmt w:val="bullet"/>
+      <w:lvlText w:val=""/>
+      <w:lvlJc w:val="left"/>
+      <w:pPr>
+        <w:ind w:left="6120" w:hanging="360"/>
+      </w:pPr>
+      <w:rPr>
+        <w:rFonts w:ascii="Symbol" w:hAnsi="Symbol" w:hint="default"/>
+      </w:rPr>
+    </w:lvl>
+    <w:lvl w:ilvl="7" w:tplc="04090003" w:tentative="1">
+      <w:start w:val="1"/>
+      <w:numFmt w:val="bullet"/>
+      <w:lvlText w:val="o"/>
+      <w:lvlJc w:val="left"/>
+      <w:pPr>
+        <w:ind w:left="6840" w:hanging="360"/>
+      </w:pPr>
+      <w:rPr>
+        <w:rFonts w:ascii="Courier New" w:hAnsi="Courier New" w:cs="Courier New" w:hint="default"/>
+      </w:rPr>
+    </w:lvl>
+    <w:lvl w:ilvl="8" w:tplc="04090005" w:tentative="1">
+      <w:start w:val="1"/>
+      <w:numFmt w:val="bullet"/>
+      <w:lvlText w:val=""/>
+      <w:lvlJc w:val="left"/>
+      <w:pPr>
+        <w:ind w:left="7560" w:hanging="360"/>
+      </w:pPr>
+      <w:rPr>
+        <w:rFonts w:ascii="Wingdings" w:hAnsi="Wingdings" w:hint="default"/>
+      </w:rPr>
+    </w:lvl>
+  </w:abstractNum>
+  <w:abstractNum w:abstractNumId="6" w15:restartNumberingAfterBreak="0">
     <w:nsid w:val="51B42BD2"/>
     <w:multiLevelType w:val="hybridMultilevel"/>
     <w:tmpl w:val="C318E95E"/>
@@ -4438,7 +4953,7 @@
       </w:rPr>
     </w:lvl>
   </w:abstractNum>
-  <w:abstractNum w:abstractNumId="3" w15:restartNumberingAfterBreak="0">
+  <w:abstractNum w:abstractNumId="7" w15:restartNumberingAfterBreak="0">
     <w:nsid w:val="59D872A4"/>
     <w:multiLevelType w:val="hybridMultilevel"/>
     <w:tmpl w:val="86C6CC48"/>
@@ -4551,17 +5066,145 @@
       </w:rPr>
     </w:lvl>
   </w:abstractNum>
+  <w:abstractNum w:abstractNumId="8" w15:restartNumberingAfterBreak="0">
+    <w:nsid w:val="77C04A91"/>
+    <w:multiLevelType w:val="hybridMultilevel"/>
+    <w:tmpl w:val="B972E6C0"/>
+    <w:lvl w:ilvl="0" w:tplc="04090001">
+      <w:start w:val="1"/>
+      <w:numFmt w:val="bullet"/>
+      <w:lvlText w:val=""/>
+      <w:lvlJc w:val="left"/>
+      <w:pPr>
+        <w:ind w:left="720" w:hanging="360"/>
+      </w:pPr>
+      <w:rPr>
+        <w:rFonts w:ascii="Symbol" w:hAnsi="Symbol" w:hint="default"/>
+      </w:rPr>
+    </w:lvl>
+    <w:lvl w:ilvl="1" w:tplc="04090003">
+      <w:start w:val="1"/>
+      <w:numFmt w:val="bullet"/>
+      <w:lvlText w:val="o"/>
+      <w:lvlJc w:val="left"/>
+      <w:pPr>
+        <w:ind w:left="1440" w:hanging="360"/>
+      </w:pPr>
+      <w:rPr>
+        <w:rFonts w:ascii="Courier New" w:hAnsi="Courier New" w:cs="Courier New" w:hint="default"/>
+      </w:rPr>
+    </w:lvl>
+    <w:lvl w:ilvl="2" w:tplc="04090005" w:tentative="1">
+      <w:start w:val="1"/>
+      <w:numFmt w:val="bullet"/>
+      <w:lvlText w:val=""/>
+      <w:lvlJc w:val="left"/>
+      <w:pPr>
+        <w:ind w:left="2160" w:hanging="360"/>
+      </w:pPr>
+      <w:rPr>
+        <w:rFonts w:ascii="Wingdings" w:hAnsi="Wingdings" w:hint="default"/>
+      </w:rPr>
+    </w:lvl>
+    <w:lvl w:ilvl="3" w:tplc="04090001" w:tentative="1">
+      <w:start w:val="1"/>
+      <w:numFmt w:val="bullet"/>
+      <w:lvlText w:val=""/>
+      <w:lvlJc w:val="left"/>
+      <w:pPr>
+        <w:ind w:left="2880" w:hanging="360"/>
+      </w:pPr>
+      <w:rPr>
+        <w:rFonts w:ascii="Symbol" w:hAnsi="Symbol" w:hint="default"/>
+      </w:rPr>
+    </w:lvl>
+    <w:lvl w:ilvl="4" w:tplc="04090003" w:tentative="1">
+      <w:start w:val="1"/>
+      <w:numFmt w:val="bullet"/>
+      <w:lvlText w:val="o"/>
+      <w:lvlJc w:val="left"/>
+      <w:pPr>
+        <w:ind w:left="3600" w:hanging="360"/>
+      </w:pPr>
+      <w:rPr>
+        <w:rFonts w:ascii="Courier New" w:hAnsi="Courier New" w:cs="Courier New" w:hint="default"/>
+      </w:rPr>
+    </w:lvl>
+    <w:lvl w:ilvl="5" w:tplc="04090005" w:tentative="1">
+      <w:start w:val="1"/>
+      <w:numFmt w:val="bullet"/>
+      <w:lvlText w:val=""/>
+      <w:lvlJc w:val="left"/>
+      <w:pPr>
+        <w:ind w:left="4320" w:hanging="360"/>
+      </w:pPr>
+      <w:rPr>
+        <w:rFonts w:ascii="Wingdings" w:hAnsi="Wingdings" w:hint="default"/>
+      </w:rPr>
+    </w:lvl>
+    <w:lvl w:ilvl="6" w:tplc="04090001" w:tentative="1">
+      <w:start w:val="1"/>
+      <w:numFmt w:val="bullet"/>
+      <w:lvlText w:val=""/>
+      <w:lvlJc w:val="left"/>
+      <w:pPr>
+        <w:ind w:left="5040" w:hanging="360"/>
+      </w:pPr>
+      <w:rPr>
+        <w:rFonts w:ascii="Symbol" w:hAnsi="Symbol" w:hint="default"/>
+      </w:rPr>
+    </w:lvl>
+    <w:lvl w:ilvl="7" w:tplc="04090003" w:tentative="1">
+      <w:start w:val="1"/>
+      <w:numFmt w:val="bullet"/>
+      <w:lvlText w:val="o"/>
+      <w:lvlJc w:val="left"/>
+      <w:pPr>
+        <w:ind w:left="5760" w:hanging="360"/>
+      </w:pPr>
+      <w:rPr>
+        <w:rFonts w:ascii="Courier New" w:hAnsi="Courier New" w:cs="Courier New" w:hint="default"/>
+      </w:rPr>
+    </w:lvl>
+    <w:lvl w:ilvl="8" w:tplc="04090005" w:tentative="1">
+      <w:start w:val="1"/>
+      <w:numFmt w:val="bullet"/>
+      <w:lvlText w:val=""/>
+      <w:lvlJc w:val="left"/>
+      <w:pPr>
+        <w:ind w:left="6480" w:hanging="360"/>
+      </w:pPr>
+      <w:rPr>
+        <w:rFonts w:ascii="Wingdings" w:hAnsi="Wingdings" w:hint="default"/>
+      </w:rPr>
+    </w:lvl>
+  </w:abstractNum>
   <w:num w:numId="1">
-    <w:abstractNumId w:val="3"/>
+    <w:abstractNumId w:val="7"/>
   </w:num>
   <w:num w:numId="2">
-    <w:abstractNumId w:val="2"/>
+    <w:abstractNumId w:val="6"/>
   </w:num>
   <w:num w:numId="3">
     <w:abstractNumId w:val="0"/>
   </w:num>
   <w:num w:numId="4">
+    <w:abstractNumId w:val="2"/>
+  </w:num>
+  <w:num w:numId="5">
     <w:abstractNumId w:val="1"/>
+  </w:num>
+  <w:num w:numId="6">
+    <w:abstractNumId w:val="5"/>
+  </w:num>
+  <w:num w:numId="7">
+    <w:abstractNumId w:val="8"/>
+  </w:num>
+  <w:num w:numId="8">
+    <w:abstractNumId w:val="3"/>
+  </w:num>
+  <w:num w:numId="9">
+    <w:abstractNumId w:val="4"/>
   </w:num>
 </w:numbering>
 </file>

</xml_diff>

<commit_message>
changed picture in word and pdf doc
</commit_message>
<xml_diff>
--- a/public/Hilliard-M-Scott-Resume-2025.docx
+++ b/public/Hilliard-M-Scott-Resume-2025.docx
@@ -18,95 +18,21 @@
       <w:r>
         <w:rPr>
           <w:b/>
-          <w:sz w:val="46"/>
-          <w:szCs w:val="46"/>
-        </w:rPr>
-        <w:t>Hilliard M. Scott III</w:t>
-      </w:r>
-    </w:p>
-    <w:p>
-      <w:pPr>
-        <w:jc w:val="center"/>
-      </w:pPr>
-      <w:r>
-        <w:rPr>
-          <w:b/>
-        </w:rPr>
-        <w:t>Email:</w:t>
-      </w:r>
-      <w:r>
-        <w:t xml:space="preserve"> </w:t>
-      </w:r>
-      <w:hyperlink r:id="rId7" w:history="1">
-        <w:r>
-          <w:rPr>
-            <w:rStyle w:val="Hyperlink"/>
-          </w:rPr>
-          <w:t>hilliards@gmail.com</w:t>
-        </w:r>
-      </w:hyperlink>
-      <w:r>
-        <w:t xml:space="preserve"> | </w:t>
-      </w:r>
-      <w:r>
-        <w:rPr>
-          <w:b/>
-        </w:rPr>
-        <w:t>Phone:</w:t>
-      </w:r>
-      <w:r>
-        <w:t xml:space="preserve"> 720-244-8559</w:t>
-      </w:r>
-    </w:p>
-    <w:p>
-      <w:pPr>
-        <w:spacing w:before="240" w:after="240"/>
-        <w:jc w:val="center"/>
-        <w:rPr>
-          <w:rStyle w:val="BookTitle"/>
-          <w:i w:val="0"/>
-          <w:sz w:val="28"/>
-          <w:szCs w:val="28"/>
-        </w:rPr>
-      </w:pPr>
-      <w:r>
-        <w:rPr>
-          <w:rStyle w:val="BookTitle"/>
-          <w:i w:val="0"/>
-          <w:sz w:val="28"/>
-          <w:szCs w:val="28"/>
-        </w:rPr>
-        <w:t>Seni</w:t>
-      </w:r>
-      <w:bookmarkStart w:id="0" w:name="_r67bn0d8k60e" w:colFirst="0" w:colLast="0"/>
-      <w:bookmarkEnd w:id="0"/>
-      <w:r>
-        <w:rPr>
-          <w:rStyle w:val="BookTitle"/>
-          <w:i w:val="0"/>
-          <w:sz w:val="28"/>
-          <w:szCs w:val="28"/>
-        </w:rPr>
-        <w:t>or Engineer &amp; Entrepreneur</w:t>
-      </w:r>
-    </w:p>
-    <w:p>
-      <w:pPr>
-        <w:spacing w:before="240" w:after="240"/>
-        <w:rPr>
-          <w:b/>
-        </w:rPr>
-      </w:pPr>
-      <w:r>
-        <w:rPr>
-          <w:b/>
           <w:noProof/>
           <w:lang w:val="en-US"/>
         </w:rPr>
         <w:drawing>
-          <wp:inline distT="0" distB="0" distL="0" distR="0" wp14:anchorId="26408301" wp14:editId="3D911819">
-            <wp:extent cx="635000" cy="635000"/>
-            <wp:effectExtent l="0" t="0" r="0" b="0"/>
+          <wp:anchor distT="0" distB="0" distL="114300" distR="114300" simplePos="0" relativeHeight="251658240" behindDoc="1" locked="0" layoutInCell="1" allowOverlap="1" wp14:anchorId="6ABFA90D" wp14:editId="51F24025">
+            <wp:simplePos x="0" y="0"/>
+            <wp:positionH relativeFrom="column">
+              <wp:posOffset>203200</wp:posOffset>
+            </wp:positionH>
+            <wp:positionV relativeFrom="paragraph">
+              <wp:posOffset>309245</wp:posOffset>
+            </wp:positionV>
+            <wp:extent cx="1073150" cy="1175385"/>
+            <wp:effectExtent l="0" t="0" r="0" b="5715"/>
+            <wp:wrapNone/>
             <wp:docPr id="3" name="Picture 3"/>
             <wp:cNvGraphicFramePr>
               <a:graphicFrameLocks xmlns:a="http://schemas.openxmlformats.org/drawingml/2006/main" noChangeAspect="1"/>
@@ -119,7 +45,7 @@
                     <pic:cNvPicPr/>
                   </pic:nvPicPr>
                   <pic:blipFill>
-                    <a:blip r:embed="rId8">
+                    <a:blip r:embed="rId7" cstate="print">
                       <a:extLst>
                         <a:ext uri="{28A0092B-C50C-407E-A947-70E740481C1C}">
                           <a14:useLocalDpi xmlns:a14="http://schemas.microsoft.com/office/drawing/2010/main" val="0"/>
@@ -133,7 +59,7 @@
                   <pic:spPr>
                     <a:xfrm>
                       <a:off x="0" y="0"/>
-                      <a:ext cx="635000" cy="635000"/>
+                      <a:ext cx="1073150" cy="1175385"/>
                     </a:xfrm>
                     <a:prstGeom prst="rect">
                       <a:avLst/>
@@ -142,9 +68,115 @@
                 </pic:pic>
               </a:graphicData>
             </a:graphic>
-          </wp:inline>
+            <wp14:sizeRelH relativeFrom="margin">
+              <wp14:pctWidth>0</wp14:pctWidth>
+            </wp14:sizeRelH>
+          </wp:anchor>
         </w:drawing>
       </w:r>
+      <w:r>
+        <w:rPr>
+          <w:b/>
+          <w:sz w:val="46"/>
+          <w:szCs w:val="46"/>
+        </w:rPr>
+        <w:t>Hilliard M. Scott III</w:t>
+      </w:r>
+    </w:p>
+    <w:p>
+      <w:pPr>
+        <w:jc w:val="center"/>
+      </w:pPr>
+      <w:r>
+        <w:rPr>
+          <w:b/>
+        </w:rPr>
+        <w:t>Email:</w:t>
+      </w:r>
+      <w:r>
+        <w:t xml:space="preserve"> </w:t>
+      </w:r>
+      <w:hyperlink r:id="rId8" w:history="1">
+        <w:r>
+          <w:rPr>
+            <w:rStyle w:val="Hyperlink"/>
+          </w:rPr>
+          <w:t>hilliards@gmail.com</w:t>
+        </w:r>
+      </w:hyperlink>
+      <w:r>
+        <w:t xml:space="preserve"> | </w:t>
+      </w:r>
+      <w:r>
+        <w:rPr>
+          <w:b/>
+        </w:rPr>
+        <w:t>Phone:</w:t>
+      </w:r>
+      <w:r>
+        <w:t xml:space="preserve"> 720-244-8559</w:t>
+      </w:r>
+    </w:p>
+    <w:p>
+      <w:pPr>
+        <w:tabs>
+          <w:tab w:val="left" w:pos="1290"/>
+          <w:tab w:val="center" w:pos="4680"/>
+        </w:tabs>
+        <w:spacing w:before="240" w:after="240"/>
+        <w:rPr>
+          <w:rStyle w:val="BookTitle"/>
+          <w:i w:val="0"/>
+          <w:sz w:val="28"/>
+          <w:szCs w:val="28"/>
+        </w:rPr>
+      </w:pPr>
+      <w:r>
+        <w:rPr>
+          <w:rStyle w:val="BookTitle"/>
+          <w:i w:val="0"/>
+          <w:sz w:val="28"/>
+          <w:szCs w:val="28"/>
+        </w:rPr>
+        <w:tab/>
+      </w:r>
+      <w:r>
+        <w:rPr>
+          <w:rStyle w:val="BookTitle"/>
+          <w:i w:val="0"/>
+          <w:sz w:val="28"/>
+          <w:szCs w:val="28"/>
+        </w:rPr>
+        <w:tab/>
+      </w:r>
+      <w:r>
+        <w:rPr>
+          <w:rStyle w:val="BookTitle"/>
+          <w:i w:val="0"/>
+          <w:sz w:val="28"/>
+          <w:szCs w:val="28"/>
+        </w:rPr>
+        <w:t>Seni</w:t>
+      </w:r>
+      <w:bookmarkStart w:id="0" w:name="_r67bn0d8k60e" w:colFirst="0" w:colLast="0"/>
+      <w:bookmarkEnd w:id="0"/>
+      <w:r>
+        <w:rPr>
+          <w:rStyle w:val="BookTitle"/>
+          <w:i w:val="0"/>
+          <w:sz w:val="28"/>
+          <w:szCs w:val="28"/>
+        </w:rPr>
+        <w:t>or Engineer &amp; Entrepreneur</w:t>
+      </w:r>
+    </w:p>
+    <w:p>
+      <w:pPr>
+        <w:spacing w:before="240" w:after="240"/>
+        <w:rPr>
+          <w:b/>
+        </w:rPr>
+      </w:pPr>
     </w:p>
     <w:p>
       <w:pPr>
@@ -667,7 +699,293 @@
           <w:bCs/>
           <w:lang w:val="en-US"/>
         </w:rPr>
+        <w:t xml:space="preserve">Tools: </w:t>
+      </w:r>
+      <w:proofErr w:type="spellStart"/>
+      <w:r>
+        <w:rPr>
+          <w:lang w:val="en-US"/>
+        </w:rPr>
+        <w:t>Atlassian</w:t>
+      </w:r>
+      <w:proofErr w:type="spellEnd"/>
+      <w:r>
+        <w:rPr>
+          <w:lang w:val="en-US"/>
+        </w:rPr>
+        <w:t xml:space="preserve"> Suite, </w:t>
+      </w:r>
+      <w:proofErr w:type="spellStart"/>
+      <w:r>
+        <w:rPr>
+          <w:lang w:val="en-US"/>
+        </w:rPr>
+        <w:t>BitBucket</w:t>
+      </w:r>
+      <w:proofErr w:type="spellEnd"/>
+      <w:r>
+        <w:rPr>
+          <w:lang w:val="en-US"/>
+        </w:rPr>
+        <w:t xml:space="preserve">, </w:t>
+      </w:r>
+      <w:proofErr w:type="spellStart"/>
+      <w:r>
+        <w:rPr>
+          <w:lang w:val="en-US"/>
+        </w:rPr>
+        <w:t>Git</w:t>
+      </w:r>
+      <w:proofErr w:type="spellEnd"/>
+      <w:r>
+        <w:rPr>
+          <w:lang w:val="en-US"/>
+        </w:rPr>
+        <w:t xml:space="preserve">, GitHub, </w:t>
+      </w:r>
+      <w:r>
+        <w:rPr>
+          <w:lang w:val="en-US"/>
+        </w:rPr>
+        <w:t xml:space="preserve">Visual Studio, </w:t>
+      </w:r>
+      <w:proofErr w:type="spellStart"/>
+      <w:r>
+        <w:rPr>
+          <w:lang w:val="en-US"/>
+        </w:rPr>
+        <w:t>RubyMine</w:t>
+      </w:r>
+      <w:proofErr w:type="spellEnd"/>
+      <w:r>
+        <w:rPr>
+          <w:lang w:val="en-US"/>
+        </w:rPr>
+        <w:t xml:space="preserve">, Cypress, Sauce Labs, Postman, </w:t>
+      </w:r>
+      <w:proofErr w:type="spellStart"/>
+      <w:r>
+        <w:rPr>
+          <w:lang w:val="en-US"/>
+        </w:rPr>
+        <w:t>Minitest</w:t>
+      </w:r>
+      <w:proofErr w:type="spellEnd"/>
+      <w:r>
+        <w:rPr>
+          <w:lang w:val="en-US"/>
+        </w:rPr>
+        <w:t xml:space="preserve">, </w:t>
+      </w:r>
+      <w:proofErr w:type="spellStart"/>
+      <w:r>
+        <w:rPr>
+          <w:lang w:val="en-US"/>
+        </w:rPr>
+        <w:t>Doxygen</w:t>
+      </w:r>
+      <w:proofErr w:type="spellEnd"/>
+    </w:p>
+    <w:p>
+      <w:pPr>
+        <w:spacing w:before="240" w:after="240"/>
+        <w:ind w:left="720"/>
+        <w:rPr>
+          <w:lang w:val="en-US"/>
+        </w:rPr>
+      </w:pPr>
+      <w:r>
+        <w:rPr>
+          <w:b/>
+          <w:bCs/>
+          <w:lang w:val="en-US"/>
+        </w:rPr>
         <w:lastRenderedPageBreak/>
+        <w:t>Additional Roles:</w:t>
+      </w:r>
+      <w:r>
+        <w:rPr>
+          <w:lang w:val="en-US"/>
+        </w:rPr>
+        <w:t xml:space="preserve"> Agile Scrum Master, Team Lead</w:t>
+      </w:r>
+    </w:p>
+    <w:p>
+      <w:pPr>
+        <w:spacing w:before="240" w:after="240"/>
+      </w:pPr>
+    </w:p>
+    <w:p>
+      <w:pPr>
+        <w:spacing w:before="240" w:after="240"/>
+      </w:pPr>
+      <w:r>
+        <w:rPr>
+          <w:b/>
+        </w:rPr>
+        <w:t xml:space="preserve">Senior </w:t>
+      </w:r>
+      <w:r>
+        <w:rPr>
+          <w:b/>
+        </w:rPr>
+        <w:t>Engineer</w:t>
+      </w:r>
+      <w:r>
+        <w:t xml:space="preserve"> </w:t>
+      </w:r>
+      <w:proofErr w:type="spellStart"/>
+      <w:r>
+        <w:rPr>
+          <w:i/>
+        </w:rPr>
+        <w:t>ClickBank</w:t>
+      </w:r>
+      <w:proofErr w:type="spellEnd"/>
+      <w:r>
+        <w:rPr>
+          <w:i/>
+        </w:rPr>
+        <w:t>.</w:t>
+      </w:r>
+      <w:r>
+        <w:t xml:space="preserve"> As a key member of the</w:t>
+      </w:r>
+      <w:r>
+        <w:t xml:space="preserve"> team, I was instrumental in automating and streamlining the software development lifecycle. I designed and implemented CI/CD pipelines, managed cloud infrastructure, and ensured the reliability and scalability of our affiliate marketing platform, enabling rapid and dependable software delivery.</w:t>
+      </w:r>
+    </w:p>
+    <w:p>
+      <w:pPr>
+        <w:spacing w:before="240" w:after="240"/>
+        <w:ind w:left="720"/>
+        <w:rPr>
+          <w:lang w:val="en-US"/>
+        </w:rPr>
+      </w:pPr>
+      <w:r>
+        <w:rPr>
+          <w:b/>
+          <w:bCs/>
+          <w:lang w:val="en-US"/>
+        </w:rPr>
+        <w:t xml:space="preserve">Technologies: </w:t>
+      </w:r>
+      <w:r>
+        <w:rPr>
+          <w:lang w:val="en-US"/>
+        </w:rPr>
+        <w:t xml:space="preserve">Ruby, Cucumber, </w:t>
+      </w:r>
+      <w:proofErr w:type="spellStart"/>
+      <w:r>
+        <w:rPr>
+          <w:lang w:val="en-US"/>
+        </w:rPr>
+        <w:t>Nutch</w:t>
+      </w:r>
+      <w:proofErr w:type="spellEnd"/>
+      <w:r>
+        <w:rPr>
+          <w:lang w:val="en-US"/>
+        </w:rPr>
+        <w:t xml:space="preserve">, </w:t>
+      </w:r>
+      <w:r>
+        <w:rPr>
+          <w:lang w:val="en-US"/>
+        </w:rPr>
+        <w:t xml:space="preserve">Java, </w:t>
+      </w:r>
+      <w:r>
+        <w:rPr>
+          <w:lang w:val="en-US"/>
+        </w:rPr>
+        <w:t xml:space="preserve">Apache Tomcat, AWS, </w:t>
+      </w:r>
+      <w:proofErr w:type="spellStart"/>
+      <w:r>
+        <w:rPr>
+          <w:lang w:val="en-US"/>
+        </w:rPr>
+        <w:t>Liquibase</w:t>
+      </w:r>
+      <w:proofErr w:type="spellEnd"/>
+      <w:r>
+        <w:rPr>
+          <w:lang w:val="en-US"/>
+        </w:rPr>
+        <w:t xml:space="preserve">, Docker, </w:t>
+      </w:r>
+      <w:proofErr w:type="spellStart"/>
+      <w:r>
+        <w:rPr>
+          <w:lang w:val="en-US"/>
+        </w:rPr>
+        <w:t>Doxygen</w:t>
+      </w:r>
+      <w:proofErr w:type="spellEnd"/>
+      <w:r>
+        <w:rPr>
+          <w:lang w:val="en-US"/>
+        </w:rPr>
+        <w:t>,</w:t>
+      </w:r>
+      <w:r>
+        <w:rPr>
+          <w:lang w:val="en-US"/>
+        </w:rPr>
+        <w:t xml:space="preserve"> </w:t>
+      </w:r>
+      <w:proofErr w:type="spellStart"/>
+      <w:r>
+        <w:rPr>
+          <w:lang w:val="en-US"/>
+        </w:rPr>
+        <w:t>BitBucket</w:t>
+      </w:r>
+      <w:proofErr w:type="spellEnd"/>
+      <w:r>
+        <w:rPr>
+          <w:lang w:val="en-US"/>
+        </w:rPr>
+        <w:t xml:space="preserve">, </w:t>
+      </w:r>
+      <w:proofErr w:type="spellStart"/>
+      <w:r>
+        <w:rPr>
+          <w:lang w:val="en-US"/>
+        </w:rPr>
+        <w:t>Git</w:t>
+      </w:r>
+      <w:proofErr w:type="spellEnd"/>
+      <w:r>
+        <w:rPr>
+          <w:lang w:val="en-US"/>
+        </w:rPr>
+        <w:t>, GitHub,</w:t>
+      </w:r>
+      <w:r>
+        <w:rPr>
+          <w:lang w:val="en-US"/>
+        </w:rPr>
+        <w:t xml:space="preserve"> Zeus/Azul</w:t>
+      </w:r>
+    </w:p>
+    <w:p>
+      <w:pPr>
+        <w:spacing w:before="240" w:after="240"/>
+        <w:ind w:left="720"/>
+        <w:rPr>
+          <w:lang w:val="en-US"/>
+        </w:rPr>
+      </w:pPr>
+      <w:r>
+        <w:rPr>
+          <w:b/>
+          <w:bCs/>
+          <w:lang w:val="en-US"/>
+        </w:rPr>
         <w:t xml:space="preserve">Tools: </w:t>
       </w:r>
       <w:proofErr w:type="spellStart"/>
@@ -689,7 +1007,7 @@
         <w:rPr>
           <w:lang w:val="en-US"/>
         </w:rPr>
-        <w:t>BitBucket</w:t>
+        <w:t>InjelliJ</w:t>
       </w:r>
       <w:proofErr w:type="spellEnd"/>
       <w:r>
@@ -703,57 +1021,96 @@
         <w:rPr>
           <w:lang w:val="en-US"/>
         </w:rPr>
-        <w:t>Git</w:t>
+        <w:t>NetNeans</w:t>
       </w:r>
       <w:proofErr w:type="spellEnd"/>
       <w:r>
         <w:rPr>
           <w:lang w:val="en-US"/>
         </w:rPr>
-        <w:t xml:space="preserve">, GitHub, </w:t>
-      </w:r>
-      <w:r>
-        <w:rPr>
-          <w:lang w:val="en-US"/>
-        </w:rPr>
-        <w:t xml:space="preserve">Visual Studio, </w:t>
+        <w:t xml:space="preserve">, Cypress, Sauce Labs, Swagger, Postman </w:t>
+      </w:r>
+    </w:p>
+    <w:p>
+      <w:pPr>
+        <w:spacing w:before="240" w:after="240"/>
+        <w:ind w:left="720"/>
+        <w:rPr>
+          <w:lang w:val="en-US"/>
+        </w:rPr>
+      </w:pPr>
+      <w:r>
+        <w:rPr>
+          <w:b/>
+          <w:bCs/>
+          <w:lang w:val="en-US"/>
+        </w:rPr>
+        <w:t>Additional Roles:</w:t>
+      </w:r>
+      <w:r>
+        <w:rPr>
+          <w:lang w:val="en-US"/>
+        </w:rPr>
+        <w:t xml:space="preserve"> Agile Scrum Master, Team Lead, </w:t>
       </w:r>
       <w:proofErr w:type="spellStart"/>
       <w:r>
         <w:rPr>
           <w:lang w:val="en-US"/>
         </w:rPr>
-        <w:t>RubyMine</w:t>
+        <w:t>Buildmeister</w:t>
       </w:r>
       <w:proofErr w:type="spellEnd"/>
-      <w:r>
-        <w:rPr>
-          <w:lang w:val="en-US"/>
-        </w:rPr>
-        <w:t xml:space="preserve">, Cypress, Sauce Labs, Postman, </w:t>
+    </w:p>
+    <w:p>
+      <w:pPr>
+        <w:spacing w:before="240" w:after="240"/>
+      </w:pPr>
+    </w:p>
+    <w:p>
+      <w:pPr>
+        <w:spacing w:before="240" w:after="240"/>
+      </w:pPr>
+      <w:r>
+        <w:rPr>
+          <w:b/>
+        </w:rPr>
+        <w:t>Co-Founder &amp; Director of IT</w:t>
+      </w:r>
+      <w:r>
+        <w:t xml:space="preserve"> </w:t>
       </w:r>
       <w:proofErr w:type="spellStart"/>
       <w:r>
         <w:rPr>
-          <w:lang w:val="en-US"/>
-        </w:rPr>
-        <w:t>Minitest</w:t>
+          <w:i/>
+        </w:rPr>
+        <w:t>Rebit</w:t>
       </w:r>
       <w:proofErr w:type="spellEnd"/>
       <w:r>
         <w:rPr>
-          <w:lang w:val="en-US"/>
-        </w:rPr>
-        <w:t xml:space="preserve">, </w:t>
+          <w:i/>
+        </w:rPr>
+        <w:t xml:space="preserve"> Inc.</w:t>
+      </w:r>
+      <w:r>
+        <w:t xml:space="preserve"> </w:t>
+      </w:r>
+      <w:r>
+        <w:t xml:space="preserve">I </w:t>
+      </w:r>
+      <w:r>
+        <w:t xml:space="preserve">Co-founded </w:t>
       </w:r>
       <w:proofErr w:type="spellStart"/>
       <w:r>
-        <w:rPr>
-          <w:lang w:val="en-US"/>
-        </w:rPr>
-        <w:t>Doxygen</w:t>
+        <w:t>Rebit</w:t>
       </w:r>
       <w:proofErr w:type="spellEnd"/>
+      <w:r>
+        <w:t xml:space="preserve"> and was part the engineering team that created a groundbreaking, simple, and automatic backup solution for consumers. We developed a "ridiculously simple" backup appliance that required no user intervention, fundamentally changing the landscape of personal data protection.</w:t>
+      </w:r>
     </w:p>
     <w:p>
       <w:pPr>
@@ -769,58 +1126,247 @@
           <w:bCs/>
           <w:lang w:val="en-US"/>
         </w:rPr>
+        <w:t xml:space="preserve">Technologies: </w:t>
+      </w:r>
+      <w:r>
+        <w:rPr>
+          <w:lang w:val="en-US"/>
+        </w:rPr>
+        <w:t>Ruby, Cucumber, C++, Delphi, PostgreSQL, Access, Oracle, MSSQL, Oracle Business 1</w:t>
+      </w:r>
+    </w:p>
+    <w:p>
+      <w:pPr>
+        <w:spacing w:before="240" w:after="240"/>
+        <w:ind w:left="720"/>
+        <w:rPr>
+          <w:lang w:val="en-US"/>
+        </w:rPr>
+      </w:pPr>
+      <w:r>
+        <w:rPr>
+          <w:b/>
+          <w:bCs/>
+          <w:lang w:val="en-US"/>
+        </w:rPr>
+        <w:t xml:space="preserve">Tools: </w:t>
+      </w:r>
+      <w:proofErr w:type="spellStart"/>
+      <w:r>
+        <w:rPr>
+          <w:lang w:val="en-US"/>
+        </w:rPr>
+        <w:t>Atlassian</w:t>
+      </w:r>
+      <w:proofErr w:type="spellEnd"/>
+      <w:r>
+        <w:rPr>
+          <w:lang w:val="en-US"/>
+        </w:rPr>
+        <w:t xml:space="preserve"> Suite, Cypress, Sauce Labs, Postman, Agile Scrum Master, </w:t>
+      </w:r>
+      <w:proofErr w:type="spellStart"/>
+      <w:r>
+        <w:rPr>
+          <w:lang w:val="en-US"/>
+        </w:rPr>
+        <w:t>MercurialHG</w:t>
+      </w:r>
+      <w:proofErr w:type="spellEnd"/>
+      <w:r>
+        <w:rPr>
+          <w:lang w:val="en-US"/>
+        </w:rPr>
+        <w:t xml:space="preserve"> </w:t>
+      </w:r>
+    </w:p>
+    <w:p>
+      <w:pPr>
+        <w:spacing w:before="240" w:after="240"/>
+        <w:ind w:left="720"/>
+        <w:rPr>
+          <w:lang w:val="en-US"/>
+        </w:rPr>
+      </w:pPr>
+      <w:r>
+        <w:rPr>
+          <w:b/>
+          <w:bCs/>
+          <w:lang w:val="en-US"/>
+        </w:rPr>
         <w:t>Additional Roles:</w:t>
       </w:r>
       <w:r>
         <w:rPr>
           <w:lang w:val="en-US"/>
         </w:rPr>
-        <w:t xml:space="preserve"> Agile Scrum Master, Team Lead</w:t>
-      </w:r>
-    </w:p>
-    <w:p>
-      <w:pPr>
-        <w:spacing w:before="240" w:after="240"/>
-      </w:pPr>
-    </w:p>
-    <w:p>
-      <w:pPr>
-        <w:spacing w:before="240" w:after="240"/>
-      </w:pPr>
-      <w:r>
-        <w:rPr>
-          <w:b/>
-        </w:rPr>
-        <w:t xml:space="preserve">Senior </w:t>
-      </w:r>
-      <w:r>
-        <w:rPr>
-          <w:b/>
-        </w:rPr>
-        <w:t>Engineer</w:t>
-      </w:r>
-      <w:r>
+        <w:t xml:space="preserve"> Agile Scrum Master, Team Lead, Software Configuration Manager</w:t>
+      </w:r>
+    </w:p>
+    <w:p>
+      <w:pPr>
+        <w:spacing w:before="240" w:after="240"/>
+        <w:ind w:left="720"/>
+        <w:rPr>
+          <w:lang w:val="en-US"/>
+        </w:rPr>
+      </w:pPr>
+      <w:r>
+        <w:rPr>
+          <w:b/>
+          <w:bCs/>
+          <w:lang w:val="en-US"/>
+        </w:rPr>
+        <w:t xml:space="preserve">Exit: </w:t>
+      </w:r>
+      <w:proofErr w:type="spellStart"/>
+      <w:r>
+        <w:rPr>
+          <w:lang w:val="en-US"/>
+        </w:rPr>
+        <w:t>Rebit</w:t>
+      </w:r>
+      <w:proofErr w:type="spellEnd"/>
+      <w:r>
+        <w:rPr>
+          <w:lang w:val="en-US"/>
+        </w:rPr>
+        <w:t xml:space="preserve"> acquired </w:t>
+      </w:r>
+      <w:r>
+        <w:rPr>
+          <w:lang w:val="en-US"/>
+        </w:rPr>
+        <w:t xml:space="preserve">by </w:t>
+      </w:r>
+      <w:proofErr w:type="spellStart"/>
+      <w:r>
+        <w:rPr>
+          <w:lang w:val="en-US"/>
+        </w:rPr>
+        <w:t>Betsol</w:t>
+      </w:r>
+      <w:proofErr w:type="spellEnd"/>
+      <w:r>
+        <w:rPr>
+          <w:lang w:val="en-US"/>
+        </w:rPr>
+        <w:t xml:space="preserve"> Carbonite</w:t>
+      </w:r>
+      <w:r>
+        <w:rPr>
+          <w:lang w:val="en-US"/>
+        </w:rPr>
         <w:t xml:space="preserve"> </w:t>
       </w:r>
+      <w:r>
+        <w:rPr>
+          <w:lang w:val="en-US"/>
+        </w:rPr>
+        <w:t xml:space="preserve">for </w:t>
+      </w:r>
+      <w:r>
+        <w:rPr>
+          <w:lang w:val="en-US"/>
+        </w:rPr>
+        <w:t>25 Million</w:t>
+      </w:r>
+    </w:p>
+    <w:p>
+      <w:pPr>
+        <w:spacing w:before="240" w:after="240"/>
+      </w:pPr>
+    </w:p>
+    <w:p>
+      <w:pPr>
+        <w:spacing w:before="240" w:after="240"/>
+      </w:pPr>
+      <w:r>
+        <w:rPr>
+          <w:b/>
+        </w:rPr>
+        <w:t xml:space="preserve">Database Consultant / System </w:t>
+      </w:r>
       <w:proofErr w:type="spellStart"/>
       <w:r>
         <w:rPr>
+          <w:b/>
+        </w:rPr>
+        <w:t>Archtect</w:t>
+      </w:r>
+      <w:proofErr w:type="spellEnd"/>
+      <w:r>
+        <w:t xml:space="preserve"> </w:t>
+      </w:r>
+      <w:proofErr w:type="spellStart"/>
+      <w:r>
+        <w:rPr>
           <w:i/>
         </w:rPr>
-        <w:t>ClickBank</w:t>
+        <w:t>Worldbank</w:t>
       </w:r>
       <w:proofErr w:type="spellEnd"/>
       <w:r>
         <w:rPr>
           <w:i/>
         </w:rPr>
-        <w:t>.</w:t>
-      </w:r>
-      <w:r>
-        <w:t xml:space="preserve"> As a key member of the</w:t>
-      </w:r>
-      <w:r>
-        <w:t xml:space="preserve"> team, I was instrumental in automating and streamlining the software development lifecycle. I designed and implemented CI/CD pipelines, managed cloud infrastructure, and ensured the reliability and scalability of our affiliate marketing platform, enabling rapid and dependable software delivery.</w:t>
+        <w:t xml:space="preserve"> Nile Basin DSS.</w:t>
+      </w:r>
+      <w:r>
+        <w:t xml:space="preserve"> </w:t>
+      </w:r>
+      <w:r>
+        <w:t xml:space="preserve">The Nile Basin Decision Support System (NB-DSS) is a platform developed by the Nile Basin Initiative (NBI) to facilitate cooperative planning and management of the Nile River's water resources by providing data, analytical tools, and modeling capabilities for Integrated Water Resources Management (IWRM). It serves as a central repository for data and offers advanced tools for s </w:t>
+      </w:r>
+      <w:proofErr w:type="spellStart"/>
+      <w:r>
+        <w:t>cenario</w:t>
+      </w:r>
+      <w:proofErr w:type="spellEnd"/>
+      <w:r>
+        <w:t xml:space="preserve"> management, optimization, and multi-criteria decision-making, aiming to support riparian countries in reaching consensus on sustainable water resource development projects.</w:t>
+      </w:r>
+    </w:p>
+    <w:p>
+      <w:pPr>
+        <w:spacing w:before="240" w:after="240"/>
+        <w:rPr>
+          <w:b/>
+          <w:bCs/>
+          <w:lang w:val="en-US"/>
+        </w:rPr>
+      </w:pPr>
+      <w:r>
+        <w:t xml:space="preserve">I </w:t>
+      </w:r>
+      <w:r>
+        <w:t xml:space="preserve">Engineered and executed the migration of a core system to a </w:t>
+      </w:r>
+      <w:r>
+        <w:rPr>
+          <w:bCs/>
+        </w:rPr>
+        <w:t>PostgreSQL</w:t>
+      </w:r>
+      <w:r>
+        <w:t xml:space="preserve"> and </w:t>
+      </w:r>
+      <w:r>
+        <w:rPr>
+          <w:bCs/>
+        </w:rPr>
+        <w:t>Ubuntu Linux</w:t>
+      </w:r>
+      <w:r>
+        <w:t xml:space="preserve"> environment. This strategic shift away from proprietary Microsoft and Oracle solutions created a sustainable, self-supporting infrastructure while achieving substantial reductions in operational licensing costs.</w:t>
+      </w:r>
+      <w:r>
+        <w:rPr>
+          <w:b/>
+          <w:bCs/>
+          <w:lang w:val="en-US"/>
+        </w:rPr>
+        <w:t xml:space="preserve"> </w:t>
       </w:r>
     </w:p>
     <w:p>
@@ -837,576 +1383,45 @@
           <w:bCs/>
           <w:lang w:val="en-US"/>
         </w:rPr>
+        <w:lastRenderedPageBreak/>
         <w:t xml:space="preserve">Technologies: </w:t>
       </w:r>
       <w:r>
         <w:rPr>
-          <w:lang w:val="en-US"/>
-        </w:rPr>
-        <w:t xml:space="preserve">Ruby, Cucumber, </w:t>
-      </w:r>
-      <w:proofErr w:type="spellStart"/>
-      <w:r>
-        <w:rPr>
-          <w:lang w:val="en-US"/>
-        </w:rPr>
-        <w:t>Nutch</w:t>
-      </w:r>
-      <w:proofErr w:type="spellEnd"/>
-      <w:r>
-        <w:rPr>
-          <w:lang w:val="en-US"/>
-        </w:rPr>
-        <w:t xml:space="preserve">, </w:t>
-      </w:r>
-      <w:r>
-        <w:rPr>
-          <w:lang w:val="en-US"/>
-        </w:rPr>
-        <w:t xml:space="preserve">Java, </w:t>
-      </w:r>
-      <w:r>
-        <w:rPr>
-          <w:lang w:val="en-US"/>
-        </w:rPr>
-        <w:t xml:space="preserve">Apache Tomcat, AWS, </w:t>
-      </w:r>
-      <w:proofErr w:type="spellStart"/>
-      <w:r>
-        <w:rPr>
-          <w:lang w:val="en-US"/>
-        </w:rPr>
-        <w:t>Liquibase</w:t>
-      </w:r>
-      <w:proofErr w:type="spellEnd"/>
-      <w:r>
-        <w:rPr>
-          <w:lang w:val="en-US"/>
-        </w:rPr>
-        <w:t xml:space="preserve">, Docker, </w:t>
-      </w:r>
-      <w:proofErr w:type="spellStart"/>
-      <w:r>
-        <w:rPr>
-          <w:lang w:val="en-US"/>
-        </w:rPr>
-        <w:t>Doxygen</w:t>
-      </w:r>
-      <w:proofErr w:type="spellEnd"/>
-      <w:r>
-        <w:rPr>
-          <w:lang w:val="en-US"/>
-        </w:rPr>
-        <w:t>,</w:t>
-      </w:r>
-      <w:r>
-        <w:rPr>
+          <w:bCs/>
+          <w:lang w:val="en-US"/>
+        </w:rPr>
+        <w:t>MS</w:t>
+      </w:r>
+      <w:r>
+        <w:rPr>
+          <w:b/>
+          <w:bCs/>
           <w:lang w:val="en-US"/>
         </w:rPr>
         <w:t xml:space="preserve"> </w:t>
       </w:r>
-      <w:proofErr w:type="spellStart"/>
-      <w:r>
-        <w:rPr>
-          <w:lang w:val="en-US"/>
-        </w:rPr>
-        <w:t>BitBucket</w:t>
-      </w:r>
-      <w:proofErr w:type="spellEnd"/>
-      <w:r>
-        <w:rPr>
-          <w:lang w:val="en-US"/>
-        </w:rPr>
-        <w:t xml:space="preserve">, </w:t>
-      </w:r>
-      <w:proofErr w:type="spellStart"/>
-      <w:r>
-        <w:rPr>
-          <w:lang w:val="en-US"/>
-        </w:rPr>
-        <w:t>Git</w:t>
-      </w:r>
-      <w:proofErr w:type="spellEnd"/>
-      <w:r>
-        <w:rPr>
-          <w:lang w:val="en-US"/>
-        </w:rPr>
-        <w:t>, GitHub,</w:t>
-      </w:r>
-      <w:r>
-        <w:rPr>
-          <w:lang w:val="en-US"/>
-        </w:rPr>
-        <w:t xml:space="preserve"> Zeus/Azul</w:t>
-      </w:r>
-    </w:p>
-    <w:p>
-      <w:pPr>
-        <w:spacing w:before="240" w:after="240"/>
-        <w:ind w:left="720"/>
-        <w:rPr>
-          <w:lang w:val="en-US"/>
-        </w:rPr>
-      </w:pPr>
-      <w:r>
-        <w:rPr>
-          <w:b/>
+      <w:r>
+        <w:rPr>
           <w:bCs/>
           <w:lang w:val="en-US"/>
         </w:rPr>
-        <w:t xml:space="preserve">Tools: </w:t>
-      </w:r>
-      <w:proofErr w:type="spellStart"/>
-      <w:r>
-        <w:rPr>
-          <w:lang w:val="en-US"/>
-        </w:rPr>
-        <w:t>Atlassian</w:t>
-      </w:r>
-      <w:proofErr w:type="spellEnd"/>
-      <w:r>
-        <w:rPr>
-          <w:lang w:val="en-US"/>
-        </w:rPr>
-        <w:t xml:space="preserve"> Suite, </w:t>
-      </w:r>
-      <w:proofErr w:type="spellStart"/>
-      <w:r>
-        <w:rPr>
-          <w:lang w:val="en-US"/>
-        </w:rPr>
-        <w:t>InjelliJ</w:t>
-      </w:r>
-      <w:proofErr w:type="spellEnd"/>
-      <w:r>
-        <w:rPr>
-          <w:lang w:val="en-US"/>
-        </w:rPr>
-        <w:t xml:space="preserve">, </w:t>
-      </w:r>
-      <w:proofErr w:type="spellStart"/>
-      <w:r>
-        <w:rPr>
-          <w:lang w:val="en-US"/>
-        </w:rPr>
-        <w:t>NetNeans</w:t>
-      </w:r>
-      <w:proofErr w:type="spellEnd"/>
-      <w:r>
-        <w:rPr>
-          <w:lang w:val="en-US"/>
-        </w:rPr>
-        <w:t xml:space="preserve">, Cypress, Sauce Labs, Swagger, Postman </w:t>
-      </w:r>
-    </w:p>
-    <w:p>
-      <w:pPr>
-        <w:spacing w:before="240" w:after="240"/>
-        <w:ind w:left="720"/>
-        <w:rPr>
-          <w:lang w:val="en-US"/>
-        </w:rPr>
-      </w:pPr>
-      <w:r>
-        <w:rPr>
-          <w:b/>
+        <w:t>Server</w:t>
+      </w:r>
+      <w:r>
+        <w:rPr>
           <w:bCs/>
           <w:lang w:val="en-US"/>
         </w:rPr>
-        <w:t>Additional Roles:</w:t>
-      </w:r>
-      <w:r>
-        <w:rPr>
-          <w:lang w:val="en-US"/>
-        </w:rPr>
-        <w:t xml:space="preserve"> Agile Scrum Master, Team Lead, </w:t>
-      </w:r>
-      <w:proofErr w:type="spellStart"/>
-      <w:r>
-        <w:rPr>
-          <w:lang w:val="en-US"/>
-        </w:rPr>
-        <w:t>Buildmeister</w:t>
-      </w:r>
-      <w:proofErr w:type="spellEnd"/>
-    </w:p>
-    <w:p>
-      <w:pPr>
-        <w:spacing w:before="240" w:after="240"/>
-      </w:pPr>
-    </w:p>
-    <w:p>
-      <w:pPr>
-        <w:spacing w:before="240" w:after="240"/>
-      </w:pPr>
-      <w:r>
-        <w:rPr>
-          <w:b/>
-        </w:rPr>
-        <w:t>Co-Founder &amp; Director of IT</w:t>
-      </w:r>
-      <w:r>
+        <w:t>, MSSQL,</w:t>
+      </w:r>
+      <w:r>
+        <w:rPr>
+          <w:bCs/>
+          <w:lang w:val="en-US"/>
+        </w:rPr>
         <w:t xml:space="preserve"> </w:t>
       </w:r>
-      <w:proofErr w:type="spellStart"/>
-      <w:r>
-        <w:rPr>
-          <w:i/>
-        </w:rPr>
-        <w:t>Rebit</w:t>
-      </w:r>
-      <w:proofErr w:type="spellEnd"/>
-      <w:r>
-        <w:rPr>
-          <w:i/>
-        </w:rPr>
-        <w:t xml:space="preserve"> Inc.</w:t>
-      </w:r>
-      <w:r>
-        <w:t xml:space="preserve"> </w:t>
-      </w:r>
-      <w:r>
-        <w:t xml:space="preserve">I </w:t>
-      </w:r>
-      <w:r>
-        <w:t xml:space="preserve">Co-founded </w:t>
-      </w:r>
-      <w:proofErr w:type="spellStart"/>
-      <w:r>
-        <w:t>Rebit</w:t>
-      </w:r>
-      <w:proofErr w:type="spellEnd"/>
-      <w:r>
-        <w:t xml:space="preserve"> and was part the engineering team that created a groundbreaking, simple, and automatic backup solution for consumers. We developed a "ridiculously simple" backup appliance that required no user intervention, fundamentally changing the landscape of personal data protection.</w:t>
-      </w:r>
-    </w:p>
-    <w:p>
-      <w:pPr>
-        <w:spacing w:before="240" w:after="240"/>
-        <w:ind w:left="720"/>
-        <w:rPr>
-          <w:lang w:val="en-US"/>
-        </w:rPr>
-      </w:pPr>
-      <w:r>
-        <w:rPr>
-          <w:b/>
-          <w:bCs/>
-          <w:lang w:val="en-US"/>
-        </w:rPr>
-        <w:t xml:space="preserve">Technologies: </w:t>
-      </w:r>
-      <w:r>
-        <w:rPr>
-          <w:lang w:val="en-US"/>
-        </w:rPr>
-        <w:t>Ruby, Cucumber, C++, Delphi, PostgreSQL, Access, Oracle, MSSQL, Oracle Business 1</w:t>
-      </w:r>
-    </w:p>
-    <w:p>
-      <w:pPr>
-        <w:spacing w:before="240" w:after="240"/>
-        <w:ind w:left="720"/>
-        <w:rPr>
-          <w:lang w:val="en-US"/>
-        </w:rPr>
-      </w:pPr>
-      <w:r>
-        <w:rPr>
-          <w:b/>
-          <w:bCs/>
-          <w:lang w:val="en-US"/>
-        </w:rPr>
-        <w:t xml:space="preserve">Tools: </w:t>
-      </w:r>
-      <w:proofErr w:type="spellStart"/>
-      <w:r>
-        <w:rPr>
-          <w:lang w:val="en-US"/>
-        </w:rPr>
-        <w:t>Atlassian</w:t>
-      </w:r>
-      <w:proofErr w:type="spellEnd"/>
-      <w:r>
-        <w:rPr>
-          <w:lang w:val="en-US"/>
-        </w:rPr>
-        <w:t xml:space="preserve"> Suite, Cypress, Sauce Labs, Postman, Agile Scrum Master, </w:t>
-      </w:r>
-      <w:proofErr w:type="spellStart"/>
-      <w:r>
-        <w:rPr>
-          <w:lang w:val="en-US"/>
-        </w:rPr>
-        <w:t>MercurialHG</w:t>
-      </w:r>
-      <w:proofErr w:type="spellEnd"/>
-      <w:r>
-        <w:rPr>
-          <w:lang w:val="en-US"/>
-        </w:rPr>
-        <w:t xml:space="preserve"> </w:t>
-      </w:r>
-    </w:p>
-    <w:p>
-      <w:pPr>
-        <w:spacing w:before="240" w:after="240"/>
-        <w:ind w:left="720"/>
-        <w:rPr>
-          <w:lang w:val="en-US"/>
-        </w:rPr>
-      </w:pPr>
-      <w:r>
-        <w:rPr>
-          <w:b/>
-          <w:bCs/>
-          <w:lang w:val="en-US"/>
-        </w:rPr>
-        <w:t>Additional Roles:</w:t>
-      </w:r>
-      <w:r>
-        <w:rPr>
-          <w:lang w:val="en-US"/>
-        </w:rPr>
-        <w:t xml:space="preserve"> Agile Scrum Master, Team Lead, Software Configuration Manager</w:t>
-      </w:r>
-    </w:p>
-    <w:p>
-      <w:pPr>
-        <w:spacing w:before="240" w:after="240"/>
-        <w:ind w:left="720"/>
-        <w:rPr>
-          <w:lang w:val="en-US"/>
-        </w:rPr>
-      </w:pPr>
-      <w:r>
-        <w:rPr>
-          <w:b/>
-          <w:bCs/>
-          <w:lang w:val="en-US"/>
-        </w:rPr>
-        <w:t xml:space="preserve">Exit: </w:t>
-      </w:r>
-      <w:proofErr w:type="spellStart"/>
-      <w:r>
-        <w:rPr>
-          <w:lang w:val="en-US"/>
-        </w:rPr>
-        <w:t>Rebit</w:t>
-      </w:r>
-      <w:proofErr w:type="spellEnd"/>
-      <w:r>
-        <w:rPr>
-          <w:lang w:val="en-US"/>
-        </w:rPr>
-        <w:t xml:space="preserve"> acquired </w:t>
-      </w:r>
-      <w:r>
-        <w:rPr>
-          <w:lang w:val="en-US"/>
-        </w:rPr>
-        <w:t xml:space="preserve">by </w:t>
-      </w:r>
-      <w:proofErr w:type="spellStart"/>
-      <w:r>
-        <w:rPr>
-          <w:lang w:val="en-US"/>
-        </w:rPr>
-        <w:t>Betsol</w:t>
-      </w:r>
-      <w:proofErr w:type="spellEnd"/>
-      <w:r>
-        <w:rPr>
-          <w:lang w:val="en-US"/>
-        </w:rPr>
-        <w:t xml:space="preserve"> Carbonite</w:t>
-      </w:r>
-      <w:r>
-        <w:rPr>
-          <w:lang w:val="en-US"/>
-        </w:rPr>
-        <w:t xml:space="preserve"> </w:t>
-      </w:r>
-      <w:r>
-        <w:rPr>
-          <w:lang w:val="en-US"/>
-        </w:rPr>
-        <w:t xml:space="preserve">for </w:t>
-      </w:r>
-      <w:r>
-        <w:rPr>
-          <w:lang w:val="en-US"/>
-        </w:rPr>
-        <w:t>25 Million</w:t>
-      </w:r>
-    </w:p>
-    <w:p>
-      <w:pPr>
-        <w:spacing w:before="240" w:after="240"/>
-      </w:pPr>
-    </w:p>
-    <w:p>
-      <w:pPr>
-        <w:spacing w:before="240" w:after="240"/>
-      </w:pPr>
-      <w:r>
-        <w:rPr>
-          <w:b/>
-        </w:rPr>
-        <w:t xml:space="preserve">Database Consultant / System </w:t>
-      </w:r>
-      <w:proofErr w:type="spellStart"/>
-      <w:r>
-        <w:rPr>
-          <w:b/>
-        </w:rPr>
-        <w:t>Archtect</w:t>
-      </w:r>
-      <w:proofErr w:type="spellEnd"/>
-      <w:r>
-        <w:t xml:space="preserve"> </w:t>
-      </w:r>
-      <w:proofErr w:type="spellStart"/>
-      <w:r>
-        <w:rPr>
-          <w:i/>
-        </w:rPr>
-        <w:t>Worldbank</w:t>
-      </w:r>
-      <w:proofErr w:type="spellEnd"/>
-      <w:r>
-        <w:rPr>
-          <w:i/>
-        </w:rPr>
-        <w:t xml:space="preserve"> </w:t>
-      </w:r>
-      <w:r>
-        <w:rPr>
-          <w:i/>
-        </w:rPr>
-        <w:t>Nile Basin DSS</w:t>
-      </w:r>
-      <w:r>
-        <w:rPr>
-          <w:i/>
-        </w:rPr>
-        <w:t>.</w:t>
-      </w:r>
-      <w:r>
-        <w:t xml:space="preserve"> </w:t>
-      </w:r>
-      <w:r>
-        <w:t xml:space="preserve">The Nile Basin Decision Support System (NB-DSS) is a platform developed by the Nile Basin Initiative (NBI) to facilitate cooperative planning and management of the Nile River's water resources by providing data, analytical tools, and modeling capabilities for Integrated Water Resources Management (IWRM). It serves as a central repository for data and offers advanced tools for s </w:t>
-      </w:r>
-      <w:proofErr w:type="spellStart"/>
-      <w:r>
-        <w:t>cenario</w:t>
-      </w:r>
-      <w:proofErr w:type="spellEnd"/>
-      <w:r>
-        <w:t xml:space="preserve"> management, optimization, and multi-criteria decision-making, aiming to support riparian countries in reaching consensus on sustainable water resource development projects.</w:t>
-      </w:r>
-    </w:p>
-    <w:p>
-      <w:pPr>
-        <w:spacing w:before="240" w:after="240"/>
-        <w:rPr>
-          <w:b/>
-          <w:bCs/>
-          <w:lang w:val="en-US"/>
-        </w:rPr>
-      </w:pPr>
-      <w:r>
-        <w:t xml:space="preserve">I </w:t>
-      </w:r>
-      <w:r>
-        <w:t xml:space="preserve">Engineered and executed the migration of a core system to a </w:t>
-      </w:r>
-      <w:r>
-        <w:rPr>
-          <w:bCs/>
-        </w:rPr>
-        <w:t>PostgreSQL</w:t>
-      </w:r>
-      <w:r>
-        <w:t xml:space="preserve"> and </w:t>
-      </w:r>
-      <w:r>
-        <w:rPr>
-          <w:bCs/>
-        </w:rPr>
-        <w:t>Ubuntu Linux</w:t>
-      </w:r>
-      <w:r>
-        <w:t xml:space="preserve"> environment. This strategic shift away from proprietary Microsoft and Oracle solutions created a </w:t>
-      </w:r>
-      <w:r>
-        <w:lastRenderedPageBreak/>
-        <w:t>sustainable, self-supporting infrastructure while achieving substantial reductions in operational licensing costs.</w:t>
-      </w:r>
-      <w:r>
-        <w:rPr>
-          <w:b/>
-          <w:bCs/>
-          <w:lang w:val="en-US"/>
-        </w:rPr>
-        <w:t xml:space="preserve"> </w:t>
-      </w:r>
-    </w:p>
-    <w:p>
-      <w:pPr>
-        <w:spacing w:before="240" w:after="240"/>
-        <w:ind w:left="720"/>
-        <w:rPr>
-          <w:lang w:val="en-US"/>
-        </w:rPr>
-      </w:pPr>
-      <w:r>
-        <w:rPr>
-          <w:b/>
-          <w:bCs/>
-          <w:lang w:val="en-US"/>
-        </w:rPr>
-        <w:t xml:space="preserve">Technologies: </w:t>
-      </w:r>
-      <w:r>
-        <w:rPr>
-          <w:bCs/>
-          <w:lang w:val="en-US"/>
-        </w:rPr>
-        <w:t>MS</w:t>
-      </w:r>
-      <w:r>
-        <w:rPr>
-          <w:b/>
-          <w:bCs/>
-          <w:lang w:val="en-US"/>
-        </w:rPr>
-        <w:t xml:space="preserve"> </w:t>
-      </w:r>
-      <w:r>
-        <w:rPr>
-          <w:bCs/>
-          <w:lang w:val="en-US"/>
-        </w:rPr>
-        <w:t>Server</w:t>
-      </w:r>
-      <w:r>
-        <w:rPr>
-          <w:bCs/>
-          <w:lang w:val="en-US"/>
-        </w:rPr>
-        <w:t>, MSSQL,</w:t>
-      </w:r>
-      <w:r>
-        <w:rPr>
-          <w:bCs/>
-          <w:lang w:val="en-US"/>
-        </w:rPr>
-        <w:t xml:space="preserve"> </w:t>
-      </w:r>
-      <w:bookmarkStart w:id="2" w:name="_GoBack"/>
-      <w:bookmarkEnd w:id="2"/>
       <w:r>
         <w:rPr>
           <w:lang w:val="en-US"/>
@@ -1983,46 +1998,49 @@
         <w:rPr>
           <w:b/>
         </w:rPr>
+        <w:t>Senior Software/Firmware Engineer/IT</w:t>
+      </w:r>
+      <w:r>
+        <w:t xml:space="preserve"> </w:t>
+      </w:r>
+      <w:proofErr w:type="spellStart"/>
+      <w:r>
+        <w:rPr>
+          <w:i/>
+        </w:rPr>
+        <w:t>StorageTek</w:t>
+      </w:r>
+      <w:proofErr w:type="spellEnd"/>
+      <w:r>
+        <w:rPr>
+          <w:i/>
+        </w:rPr>
+        <w:t>.</w:t>
+      </w:r>
+      <w:r>
+        <w:t xml:space="preserve"> </w:t>
+      </w:r>
+      <w:r>
+        <w:t xml:space="preserve">I </w:t>
+      </w:r>
+      <w:r>
+        <w:t>Contributed to the development of cutti</w:t>
+      </w:r>
+      <w:r>
+        <w:t>ng-edge automated storage systems</w:t>
+      </w:r>
+      <w:r>
+        <w:t xml:space="preserve">, including the innovative Iceberg </w:t>
+      </w:r>
+      <w:r>
+        <w:t xml:space="preserve">a </w:t>
+      </w:r>
+      <w:r>
+        <w:t xml:space="preserve">totally redundant, fault tolerant disk system. My work in tools and software engineering was vital to the </w:t>
+      </w:r>
+      <w:r>
         <w:lastRenderedPageBreak/>
-        <w:t>Senior Software/Firmware Engineer/IT</w:t>
-      </w:r>
-      <w:r>
-        <w:t xml:space="preserve"> </w:t>
-      </w:r>
-      <w:proofErr w:type="spellStart"/>
-      <w:r>
-        <w:rPr>
-          <w:i/>
-        </w:rPr>
-        <w:t>StorageTek</w:t>
-      </w:r>
-      <w:proofErr w:type="spellEnd"/>
-      <w:r>
-        <w:rPr>
-          <w:i/>
-        </w:rPr>
-        <w:t>.</w:t>
-      </w:r>
-      <w:r>
-        <w:t xml:space="preserve"> </w:t>
-      </w:r>
-      <w:r>
-        <w:t xml:space="preserve">I </w:t>
-      </w:r>
-      <w:r>
-        <w:t>Contributed to the development of cutti</w:t>
-      </w:r>
-      <w:r>
-        <w:t>ng-edge automated storage systems</w:t>
-      </w:r>
-      <w:r>
-        <w:t xml:space="preserve">, including the innovative Iceberg </w:t>
-      </w:r>
-      <w:r>
-        <w:t xml:space="preserve">a </w:t>
-      </w:r>
-      <w:r>
-        <w:t>totally redundant, fault tolerant disk system. My work in tools and software engineering was vital to the functionality and reliability of these large-scale data storage solutions, which were used by major corporations worldwide.</w:t>
+        <w:t>functionality and reliability of these large-scale data storage solutions, which were used by major corporations worldwide.</w:t>
       </w:r>
     </w:p>
     <w:p>
@@ -2590,7 +2608,6 @@
           <w:b/>
           <w:lang w:val="en-US"/>
         </w:rPr>
-        <w:lastRenderedPageBreak/>
         <w:t>Maintain Broadcast Systems:</w:t>
       </w:r>
       <w:r>
@@ -2617,6 +2634,7 @@
           <w:b/>
           <w:lang w:val="en-US"/>
         </w:rPr>
+        <w:lastRenderedPageBreak/>
         <w:t>Ensure FCC Compliance:</w:t>
       </w:r>
       <w:r>
@@ -2863,11 +2881,26 @@
     </w:p>
     <w:p>
       <w:pPr>
-        <w:spacing w:before="240" w:after="240"/>
-        <w:rPr>
-          <w:lang w:val="en-US"/>
-        </w:rPr>
-      </w:pPr>
+        <w:rPr>
+          <w:lang w:val="en-US"/>
+        </w:rPr>
+      </w:pPr>
+      <w:r>
+        <w:rPr>
+          <w:lang w:val="en-US"/>
+        </w:rPr>
+        <w:br w:type="page"/>
+      </w:r>
+    </w:p>
+    <w:p>
+      <w:pPr>
+        <w:spacing w:before="240" w:after="240"/>
+        <w:rPr>
+          <w:lang w:val="en-US"/>
+        </w:rPr>
+      </w:pPr>
+      <w:bookmarkStart w:id="2" w:name="_GoBack"/>
+      <w:bookmarkEnd w:id="2"/>
     </w:p>
     <w:p/>
     <w:tbl>
@@ -3224,7 +3257,6 @@
                 <w:rFonts w:ascii="Arial" w:hAnsi="Arial" w:cs="Arial"/>
                 <w:szCs w:val="22"/>
               </w:rPr>
-              <w:lastRenderedPageBreak/>
               <w:t xml:space="preserve">                         </w:t>
             </w:r>
             <w:r>
@@ -5974,6 +6006,7 @@
   <w:style w:type="character" w:default="1" w:styleId="DefaultParagraphFont">
     <w:name w:val="Default Paragraph Font"/>
     <w:uiPriority w:val="1"/>
+    <w:semiHidden/>
     <w:unhideWhenUsed/>
   </w:style>
   <w:style w:type="table" w:default="1" w:styleId="TableNormal">

</xml_diff>